<commit_message>
some fixes wp wps equation
</commit_message>
<xml_diff>
--- a/resources/Лазарев диплом.docx
+++ b/resources/Лазарев диплом.docx
@@ -2,7 +2,13 @@
 <file path=word/document.xml><?xml version="1.0" encoding="utf-8"?>
 <w:document xmlns:wpc="http://schemas.microsoft.com/office/word/2010/wordprocessingCanvas" xmlns:cx="http://schemas.microsoft.com/office/drawing/2014/chartex" xmlns:cx1="http://schemas.microsoft.com/office/drawing/2015/9/8/chartex" xmlns:cx2="http://schemas.microsoft.com/office/drawing/2015/10/21/chartex" xmlns:cx3="http://schemas.microsoft.com/office/drawing/2016/5/9/chartex" xmlns:cx4="http://schemas.microsoft.com/office/drawing/2016/5/10/chartex" xmlns:cx5="http://schemas.microsoft.com/office/drawing/2016/5/11/chartex" xmlns:cx6="http://schemas.microsoft.com/office/drawing/2016/5/12/chartex" xmlns:cx7="http://schemas.microsoft.com/office/drawing/2016/5/13/chartex" xmlns:cx8="http://schemas.microsoft.com/office/drawing/2016/5/14/chartex" xmlns:mc="http://schemas.openxmlformats.org/markup-compatibility/2006" xmlns:aink="http://schemas.microsoft.com/office/drawing/2016/ink" xmlns:am3d="http://schemas.microsoft.com/office/drawing/2017/model3d" xmlns:o="urn:schemas-microsoft-com:office:office" xmlns:r="http://schemas.openxmlformats.org/officeDocument/2006/relationships" xmlns:m="http://schemas.openxmlformats.org/officeDocument/2006/math" xmlns:v="urn:schemas-microsoft-com:vml" xmlns:wp14="http://schemas.microsoft.com/office/word/2010/wordprocessingDrawing" xmlns:wp="http://schemas.openxmlformats.org/drawingml/2006/wordprocessingDrawing" xmlns:w10="urn:schemas-microsoft-com:office:word" xmlns:w="http://schemas.openxmlformats.org/wordprocessingml/2006/main" xmlns:w14="http://schemas.microsoft.com/office/word/2010/wordml" xmlns:w15="http://schemas.microsoft.com/office/word/2012/wordml" xmlns:w16cex="http://schemas.microsoft.com/office/word/2018/wordml/cex" xmlns:w16cid="http://schemas.microsoft.com/office/word/2016/wordml/cid" xmlns:w16="http://schemas.microsoft.com/office/word/2018/wordml" xmlns:w16sdtdh="http://schemas.microsoft.com/office/word/2020/wordml/sdtdatahash" xmlns:w16se="http://schemas.microsoft.com/office/word/2015/wordml/symex" xmlns:wpg="http://schemas.microsoft.com/office/word/2010/wordprocessingGroup" xmlns:wpi="http://schemas.microsoft.com/office/word/2010/wordprocessingInk" xmlns:wne="http://schemas.microsoft.com/office/word/2006/wordml" xmlns:wps="http://schemas.microsoft.com/office/word/2010/wordprocessingShape" mc:Ignorable="w14 w15 w16se w16cid w16 w16cex w16sdtdh wp14">
   <w:body>
-    <w:p/>
+    <w:p>
+      <w:pPr>
+        <w:rPr>
+          <w:lang w:val="en-US"/>
+        </w:rPr>
+      </w:pPr>
+    </w:p>
     <w:p/>
     <w:p>
       <w:pPr>
@@ -96,7 +102,11 @@
         <w:t>Направление</w:t>
       </w:r>
       <w:r>
-        <w:t xml:space="preserve"> подготовки</w:t>
+        <w:t xml:space="preserve"> </w:t>
+      </w:r>
+      <w:proofErr w:type="gramStart"/>
+      <w:r>
+        <w:t>подготовки</w:t>
       </w:r>
       <w:r>
         <w:t>:</w:t>
@@ -105,7 +115,14 @@
         <w:rPr>
           <w:u w:val="single"/>
         </w:rPr>
-        <w:t xml:space="preserve">  01.04.03  </w:t>
+        <w:t xml:space="preserve">  01.04.03</w:t>
+      </w:r>
+      <w:proofErr w:type="gramEnd"/>
+      <w:r>
+        <w:rPr>
+          <w:u w:val="single"/>
+        </w:rPr>
+        <w:t xml:space="preserve">  </w:t>
       </w:r>
       <w:r>
         <w:t xml:space="preserve"> –</w:t>
@@ -354,32 +371,50 @@
         <w:spacing w:after="0" w:line="240" w:lineRule="auto"/>
       </w:pPr>
       <w:r>
-        <w:t>___</w:t>
-      </w:r>
-      <w:r>
         <w:rPr>
           <w:u w:val="single"/>
         </w:rPr>
+        <w:t xml:space="preserve">       </w:t>
+      </w:r>
+      <w:r>
+        <w:rPr>
+          <w:u w:val="single"/>
+        </w:rPr>
         <w:t xml:space="preserve">д. ф.- </w:t>
       </w:r>
       <w:proofErr w:type="spellStart"/>
+      <w:proofErr w:type="gramStart"/>
       <w:r>
         <w:rPr>
           <w:u w:val="single"/>
         </w:rPr>
-        <w:t>м.н.</w:t>
-      </w:r>
-      <w:r>
-        <w:t>_</w:t>
-      </w:r>
+        <w:t>м.н</w:t>
+      </w:r>
+      <w:proofErr w:type="spellEnd"/>
       <w:r>
         <w:rPr>
           <w:u w:val="single"/>
         </w:rPr>
+        <w:t>.</w:t>
+      </w:r>
+      <w:r>
+        <w:rPr>
+          <w:u w:val="single"/>
+        </w:rPr>
+        <w:t xml:space="preserve"> </w:t>
+      </w:r>
+      <w:r>
+        <w:rPr>
+          <w:u w:val="single"/>
+        </w:rPr>
         <w:t>,</w:t>
       </w:r>
-      <w:r>
-        <w:t>___</w:t>
+      <w:proofErr w:type="gramEnd"/>
+      <w:r>
+        <w:rPr>
+          <w:u w:val="single"/>
+        </w:rPr>
+        <w:t xml:space="preserve">        </w:t>
       </w:r>
       <w:r>
         <w:rPr>
@@ -388,9 +423,11 @@
         </w:rPr>
         <w:t>доцент</w:t>
       </w:r>
-      <w:proofErr w:type="spellEnd"/>
-      <w:r>
-        <w:t>_______</w:t>
+      <w:r>
+        <w:rPr>
+          <w:u w:val="single"/>
+        </w:rPr>
+        <w:t xml:space="preserve">            </w:t>
       </w:r>
       <w:r>
         <w:tab/>
@@ -488,15 +525,19 @@
         <w:spacing w:after="0" w:line="240" w:lineRule="auto"/>
       </w:pPr>
       <w:r>
-        <w:t>___</w:t>
-      </w:r>
-      <w:r>
         <w:rPr>
           <w:u w:val="single"/>
         </w:rPr>
+        <w:t xml:space="preserve">       </w:t>
+      </w:r>
+      <w:r>
+        <w:rPr>
+          <w:u w:val="single"/>
+        </w:rPr>
         <w:t xml:space="preserve">д. ф.- </w:t>
       </w:r>
       <w:proofErr w:type="spellStart"/>
+      <w:proofErr w:type="gramStart"/>
       <w:r>
         <w:rPr>
           <w:u w:val="single"/>
@@ -511,16 +552,41 @@
         <w:t>.</w:t>
       </w:r>
       <w:r>
-        <w:t>__, ___</w:t>
-      </w:r>
-      <w:r>
         <w:rPr>
           <w:u w:val="single"/>
         </w:rPr>
+        <w:t xml:space="preserve"> </w:t>
+      </w:r>
+      <w:r>
+        <w:rPr>
+          <w:u w:val="single"/>
+        </w:rPr>
+        <w:t>,</w:t>
+      </w:r>
+      <w:proofErr w:type="gramEnd"/>
+      <w:r>
+        <w:rPr>
+          <w:u w:val="single"/>
+        </w:rPr>
+        <w:t xml:space="preserve"> </w:t>
+      </w:r>
+      <w:r>
+        <w:rPr>
+          <w:u w:val="single"/>
+        </w:rPr>
+        <w:t xml:space="preserve">         </w:t>
+      </w:r>
+      <w:r>
+        <w:rPr>
+          <w:u w:val="single"/>
+        </w:rPr>
         <w:t>доцент</w:t>
       </w:r>
       <w:r>
-        <w:t>_________</w:t>
+        <w:rPr>
+          <w:u w:val="single"/>
+        </w:rPr>
+        <w:t xml:space="preserve">          </w:t>
       </w:r>
       <w:r>
         <w:tab/>
@@ -560,20 +626,55 @@
         </w:rPr>
         <w:t>уч. степень</w:t>
       </w:r>
+      <w:proofErr w:type="gramStart"/>
       <w:r>
         <w:rPr>
           <w:sz w:val="20"/>
           <w:szCs w:val="20"/>
         </w:rPr>
         <w:tab/>
-        <w:t>уч. звание</w:t>
       </w:r>
       <w:r>
         <w:rPr>
           <w:sz w:val="20"/>
           <w:szCs w:val="20"/>
         </w:rPr>
+        <w:t xml:space="preserve">  </w:t>
+      </w:r>
+      <w:r>
+        <w:rPr>
+          <w:sz w:val="20"/>
+          <w:szCs w:val="20"/>
+        </w:rPr>
+        <w:t>уч.</w:t>
+      </w:r>
+      <w:proofErr w:type="gramEnd"/>
+      <w:r>
+        <w:rPr>
+          <w:sz w:val="20"/>
+          <w:szCs w:val="20"/>
+        </w:rPr>
+        <w:t xml:space="preserve"> звание</w:t>
+      </w:r>
+      <w:r>
+        <w:rPr>
+          <w:sz w:val="20"/>
+          <w:szCs w:val="20"/>
+        </w:rPr>
         <w:tab/>
+      </w:r>
+      <w:r>
+        <w:rPr>
+          <w:sz w:val="20"/>
+          <w:szCs w:val="20"/>
+        </w:rPr>
+        <w:t xml:space="preserve">        </w:t>
+      </w:r>
+      <w:r>
+        <w:rPr>
+          <w:sz w:val="20"/>
+          <w:szCs w:val="20"/>
+        </w:rPr>
         <w:t>подпись</w:t>
       </w:r>
     </w:p>
@@ -677,7 +778,7 @@
           <w:r>
             <w:fldChar w:fldCharType="separate"/>
           </w:r>
-          <w:hyperlink w:anchor="_Toc199604214" w:history="1">
+          <w:hyperlink w:anchor="_Toc199749667" w:history="1">
             <w:r>
               <w:rPr>
                 <w:rStyle w:val="a9"/>
@@ -704,7 +805,7 @@
                 <w:noProof/>
                 <w:webHidden/>
               </w:rPr>
-              <w:instrText xml:space="preserve"> PAGEREF _Toc199604214 \h </w:instrText>
+              <w:instrText xml:space="preserve"> PAGEREF _Toc199749667 \h </w:instrText>
             </w:r>
             <w:r>
               <w:rPr>
@@ -749,7 +850,7 @@
               <w:lang w:eastAsia="ru-RU"/>
             </w:rPr>
           </w:pPr>
-          <w:hyperlink w:anchor="_Toc199604215" w:history="1">
+          <w:hyperlink w:anchor="_Toc199749668" w:history="1">
             <w:r>
               <w:rPr>
                 <w:rStyle w:val="a9"/>
@@ -776,7 +877,7 @@
                 <w:noProof/>
                 <w:webHidden/>
               </w:rPr>
-              <w:instrText xml:space="preserve"> PAGEREF _Toc199604215 \h </w:instrText>
+              <w:instrText xml:space="preserve"> PAGEREF _Toc199749668 \h </w:instrText>
             </w:r>
             <w:r>
               <w:rPr>
@@ -821,13 +922,13 @@
               <w:lang w:eastAsia="ru-RU"/>
             </w:rPr>
           </w:pPr>
-          <w:hyperlink w:anchor="_Toc199604216" w:history="1">
+          <w:hyperlink w:anchor="_Toc199749669" w:history="1">
             <w:r>
               <w:rPr>
                 <w:rStyle w:val="a9"/>
                 <w:noProof/>
               </w:rPr>
-              <w:t>Вывод уравнений</w:t>
+              <w:t>Решение</w:t>
             </w:r>
             <w:r>
               <w:rPr>
@@ -848,7 +949,7 @@
                 <w:noProof/>
                 <w:webHidden/>
               </w:rPr>
-              <w:instrText xml:space="preserve"> PAGEREF _Toc199604216 \h </w:instrText>
+              <w:instrText xml:space="preserve"> PAGEREF _Toc199749669 \h </w:instrText>
             </w:r>
             <w:r>
               <w:rPr>
@@ -899,15 +1000,15 @@
               <w:noProof/>
               <w:u w:val="none"/>
             </w:rPr>
-            <w:t xml:space="preserve">       </w:t>
+            <w:t xml:space="preserve">        </w:t>
           </w:r>
-          <w:hyperlink w:anchor="_Toc199604217" w:history="1">
+          <w:hyperlink w:anchor="_Toc199749670" w:history="1">
             <w:r>
               <w:rPr>
                 <w:rStyle w:val="a9"/>
                 <w:noProof/>
               </w:rPr>
-              <w:t>Аппроксимация и преобразование уравнений для давления и насыщенности</w:t>
+              <w:t>Вывод уравнений для давления и насыщенности</w:t>
             </w:r>
             <w:r>
               <w:rPr>
@@ -928,7 +1029,7 @@
                 <w:noProof/>
                 <w:webHidden/>
               </w:rPr>
-              <w:instrText xml:space="preserve"> PAGEREF _Toc199604217 \h </w:instrText>
+              <w:instrText xml:space="preserve"> PAGEREF _Toc199749670 \h </w:instrText>
             </w:r>
             <w:r>
               <w:rPr>
@@ -973,13 +1074,21 @@
               <w:lang w:eastAsia="ru-RU"/>
             </w:rPr>
           </w:pPr>
-          <w:hyperlink w:anchor="_Toc199604218" w:history="1">
+          <w:r>
+            <w:rPr>
+              <w:rStyle w:val="a9"/>
+              <w:noProof/>
+              <w:u w:val="none"/>
+            </w:rPr>
+            <w:t xml:space="preserve">        </w:t>
+          </w:r>
+          <w:hyperlink w:anchor="_Toc199749671" w:history="1">
             <w:r>
               <w:rPr>
                 <w:rStyle w:val="a9"/>
                 <w:noProof/>
               </w:rPr>
-              <w:t>Результаты расчетов</w:t>
+              <w:t>Вывод уравнений массовой доли растворенного парафина</w:t>
             </w:r>
             <w:r>
               <w:rPr>
@@ -1000,7 +1109,87 @@
                 <w:noProof/>
                 <w:webHidden/>
               </w:rPr>
-              <w:instrText xml:space="preserve"> PAGEREF _Toc199604218 \h </w:instrText>
+              <w:instrText xml:space="preserve"> PAGEREF _Toc199749671 \h </w:instrText>
+            </w:r>
+            <w:r>
+              <w:rPr>
+                <w:noProof/>
+                <w:webHidden/>
+              </w:rPr>
+            </w:r>
+            <w:r>
+              <w:rPr>
+                <w:noProof/>
+                <w:webHidden/>
+              </w:rPr>
+              <w:fldChar w:fldCharType="separate"/>
+            </w:r>
+            <w:r>
+              <w:rPr>
+                <w:noProof/>
+                <w:webHidden/>
+              </w:rPr>
+              <w:t>11</w:t>
+            </w:r>
+            <w:r>
+              <w:rPr>
+                <w:noProof/>
+                <w:webHidden/>
+              </w:rPr>
+              <w:fldChar w:fldCharType="end"/>
+            </w:r>
+          </w:hyperlink>
+        </w:p>
+        <w:p>
+          <w:pPr>
+            <w:pStyle w:val="11"/>
+            <w:tabs>
+              <w:tab w:val="right" w:leader="dot" w:pos="9345"/>
+            </w:tabs>
+            <w:rPr>
+              <w:rFonts w:asciiTheme="minorHAnsi" w:eastAsiaTheme="minorEastAsia" w:hAnsiTheme="minorHAnsi" w:cstheme="minorBidi"/>
+              <w:noProof/>
+              <w:sz w:val="22"/>
+              <w:szCs w:val="22"/>
+              <w:lang w:eastAsia="ru-RU"/>
+            </w:rPr>
+          </w:pPr>
+          <w:r>
+            <w:rPr>
+              <w:rStyle w:val="a9"/>
+              <w:noProof/>
+              <w:u w:val="none"/>
+            </w:rPr>
+            <w:t xml:space="preserve">        </w:t>
+          </w:r>
+          <w:hyperlink w:anchor="_Toc199749672" w:history="1">
+            <w:r>
+              <w:rPr>
+                <w:rStyle w:val="a9"/>
+                <w:noProof/>
+              </w:rPr>
+              <w:t>Вывод уравнений для температуры</w:t>
+            </w:r>
+            <w:r>
+              <w:rPr>
+                <w:noProof/>
+                <w:webHidden/>
+              </w:rPr>
+              <w:tab/>
+            </w:r>
+            <w:r>
+              <w:rPr>
+                <w:noProof/>
+                <w:webHidden/>
+              </w:rPr>
+              <w:fldChar w:fldCharType="begin"/>
+            </w:r>
+            <w:r>
+              <w:rPr>
+                <w:noProof/>
+                <w:webHidden/>
+              </w:rPr>
+              <w:instrText xml:space="preserve"> PAGEREF _Toc199749672 \h </w:instrText>
             </w:r>
             <w:r>
               <w:rPr>
@@ -1045,13 +1234,21 @@
               <w:lang w:eastAsia="ru-RU"/>
             </w:rPr>
           </w:pPr>
-          <w:hyperlink w:anchor="_Toc199604219" w:history="1">
+          <w:r>
+            <w:rPr>
+              <w:rStyle w:val="a9"/>
+              <w:noProof/>
+              <w:u w:val="none"/>
+            </w:rPr>
+            <w:t xml:space="preserve">        </w:t>
+          </w:r>
+          <w:hyperlink w:anchor="_Toc199749673" w:history="1">
             <w:r>
               <w:rPr>
                 <w:rStyle w:val="a9"/>
                 <w:noProof/>
               </w:rPr>
-              <w:t>Заключение</w:t>
+              <w:t>Кольматация</w:t>
             </w:r>
             <w:r>
               <w:rPr>
@@ -1072,7 +1269,7 @@
                 <w:noProof/>
                 <w:webHidden/>
               </w:rPr>
-              <w:instrText xml:space="preserve"> PAGEREF _Toc199604219 \h </w:instrText>
+              <w:instrText xml:space="preserve"> PAGEREF _Toc199749673 \h </w:instrText>
             </w:r>
             <w:r>
               <w:rPr>
@@ -1117,13 +1314,21 @@
               <w:lang w:eastAsia="ru-RU"/>
             </w:rPr>
           </w:pPr>
-          <w:hyperlink w:anchor="_Toc199604220" w:history="1">
+          <w:r>
+            <w:rPr>
+              <w:rStyle w:val="a9"/>
+              <w:noProof/>
+              <w:u w:val="none"/>
+            </w:rPr>
+            <w:t xml:space="preserve">        </w:t>
+          </w:r>
+          <w:hyperlink w:anchor="_Toc199749674" w:history="1">
             <w:r>
               <w:rPr>
                 <w:rStyle w:val="a9"/>
                 <w:noProof/>
               </w:rPr>
-              <w:t>Список литературы</w:t>
+              <w:t>Суффозия</w:t>
             </w:r>
             <w:r>
               <w:rPr>
@@ -1144,7 +1349,7 @@
                 <w:noProof/>
                 <w:webHidden/>
               </w:rPr>
-              <w:instrText xml:space="preserve"> PAGEREF _Toc199604220 \h </w:instrText>
+              <w:instrText xml:space="preserve"> PAGEREF _Toc199749674 \h </w:instrText>
             </w:r>
             <w:r>
               <w:rPr>
@@ -1189,13 +1394,13 @@
               <w:lang w:eastAsia="ru-RU"/>
             </w:rPr>
           </w:pPr>
-          <w:hyperlink w:anchor="_Toc199604221" w:history="1">
+          <w:hyperlink w:anchor="_Toc199749675" w:history="1">
             <w:r>
               <w:rPr>
                 <w:rStyle w:val="a9"/>
                 <w:noProof/>
               </w:rPr>
-              <w:t>Список условных обозначений</w:t>
+              <w:t>Результаты расчетов</w:t>
             </w:r>
             <w:r>
               <w:rPr>
@@ -1216,7 +1421,79 @@
                 <w:noProof/>
                 <w:webHidden/>
               </w:rPr>
-              <w:instrText xml:space="preserve"> PAGEREF _Toc199604221 \h </w:instrText>
+              <w:instrText xml:space="preserve"> PAGEREF _Toc199749675 \h </w:instrText>
+            </w:r>
+            <w:r>
+              <w:rPr>
+                <w:noProof/>
+                <w:webHidden/>
+              </w:rPr>
+            </w:r>
+            <w:r>
+              <w:rPr>
+                <w:noProof/>
+                <w:webHidden/>
+              </w:rPr>
+              <w:fldChar w:fldCharType="separate"/>
+            </w:r>
+            <w:r>
+              <w:rPr>
+                <w:noProof/>
+                <w:webHidden/>
+              </w:rPr>
+              <w:t>15</w:t>
+            </w:r>
+            <w:r>
+              <w:rPr>
+                <w:noProof/>
+                <w:webHidden/>
+              </w:rPr>
+              <w:fldChar w:fldCharType="end"/>
+            </w:r>
+          </w:hyperlink>
+        </w:p>
+        <w:p>
+          <w:pPr>
+            <w:pStyle w:val="11"/>
+            <w:tabs>
+              <w:tab w:val="right" w:leader="dot" w:pos="9345"/>
+            </w:tabs>
+            <w:rPr>
+              <w:rFonts w:asciiTheme="minorHAnsi" w:eastAsiaTheme="minorEastAsia" w:hAnsiTheme="minorHAnsi" w:cstheme="minorBidi"/>
+              <w:noProof/>
+              <w:sz w:val="22"/>
+              <w:szCs w:val="22"/>
+              <w:lang w:eastAsia="ru-RU"/>
+            </w:rPr>
+          </w:pPr>
+          <w:hyperlink w:anchor="_Toc199749676" w:history="1">
+            <w:r>
+              <w:rPr>
+                <w:rStyle w:val="a9"/>
+                <w:noProof/>
+              </w:rPr>
+              <w:t>Заключение</w:t>
+            </w:r>
+            <w:r>
+              <w:rPr>
+                <w:noProof/>
+                <w:webHidden/>
+              </w:rPr>
+              <w:tab/>
+            </w:r>
+            <w:r>
+              <w:rPr>
+                <w:noProof/>
+                <w:webHidden/>
+              </w:rPr>
+              <w:fldChar w:fldCharType="begin"/>
+            </w:r>
+            <w:r>
+              <w:rPr>
+                <w:noProof/>
+                <w:webHidden/>
+              </w:rPr>
+              <w:instrText xml:space="preserve"> PAGEREF _Toc199749676 \h </w:instrText>
             </w:r>
             <w:r>
               <w:rPr>
@@ -1249,14 +1526,154 @@
         </w:p>
         <w:p>
           <w:pPr>
+            <w:pStyle w:val="11"/>
+            <w:tabs>
+              <w:tab w:val="right" w:leader="dot" w:pos="9345"/>
+            </w:tabs>
+            <w:rPr>
+              <w:rFonts w:asciiTheme="minorHAnsi" w:eastAsiaTheme="minorEastAsia" w:hAnsiTheme="minorHAnsi" w:cstheme="minorBidi"/>
+              <w:noProof/>
+              <w:sz w:val="22"/>
+              <w:szCs w:val="22"/>
+              <w:lang w:eastAsia="ru-RU"/>
+            </w:rPr>
+          </w:pPr>
+          <w:hyperlink w:anchor="_Toc199749677" w:history="1">
+            <w:r>
+              <w:rPr>
+                <w:rStyle w:val="a9"/>
+                <w:noProof/>
+              </w:rPr>
+              <w:t>Список литературы</w:t>
+            </w:r>
+            <w:r>
+              <w:rPr>
+                <w:noProof/>
+                <w:webHidden/>
+              </w:rPr>
+              <w:tab/>
+            </w:r>
+            <w:r>
+              <w:rPr>
+                <w:noProof/>
+                <w:webHidden/>
+              </w:rPr>
+              <w:fldChar w:fldCharType="begin"/>
+            </w:r>
+            <w:r>
+              <w:rPr>
+                <w:noProof/>
+                <w:webHidden/>
+              </w:rPr>
+              <w:instrText xml:space="preserve"> PAGEREF _Toc199749677 \h </w:instrText>
+            </w:r>
+            <w:r>
+              <w:rPr>
+                <w:noProof/>
+                <w:webHidden/>
+              </w:rPr>
+            </w:r>
+            <w:r>
+              <w:rPr>
+                <w:noProof/>
+                <w:webHidden/>
+              </w:rPr>
+              <w:fldChar w:fldCharType="separate"/>
+            </w:r>
+            <w:r>
+              <w:rPr>
+                <w:noProof/>
+                <w:webHidden/>
+              </w:rPr>
+              <w:t>17</w:t>
+            </w:r>
+            <w:r>
+              <w:rPr>
+                <w:noProof/>
+                <w:webHidden/>
+              </w:rPr>
+              <w:fldChar w:fldCharType="end"/>
+            </w:r>
+          </w:hyperlink>
+        </w:p>
+        <w:p>
+          <w:pPr>
+            <w:pStyle w:val="11"/>
+            <w:tabs>
+              <w:tab w:val="right" w:leader="dot" w:pos="9345"/>
+            </w:tabs>
+            <w:rPr>
+              <w:rFonts w:asciiTheme="minorHAnsi" w:eastAsiaTheme="minorEastAsia" w:hAnsiTheme="minorHAnsi" w:cstheme="minorBidi"/>
+              <w:noProof/>
+              <w:sz w:val="22"/>
+              <w:szCs w:val="22"/>
+              <w:lang w:eastAsia="ru-RU"/>
+            </w:rPr>
+          </w:pPr>
+          <w:hyperlink w:anchor="_Toc199749678" w:history="1">
+            <w:r>
+              <w:rPr>
+                <w:rStyle w:val="a9"/>
+                <w:noProof/>
+              </w:rPr>
+              <w:t>Список условных обозначений</w:t>
+            </w:r>
+            <w:r>
+              <w:rPr>
+                <w:noProof/>
+                <w:webHidden/>
+              </w:rPr>
+              <w:tab/>
+            </w:r>
+            <w:r>
+              <w:rPr>
+                <w:noProof/>
+                <w:webHidden/>
+              </w:rPr>
+              <w:fldChar w:fldCharType="begin"/>
+            </w:r>
+            <w:r>
+              <w:rPr>
+                <w:noProof/>
+                <w:webHidden/>
+              </w:rPr>
+              <w:instrText xml:space="preserve"> PAGEREF _Toc199749678 \h </w:instrText>
+            </w:r>
+            <w:r>
+              <w:rPr>
+                <w:noProof/>
+                <w:webHidden/>
+              </w:rPr>
+            </w:r>
+            <w:r>
+              <w:rPr>
+                <w:noProof/>
+                <w:webHidden/>
+              </w:rPr>
+              <w:fldChar w:fldCharType="separate"/>
+            </w:r>
+            <w:r>
+              <w:rPr>
+                <w:noProof/>
+                <w:webHidden/>
+              </w:rPr>
+              <w:t>19</w:t>
+            </w:r>
+            <w:r>
+              <w:rPr>
+                <w:noProof/>
+                <w:webHidden/>
+              </w:rPr>
+              <w:fldChar w:fldCharType="end"/>
+            </w:r>
+          </w:hyperlink>
+        </w:p>
+        <w:p>
+          <w:pPr>
             <w:spacing w:line="360" w:lineRule="auto"/>
             <w:jc w:val="both"/>
           </w:pPr>
           <w:r>
-            <w:rPr>
-              <w:b/>
-              <w:bCs/>
-            </w:rPr>
             <w:fldChar w:fldCharType="end"/>
           </w:r>
         </w:p>
@@ -1285,7 +1702,7 @@
           <w:szCs w:val="28"/>
         </w:rPr>
       </w:pPr>
-      <w:bookmarkStart w:id="0" w:name="_Toc199604214"/>
+      <w:bookmarkStart w:id="0" w:name="_Toc199749667"/>
       <w:r>
         <w:rPr>
           <w:rFonts w:ascii="Times New Roman" w:hAnsi="Times New Roman" w:cs="Times New Roman"/>
@@ -1920,8 +2337,13 @@
       <w:r>
         <w:t xml:space="preserve"> </w:t>
       </w:r>
-      <w:r>
-        <w:t xml:space="preserve">температуру </w:t>
+      <w:proofErr w:type="gramStart"/>
+      <w:r>
+        <w:t>температуру</w:t>
+      </w:r>
+      <w:proofErr w:type="gramEnd"/>
+      <w:r>
+        <w:t xml:space="preserve"> </w:t>
       </w:r>
       <w:r>
         <w:t>начал</w:t>
@@ -2363,7 +2785,7 @@
           <w:szCs w:val="28"/>
         </w:rPr>
       </w:pPr>
-      <w:bookmarkStart w:id="1" w:name="_Toc199604215"/>
+      <w:bookmarkStart w:id="1" w:name="_Toc199749668"/>
       <w:r>
         <w:rPr>
           <w:rFonts w:ascii="Times New Roman" w:hAnsi="Times New Roman" w:cs="Times New Roman"/>
@@ -2660,14 +3082,7 @@
               <w:rFonts w:ascii="Cambria Math" w:hAnsi="Cambria Math"/>
               <w:lang w:val="en-US"/>
             </w:rPr>
-            <m:t>:x</m:t>
-          </m:r>
-          <m:r>
-            <w:rPr>
-              <w:rFonts w:ascii="Cambria Math" w:hAnsi="Cambria Math"/>
-              <w:lang w:val="en-US"/>
-            </w:rPr>
-            <m:t>∈</m:t>
+            <m:t>:x∈</m:t>
           </m:r>
           <m:d>
             <m:dPr>
@@ -3011,13 +3426,18 @@
         <w:t xml:space="preserve">флюида </w:t>
       </w:r>
       <w:r>
-        <w:t xml:space="preserve">и три псевдокомпонента. Двумя фазами являются </w:t>
-      </w:r>
-      <w:r>
-        <w:t>нефт</w:t>
-      </w:r>
-      <w:r>
-        <w:t>ь и вода</w:t>
+        <w:t xml:space="preserve">и три </w:t>
+      </w:r>
+      <w:proofErr w:type="spellStart"/>
+      <w:r>
+        <w:t>псевдокомпонента</w:t>
+      </w:r>
+      <w:proofErr w:type="spellEnd"/>
+      <w:r>
+        <w:t xml:space="preserve">. Двумя фазами являются </w:t>
+      </w:r>
+      <w:r>
+        <w:t>нефть и вода</w:t>
       </w:r>
       <w:r>
         <w:t xml:space="preserve">. </w:t>
@@ -3038,16 +3458,10 @@
         <w:t>ми</w:t>
       </w:r>
       <w:r>
-        <w:t xml:space="preserve"> </w:t>
-      </w:r>
-      <w:r>
-        <w:t>—</w:t>
-      </w:r>
-      <w:r>
-        <w:t xml:space="preserve"> </w:t>
-      </w:r>
-      <w:r>
-        <w:t>нефть</w:t>
+        <w:t xml:space="preserve"> —</w:t>
+      </w:r>
+      <w:r>
+        <w:t xml:space="preserve"> нефть</w:t>
       </w:r>
       <w:r>
         <w:t xml:space="preserve">, вода и парафин. Предполагается, </w:t>
@@ -3080,10 +3494,7 @@
         <w:t>. А также</w:t>
       </w:r>
       <w:r>
-        <w:t xml:space="preserve"> </w:t>
-      </w:r>
-      <w:r>
-        <w:t xml:space="preserve">что между водной и </w:t>
+        <w:t xml:space="preserve"> что между водной и </w:t>
       </w:r>
       <w:r>
         <w:t>нефтяной</w:t>
@@ -3113,13 +3524,7 @@
         <w:t>апиллярны</w:t>
       </w:r>
       <w:r>
-        <w:t>х</w:t>
-      </w:r>
-      <w:r>
-        <w:t xml:space="preserve"> и гравитационны</w:t>
-      </w:r>
-      <w:r>
-        <w:t>х</w:t>
+        <w:t>х и гравитационных</w:t>
       </w:r>
       <w:r>
         <w:t xml:space="preserve"> сил</w:t>
@@ -3175,13 +3580,6 @@
               </w:rPr>
               <m:t>t</m:t>
             </m:r>
-            <m:ctrlPr>
-              <w:rPr>
-                <w:rFonts w:ascii="Cambria Math"/>
-                <w:i/>
-                <w:lang w:val="en-US"/>
-              </w:rPr>
-            </m:ctrlPr>
           </m:den>
         </m:f>
         <m:r>
@@ -3201,7 +3599,7 @@
           <m:sSubPr>
             <m:ctrlPr>
               <w:rPr>
-                <w:rFonts w:ascii="Cambria Math"/>
+                <w:rFonts w:ascii="Cambria Math" w:hAnsi="Cambria Math"/>
                 <w:i/>
                 <w:lang w:val="en-US"/>
               </w:rPr>
@@ -3230,7 +3628,7 @@
           <m:sSubPr>
             <m:ctrlPr>
               <w:rPr>
-                <w:rFonts w:ascii="Cambria Math"/>
+                <w:rFonts w:ascii="Cambria Math" w:hAnsi="Cambria Math"/>
                 <w:i/>
                 <w:lang w:val="en-US"/>
               </w:rPr>
@@ -3277,7 +3675,7 @@
           <m:sSubPr>
             <m:ctrlPr>
               <w:rPr>
-                <w:rFonts w:ascii="Cambria Math"/>
+                <w:rFonts w:ascii="Cambria Math" w:hAnsi="Cambria Math"/>
                 <w:i/>
                 <w:lang w:val="en-US"/>
               </w:rPr>
@@ -3306,7 +3704,7 @@
           <m:sSubPr>
             <m:ctrlPr>
               <w:rPr>
-                <w:rFonts w:ascii="Cambria Math"/>
+                <w:rFonts w:ascii="Cambria Math" w:hAnsi="Cambria Math"/>
                 <w:i/>
                 <w:lang w:val="en-US"/>
               </w:rPr>
@@ -3371,7 +3769,7 @@
           <m:sSubPr>
             <m:ctrlPr>
               <w:rPr>
-                <w:rFonts w:ascii="Cambria Math"/>
+                <w:rFonts w:ascii="Cambria Math" w:hAnsi="Cambria Math"/>
                 <w:i/>
                 <w:lang w:val="en-US"/>
               </w:rPr>
@@ -3468,20 +3866,13 @@
               </w:rPr>
               <m:t>t</m:t>
             </m:r>
-            <m:ctrlPr>
-              <w:rPr>
-                <w:rFonts w:ascii="Cambria Math"/>
-                <w:i/>
-                <w:lang w:val="en-US"/>
-              </w:rPr>
-            </m:ctrlPr>
           </m:den>
         </m:f>
         <m:d>
           <m:dPr>
             <m:ctrlPr>
               <w:rPr>
-                <w:rFonts w:ascii="Cambria Math"/>
+                <w:rFonts w:ascii="Cambria Math" w:hAnsi="Cambria Math"/>
                 <w:i/>
               </w:rPr>
             </m:ctrlPr>
@@ -3498,7 +3889,7 @@
               <m:sSubPr>
                 <m:ctrlPr>
                   <w:rPr>
-                    <w:rFonts w:ascii="Cambria Math"/>
+                    <w:rFonts w:ascii="Cambria Math" w:hAnsi="Cambria Math"/>
                     <w:i/>
                     <w:lang w:val="en-US"/>
                   </w:rPr>
@@ -3527,7 +3918,7 @@
               <m:sSubPr>
                 <m:ctrlPr>
                   <w:rPr>
-                    <w:rFonts w:ascii="Cambria Math"/>
+                    <w:rFonts w:ascii="Cambria Math" w:hAnsi="Cambria Math"/>
                     <w:i/>
                     <w:lang w:val="en-US"/>
                   </w:rPr>
@@ -3556,7 +3947,7 @@
               <m:sSubPr>
                 <m:ctrlPr>
                   <w:rPr>
-                    <w:rFonts w:ascii="Cambria Math"/>
+                    <w:rFonts w:ascii="Cambria Math" w:hAnsi="Cambria Math"/>
                     <w:i/>
                     <w:lang w:val="en-US"/>
                   </w:rPr>
@@ -3599,7 +3990,7 @@
           <m:dPr>
             <m:ctrlPr>
               <w:rPr>
-                <w:rFonts w:ascii="Cambria Math"/>
+                <w:rFonts w:ascii="Cambria Math" w:hAnsi="Cambria Math"/>
                 <w:i/>
               </w:rPr>
             </m:ctrlPr>
@@ -3609,7 +4000,7 @@
               <m:sSubPr>
                 <m:ctrlPr>
                   <w:rPr>
-                    <w:rFonts w:ascii="Cambria Math"/>
+                    <w:rFonts w:ascii="Cambria Math" w:hAnsi="Cambria Math"/>
                     <w:i/>
                     <w:lang w:val="en-US"/>
                   </w:rPr>
@@ -3638,7 +4029,7 @@
               <m:sSubPr>
                 <m:ctrlPr>
                   <w:rPr>
-                    <w:rFonts w:ascii="Cambria Math"/>
+                    <w:rFonts w:ascii="Cambria Math" w:hAnsi="Cambria Math"/>
                     <w:i/>
                     <w:lang w:val="en-US"/>
                   </w:rPr>
@@ -3667,7 +4058,7 @@
               <m:sSubPr>
                 <m:ctrlPr>
                   <w:rPr>
-                    <w:rFonts w:ascii="Cambria Math"/>
+                    <w:rFonts w:ascii="Cambria Math" w:hAnsi="Cambria Math"/>
                     <w:i/>
                     <w:lang w:val="en-US"/>
                   </w:rPr>
@@ -3737,7 +4128,7 @@
           <m:sSubPr>
             <m:ctrlPr>
               <w:rPr>
-                <w:rFonts w:ascii="Cambria Math"/>
+                <w:rFonts w:ascii="Cambria Math" w:hAnsi="Cambria Math"/>
                 <w:i/>
                 <w:lang w:val="en-US"/>
               </w:rPr>
@@ -3908,20 +4299,13 @@
               </w:rPr>
               <m:t>t</m:t>
             </m:r>
-            <m:ctrlPr>
-              <w:rPr>
-                <w:rFonts w:ascii="Cambria Math"/>
-                <w:i/>
-                <w:lang w:val="en-US"/>
-              </w:rPr>
-            </m:ctrlPr>
           </m:den>
         </m:f>
         <m:d>
           <m:dPr>
             <m:ctrlPr>
               <w:rPr>
-                <w:rFonts w:ascii="Cambria Math"/>
+                <w:rFonts w:ascii="Cambria Math" w:hAnsi="Cambria Math"/>
                 <w:i/>
                 <w:lang w:val="en-US"/>
               </w:rPr>
@@ -3939,7 +4323,7 @@
               <m:sSubPr>
                 <m:ctrlPr>
                   <w:rPr>
-                    <w:rFonts w:ascii="Cambria Math"/>
+                    <w:rFonts w:ascii="Cambria Math" w:hAnsi="Cambria Math"/>
                     <w:i/>
                     <w:lang w:val="en-US"/>
                   </w:rPr>
@@ -3994,7 +4378,7 @@
               <m:sSubPr>
                 <m:ctrlPr>
                   <w:rPr>
-                    <w:rFonts w:ascii="Cambria Math"/>
+                    <w:rFonts w:ascii="Cambria Math" w:hAnsi="Cambria Math"/>
                     <w:i/>
                     <w:lang w:val="en-US"/>
                   </w:rPr>
@@ -4036,7 +4420,7 @@
               <m:sSubPr>
                 <m:ctrlPr>
                   <w:rPr>
-                    <w:rFonts w:ascii="Cambria Math"/>
+                    <w:rFonts w:ascii="Cambria Math" w:hAnsi="Cambria Math"/>
                     <w:i/>
                     <w:lang w:val="en-US"/>
                   </w:rPr>
@@ -4065,7 +4449,7 @@
               <m:sSubPr>
                 <m:ctrlPr>
                   <w:rPr>
-                    <w:rFonts w:ascii="Cambria Math"/>
+                    <w:rFonts w:ascii="Cambria Math" w:hAnsi="Cambria Math"/>
                     <w:i/>
                     <w:lang w:val="en-US"/>
                   </w:rPr>
@@ -4094,7 +4478,7 @@
               <m:sSubPr>
                 <m:ctrlPr>
                   <w:rPr>
-                    <w:rFonts w:ascii="Cambria Math"/>
+                    <w:rFonts w:ascii="Cambria Math" w:hAnsi="Cambria Math"/>
                     <w:i/>
                     <w:lang w:val="en-US"/>
                   </w:rPr>
@@ -4137,7 +4521,7 @@
           <m:dPr>
             <m:ctrlPr>
               <w:rPr>
-                <w:rFonts w:ascii="Cambria Math"/>
+                <w:rFonts w:ascii="Cambria Math" w:hAnsi="Cambria Math"/>
                 <w:i/>
                 <w:lang w:val="en-US"/>
               </w:rPr>
@@ -4148,7 +4532,7 @@
               <m:sSubPr>
                 <m:ctrlPr>
                   <w:rPr>
-                    <w:rFonts w:ascii="Cambria Math"/>
+                    <w:rFonts w:ascii="Cambria Math" w:hAnsi="Cambria Math"/>
                     <w:i/>
                     <w:lang w:val="en-US"/>
                   </w:rPr>
@@ -4177,7 +4561,7 @@
               <m:sSubPr>
                 <m:ctrlPr>
                   <w:rPr>
-                    <w:rFonts w:ascii="Cambria Math"/>
+                    <w:rFonts w:ascii="Cambria Math" w:hAnsi="Cambria Math"/>
                     <w:i/>
                     <w:lang w:val="en-US"/>
                   </w:rPr>
@@ -4206,7 +4590,7 @@
               <m:sSubPr>
                 <m:ctrlPr>
                   <w:rPr>
-                    <w:rFonts w:ascii="Cambria Math"/>
+                    <w:rFonts w:ascii="Cambria Math" w:hAnsi="Cambria Math"/>
                     <w:i/>
                     <w:lang w:val="en-US"/>
                   </w:rPr>
@@ -4244,7 +4628,7 @@
               <m:sSubPr>
                 <m:ctrlPr>
                   <w:rPr>
-                    <w:rFonts w:ascii="Cambria Math"/>
+                    <w:rFonts w:ascii="Cambria Math" w:hAnsi="Cambria Math"/>
                     <w:i/>
                     <w:lang w:val="en-US"/>
                   </w:rPr>
@@ -4273,7 +4657,7 @@
               <m:sSubPr>
                 <m:ctrlPr>
                   <w:rPr>
-                    <w:rFonts w:ascii="Cambria Math"/>
+                    <w:rFonts w:ascii="Cambria Math" w:hAnsi="Cambria Math"/>
                     <w:i/>
                     <w:lang w:val="en-US"/>
                   </w:rPr>
@@ -4302,7 +4686,7 @@
               <m:sSubPr>
                 <m:ctrlPr>
                   <w:rPr>
-                    <w:rFonts w:ascii="Cambria Math"/>
+                    <w:rFonts w:ascii="Cambria Math" w:hAnsi="Cambria Math"/>
                     <w:i/>
                     <w:lang w:val="en-US"/>
                   </w:rPr>
@@ -4348,7 +4732,7 @@
           <m:sSubPr>
             <m:ctrlPr>
               <w:rPr>
-                <w:rFonts w:ascii="Cambria Math"/>
+                <w:rFonts w:ascii="Cambria Math" w:hAnsi="Cambria Math"/>
                 <w:i/>
                 <w:lang w:val="en-US"/>
               </w:rPr>
@@ -4473,7 +4857,7 @@
               <m:sSubPr>
                 <m:ctrlPr>
                   <w:rPr>
-                    <w:rFonts w:ascii="Cambria Math"/>
+                    <w:rFonts w:ascii="Cambria Math" w:hAnsi="Cambria Math"/>
                     <w:i/>
                     <w:lang w:val="en-US"/>
                   </w:rPr>
@@ -4508,7 +4892,7 @@
               <m:sSubPr>
                 <m:ctrlPr>
                   <w:rPr>
-                    <w:rFonts w:ascii="Cambria Math"/>
+                    <w:rFonts w:ascii="Cambria Math" w:hAnsi="Cambria Math"/>
                     <w:i/>
                     <w:lang w:val="en-US"/>
                   </w:rPr>
@@ -4537,13 +4921,7 @@
                       <w:rPr>
                         <w:rFonts w:ascii="Cambria Math" w:hAnsi="Cambria Math"/>
                       </w:rPr>
-                      <m:t>p</m:t>
-                    </m:r>
-                    <m:r>
-                      <w:rPr>
-                        <w:rFonts w:ascii="Cambria Math" w:hAnsi="Cambria Math"/>
-                      </w:rPr>
-                      <m:t>s</m:t>
+                      <m:t>ps</m:t>
                     </m:r>
                   </m:sub>
                 </m:sSub>
@@ -4622,7 +5000,6 @@
         <w:rPr>
           <w:rFonts w:eastAsiaTheme="minorEastAsia"/>
           <w:color w:val="000000" w:themeColor="text1"/>
-          <w:lang w:val="en-US"/>
         </w:rPr>
         <w:tab/>
       </w:r>
@@ -4639,7 +5016,7 @@
             </m:mcs>
             <m:ctrlPr>
               <w:rPr>
-                <w:rFonts w:ascii="Cambria Math"/>
+                <w:rFonts w:ascii="Cambria Math" w:hAnsi="Cambria Math"/>
                 <w:i/>
                 <w:color w:val="000000" w:themeColor="text1"/>
                 <w:lang w:val="en-US"/>
@@ -4652,7 +5029,7 @@
                 <m:sSubPr>
                   <m:ctrlPr>
                     <w:rPr>
-                      <w:rFonts w:ascii="Cambria Math"/>
+                      <w:rFonts w:ascii="Cambria Math" w:hAnsi="Cambria Math"/>
                       <w:i/>
                       <w:color w:val="000000" w:themeColor="text1"/>
                       <w:lang w:val="en-US"/>
@@ -4691,7 +5068,7 @@
                 <m:sSubPr>
                   <m:ctrlPr>
                     <w:rPr>
-                      <w:rFonts w:ascii="Cambria Math"/>
+                      <w:rFonts w:ascii="Cambria Math" w:hAnsi="Cambria Math"/>
                       <w:i/>
                       <w:color w:val="000000" w:themeColor="text1"/>
                       <w:lang w:val="en-US"/>
@@ -4734,7 +5111,7 @@
                 <m:sSubPr>
                   <m:ctrlPr>
                     <w:rPr>
-                      <w:rFonts w:ascii="Cambria Math"/>
+                      <w:rFonts w:ascii="Cambria Math" w:hAnsi="Cambria Math"/>
                       <w:i/>
                       <w:lang w:val="en-US"/>
                     </w:rPr>
@@ -4769,7 +5146,7 @@
                 <m:sSubPr>
                   <m:ctrlPr>
                     <w:rPr>
-                      <w:rFonts w:ascii="Cambria Math"/>
+                      <w:rFonts w:ascii="Cambria Math" w:hAnsi="Cambria Math"/>
                       <w:i/>
                       <w:lang w:val="en-US"/>
                     </w:rPr>
@@ -4804,7 +5181,7 @@
                 <m:sSubPr>
                   <m:ctrlPr>
                     <w:rPr>
-                      <w:rFonts w:ascii="Cambria Math"/>
+                      <w:rFonts w:ascii="Cambria Math" w:hAnsi="Cambria Math"/>
                       <w:i/>
                       <w:lang w:val="en-US"/>
                     </w:rPr>
@@ -4873,6 +5250,13 @@
           <w:rFonts w:eastAsiaTheme="minorEastAsia"/>
         </w:rPr>
       </w:pPr>
+      <w:r>
+        <w:rPr>
+          <w:rFonts w:eastAsiaTheme="minorEastAsia"/>
+          <w:highlight w:val="yellow"/>
+        </w:rPr>
+        <w:t>Перечислить ли тут условные обозначения?</w:t>
+      </w:r>
     </w:p>
     <w:p>
       <w:pPr>
@@ -4962,7 +5346,7 @@
       </w:r>
       <w:r>
         <w:tab/>
-        <w:t>(6)</w:t>
+        <w:t>()</w:t>
       </w:r>
     </w:p>
     <w:p>
@@ -5104,7 +5488,7 @@
         <w:rPr>
           <w:iCs/>
         </w:rPr>
-        <w:t>(7)</w:t>
+        <w:t>()</w:t>
       </w:r>
     </w:p>
     <w:p>
@@ -5470,7 +5854,7 @@
         <w:rPr>
           <w:iCs/>
         </w:rPr>
-        <w:t>(8)</w:t>
+        <w:t>()</w:t>
       </w:r>
     </w:p>
     <w:p>
@@ -5492,7 +5876,7 @@
     <w:p>
       <w:pPr>
         <w:pStyle w:val="1"/>
-        <w:spacing w:line="360" w:lineRule="auto"/>
+        <w:spacing w:line="240" w:lineRule="auto"/>
         <w:jc w:val="both"/>
         <w:rPr>
           <w:rFonts w:ascii="Times New Roman" w:hAnsi="Times New Roman" w:cs="Times New Roman"/>
@@ -5503,7 +5887,7 @@
           <w:szCs w:val="28"/>
         </w:rPr>
       </w:pPr>
-      <w:bookmarkStart w:id="2" w:name="_Toc199604216"/>
+      <w:bookmarkStart w:id="2" w:name="_Toc199749669"/>
       <w:r>
         <w:rPr>
           <w:rFonts w:ascii="Times New Roman" w:hAnsi="Times New Roman" w:cs="Times New Roman"/>
@@ -5514,7 +5898,7 @@
           <w:szCs w:val="28"/>
         </w:rPr>
         <w:lastRenderedPageBreak/>
-        <w:t>Вывод уравнений</w:t>
+        <w:t>Решение</w:t>
       </w:r>
       <w:bookmarkEnd w:id="2"/>
     </w:p>
@@ -5526,21 +5910,32 @@
           <w:b/>
           <w:bCs/>
           <w:color w:val="auto"/>
-          <w:sz w:val="24"/>
-          <w:szCs w:val="24"/>
+          <w:sz w:val="28"/>
+          <w:szCs w:val="28"/>
         </w:rPr>
       </w:pPr>
-      <w:bookmarkStart w:id="3" w:name="_Toc199604217"/>
+      <w:bookmarkStart w:id="3" w:name="_Toc199749670"/>
       <w:r>
         <w:rPr>
           <w:rFonts w:ascii="Times New Roman" w:hAnsi="Times New Roman" w:cs="Times New Roman"/>
           <w:b/>
           <w:bCs/>
           <w:color w:val="auto"/>
-          <w:sz w:val="24"/>
-          <w:szCs w:val="24"/>
-        </w:rPr>
-        <w:t>Аппроксимация и преобразование уравнений для давления и насыщенности</w:t>
+          <w:sz w:val="28"/>
+          <w:szCs w:val="28"/>
+        </w:rPr>
+        <w:t>Вывод</w:t>
+      </w:r>
+      <w:r>
+        <w:rPr>
+          <w:rFonts w:ascii="Times New Roman" w:hAnsi="Times New Roman" w:cs="Times New Roman"/>
+          <w:b/>
+          <w:bCs/>
+          <w:color w:val="auto"/>
+          <w:sz w:val="28"/>
+          <w:szCs w:val="28"/>
+        </w:rPr>
+        <w:t xml:space="preserve"> уравнений давления и насыщенности</w:t>
       </w:r>
       <w:bookmarkEnd w:id="3"/>
     </w:p>
@@ -7227,7 +7622,7 @@
           <v:shape id="_x0000_i1025" type="#_x0000_t75" style="width:372pt;height:78pt" o:ole="">
             <v:imagedata r:id="rId8" o:title=""/>
           </v:shape>
-          <o:OLEObject Type="Embed" ProgID="Equation.DSMT4" ShapeID="_x0000_i1025" DrawAspect="Content" ObjectID="_1810301755" r:id="rId9"/>
+          <o:OLEObject Type="Embed" ProgID="Equation.DSMT4" ShapeID="_x0000_i1025" DrawAspect="Content" ObjectID="_1810366911" r:id="rId9"/>
         </w:object>
       </w:r>
     </w:p>
@@ -7255,7 +7650,7 @@
           <v:shape id="_x0000_i1026" type="#_x0000_t75" style="width:474pt;height:1in" o:ole="">
             <v:imagedata r:id="rId10" o:title=""/>
           </v:shape>
-          <o:OLEObject Type="Embed" ProgID="Equation.DSMT4" ShapeID="_x0000_i1026" DrawAspect="Content" ObjectID="_1810301756" r:id="rId11"/>
+          <o:OLEObject Type="Embed" ProgID="Equation.DSMT4" ShapeID="_x0000_i1026" DrawAspect="Content" ObjectID="_1810366912" r:id="rId11"/>
         </w:object>
       </w:r>
     </w:p>
@@ -8084,7 +8479,15 @@
           <w:sz w:val="26"/>
           <w:szCs w:val="26"/>
         </w:rPr>
-        <w:t xml:space="preserve">по блоку  </w:t>
+        <w:t xml:space="preserve">по </w:t>
+      </w:r>
+      <w:proofErr w:type="gramStart"/>
+      <w:r>
+        <w:rPr>
+          <w:sz w:val="26"/>
+          <w:szCs w:val="26"/>
+        </w:rPr>
+        <w:t xml:space="preserve">блоку  </w:t>
       </w:r>
       <w:r>
         <w:rPr>
@@ -8106,6 +8509,7 @@
         <w:t>i</w:t>
       </w:r>
       <w:proofErr w:type="spellEnd"/>
+      <w:proofErr w:type="gramEnd"/>
       <w:r>
         <w:rPr>
           <w:sz w:val="26"/>
@@ -13542,7 +13946,7 @@
           <v:shape id="_x0000_i1027" type="#_x0000_t75" style="width:42pt;height:24pt" o:ole="">
             <v:imagedata r:id="rId12" o:title=""/>
           </v:shape>
-          <o:OLEObject Type="Embed" ProgID="Equation.3" ShapeID="_x0000_i1027" DrawAspect="Content" ObjectID="_1810301757" r:id="rId13"/>
+          <o:OLEObject Type="Embed" ProgID="Equation.3" ShapeID="_x0000_i1027" DrawAspect="Content" ObjectID="_1810366913" r:id="rId13"/>
         </w:object>
       </w:r>
       <w:r>
@@ -13582,7 +13986,7 @@
           <v:shape id="_x0000_i1028" type="#_x0000_t75" style="width:78pt;height:42pt" o:ole="">
             <v:imagedata r:id="rId14" o:title=""/>
           </v:shape>
-          <o:OLEObject Type="Embed" ProgID="Equation.3" ShapeID="_x0000_i1028" DrawAspect="Content" ObjectID="_1810301758" r:id="rId15"/>
+          <o:OLEObject Type="Embed" ProgID="Equation.3" ShapeID="_x0000_i1028" DrawAspect="Content" ObjectID="_1810366914" r:id="rId15"/>
         </w:object>
       </w:r>
       <w:r>
@@ -13601,6 +14005,7 @@
           <w:szCs w:val="26"/>
         </w:rPr>
       </w:pPr>
+      <w:proofErr w:type="gramStart"/>
       <w:r>
         <w:rPr>
           <w:sz w:val="26"/>
@@ -13609,6 +14014,7 @@
         <w:t>Символ  “</w:t>
       </w:r>
       <w:proofErr w:type="spellStart"/>
+      <w:proofErr w:type="gramEnd"/>
       <w:r>
         <w:rPr>
           <w:i/>
@@ -13647,7 +14053,7 @@
           <v:shape id="_x0000_i1029" type="#_x0000_t75" style="width:198pt;height:102pt" o:ole="">
             <v:imagedata r:id="rId16" o:title=""/>
           </v:shape>
-          <o:OLEObject Type="Embed" ProgID="Equation.3" ShapeID="_x0000_i1029" DrawAspect="Content" ObjectID="_1810301759" r:id="rId17"/>
+          <o:OLEObject Type="Embed" ProgID="Equation.3" ShapeID="_x0000_i1029" DrawAspect="Content" ObjectID="_1810366915" r:id="rId17"/>
         </w:object>
       </w:r>
     </w:p>
@@ -22175,425 +22581,420 @@
           <w:szCs w:val="28"/>
         </w:rPr>
       </w:pPr>
-      <m:oMath>
-        <m:r>
-          <w:rPr>
-            <w:rFonts w:ascii="Cambria Math" w:eastAsiaTheme="minorEastAsia" w:hAnsi="Cambria Math"/>
-            <w:sz w:val="28"/>
-            <w:szCs w:val="40"/>
-          </w:rPr>
-          <m:t xml:space="preserve">q= </m:t>
-        </m:r>
-        <m:f>
-          <m:fPr>
-            <m:ctrlPr>
-              <w:rPr>
-                <w:rFonts w:ascii="Cambria Math" w:eastAsiaTheme="minorEastAsia" w:hAnsi="Cambria Math"/>
-                <w:i/>
-                <w:sz w:val="28"/>
-                <w:szCs w:val="40"/>
-              </w:rPr>
-            </m:ctrlPr>
-          </m:fPr>
-          <m:num>
-            <m:d>
-              <m:dPr>
-                <m:ctrlPr>
-                  <w:rPr>
-                    <w:rFonts w:ascii="Cambria Math" w:eastAsiaTheme="minorEastAsia" w:hAnsi="Cambria Math"/>
-                    <w:i/>
-                    <w:sz w:val="28"/>
-                    <w:szCs w:val="40"/>
-                  </w:rPr>
-                </m:ctrlPr>
-              </m:dPr>
-              <m:e>
-                <m:r>
-                  <w:rPr>
-                    <w:rFonts w:ascii="Cambria Math" w:eastAsiaTheme="minorEastAsia" w:hAnsi="Cambria Math"/>
-                    <w:sz w:val="28"/>
-                    <w:szCs w:val="40"/>
-                  </w:rPr>
-                  <m:t>P-</m:t>
-                </m:r>
-                <m:sSub>
-                  <m:sSubPr>
-                    <m:ctrlPr>
-                      <w:rPr>
-                        <w:rFonts w:ascii="Cambria Math" w:eastAsiaTheme="minorEastAsia" w:hAnsi="Cambria Math"/>
-                        <w:i/>
-                        <w:sz w:val="28"/>
-                        <w:szCs w:val="40"/>
-                      </w:rPr>
-                    </m:ctrlPr>
-                  </m:sSubPr>
-                  <m:e>
-                    <m:r>
-                      <w:rPr>
-                        <w:rFonts w:ascii="Cambria Math" w:eastAsiaTheme="minorEastAsia" w:hAnsi="Cambria Math"/>
-                        <w:sz w:val="28"/>
-                        <w:szCs w:val="40"/>
-                      </w:rPr>
-                      <m:t>P</m:t>
-                    </m:r>
-                  </m:e>
-                  <m:sub>
-                    <m:r>
-                      <w:rPr>
-                        <w:rFonts w:ascii="Cambria Math" w:eastAsiaTheme="minorEastAsia" w:hAnsi="Cambria Math"/>
-                        <w:sz w:val="28"/>
-                        <w:szCs w:val="40"/>
-                      </w:rPr>
-                      <m:t>w</m:t>
-                    </m:r>
-                  </m:sub>
-                </m:sSub>
-              </m:e>
-            </m:d>
-            <m:r>
-              <w:rPr>
-                <w:rFonts w:ascii="Cambria Math" w:eastAsiaTheme="minorEastAsia" w:hAnsi="Cambria Math"/>
-                <w:sz w:val="28"/>
-                <w:szCs w:val="40"/>
-              </w:rPr>
-              <m:t>2 π k h</m:t>
-            </m:r>
-          </m:num>
-          <m:den>
-            <m:r>
-              <m:rPr>
-                <m:sty m:val="p"/>
-              </m:rPr>
-              <w:rPr>
-                <w:rFonts w:ascii="Cambria Math" w:eastAsiaTheme="minorEastAsia" w:hAnsi="Cambria Math"/>
-                <w:sz w:val="28"/>
-                <w:szCs w:val="40"/>
-              </w:rPr>
-              <m:t>ln⁡</m:t>
-            </m:r>
-            <m:r>
-              <w:rPr>
-                <w:rFonts w:ascii="Cambria Math" w:eastAsiaTheme="minorEastAsia" w:hAnsi="Cambria Math"/>
-                <w:sz w:val="28"/>
-                <w:szCs w:val="40"/>
-              </w:rPr>
-              <m:t>(</m:t>
-            </m:r>
-            <m:f>
-              <m:fPr>
-                <m:ctrlPr>
-                  <w:rPr>
-                    <w:rFonts w:ascii="Cambria Math" w:eastAsiaTheme="minorEastAsia" w:hAnsi="Cambria Math"/>
-                    <w:i/>
-                    <w:sz w:val="28"/>
-                    <w:szCs w:val="40"/>
-                  </w:rPr>
-                </m:ctrlPr>
-              </m:fPr>
-              <m:num>
-                <m:sSub>
-                  <m:sSubPr>
-                    <m:ctrlPr>
-                      <w:rPr>
-                        <w:rFonts w:ascii="Cambria Math" w:eastAsiaTheme="minorEastAsia" w:hAnsi="Cambria Math"/>
-                        <w:i/>
-                        <w:sz w:val="28"/>
-                        <w:szCs w:val="40"/>
-                      </w:rPr>
-                    </m:ctrlPr>
-                  </m:sSubPr>
-                  <m:e>
-                    <m:r>
-                      <w:rPr>
-                        <w:rFonts w:ascii="Cambria Math" w:eastAsiaTheme="minorEastAsia" w:hAnsi="Cambria Math"/>
-                        <w:sz w:val="28"/>
-                        <w:szCs w:val="40"/>
-                      </w:rPr>
-                      <m:t>r</m:t>
-                    </m:r>
-                  </m:e>
-                  <m:sub>
-                    <m:r>
-                      <w:rPr>
-                        <w:rFonts w:ascii="Cambria Math" w:eastAsiaTheme="minorEastAsia" w:hAnsi="Cambria Math"/>
-                        <w:sz w:val="28"/>
-                        <w:szCs w:val="40"/>
-                        <w:lang w:val="en-US"/>
-                      </w:rPr>
-                      <m:t>o</m:t>
-                    </m:r>
-                  </m:sub>
-                </m:sSub>
-              </m:num>
-              <m:den>
-                <m:sSub>
-                  <m:sSubPr>
-                    <m:ctrlPr>
-                      <w:rPr>
-                        <w:rFonts w:ascii="Cambria Math" w:eastAsiaTheme="minorEastAsia" w:hAnsi="Cambria Math"/>
-                        <w:i/>
-                        <w:sz w:val="28"/>
-                        <w:szCs w:val="40"/>
-                      </w:rPr>
-                    </m:ctrlPr>
-                  </m:sSubPr>
-                  <m:e>
-                    <m:r>
-                      <w:rPr>
-                        <w:rFonts w:ascii="Cambria Math" w:eastAsiaTheme="minorEastAsia" w:hAnsi="Cambria Math"/>
-                        <w:sz w:val="28"/>
-                        <w:szCs w:val="40"/>
-                      </w:rPr>
-                      <m:t>r</m:t>
-                    </m:r>
-                  </m:e>
-                  <m:sub>
-                    <m:r>
-                      <w:rPr>
-                        <w:rFonts w:ascii="Cambria Math" w:eastAsiaTheme="minorEastAsia" w:hAnsi="Cambria Math"/>
-                        <w:sz w:val="28"/>
-                        <w:szCs w:val="40"/>
-                      </w:rPr>
-                      <m:t>w</m:t>
-                    </m:r>
-                  </m:sub>
-                </m:sSub>
-              </m:den>
-            </m:f>
-            <m:r>
-              <w:rPr>
-                <w:rFonts w:ascii="Cambria Math" w:eastAsiaTheme="minorEastAsia" w:hAnsi="Cambria Math"/>
-                <w:sz w:val="28"/>
-                <w:szCs w:val="40"/>
-              </w:rPr>
-              <m:t>)</m:t>
-            </m:r>
-          </m:den>
-        </m:f>
-        <m:f>
-          <m:fPr>
-            <m:ctrlPr>
-              <w:rPr>
-                <w:rFonts w:ascii="Cambria Math" w:eastAsiaTheme="minorEastAsia" w:hAnsi="Cambria Math"/>
-                <w:i/>
-                <w:sz w:val="28"/>
-                <w:szCs w:val="40"/>
-              </w:rPr>
-            </m:ctrlPr>
-          </m:fPr>
-          <m:num>
-            <m:sSub>
-              <m:sSubPr>
-                <m:ctrlPr>
-                  <w:rPr>
-                    <w:rFonts w:ascii="Cambria Math" w:eastAsiaTheme="minorEastAsia" w:hAnsi="Cambria Math"/>
-                    <w:i/>
-                    <w:sz w:val="28"/>
-                    <w:szCs w:val="40"/>
-                  </w:rPr>
-                </m:ctrlPr>
-              </m:sSubPr>
-              <m:e>
-                <m:r>
-                  <w:rPr>
-                    <w:rFonts w:ascii="Cambria Math" w:eastAsiaTheme="minorEastAsia" w:hAnsi="Cambria Math"/>
-                    <w:sz w:val="28"/>
-                    <w:szCs w:val="40"/>
-                  </w:rPr>
-                  <m:t>f</m:t>
-                </m:r>
-              </m:e>
-              <m:sub>
-                <m:r>
-                  <w:rPr>
-                    <w:rFonts w:ascii="Cambria Math" w:eastAsiaTheme="minorEastAsia" w:hAnsi="Cambria Math"/>
-                    <w:sz w:val="28"/>
-                    <w:szCs w:val="40"/>
-                  </w:rPr>
-                  <m:t>α</m:t>
-                </m:r>
-              </m:sub>
-            </m:sSub>
-          </m:num>
-          <m:den>
-            <m:sSub>
-              <m:sSubPr>
-                <m:ctrlPr>
-                  <w:rPr>
-                    <w:rFonts w:ascii="Cambria Math" w:eastAsiaTheme="minorEastAsia" w:hAnsi="Cambria Math"/>
-                    <w:i/>
-                    <w:sz w:val="28"/>
-                    <w:szCs w:val="40"/>
-                  </w:rPr>
-                </m:ctrlPr>
-              </m:sSubPr>
-              <m:e>
-                <m:r>
-                  <w:rPr>
-                    <w:rFonts w:ascii="Cambria Math" w:eastAsiaTheme="minorEastAsia" w:hAnsi="Cambria Math"/>
-                    <w:sz w:val="28"/>
-                    <w:szCs w:val="40"/>
-                  </w:rPr>
-                  <m:t>μ</m:t>
-                </m:r>
-              </m:e>
-              <m:sub>
-                <m:r>
-                  <w:rPr>
-                    <w:rFonts w:ascii="Cambria Math" w:eastAsiaTheme="minorEastAsia" w:hAnsi="Cambria Math"/>
-                    <w:sz w:val="28"/>
-                    <w:szCs w:val="40"/>
-                  </w:rPr>
-                  <m:t>α</m:t>
-                </m:r>
-              </m:sub>
-            </m:sSub>
-          </m:den>
-        </m:f>
-        <m:r>
-          <w:rPr>
-            <w:rFonts w:ascii="Cambria Math" w:eastAsiaTheme="minorEastAsia" w:hAnsi="Cambria Math"/>
-            <w:sz w:val="28"/>
-            <w:szCs w:val="40"/>
-          </w:rPr>
-          <m:t xml:space="preserve">,   </m:t>
-        </m:r>
-        <m:sSub>
-          <m:sSubPr>
-            <m:ctrlPr>
-              <w:rPr>
-                <w:rFonts w:ascii="Cambria Math" w:eastAsiaTheme="minorEastAsia" w:hAnsi="Cambria Math"/>
-                <w:i/>
-                <w:sz w:val="28"/>
-                <w:szCs w:val="40"/>
-              </w:rPr>
-            </m:ctrlPr>
-          </m:sSubPr>
-          <m:e>
-            <m:r>
-              <w:rPr>
-                <w:rFonts w:ascii="Cambria Math" w:eastAsiaTheme="minorEastAsia" w:hAnsi="Cambria Math"/>
-                <w:sz w:val="28"/>
-                <w:szCs w:val="40"/>
-              </w:rPr>
-              <m:t>r</m:t>
-            </m:r>
-          </m:e>
-          <m:sub>
-            <m:r>
-              <w:rPr>
-                <w:rFonts w:ascii="Cambria Math" w:eastAsiaTheme="minorEastAsia" w:hAnsi="Cambria Math"/>
-                <w:sz w:val="28"/>
-                <w:szCs w:val="40"/>
-              </w:rPr>
-              <m:t>0</m:t>
-            </m:r>
-          </m:sub>
-        </m:sSub>
-        <m:r>
-          <w:rPr>
-            <w:rFonts w:ascii="Cambria Math" w:eastAsiaTheme="minorEastAsia" w:hAnsi="Cambria Math"/>
-            <w:sz w:val="28"/>
-            <w:szCs w:val="40"/>
-          </w:rPr>
-          <m:t>=0.14</m:t>
-        </m:r>
-        <m:rad>
-          <m:radPr>
-            <m:degHide m:val="1"/>
-            <m:ctrlPr>
-              <w:rPr>
-                <w:rFonts w:ascii="Cambria Math" w:eastAsiaTheme="minorEastAsia" w:hAnsi="Cambria Math"/>
-                <w:i/>
-                <w:sz w:val="28"/>
-                <w:szCs w:val="40"/>
-              </w:rPr>
-            </m:ctrlPr>
-          </m:radPr>
-          <m:deg/>
-          <m:e>
-            <m:sSup>
-              <m:sSupPr>
-                <m:ctrlPr>
-                  <w:rPr>
-                    <w:rFonts w:ascii="Cambria Math" w:eastAsiaTheme="minorEastAsia" w:hAnsi="Cambria Math"/>
-                    <w:i/>
-                    <w:sz w:val="28"/>
-                    <w:szCs w:val="40"/>
-                  </w:rPr>
-                </m:ctrlPr>
-              </m:sSupPr>
-              <m:e>
-                <m:r>
-                  <w:rPr>
-                    <w:rFonts w:ascii="Cambria Math" w:eastAsiaTheme="minorEastAsia" w:hAnsi="Cambria Math"/>
-                    <w:sz w:val="28"/>
-                    <w:szCs w:val="40"/>
-                  </w:rPr>
-                  <m:t>∆x</m:t>
-                </m:r>
-              </m:e>
-              <m:sup>
-                <m:r>
-                  <w:rPr>
-                    <w:rFonts w:ascii="Cambria Math" w:eastAsiaTheme="minorEastAsia" w:hAnsi="Cambria Math"/>
-                    <w:sz w:val="28"/>
-                    <w:szCs w:val="40"/>
-                  </w:rPr>
-                  <m:t>2</m:t>
-                </m:r>
-              </m:sup>
-            </m:sSup>
-            <m:r>
-              <w:rPr>
-                <w:rFonts w:ascii="Cambria Math" w:eastAsiaTheme="minorEastAsia" w:hAnsi="Cambria Math"/>
-                <w:sz w:val="28"/>
-                <w:szCs w:val="40"/>
-              </w:rPr>
-              <m:t>+</m:t>
-            </m:r>
-            <m:sSup>
-              <m:sSupPr>
-                <m:ctrlPr>
-                  <w:rPr>
-                    <w:rFonts w:ascii="Cambria Math" w:eastAsiaTheme="minorEastAsia" w:hAnsi="Cambria Math"/>
-                    <w:i/>
-                    <w:sz w:val="28"/>
-                    <w:szCs w:val="40"/>
-                  </w:rPr>
-                </m:ctrlPr>
-              </m:sSupPr>
-              <m:e>
-                <m:r>
-                  <w:rPr>
-                    <w:rFonts w:ascii="Cambria Math" w:eastAsiaTheme="minorEastAsia" w:hAnsi="Cambria Math"/>
-                    <w:sz w:val="28"/>
-                    <w:szCs w:val="40"/>
-                  </w:rPr>
-                  <m:t>∆y</m:t>
-                </m:r>
-              </m:e>
-              <m:sup>
-                <m:r>
-                  <w:rPr>
-                    <w:rFonts w:ascii="Cambria Math" w:eastAsiaTheme="minorEastAsia" w:hAnsi="Cambria Math"/>
-                    <w:sz w:val="28"/>
-                    <w:szCs w:val="40"/>
-                  </w:rPr>
-                  <m:t>2</m:t>
-                </m:r>
-              </m:sup>
-            </m:sSup>
-          </m:e>
-        </m:rad>
-      </m:oMath>
-      <w:r>
-        <w:rPr>
-          <w:rFonts w:eastAsiaTheme="minorEastAsia"/>
-          <w:szCs w:val="28"/>
-        </w:rPr>
-        <w:br w:type="page"/>
-      </w:r>
+      <m:oMathPara>
+        <m:oMath>
+          <m:r>
+            <w:rPr>
+              <w:rFonts w:ascii="Cambria Math" w:eastAsiaTheme="minorEastAsia" w:hAnsi="Cambria Math"/>
+              <w:sz w:val="28"/>
+              <w:szCs w:val="40"/>
+            </w:rPr>
+            <m:t xml:space="preserve">q= </m:t>
+          </m:r>
+          <m:f>
+            <m:fPr>
+              <m:ctrlPr>
+                <w:rPr>
+                  <w:rFonts w:ascii="Cambria Math" w:eastAsiaTheme="minorEastAsia" w:hAnsi="Cambria Math"/>
+                  <w:i/>
+                  <w:sz w:val="28"/>
+                  <w:szCs w:val="40"/>
+                </w:rPr>
+              </m:ctrlPr>
+            </m:fPr>
+            <m:num>
+              <m:d>
+                <m:dPr>
+                  <m:ctrlPr>
+                    <w:rPr>
+                      <w:rFonts w:ascii="Cambria Math" w:eastAsiaTheme="minorEastAsia" w:hAnsi="Cambria Math"/>
+                      <w:i/>
+                      <w:sz w:val="28"/>
+                      <w:szCs w:val="40"/>
+                    </w:rPr>
+                  </m:ctrlPr>
+                </m:dPr>
+                <m:e>
+                  <m:r>
+                    <w:rPr>
+                      <w:rFonts w:ascii="Cambria Math" w:eastAsiaTheme="minorEastAsia" w:hAnsi="Cambria Math"/>
+                      <w:sz w:val="28"/>
+                      <w:szCs w:val="40"/>
+                    </w:rPr>
+                    <m:t>P-</m:t>
+                  </m:r>
+                  <m:sSub>
+                    <m:sSubPr>
+                      <m:ctrlPr>
+                        <w:rPr>
+                          <w:rFonts w:ascii="Cambria Math" w:eastAsiaTheme="minorEastAsia" w:hAnsi="Cambria Math"/>
+                          <w:i/>
+                          <w:sz w:val="28"/>
+                          <w:szCs w:val="40"/>
+                        </w:rPr>
+                      </m:ctrlPr>
+                    </m:sSubPr>
+                    <m:e>
+                      <m:r>
+                        <w:rPr>
+                          <w:rFonts w:ascii="Cambria Math" w:eastAsiaTheme="minorEastAsia" w:hAnsi="Cambria Math"/>
+                          <w:sz w:val="28"/>
+                          <w:szCs w:val="40"/>
+                        </w:rPr>
+                        <m:t>P</m:t>
+                      </m:r>
+                    </m:e>
+                    <m:sub>
+                      <m:r>
+                        <w:rPr>
+                          <w:rFonts w:ascii="Cambria Math" w:eastAsiaTheme="minorEastAsia" w:hAnsi="Cambria Math"/>
+                          <w:sz w:val="28"/>
+                          <w:szCs w:val="40"/>
+                        </w:rPr>
+                        <m:t>w</m:t>
+                      </m:r>
+                    </m:sub>
+                  </m:sSub>
+                </m:e>
+              </m:d>
+              <m:r>
+                <w:rPr>
+                  <w:rFonts w:ascii="Cambria Math" w:eastAsiaTheme="minorEastAsia" w:hAnsi="Cambria Math"/>
+                  <w:sz w:val="28"/>
+                  <w:szCs w:val="40"/>
+                </w:rPr>
+                <m:t>2 π k h</m:t>
+              </m:r>
+            </m:num>
+            <m:den>
+              <m:r>
+                <m:rPr>
+                  <m:sty m:val="p"/>
+                </m:rPr>
+                <w:rPr>
+                  <w:rFonts w:ascii="Cambria Math" w:eastAsiaTheme="minorEastAsia" w:hAnsi="Cambria Math"/>
+                  <w:sz w:val="28"/>
+                  <w:szCs w:val="40"/>
+                </w:rPr>
+                <m:t>ln⁡</m:t>
+              </m:r>
+              <m:r>
+                <w:rPr>
+                  <w:rFonts w:ascii="Cambria Math" w:eastAsiaTheme="minorEastAsia" w:hAnsi="Cambria Math"/>
+                  <w:sz w:val="28"/>
+                  <w:szCs w:val="40"/>
+                </w:rPr>
+                <m:t>(</m:t>
+              </m:r>
+              <m:f>
+                <m:fPr>
+                  <m:ctrlPr>
+                    <w:rPr>
+                      <w:rFonts w:ascii="Cambria Math" w:eastAsiaTheme="minorEastAsia" w:hAnsi="Cambria Math"/>
+                      <w:i/>
+                      <w:sz w:val="28"/>
+                      <w:szCs w:val="40"/>
+                    </w:rPr>
+                  </m:ctrlPr>
+                </m:fPr>
+                <m:num>
+                  <m:sSub>
+                    <m:sSubPr>
+                      <m:ctrlPr>
+                        <w:rPr>
+                          <w:rFonts w:ascii="Cambria Math" w:eastAsiaTheme="minorEastAsia" w:hAnsi="Cambria Math"/>
+                          <w:i/>
+                          <w:sz w:val="28"/>
+                          <w:szCs w:val="40"/>
+                        </w:rPr>
+                      </m:ctrlPr>
+                    </m:sSubPr>
+                    <m:e>
+                      <m:r>
+                        <w:rPr>
+                          <w:rFonts w:ascii="Cambria Math" w:eastAsiaTheme="minorEastAsia" w:hAnsi="Cambria Math"/>
+                          <w:sz w:val="28"/>
+                          <w:szCs w:val="40"/>
+                        </w:rPr>
+                        <m:t>r</m:t>
+                      </m:r>
+                    </m:e>
+                    <m:sub>
+                      <m:r>
+                        <w:rPr>
+                          <w:rFonts w:ascii="Cambria Math" w:eastAsiaTheme="minorEastAsia" w:hAnsi="Cambria Math"/>
+                          <w:sz w:val="28"/>
+                          <w:szCs w:val="40"/>
+                          <w:lang w:val="en-US"/>
+                        </w:rPr>
+                        <m:t>o</m:t>
+                      </m:r>
+                    </m:sub>
+                  </m:sSub>
+                </m:num>
+                <m:den>
+                  <m:sSub>
+                    <m:sSubPr>
+                      <m:ctrlPr>
+                        <w:rPr>
+                          <w:rFonts w:ascii="Cambria Math" w:eastAsiaTheme="minorEastAsia" w:hAnsi="Cambria Math"/>
+                          <w:i/>
+                          <w:sz w:val="28"/>
+                          <w:szCs w:val="40"/>
+                        </w:rPr>
+                      </m:ctrlPr>
+                    </m:sSubPr>
+                    <m:e>
+                      <m:r>
+                        <w:rPr>
+                          <w:rFonts w:ascii="Cambria Math" w:eastAsiaTheme="minorEastAsia" w:hAnsi="Cambria Math"/>
+                          <w:sz w:val="28"/>
+                          <w:szCs w:val="40"/>
+                        </w:rPr>
+                        <m:t>r</m:t>
+                      </m:r>
+                    </m:e>
+                    <m:sub>
+                      <m:r>
+                        <w:rPr>
+                          <w:rFonts w:ascii="Cambria Math" w:eastAsiaTheme="minorEastAsia" w:hAnsi="Cambria Math"/>
+                          <w:sz w:val="28"/>
+                          <w:szCs w:val="40"/>
+                        </w:rPr>
+                        <m:t>w</m:t>
+                      </m:r>
+                    </m:sub>
+                  </m:sSub>
+                </m:den>
+              </m:f>
+              <m:r>
+                <w:rPr>
+                  <w:rFonts w:ascii="Cambria Math" w:eastAsiaTheme="minorEastAsia" w:hAnsi="Cambria Math"/>
+                  <w:sz w:val="28"/>
+                  <w:szCs w:val="40"/>
+                </w:rPr>
+                <m:t>)</m:t>
+              </m:r>
+            </m:den>
+          </m:f>
+          <m:f>
+            <m:fPr>
+              <m:ctrlPr>
+                <w:rPr>
+                  <w:rFonts w:ascii="Cambria Math" w:eastAsiaTheme="minorEastAsia" w:hAnsi="Cambria Math"/>
+                  <w:i/>
+                  <w:sz w:val="28"/>
+                  <w:szCs w:val="40"/>
+                </w:rPr>
+              </m:ctrlPr>
+            </m:fPr>
+            <m:num>
+              <m:sSub>
+                <m:sSubPr>
+                  <m:ctrlPr>
+                    <w:rPr>
+                      <w:rFonts w:ascii="Cambria Math" w:eastAsiaTheme="minorEastAsia" w:hAnsi="Cambria Math"/>
+                      <w:i/>
+                      <w:sz w:val="28"/>
+                      <w:szCs w:val="40"/>
+                    </w:rPr>
+                  </m:ctrlPr>
+                </m:sSubPr>
+                <m:e>
+                  <m:r>
+                    <w:rPr>
+                      <w:rFonts w:ascii="Cambria Math" w:eastAsiaTheme="minorEastAsia" w:hAnsi="Cambria Math"/>
+                      <w:sz w:val="28"/>
+                      <w:szCs w:val="40"/>
+                    </w:rPr>
+                    <m:t>f</m:t>
+                  </m:r>
+                </m:e>
+                <m:sub>
+                  <m:r>
+                    <w:rPr>
+                      <w:rFonts w:ascii="Cambria Math" w:eastAsiaTheme="minorEastAsia" w:hAnsi="Cambria Math"/>
+                      <w:sz w:val="28"/>
+                      <w:szCs w:val="40"/>
+                    </w:rPr>
+                    <m:t>α</m:t>
+                  </m:r>
+                </m:sub>
+              </m:sSub>
+            </m:num>
+            <m:den>
+              <m:sSub>
+                <m:sSubPr>
+                  <m:ctrlPr>
+                    <w:rPr>
+                      <w:rFonts w:ascii="Cambria Math" w:eastAsiaTheme="minorEastAsia" w:hAnsi="Cambria Math"/>
+                      <w:i/>
+                      <w:sz w:val="28"/>
+                      <w:szCs w:val="40"/>
+                    </w:rPr>
+                  </m:ctrlPr>
+                </m:sSubPr>
+                <m:e>
+                  <m:r>
+                    <w:rPr>
+                      <w:rFonts w:ascii="Cambria Math" w:eastAsiaTheme="minorEastAsia" w:hAnsi="Cambria Math"/>
+                      <w:sz w:val="28"/>
+                      <w:szCs w:val="40"/>
+                    </w:rPr>
+                    <m:t>μ</m:t>
+                  </m:r>
+                </m:e>
+                <m:sub>
+                  <m:r>
+                    <w:rPr>
+                      <w:rFonts w:ascii="Cambria Math" w:eastAsiaTheme="minorEastAsia" w:hAnsi="Cambria Math"/>
+                      <w:sz w:val="28"/>
+                      <w:szCs w:val="40"/>
+                    </w:rPr>
+                    <m:t>α</m:t>
+                  </m:r>
+                </m:sub>
+              </m:sSub>
+            </m:den>
+          </m:f>
+          <m:r>
+            <w:rPr>
+              <w:rFonts w:ascii="Cambria Math" w:eastAsiaTheme="minorEastAsia" w:hAnsi="Cambria Math"/>
+              <w:sz w:val="28"/>
+              <w:szCs w:val="40"/>
+            </w:rPr>
+            <m:t xml:space="preserve">,   </m:t>
+          </m:r>
+          <m:sSub>
+            <m:sSubPr>
+              <m:ctrlPr>
+                <w:rPr>
+                  <w:rFonts w:ascii="Cambria Math" w:eastAsiaTheme="minorEastAsia" w:hAnsi="Cambria Math"/>
+                  <w:i/>
+                  <w:sz w:val="28"/>
+                  <w:szCs w:val="40"/>
+                </w:rPr>
+              </m:ctrlPr>
+            </m:sSubPr>
+            <m:e>
+              <m:r>
+                <w:rPr>
+                  <w:rFonts w:ascii="Cambria Math" w:eastAsiaTheme="minorEastAsia" w:hAnsi="Cambria Math"/>
+                  <w:sz w:val="28"/>
+                  <w:szCs w:val="40"/>
+                </w:rPr>
+                <m:t>r</m:t>
+              </m:r>
+            </m:e>
+            <m:sub>
+              <m:r>
+                <w:rPr>
+                  <w:rFonts w:ascii="Cambria Math" w:eastAsiaTheme="minorEastAsia" w:hAnsi="Cambria Math"/>
+                  <w:sz w:val="28"/>
+                  <w:szCs w:val="40"/>
+                </w:rPr>
+                <m:t>0</m:t>
+              </m:r>
+            </m:sub>
+          </m:sSub>
+          <m:r>
+            <w:rPr>
+              <w:rFonts w:ascii="Cambria Math" w:eastAsiaTheme="minorEastAsia" w:hAnsi="Cambria Math"/>
+              <w:sz w:val="28"/>
+              <w:szCs w:val="40"/>
+            </w:rPr>
+            <m:t>=0.14</m:t>
+          </m:r>
+          <m:rad>
+            <m:radPr>
+              <m:degHide m:val="1"/>
+              <m:ctrlPr>
+                <w:rPr>
+                  <w:rFonts w:ascii="Cambria Math" w:eastAsiaTheme="minorEastAsia" w:hAnsi="Cambria Math"/>
+                  <w:i/>
+                  <w:sz w:val="28"/>
+                  <w:szCs w:val="40"/>
+                </w:rPr>
+              </m:ctrlPr>
+            </m:radPr>
+            <m:deg/>
+            <m:e>
+              <m:sSup>
+                <m:sSupPr>
+                  <m:ctrlPr>
+                    <w:rPr>
+                      <w:rFonts w:ascii="Cambria Math" w:eastAsiaTheme="minorEastAsia" w:hAnsi="Cambria Math"/>
+                      <w:i/>
+                      <w:sz w:val="28"/>
+                      <w:szCs w:val="40"/>
+                    </w:rPr>
+                  </m:ctrlPr>
+                </m:sSupPr>
+                <m:e>
+                  <m:r>
+                    <w:rPr>
+                      <w:rFonts w:ascii="Cambria Math" w:eastAsiaTheme="minorEastAsia" w:hAnsi="Cambria Math"/>
+                      <w:sz w:val="28"/>
+                      <w:szCs w:val="40"/>
+                    </w:rPr>
+                    <m:t>∆x</m:t>
+                  </m:r>
+                </m:e>
+                <m:sup>
+                  <m:r>
+                    <w:rPr>
+                      <w:rFonts w:ascii="Cambria Math" w:eastAsiaTheme="minorEastAsia" w:hAnsi="Cambria Math"/>
+                      <w:sz w:val="28"/>
+                      <w:szCs w:val="40"/>
+                    </w:rPr>
+                    <m:t>2</m:t>
+                  </m:r>
+                </m:sup>
+              </m:sSup>
+              <m:r>
+                <w:rPr>
+                  <w:rFonts w:ascii="Cambria Math" w:eastAsiaTheme="minorEastAsia" w:hAnsi="Cambria Math"/>
+                  <w:sz w:val="28"/>
+                  <w:szCs w:val="40"/>
+                </w:rPr>
+                <m:t>+</m:t>
+              </m:r>
+              <m:sSup>
+                <m:sSupPr>
+                  <m:ctrlPr>
+                    <w:rPr>
+                      <w:rFonts w:ascii="Cambria Math" w:eastAsiaTheme="minorEastAsia" w:hAnsi="Cambria Math"/>
+                      <w:i/>
+                      <w:sz w:val="28"/>
+                      <w:szCs w:val="40"/>
+                    </w:rPr>
+                  </m:ctrlPr>
+                </m:sSupPr>
+                <m:e>
+                  <m:r>
+                    <w:rPr>
+                      <w:rFonts w:ascii="Cambria Math" w:eastAsiaTheme="minorEastAsia" w:hAnsi="Cambria Math"/>
+                      <w:sz w:val="28"/>
+                      <w:szCs w:val="40"/>
+                    </w:rPr>
+                    <m:t>∆y</m:t>
+                  </m:r>
+                </m:e>
+                <m:sup>
+                  <m:r>
+                    <w:rPr>
+                      <w:rFonts w:ascii="Cambria Math" w:eastAsiaTheme="minorEastAsia" w:hAnsi="Cambria Math"/>
+                      <w:sz w:val="28"/>
+                      <w:szCs w:val="40"/>
+                    </w:rPr>
+                    <m:t>2</m:t>
+                  </m:r>
+                </m:sup>
+              </m:sSup>
+            </m:e>
+          </m:rad>
+        </m:oMath>
+      </m:oMathPara>
     </w:p>
     <w:p>
       <w:pPr>
@@ -22601,20 +23002,17 @@
         <w:spacing w:line="480" w:lineRule="atLeast"/>
         <w:jc w:val="both"/>
         <w:rPr>
+          <w:rFonts w:eastAsiaTheme="minorEastAsia"/>
+          <w:szCs w:val="28"/>
+        </w:rPr>
+      </w:pPr>
+      <w:r>
+        <w:rPr>
           <w:b/>
           <w:bCs/>
           <w:sz w:val="28"/>
           <w:szCs w:val="28"/>
         </w:rPr>
-      </w:pPr>
-      <w:r>
-        <w:rPr>
-          <w:b/>
-          <w:bCs/>
-          <w:sz w:val="28"/>
-          <w:szCs w:val="28"/>
-        </w:rPr>
-        <w:lastRenderedPageBreak/>
         <w:t xml:space="preserve">Уравнение для насыщенности </w:t>
       </w:r>
     </w:p>
@@ -27931,6 +28329,230 @@
     </w:p>
     <w:p>
       <w:pPr>
+        <w:spacing w:after="160" w:line="259" w:lineRule="auto"/>
+      </w:pPr>
+      <w:r>
+        <w:br w:type="page"/>
+      </w:r>
+    </w:p>
+    <w:p>
+      <w:pPr>
+        <w:pStyle w:val="1"/>
+        <w:rPr>
+          <w:rFonts w:ascii="Times New Roman" w:hAnsi="Times New Roman" w:cs="Times New Roman"/>
+          <w:b/>
+          <w:bCs/>
+          <w:color w:val="auto"/>
+          <w:sz w:val="28"/>
+          <w:szCs w:val="28"/>
+        </w:rPr>
+      </w:pPr>
+      <w:bookmarkStart w:id="4" w:name="_Toc199749671"/>
+      <w:r>
+        <w:rPr>
+          <w:rFonts w:ascii="Times New Roman" w:hAnsi="Times New Roman" w:cs="Times New Roman"/>
+          <w:b/>
+          <w:bCs/>
+          <w:color w:val="auto"/>
+          <w:sz w:val="28"/>
+          <w:szCs w:val="28"/>
+        </w:rPr>
+        <w:lastRenderedPageBreak/>
+        <w:t>Вывод уравнени</w:t>
+      </w:r>
+      <w:r>
+        <w:rPr>
+          <w:rFonts w:ascii="Times New Roman" w:hAnsi="Times New Roman" w:cs="Times New Roman"/>
+          <w:b/>
+          <w:bCs/>
+          <w:color w:val="auto"/>
+          <w:sz w:val="28"/>
+          <w:szCs w:val="28"/>
+        </w:rPr>
+        <w:t>я</w:t>
+      </w:r>
+      <w:r>
+        <w:rPr>
+          <w:rFonts w:ascii="Times New Roman" w:hAnsi="Times New Roman" w:cs="Times New Roman"/>
+          <w:b/>
+          <w:bCs/>
+          <w:color w:val="auto"/>
+          <w:sz w:val="28"/>
+          <w:szCs w:val="28"/>
+        </w:rPr>
+        <w:t xml:space="preserve"> </w:t>
+      </w:r>
+      <w:r>
+        <w:rPr>
+          <w:rFonts w:ascii="Times New Roman" w:hAnsi="Times New Roman" w:cs="Times New Roman"/>
+          <w:b/>
+          <w:bCs/>
+          <w:color w:val="auto"/>
+          <w:sz w:val="28"/>
+          <w:szCs w:val="28"/>
+        </w:rPr>
+        <w:t>массовой доли растворенного парафина</w:t>
+      </w:r>
+      <w:bookmarkEnd w:id="4"/>
+    </w:p>
+    <w:p/>
+    <w:p>
+      <w:pPr>
+        <w:spacing w:after="160" w:line="259" w:lineRule="auto"/>
+      </w:pPr>
+      <w:r>
+        <w:br w:type="page"/>
+      </w:r>
+    </w:p>
+    <w:p>
+      <w:pPr>
+        <w:pStyle w:val="1"/>
+        <w:rPr>
+          <w:rFonts w:ascii="Times New Roman" w:hAnsi="Times New Roman" w:cs="Times New Roman"/>
+          <w:b/>
+          <w:bCs/>
+          <w:color w:val="auto"/>
+          <w:sz w:val="28"/>
+          <w:szCs w:val="28"/>
+        </w:rPr>
+      </w:pPr>
+      <w:bookmarkStart w:id="5" w:name="_Toc199749672"/>
+      <w:r>
+        <w:rPr>
+          <w:rFonts w:ascii="Times New Roman" w:hAnsi="Times New Roman" w:cs="Times New Roman"/>
+          <w:b/>
+          <w:bCs/>
+          <w:color w:val="auto"/>
+          <w:sz w:val="28"/>
+          <w:szCs w:val="28"/>
+        </w:rPr>
+        <w:lastRenderedPageBreak/>
+        <w:t>Вывод уравнени</w:t>
+      </w:r>
+      <w:r>
+        <w:rPr>
+          <w:rFonts w:ascii="Times New Roman" w:hAnsi="Times New Roman" w:cs="Times New Roman"/>
+          <w:b/>
+          <w:bCs/>
+          <w:color w:val="auto"/>
+          <w:sz w:val="28"/>
+          <w:szCs w:val="28"/>
+        </w:rPr>
+        <w:t>я</w:t>
+      </w:r>
+      <w:r>
+        <w:rPr>
+          <w:rFonts w:ascii="Times New Roman" w:hAnsi="Times New Roman" w:cs="Times New Roman"/>
+          <w:b/>
+          <w:bCs/>
+          <w:color w:val="auto"/>
+          <w:sz w:val="28"/>
+          <w:szCs w:val="28"/>
+        </w:rPr>
+        <w:t xml:space="preserve"> </w:t>
+      </w:r>
+      <w:r>
+        <w:rPr>
+          <w:rFonts w:ascii="Times New Roman" w:hAnsi="Times New Roman" w:cs="Times New Roman"/>
+          <w:b/>
+          <w:bCs/>
+          <w:color w:val="auto"/>
+          <w:sz w:val="28"/>
+          <w:szCs w:val="28"/>
+        </w:rPr>
+        <w:t>температуры</w:t>
+      </w:r>
+      <w:bookmarkEnd w:id="5"/>
+    </w:p>
+    <w:p/>
+    <w:p/>
+    <w:p>
+      <w:pPr>
+        <w:spacing w:after="160" w:line="259" w:lineRule="auto"/>
+      </w:pPr>
+      <w:r>
+        <w:br w:type="page"/>
+      </w:r>
+    </w:p>
+    <w:p>
+      <w:pPr>
+        <w:pStyle w:val="1"/>
+        <w:rPr>
+          <w:rFonts w:ascii="Times New Roman" w:hAnsi="Times New Roman" w:cs="Times New Roman"/>
+          <w:b/>
+          <w:bCs/>
+          <w:color w:val="auto"/>
+          <w:sz w:val="28"/>
+          <w:szCs w:val="28"/>
+        </w:rPr>
+      </w:pPr>
+      <w:bookmarkStart w:id="6" w:name="_Toc199749673"/>
+      <w:r>
+        <w:rPr>
+          <w:rFonts w:ascii="Times New Roman" w:hAnsi="Times New Roman" w:cs="Times New Roman"/>
+          <w:b/>
+          <w:bCs/>
+          <w:color w:val="auto"/>
+          <w:sz w:val="28"/>
+          <w:szCs w:val="28"/>
+        </w:rPr>
+        <w:lastRenderedPageBreak/>
+        <w:t>Кольматация</w:t>
+      </w:r>
+      <w:bookmarkEnd w:id="6"/>
+      <w:r>
+        <w:rPr>
+          <w:rFonts w:ascii="Times New Roman" w:hAnsi="Times New Roman" w:cs="Times New Roman"/>
+          <w:b/>
+          <w:bCs/>
+          <w:color w:val="auto"/>
+          <w:sz w:val="28"/>
+          <w:szCs w:val="28"/>
+        </w:rPr>
+        <w:t xml:space="preserve"> </w:t>
+      </w:r>
+    </w:p>
+    <w:p/>
+    <w:p>
+      <w:pPr>
+        <w:spacing w:after="160" w:line="259" w:lineRule="auto"/>
+      </w:pPr>
+      <w:r>
+        <w:br w:type="page"/>
+      </w:r>
+    </w:p>
+    <w:p>
+      <w:pPr>
+        <w:pStyle w:val="1"/>
+        <w:rPr>
+          <w:rFonts w:ascii="Times New Roman" w:eastAsiaTheme="minorHAnsi" w:hAnsi="Times New Roman" w:cs="Times New Roman"/>
+          <w:b/>
+          <w:bCs/>
+          <w:color w:val="auto"/>
+          <w:sz w:val="28"/>
+          <w:szCs w:val="28"/>
+        </w:rPr>
+      </w:pPr>
+      <w:bookmarkStart w:id="7" w:name="_Toc199749674"/>
+      <w:r>
+        <w:rPr>
+          <w:rFonts w:ascii="Times New Roman" w:hAnsi="Times New Roman" w:cs="Times New Roman"/>
+          <w:b/>
+          <w:bCs/>
+          <w:color w:val="auto"/>
+          <w:sz w:val="28"/>
+          <w:szCs w:val="28"/>
+        </w:rPr>
+        <w:lastRenderedPageBreak/>
+        <w:t>Суффозия</w:t>
+      </w:r>
+      <w:bookmarkEnd w:id="7"/>
+    </w:p>
+    <w:p/>
+    <w:p/>
+    <w:p/>
+    <w:p>
+      <w:pPr>
         <w:spacing w:after="160" w:line="360" w:lineRule="auto"/>
         <w:jc w:val="both"/>
       </w:pPr>
@@ -27952,7 +28574,7 @@
           <w:szCs w:val="28"/>
         </w:rPr>
       </w:pPr>
-      <w:bookmarkStart w:id="4" w:name="_Toc199604218"/>
+      <w:bookmarkStart w:id="8" w:name="_Toc199749675"/>
       <w:r>
         <w:rPr>
           <w:rFonts w:ascii="Times New Roman" w:hAnsi="Times New Roman" w:cs="Times New Roman"/>
@@ -27965,7 +28587,7 @@
         <w:lastRenderedPageBreak/>
         <w:t>Результаты расчетов</w:t>
       </w:r>
-      <w:bookmarkEnd w:id="4"/>
+      <w:bookmarkEnd w:id="8"/>
     </w:p>
     <w:p>
       <w:pPr>
@@ -27996,7 +28618,7 @@
           <w:szCs w:val="28"/>
         </w:rPr>
       </w:pPr>
-      <w:bookmarkStart w:id="5" w:name="_Toc199604219"/>
+      <w:bookmarkStart w:id="9" w:name="_Toc199749676"/>
       <w:r>
         <w:rPr>
           <w:rFonts w:ascii="Times New Roman" w:hAnsi="Times New Roman" w:cs="Times New Roman"/>
@@ -28009,7 +28631,7 @@
         <w:lastRenderedPageBreak/>
         <w:t>Заключение</w:t>
       </w:r>
-      <w:bookmarkEnd w:id="5"/>
+      <w:bookmarkEnd w:id="9"/>
     </w:p>
     <w:p>
       <w:pPr>
@@ -28040,7 +28662,7 @@
           <w:szCs w:val="28"/>
         </w:rPr>
       </w:pPr>
-      <w:bookmarkStart w:id="6" w:name="_Toc199604220"/>
+      <w:bookmarkStart w:id="10" w:name="_Toc199749677"/>
       <w:r>
         <w:rPr>
           <w:rFonts w:ascii="Times New Roman" w:hAnsi="Times New Roman" w:cs="Times New Roman"/>
@@ -28053,7 +28675,7 @@
         <w:lastRenderedPageBreak/>
         <w:t>Список литературы</w:t>
       </w:r>
-      <w:bookmarkEnd w:id="6"/>
+      <w:bookmarkEnd w:id="10"/>
     </w:p>
     <w:p>
       <w:pPr>
@@ -29148,7 +29770,15 @@
         <w:jc w:val="both"/>
       </w:pPr>
       <w:r>
-        <w:t xml:space="preserve">Пудовкин М.А., Саламатин А.Н., Чугунов В.А. Температурные процессы в действующих скважинах. - Казань : Изд-во </w:t>
+        <w:t xml:space="preserve">Пудовкин М.А., Саламатин А.Н., Чугунов В.А. Температурные процессы в действующих скважинах. - </w:t>
+      </w:r>
+      <w:proofErr w:type="gramStart"/>
+      <w:r>
+        <w:t>Казань :</w:t>
+      </w:r>
+      <w:proofErr w:type="gramEnd"/>
+      <w:r>
+        <w:t xml:space="preserve"> Изд-во </w:t>
       </w:r>
       <w:proofErr w:type="spellStart"/>
       <w:r>
@@ -29333,21 +29963,36 @@
       </w:r>
     </w:p>
     <w:p>
-      <w:bookmarkStart w:id="7" w:name="_Toc199604221"/>
-      <w:r>
-        <w:rPr>
+      <w:pPr>
+        <w:pStyle w:val="1"/>
+        <w:rPr>
+          <w:rFonts w:ascii="Times New Roman" w:hAnsi="Times New Roman" w:cs="Times New Roman"/>
           <w:b/>
           <w:bCs/>
+          <w:color w:val="auto"/>
           <w:sz w:val="28"/>
           <w:szCs w:val="28"/>
         </w:rPr>
+      </w:pPr>
+      <w:bookmarkStart w:id="11" w:name="_Toc199749678"/>
+      <w:r>
+        <w:rPr>
+          <w:rFonts w:ascii="Times New Roman" w:hAnsi="Times New Roman" w:cs="Times New Roman"/>
+          <w:b/>
+          <w:bCs/>
+          <w:color w:val="auto"/>
+          <w:sz w:val="28"/>
+          <w:szCs w:val="28"/>
+        </w:rPr>
         <w:lastRenderedPageBreak/>
         <w:t xml:space="preserve">Список </w:t>
       </w:r>
       <w:r>
         <w:rPr>
+          <w:rFonts w:ascii="Times New Roman" w:hAnsi="Times New Roman" w:cs="Times New Roman"/>
           <w:b/>
           <w:bCs/>
+          <w:color w:val="auto"/>
           <w:sz w:val="28"/>
           <w:szCs w:val="28"/>
         </w:rPr>
@@ -29355,14 +30000,613 @@
       </w:r>
       <w:r>
         <w:rPr>
+          <w:rFonts w:ascii="Times New Roman" w:hAnsi="Times New Roman" w:cs="Times New Roman"/>
           <w:b/>
           <w:bCs/>
+          <w:color w:val="auto"/>
           <w:sz w:val="28"/>
           <w:szCs w:val="28"/>
         </w:rPr>
         <w:t>обозначений</w:t>
       </w:r>
-      <w:bookmarkEnd w:id="7"/>
+      <w:bookmarkEnd w:id="11"/>
+    </w:p>
+    <w:p>
+      <w:pPr>
+        <w:rPr>
+          <w:lang w:val="en-US"/>
+        </w:rPr>
+      </w:pPr>
+      <m:oMath>
+        <m:r>
+          <w:rPr>
+            <w:rFonts w:ascii="Cambria Math" w:hAnsi="Cambria Math"/>
+            <w:lang w:val="en-US"/>
+          </w:rPr>
+          <m:t>p-</m:t>
+        </m:r>
+      </m:oMath>
+      <w:r>
+        <w:rPr>
+          <w:rFonts w:eastAsiaTheme="minorEastAsia"/>
+          <w:lang w:val="en-US"/>
+        </w:rPr>
+        <w:t xml:space="preserve"> </w:t>
+      </w:r>
+      <w:r>
+        <w:rPr>
+          <w:rFonts w:eastAsiaTheme="minorEastAsia"/>
+        </w:rPr>
+        <w:t>давление,</w:t>
+      </w:r>
+      <w:r>
+        <w:rPr>
+          <w:lang w:val="en-US"/>
+        </w:rPr>
+        <w:t xml:space="preserve"> </w:t>
+      </w:r>
+      <m:oMath>
+        <m:r>
+          <w:rPr>
+            <w:rFonts w:ascii="Cambria Math" w:hAnsi="Cambria Math"/>
+            <w:lang w:val="en-US"/>
+          </w:rPr>
+          <m:t>[Па]</m:t>
+        </m:r>
+      </m:oMath>
+    </w:p>
+    <w:p>
+      <w:pPr>
+        <w:rPr>
+          <w:rFonts w:eastAsiaTheme="minorEastAsia"/>
+          <w:lang w:val="en-US"/>
+        </w:rPr>
+      </w:pPr>
+      <m:oMath>
+        <m:sSub>
+          <m:sSubPr>
+            <m:ctrlPr>
+              <w:rPr>
+                <w:rFonts w:ascii="Cambria Math" w:eastAsiaTheme="minorEastAsia" w:hAnsi="Cambria Math"/>
+                <w:i/>
+                <w:lang w:val="en-US"/>
+              </w:rPr>
+            </m:ctrlPr>
+          </m:sSubPr>
+          <m:e>
+            <m:r>
+              <w:rPr>
+                <w:rFonts w:ascii="Cambria Math" w:eastAsiaTheme="minorEastAsia" w:hAnsi="Cambria Math"/>
+                <w:lang w:val="en-US"/>
+              </w:rPr>
+              <m:t>S</m:t>
+            </m:r>
+          </m:e>
+          <m:sub>
+            <m:r>
+              <w:rPr>
+                <w:rFonts w:ascii="Cambria Math" w:eastAsiaTheme="minorEastAsia" w:hAnsi="Cambria Math"/>
+                <w:lang w:val="en-US"/>
+              </w:rPr>
+              <m:t>o</m:t>
+            </m:r>
+          </m:sub>
+        </m:sSub>
+        <m:r>
+          <w:rPr>
+            <w:rFonts w:ascii="Cambria Math" w:eastAsiaTheme="minorEastAsia" w:hAnsi="Cambria Math"/>
+          </w:rPr>
+          <m:t>-</m:t>
+        </m:r>
+      </m:oMath>
+      <w:r>
+        <w:t xml:space="preserve">  </w:t>
+      </w:r>
+      <w:r>
+        <w:t>насыщенность нефти,</w:t>
+      </w:r>
+      <m:oMath>
+        <m:r>
+          <w:rPr>
+            <w:rFonts w:ascii="Cambria Math" w:hAnsi="Cambria Math"/>
+          </w:rPr>
+          <m:t xml:space="preserve"> </m:t>
+        </m:r>
+        <m:r>
+          <w:rPr>
+            <w:rFonts w:ascii="Cambria Math" w:hAnsi="Cambria Math"/>
+            <w:lang w:val="en-US"/>
+          </w:rPr>
+          <m:t>[-]</m:t>
+        </m:r>
+      </m:oMath>
+    </w:p>
+    <w:p>
+      <w:pPr>
+        <w:rPr>
+          <w:rFonts w:eastAsiaTheme="minorEastAsia"/>
+        </w:rPr>
+      </w:pPr>
+      <m:oMath>
+        <m:sSub>
+          <m:sSubPr>
+            <m:ctrlPr>
+              <w:rPr>
+                <w:rFonts w:ascii="Cambria Math" w:eastAsiaTheme="minorEastAsia" w:hAnsi="Cambria Math"/>
+                <w:i/>
+                <w:lang w:val="en-US"/>
+              </w:rPr>
+            </m:ctrlPr>
+          </m:sSubPr>
+          <m:e>
+            <m:r>
+              <w:rPr>
+                <w:rFonts w:ascii="Cambria Math" w:eastAsiaTheme="minorEastAsia" w:hAnsi="Cambria Math"/>
+                <w:lang w:val="en-US"/>
+              </w:rPr>
+              <m:t>S</m:t>
+            </m:r>
+          </m:e>
+          <m:sub>
+            <m:r>
+              <w:rPr>
+                <w:rFonts w:ascii="Cambria Math" w:eastAsiaTheme="minorEastAsia" w:hAnsi="Cambria Math"/>
+                <w:lang w:val="en-US"/>
+              </w:rPr>
+              <m:t>w</m:t>
+            </m:r>
+          </m:sub>
+        </m:sSub>
+        <m:r>
+          <w:rPr>
+            <w:rFonts w:ascii="Cambria Math" w:eastAsiaTheme="minorEastAsia" w:hAnsi="Cambria Math"/>
+          </w:rPr>
+          <m:t>-</m:t>
+        </m:r>
+      </m:oMath>
+      <w:r>
+        <w:t xml:space="preserve">  </w:t>
+      </w:r>
+      <w:r>
+        <w:t>насыщенность воды,</w:t>
+      </w:r>
+      <m:oMath>
+        <m:r>
+          <w:rPr>
+            <w:rFonts w:ascii="Cambria Math" w:hAnsi="Cambria Math"/>
+          </w:rPr>
+          <m:t xml:space="preserve"> [-]</m:t>
+        </m:r>
+      </m:oMath>
+    </w:p>
+    <w:p>
+      <m:oMath>
+        <m:sSub>
+          <m:sSubPr>
+            <m:ctrlPr>
+              <w:rPr>
+                <w:rFonts w:ascii="Cambria Math" w:eastAsiaTheme="minorEastAsia" w:hAnsi="Cambria Math"/>
+                <w:i/>
+                <w:lang w:val="en-US"/>
+              </w:rPr>
+            </m:ctrlPr>
+          </m:sSubPr>
+          <m:e>
+            <m:r>
+              <w:rPr>
+                <w:rFonts w:ascii="Cambria Math" w:eastAsiaTheme="minorEastAsia" w:hAnsi="Cambria Math"/>
+                <w:lang w:val="en-US"/>
+              </w:rPr>
+              <m:t>w</m:t>
+            </m:r>
+          </m:e>
+          <m:sub>
+            <m:r>
+              <w:rPr>
+                <w:rFonts w:ascii="Cambria Math" w:eastAsiaTheme="minorEastAsia" w:hAnsi="Cambria Math"/>
+                <w:lang w:val="en-US"/>
+              </w:rPr>
+              <m:t>o</m:t>
+            </m:r>
+          </m:sub>
+        </m:sSub>
+        <m:r>
+          <w:rPr>
+            <w:rFonts w:ascii="Cambria Math" w:eastAsiaTheme="minorEastAsia" w:hAnsi="Cambria Math"/>
+          </w:rPr>
+          <m:t>-</m:t>
+        </m:r>
+      </m:oMath>
+      <w:r>
+        <w:t xml:space="preserve">  </w:t>
+      </w:r>
+      <w:r>
+        <w:t>массов</w:t>
+      </w:r>
+      <w:r>
+        <w:t>ая</w:t>
+      </w:r>
+      <w:r>
+        <w:t xml:space="preserve"> дол</w:t>
+      </w:r>
+      <w:r>
+        <w:t>я</w:t>
+      </w:r>
+      <w:r>
+        <w:t xml:space="preserve"> масляного компонента в </w:t>
+      </w:r>
+      <w:r>
+        <w:t>нефтяной</w:t>
+      </w:r>
+      <w:r>
+        <w:t xml:space="preserve"> фазе</w:t>
+      </w:r>
+      <w:r>
+        <w:t>,</w:t>
+      </w:r>
+      <m:oMath>
+        <m:r>
+          <w:rPr>
+            <w:rFonts w:ascii="Cambria Math" w:hAnsi="Cambria Math"/>
+          </w:rPr>
+          <m:t xml:space="preserve"> [-]</m:t>
+        </m:r>
+      </m:oMath>
+    </w:p>
+    <w:p>
+      <m:oMath>
+        <m:sSub>
+          <m:sSubPr>
+            <m:ctrlPr>
+              <w:rPr>
+                <w:rFonts w:ascii="Cambria Math" w:eastAsiaTheme="minorEastAsia" w:hAnsi="Cambria Math"/>
+                <w:i/>
+                <w:lang w:val="en-US"/>
+              </w:rPr>
+            </m:ctrlPr>
+          </m:sSubPr>
+          <m:e>
+            <m:r>
+              <w:rPr>
+                <w:rFonts w:ascii="Cambria Math" w:eastAsiaTheme="minorEastAsia" w:hAnsi="Cambria Math"/>
+                <w:lang w:val="en-US"/>
+              </w:rPr>
+              <m:t>w</m:t>
+            </m:r>
+          </m:e>
+          <m:sub>
+            <m:r>
+              <w:rPr>
+                <w:rFonts w:ascii="Cambria Math" w:eastAsiaTheme="minorEastAsia" w:hAnsi="Cambria Math"/>
+                <w:lang w:val="en-US"/>
+              </w:rPr>
+              <m:t>p</m:t>
+            </m:r>
+          </m:sub>
+        </m:sSub>
+        <m:r>
+          <w:rPr>
+            <w:rFonts w:ascii="Cambria Math" w:eastAsiaTheme="minorEastAsia" w:hAnsi="Cambria Math"/>
+          </w:rPr>
+          <m:t>-</m:t>
+        </m:r>
+      </m:oMath>
+      <w:r>
+        <w:t xml:space="preserve">  </w:t>
+      </w:r>
+      <w:r>
+        <w:t>массов</w:t>
+      </w:r>
+      <w:r>
+        <w:t>ая</w:t>
+      </w:r>
+      <w:r>
+        <w:t xml:space="preserve"> дол</w:t>
+      </w:r>
+      <w:r>
+        <w:t>я</w:t>
+      </w:r>
+      <w:r>
+        <w:t xml:space="preserve"> </w:t>
+      </w:r>
+      <w:r>
+        <w:t>растворенного парафина</w:t>
+      </w:r>
+      <w:r>
+        <w:t xml:space="preserve"> в </w:t>
+      </w:r>
+      <w:r>
+        <w:t>нефтяной</w:t>
+      </w:r>
+      <w:r>
+        <w:t xml:space="preserve"> фазе</w:t>
+      </w:r>
+      <w:r>
+        <w:t>,</w:t>
+      </w:r>
+      <m:oMath>
+        <m:r>
+          <w:rPr>
+            <w:rFonts w:ascii="Cambria Math" w:hAnsi="Cambria Math"/>
+          </w:rPr>
+          <m:t xml:space="preserve"> [-]</m:t>
+        </m:r>
+      </m:oMath>
+    </w:p>
+    <w:p>
+      <m:oMath>
+        <m:sSub>
+          <m:sSubPr>
+            <m:ctrlPr>
+              <w:rPr>
+                <w:rFonts w:ascii="Cambria Math" w:eastAsiaTheme="minorEastAsia" w:hAnsi="Cambria Math"/>
+                <w:i/>
+                <w:lang w:val="en-US"/>
+              </w:rPr>
+            </m:ctrlPr>
+          </m:sSubPr>
+          <m:e>
+            <m:r>
+              <w:rPr>
+                <w:rFonts w:ascii="Cambria Math" w:eastAsiaTheme="minorEastAsia" w:hAnsi="Cambria Math"/>
+                <w:lang w:val="en-US"/>
+              </w:rPr>
+              <m:t>w</m:t>
+            </m:r>
+          </m:e>
+          <m:sub>
+            <m:r>
+              <w:rPr>
+                <w:rFonts w:ascii="Cambria Math" w:eastAsiaTheme="minorEastAsia" w:hAnsi="Cambria Math"/>
+                <w:lang w:val="en-US"/>
+              </w:rPr>
+              <m:t>ps</m:t>
+            </m:r>
+          </m:sub>
+        </m:sSub>
+        <m:r>
+          <w:rPr>
+            <w:rFonts w:ascii="Cambria Math" w:eastAsiaTheme="minorEastAsia" w:hAnsi="Cambria Math"/>
+          </w:rPr>
+          <m:t>-</m:t>
+        </m:r>
+      </m:oMath>
+      <w:r>
+        <w:t xml:space="preserve"> </w:t>
+      </w:r>
+      <w:r>
+        <w:t>массов</w:t>
+      </w:r>
+      <w:r>
+        <w:t>ая</w:t>
+      </w:r>
+      <w:r>
+        <w:t xml:space="preserve"> дол</w:t>
+      </w:r>
+      <w:r>
+        <w:t>я</w:t>
+      </w:r>
+      <w:r>
+        <w:t xml:space="preserve"> </w:t>
+      </w:r>
+      <w:r>
+        <w:t xml:space="preserve">взвешенного парафина </w:t>
+      </w:r>
+      <w:r>
+        <w:t xml:space="preserve">в </w:t>
+      </w:r>
+      <w:r>
+        <w:t>нефтяной</w:t>
+      </w:r>
+      <w:r>
+        <w:t xml:space="preserve"> фазе</w:t>
+      </w:r>
+      <w:r>
+        <w:t>,</w:t>
+      </w:r>
+      <m:oMath>
+        <m:r>
+          <w:rPr>
+            <w:rFonts w:ascii="Cambria Math" w:hAnsi="Cambria Math"/>
+          </w:rPr>
+          <m:t xml:space="preserve"> [-]</m:t>
+        </m:r>
+      </m:oMath>
+    </w:p>
+    <w:p>
+      <m:oMath>
+        <m:r>
+          <w:rPr>
+            <w:rFonts w:ascii="Cambria Math" w:hAnsi="Cambria Math"/>
+            <w:lang w:val="en-US"/>
+          </w:rPr>
+          <m:t>k</m:t>
+        </m:r>
+        <m:r>
+          <w:rPr>
+            <w:rFonts w:ascii="Cambria Math" w:hAnsi="Cambria Math"/>
+          </w:rPr>
+          <m:t xml:space="preserve"> –</m:t>
+        </m:r>
+      </m:oMath>
+      <w:r>
+        <w:t xml:space="preserve"> </w:t>
+      </w:r>
+      <w:r>
+        <w:t xml:space="preserve">проницаемость пласта, </w:t>
+      </w:r>
+      <m:oMath>
+        <m:r>
+          <w:rPr>
+            <w:rFonts w:ascii="Cambria Math" w:hAnsi="Cambria Math"/>
+          </w:rPr>
+          <m:t>[</m:t>
+        </m:r>
+        <m:sSup>
+          <m:sSupPr>
+            <m:ctrlPr>
+              <w:rPr>
+                <w:rFonts w:ascii="Cambria Math" w:hAnsi="Cambria Math"/>
+                <w:i/>
+              </w:rPr>
+            </m:ctrlPr>
+          </m:sSupPr>
+          <m:e>
+            <m:r>
+              <w:rPr>
+                <w:rFonts w:ascii="Cambria Math" w:hAnsi="Cambria Math"/>
+              </w:rPr>
+              <m:t>м</m:t>
+            </m:r>
+          </m:e>
+          <m:sup>
+            <m:r>
+              <w:rPr>
+                <w:rFonts w:ascii="Cambria Math" w:hAnsi="Cambria Math"/>
+              </w:rPr>
+              <m:t>2</m:t>
+            </m:r>
+          </m:sup>
+        </m:sSup>
+        <m:r>
+          <w:rPr>
+            <w:rFonts w:ascii="Cambria Math" w:hAnsi="Cambria Math"/>
+          </w:rPr>
+          <m:t>]</m:t>
+        </m:r>
+      </m:oMath>
+    </w:p>
+    <w:p>
+      <m:oMath>
+        <m:r>
+          <w:rPr>
+            <w:rFonts w:ascii="Cambria Math" w:hAnsi="Cambria Math"/>
+            <w:lang w:val="en-US"/>
+          </w:rPr>
+          <m:t>m</m:t>
+        </m:r>
+        <m:r>
+          <w:rPr>
+            <w:rFonts w:ascii="Cambria Math" w:hAnsi="Cambria Math"/>
+          </w:rPr>
+          <m:t>-</m:t>
+        </m:r>
+      </m:oMath>
+      <w:r>
+        <w:t xml:space="preserve">  </w:t>
+      </w:r>
+      <w:r>
+        <w:t xml:space="preserve">пористость пласта, </w:t>
+      </w:r>
+      <m:oMath>
+        <m:r>
+          <w:rPr>
+            <w:rFonts w:ascii="Cambria Math" w:hAnsi="Cambria Math"/>
+          </w:rPr>
+          <m:t>[-]</m:t>
+        </m:r>
+      </m:oMath>
+    </w:p>
+    <w:p>
+      <w:pPr>
+        <w:rPr>
+          <w:lang w:val="en-US"/>
+        </w:rPr>
+      </w:pPr>
+      <w:r>
+        <w:rPr>
+          <w:lang w:val="en-US"/>
+        </w:rPr>
+        <w:t>T</w:t>
+      </w:r>
+      <w:r>
+        <w:rPr>
+          <w:lang w:val="en-US"/>
+        </w:rPr>
+        <w:t xml:space="preserve">   = </w:t>
+      </w:r>
+      <w:proofErr w:type="gramStart"/>
+      <w:r>
+        <w:rPr>
+          <w:lang w:val="en-US"/>
+        </w:rPr>
+        <w:t>80  #</w:t>
+      </w:r>
+      <w:proofErr w:type="gramEnd"/>
+      <w:r>
+        <w:rPr>
+          <w:lang w:val="en-US"/>
+        </w:rPr>
+        <w:t xml:space="preserve"> [</w:t>
+      </w:r>
+      <w:r>
+        <w:rPr>
+          <w:lang w:val="en-US"/>
+        </w:rPr>
+        <w:t>C</w:t>
+      </w:r>
+      <w:r>
+        <w:rPr>
+          <w:lang w:val="en-US"/>
+        </w:rPr>
+        <w:t>]</w:t>
+      </w:r>
+    </w:p>
+    <w:p>
+      <w:pPr>
+        <w:rPr>
+          <w:lang w:val="en-US"/>
+        </w:rPr>
+      </w:pPr>
+      <w:proofErr w:type="spellStart"/>
+      <w:r>
+        <w:rPr>
+          <w:lang w:val="en-US"/>
+        </w:rPr>
+        <w:t>init_</w:t>
+      </w:r>
+      <w:proofErr w:type="gramStart"/>
+      <w:r>
+        <w:rPr>
+          <w:lang w:val="en-US"/>
+        </w:rPr>
+        <w:t>qp</w:t>
+      </w:r>
+      <w:proofErr w:type="spellEnd"/>
+      <w:r>
+        <w:rPr>
+          <w:lang w:val="en-US"/>
+        </w:rPr>
+        <w:t xml:space="preserve">  =</w:t>
+      </w:r>
+      <w:proofErr w:type="gramEnd"/>
+      <w:r>
+        <w:rPr>
+          <w:lang w:val="en-US"/>
+        </w:rPr>
+        <w:t xml:space="preserve"> 0.0</w:t>
+      </w:r>
+    </w:p>
+    <w:p>
+      <w:pPr>
+        <w:rPr>
+          <w:lang w:val="en-US"/>
+        </w:rPr>
+      </w:pPr>
+      <w:proofErr w:type="spellStart"/>
+      <w:r>
+        <w:rPr>
+          <w:lang w:val="en-US"/>
+        </w:rPr>
+        <w:t>init_h_sloy</w:t>
+      </w:r>
+      <w:proofErr w:type="spellEnd"/>
+      <w:r>
+        <w:rPr>
+          <w:lang w:val="en-US"/>
+        </w:rPr>
+        <w:t xml:space="preserve"> = 0.0</w:t>
+      </w:r>
     </w:p>
     <w:p>
       <w:proofErr w:type="spellStart"/>
@@ -29385,11 +30629,19 @@
       </w:r>
       <w:proofErr w:type="spellStart"/>
       <w:r>
-        <w:t>bar_to_pa</w:t>
+        <w:t>bar_to_</w:t>
+      </w:r>
+      <w:proofErr w:type="gramStart"/>
+      <w:r>
+        <w:t>pa</w:t>
       </w:r>
       <w:proofErr w:type="spellEnd"/>
       <w:r>
-        <w:t xml:space="preserve">  # Давление на нагнетательной скважине, [Па]</w:t>
+        <w:t xml:space="preserve">  #</w:t>
+      </w:r>
+      <w:proofErr w:type="gramEnd"/>
+      <w:r>
+        <w:t xml:space="preserve"> Давление на нагнетательной скважине, [Па]</w:t>
       </w:r>
     </w:p>
     <w:p>
@@ -29511,7 +30763,15 @@
       </w:r>
       <w:proofErr w:type="spellEnd"/>
       <w:r>
-        <w:t xml:space="preserve"> = 1000.0  # Плотность воды, [кг/м^3]</w:t>
+        <w:t xml:space="preserve"> = </w:t>
+      </w:r>
+      <w:proofErr w:type="gramStart"/>
+      <w:r>
+        <w:t>1000.0  #</w:t>
+      </w:r>
+      <w:proofErr w:type="gramEnd"/>
+      <w:r>
+        <w:t xml:space="preserve"> Плотность воды, [кг/м^3]</w:t>
       </w:r>
     </w:p>
     <w:p>
@@ -29541,7 +30801,15 @@
       </w:r>
       <w:proofErr w:type="spellEnd"/>
       <w:r>
-        <w:t xml:space="preserve"> = 2500.0  # Плотность пласта, [кг/м^3]</w:t>
+        <w:t xml:space="preserve"> = </w:t>
+      </w:r>
+      <w:proofErr w:type="gramStart"/>
+      <w:r>
+        <w:t>2500.0  #</w:t>
+      </w:r>
+      <w:proofErr w:type="gramEnd"/>
+      <w:r>
+        <w:t xml:space="preserve"> Плотность пласта, [кг/м^3]</w:t>
       </w:r>
     </w:p>
     <w:p>
@@ -29555,16 +30823,25 @@
       </w:r>
       <w:proofErr w:type="spellStart"/>
       <w:r>
-        <w:t>cpoise_to_Pas</w:t>
+        <w:t>cpoise_to_</w:t>
+      </w:r>
+      <w:proofErr w:type="gramStart"/>
+      <w:r>
+        <w:t>Pas</w:t>
       </w:r>
       <w:proofErr w:type="spellEnd"/>
       <w:r>
-        <w:t xml:space="preserve">  # Вязкость воды, [Па*с]</w:t>
+        <w:t xml:space="preserve">  #</w:t>
+      </w:r>
+      <w:proofErr w:type="gramEnd"/>
+      <w:r>
+        <w:t xml:space="preserve"> Вязкость воды, [Па*с]</w:t>
       </w:r>
     </w:p>
     <w:p>
       <w:proofErr w:type="spellStart"/>
       <w:r>
+        <w:lastRenderedPageBreak/>
         <w:t>mu_o</w:t>
       </w:r>
       <w:proofErr w:type="spellEnd"/>
@@ -29573,11 +30850,19 @@
       </w:r>
       <w:proofErr w:type="spellStart"/>
       <w:r>
-        <w:t>cpoise_to_Pas</w:t>
+        <w:t>cpoise_to_</w:t>
+      </w:r>
+      <w:proofErr w:type="gramStart"/>
+      <w:r>
+        <w:t>Pas</w:t>
       </w:r>
       <w:proofErr w:type="spellEnd"/>
       <w:r>
-        <w:t xml:space="preserve">  # Вязкость нефти, [Па*с]</w:t>
+        <w:t xml:space="preserve">  #</w:t>
+      </w:r>
+      <w:proofErr w:type="gramEnd"/>
+      <w:r>
+        <w:t xml:space="preserve"> Вязкость нефти, [Па*с]</w:t>
       </w:r>
     </w:p>
     <w:p>
@@ -29587,7 +30872,15 @@
       </w:r>
       <w:proofErr w:type="spellEnd"/>
       <w:r>
-        <w:t xml:space="preserve"> = 4200  # Теплоемкость воды, [Дж*кг/C]</w:t>
+        <w:t xml:space="preserve"> = </w:t>
+      </w:r>
+      <w:proofErr w:type="gramStart"/>
+      <w:r>
+        <w:t>4200  #</w:t>
+      </w:r>
+      <w:proofErr w:type="gramEnd"/>
+      <w:r>
+        <w:t xml:space="preserve"> Теплоемкость воды, [Дж*кг/C]</w:t>
       </w:r>
     </w:p>
     <w:p>
@@ -29597,7 +30890,15 @@
       </w:r>
       <w:proofErr w:type="spellEnd"/>
       <w:r>
-        <w:t xml:space="preserve"> = 2000  # Теплоемкость нефти, [Дж*кг/C]</w:t>
+        <w:t xml:space="preserve"> = </w:t>
+      </w:r>
+      <w:proofErr w:type="gramStart"/>
+      <w:r>
+        <w:t>2000  #</w:t>
+      </w:r>
+      <w:proofErr w:type="gramEnd"/>
+      <w:r>
+        <w:t xml:space="preserve"> Теплоемкость нефти, [Дж*кг/C]</w:t>
       </w:r>
     </w:p>
     <w:p>
@@ -29607,7 +30908,15 @@
       </w:r>
       <w:proofErr w:type="spellEnd"/>
       <w:r>
-        <w:t xml:space="preserve"> = 2200  # Теплоемкость парафина, [Дж*кг/C]</w:t>
+        <w:t xml:space="preserve"> = </w:t>
+      </w:r>
+      <w:proofErr w:type="gramStart"/>
+      <w:r>
+        <w:t>2200  #</w:t>
+      </w:r>
+      <w:proofErr w:type="gramEnd"/>
+      <w:r>
+        <w:t xml:space="preserve"> Теплоемкость парафина, [Дж*кг/C]</w:t>
       </w:r>
     </w:p>
     <w:p>
@@ -29623,11 +30932,19 @@
     <w:p>
       <w:proofErr w:type="spellStart"/>
       <w:r>
-        <w:t>K_p</w:t>
+        <w:t>K_</w:t>
+      </w:r>
+      <w:proofErr w:type="gramStart"/>
+      <w:r>
+        <w:t>p</w:t>
       </w:r>
       <w:proofErr w:type="spellEnd"/>
       <w:r>
-        <w:t xml:space="preserve">  = 0.2  # Теплопроводность парафина, Вт/(</w:t>
+        <w:t xml:space="preserve">  =</w:t>
+      </w:r>
+      <w:proofErr w:type="gramEnd"/>
+      <w:r>
+        <w:t xml:space="preserve"> 0.2  # Теплопроводность парафина, Вт/(</w:t>
       </w:r>
       <w:proofErr w:type="spellStart"/>
       <w:r>
@@ -29641,11 +30958,19 @@
     <w:p>
       <w:proofErr w:type="spellStart"/>
       <w:r>
-        <w:t>K_w</w:t>
+        <w:t>K_</w:t>
+      </w:r>
+      <w:proofErr w:type="gramStart"/>
+      <w:r>
+        <w:t>w</w:t>
       </w:r>
       <w:proofErr w:type="spellEnd"/>
       <w:r>
-        <w:t xml:space="preserve">  = 0.6  # Теплопроводность воды, Вт/(</w:t>
+        <w:t xml:space="preserve">  =</w:t>
+      </w:r>
+      <w:proofErr w:type="gramEnd"/>
+      <w:r>
+        <w:t xml:space="preserve"> 0.6  # Теплопроводность воды, Вт/(</w:t>
       </w:r>
       <w:proofErr w:type="spellStart"/>
       <w:r>
@@ -29659,11 +30984,19 @@
     <w:p>
       <w:proofErr w:type="spellStart"/>
       <w:r>
-        <w:t>K_o</w:t>
+        <w:t>K_</w:t>
+      </w:r>
+      <w:proofErr w:type="gramStart"/>
+      <w:r>
+        <w:t>o</w:t>
       </w:r>
       <w:proofErr w:type="spellEnd"/>
       <w:r>
-        <w:t xml:space="preserve">  = 0.12 # Теплопроводность нефти, Вт/(</w:t>
+        <w:t xml:space="preserve">  =</w:t>
+      </w:r>
+      <w:proofErr w:type="gramEnd"/>
+      <w:r>
+        <w:t xml:space="preserve"> 0.12 # Теплопроводность нефти, Вт/(</w:t>
       </w:r>
       <w:proofErr w:type="spellStart"/>
       <w:r>
@@ -29677,11 +31010,19 @@
     <w:p>
       <w:proofErr w:type="spellStart"/>
       <w:r>
-        <w:t>K_f</w:t>
+        <w:t>K_</w:t>
+      </w:r>
+      <w:proofErr w:type="gramStart"/>
+      <w:r>
+        <w:t>f</w:t>
       </w:r>
       <w:proofErr w:type="spellEnd"/>
       <w:r>
-        <w:t xml:space="preserve">  = 2.0  # Теплопроводность пласта, Вт/(</w:t>
+        <w:t xml:space="preserve">  =</w:t>
+      </w:r>
+      <w:proofErr w:type="gramEnd"/>
+      <w:r>
+        <w:t xml:space="preserve"> 2.0  # Теплопроводность пласта, Вт/(</w:t>
       </w:r>
       <w:proofErr w:type="spellStart"/>
       <w:r>
@@ -29700,18 +31041,22 @@
     </w:p>
     <w:p>
       <w:r>
-        <w:lastRenderedPageBreak/>
         <w:t>g     = 9.81   # Ускорение свободного падения, [м/с^2]</w:t>
       </w:r>
     </w:p>
     <w:p>
       <w:proofErr w:type="spellStart"/>
+      <w:proofErr w:type="gramStart"/>
       <w:r>
         <w:t>Diff</w:t>
       </w:r>
       <w:proofErr w:type="spellEnd"/>
       <w:r>
-        <w:t xml:space="preserve">  = 2e-18  # Коэффициент диффузионного осаждения частиц, [м^2/с]</w:t>
+        <w:t xml:space="preserve">  =</w:t>
+      </w:r>
+      <w:proofErr w:type="gramEnd"/>
+      <w:r>
+        <w:t xml:space="preserve"> 2e-18  # Коэффициент диффузионного осаждения частиц, [м^2/с]</w:t>
       </w:r>
     </w:p>
     <w:p>
@@ -29771,12 +31116,28 @@
     </w:p>
     <w:p>
       <w:r>
-        <w:t>Delta = 0.005  # Кинетическая константа суффозии, [1/м]</w:t>
+        <w:t xml:space="preserve">Delta = </w:t>
+      </w:r>
+      <w:proofErr w:type="gramStart"/>
+      <w:r>
+        <w:t>0.005  #</w:t>
+      </w:r>
+      <w:proofErr w:type="gramEnd"/>
+      <w:r>
+        <w:t xml:space="preserve"> Кинетическая константа суффозии, [1/м]</w:t>
       </w:r>
     </w:p>
     <w:p>
       <w:r>
-        <w:t>R     = 8.31446261815324  # Газовая постоянная, [J</w:t>
+        <w:t xml:space="preserve">R     = </w:t>
+      </w:r>
+      <w:proofErr w:type="gramStart"/>
+      <w:r>
+        <w:t>8.31446261815324  #</w:t>
+      </w:r>
+      <w:proofErr w:type="gramEnd"/>
+      <w:r>
+        <w:t xml:space="preserve"> Газовая постоянная, [J</w:t>
       </w:r>
       <w:r>
         <w:rPr>
@@ -29810,7 +31171,15 @@
     </w:p>
     <w:p>
       <w:r>
-        <w:t>MW = 350.0  # Молекулярная масса</w:t>
+        <w:t xml:space="preserve">MW = </w:t>
+      </w:r>
+      <w:proofErr w:type="gramStart"/>
+      <w:r>
+        <w:t>350.0  #</w:t>
+      </w:r>
+      <w:proofErr w:type="gramEnd"/>
+      <w:r>
+        <w:t xml:space="preserve"> Молекулярная масса</w:t>
       </w:r>
     </w:p>
     <w:p>
@@ -29820,7 +31189,15 @@
       </w:r>
       <w:proofErr w:type="spellEnd"/>
       <w:r>
-        <w:t xml:space="preserve"> = 374.5 + 0.02617 * MW - 2.0172e4 / MW - 273.15  # Температура кристаллизации парафина, [C]</w:t>
+        <w:t xml:space="preserve"> = 374.5 + 0.02617 * MW - 2.0172e4 / MW - </w:t>
+      </w:r>
+      <w:proofErr w:type="gramStart"/>
+      <w:r>
+        <w:t>273.15  #</w:t>
+      </w:r>
+      <w:proofErr w:type="gramEnd"/>
+      <w:r>
+        <w:t xml:space="preserve"> Температура кристаллизации парафина, [C]</w:t>
       </w:r>
     </w:p>
     <w:p>
@@ -29842,11 +31219,19 @@
       </w:r>
       <w:proofErr w:type="spellStart"/>
       <w:r>
-        <w:t>kal_to_J</w:t>
+        <w:t>kal_to_</w:t>
+      </w:r>
+      <w:proofErr w:type="gramStart"/>
+      <w:r>
+        <w:t>J</w:t>
       </w:r>
       <w:proofErr w:type="spellEnd"/>
       <w:r>
-        <w:t xml:space="preserve">  # Скрытая теплота плавления парафина, [J/</w:t>
+        <w:t xml:space="preserve">  #</w:t>
+      </w:r>
+      <w:proofErr w:type="gramEnd"/>
+      <w:r>
+        <w:t xml:space="preserve"> Скрытая теплота плавления парафина, [J/</w:t>
       </w:r>
       <w:proofErr w:type="spellStart"/>
       <w:r>

</xml_diff>

<commit_message>
update tezis and text dissertation
</commit_message>
<xml_diff>
--- a/resources/Лазарев диплом.docx
+++ b/resources/Лазарев диплом.docx
@@ -102,11 +102,7 @@
         <w:t>Направление</w:t>
       </w:r>
       <w:r>
-        <w:t xml:space="preserve"> </w:t>
-      </w:r>
-      <w:proofErr w:type="gramStart"/>
-      <w:r>
-        <w:t>подготовки</w:t>
+        <w:t xml:space="preserve"> подготовки</w:t>
       </w:r>
       <w:r>
         <w:t>:</w:t>
@@ -115,14 +111,7 @@
         <w:rPr>
           <w:u w:val="single"/>
         </w:rPr>
-        <w:t xml:space="preserve">  01.04.03</w:t>
-      </w:r>
-      <w:proofErr w:type="gramEnd"/>
-      <w:r>
-        <w:rPr>
-          <w:u w:val="single"/>
-        </w:rPr>
-        <w:t xml:space="preserve">  </w:t>
+        <w:t xml:space="preserve">  01.04.03  </w:t>
       </w:r>
       <w:r>
         <w:t xml:space="preserve"> –</w:t>
@@ -402,7 +391,6 @@
         <w:t xml:space="preserve">д. ф.- </w:t>
       </w:r>
       <w:proofErr w:type="spellStart"/>
-      <w:proofErr w:type="gramStart"/>
       <w:r>
         <w:rPr>
           <w:u w:val="single"/>
@@ -428,7 +416,6 @@
         </w:rPr>
         <w:t>,</w:t>
       </w:r>
-      <w:proofErr w:type="gramEnd"/>
       <w:r>
         <w:rPr>
           <w:u w:val="single"/>
@@ -581,7 +568,6 @@
         <w:t xml:space="preserve">д. ф.- </w:t>
       </w:r>
       <w:proofErr w:type="spellStart"/>
-      <w:proofErr w:type="gramStart"/>
       <w:r>
         <w:rPr>
           <w:u w:val="single"/>
@@ -605,14 +591,7 @@
         <w:rPr>
           <w:u w:val="single"/>
         </w:rPr>
-        <w:t>,</w:t>
-      </w:r>
-      <w:proofErr w:type="gramEnd"/>
-      <w:r>
-        <w:rPr>
-          <w:u w:val="single"/>
-        </w:rPr>
-        <w:t xml:space="preserve"> </w:t>
+        <w:t xml:space="preserve">, </w:t>
       </w:r>
       <w:r>
         <w:rPr>
@@ -2294,13 +2273,29 @@
         <w:t xml:space="preserve">открытой </w:t>
       </w:r>
       <w:r>
-        <w:t>пористости с 9% до 2</w:t>
-      </w:r>
-      <w:r>
-        <w:t>.</w:t>
-      </w:r>
-      <w:r>
-        <w:t xml:space="preserve">1%. </w:t>
+        <w:t xml:space="preserve">пористости с </w:t>
+      </w:r>
+      <m:oMath>
+        <m:r>
+          <w:rPr>
+            <w:rFonts w:ascii="Cambria Math" w:hAnsi="Cambria Math"/>
+          </w:rPr>
+          <m:t>9%</m:t>
+        </m:r>
+      </m:oMath>
+      <w:r>
+        <w:t xml:space="preserve"> до </w:t>
+      </w:r>
+      <m:oMath>
+        <m:r>
+          <w:rPr>
+            <w:rFonts w:ascii="Cambria Math" w:hAnsi="Cambria Math"/>
+          </w:rPr>
+          <m:t>2.1%.</m:t>
+        </m:r>
+      </m:oMath>
+      <w:r>
+        <w:t xml:space="preserve"> </w:t>
       </w:r>
     </w:p>
     <w:p>
@@ -2478,13 +2473,8 @@
       <w:r>
         <w:t xml:space="preserve"> </w:t>
       </w:r>
-      <w:proofErr w:type="gramStart"/>
-      <w:r>
-        <w:t>температуру</w:t>
-      </w:r>
-      <w:proofErr w:type="gramEnd"/>
-      <w:r>
-        <w:t xml:space="preserve"> </w:t>
+      <w:r>
+        <w:t xml:space="preserve">температуру </w:t>
       </w:r>
       <w:r>
         <w:t>начал</w:t>
@@ -3586,10 +3576,13 @@
         <w:t xml:space="preserve">, вода и парафин. Предполагается, </w:t>
       </w:r>
       <w:r>
-        <w:t>что ф</w:t>
-      </w:r>
-      <w:r>
-        <w:t xml:space="preserve">люиды </w:t>
+        <w:t xml:space="preserve">что </w:t>
+      </w:r>
+      <w:r>
+        <w:t>жидкости</w:t>
+      </w:r>
+      <w:r>
+        <w:t xml:space="preserve"> </w:t>
       </w:r>
       <w:r>
         <w:t>не</w:t>
@@ -7064,12 +7057,18 @@
         <w:jc w:val="both"/>
       </w:pPr>
       <w:r>
-        <w:t xml:space="preserve">Теплообмен в </w:t>
+        <w:t>В рассматриваемом случае т</w:t>
+      </w:r>
+      <w:r>
+        <w:t xml:space="preserve">еплообмен в </w:t>
       </w:r>
       <w:r>
         <w:t>пористой среде</w:t>
       </w:r>
       <w:r>
+        <w:t xml:space="preserve"> (ПС)</w:t>
+      </w:r>
+      <w:r>
         <w:t xml:space="preserve"> </w:t>
       </w:r>
       <w:r>
@@ -7121,7 +7120,7 @@
         <w:t xml:space="preserve">скелету </w:t>
       </w:r>
       <w:r>
-        <w:t>пористой среды</w:t>
+        <w:t>(ПС)</w:t>
       </w:r>
       <w:r>
         <w:t xml:space="preserve">. </w:t>
@@ -7163,7 +7162,13 @@
         <w:t xml:space="preserve"> Поэтому можно полагать, что </w:t>
       </w:r>
       <w:r>
-        <w:t>в некотором пространстве</w:t>
+        <w:t xml:space="preserve">в некотором </w:t>
+      </w:r>
+      <w:r>
+        <w:t xml:space="preserve">представительном объеме </w:t>
+      </w:r>
+      <w:r>
+        <w:t>(ПС)</w:t>
       </w:r>
       <w:r>
         <w:t xml:space="preserve"> </w:t>
@@ -7172,7 +7177,7 @@
         <w:t>температур</w:t>
       </w:r>
       <w:r>
-        <w:t>ы</w:t>
+        <w:t>а</w:t>
       </w:r>
       <w:r>
         <w:t xml:space="preserve"> </w:t>
@@ -7190,7 +7195,7 @@
         <w:t xml:space="preserve"> и пористого материала име</w:t>
       </w:r>
       <w:r>
-        <w:t>ю</w:t>
+        <w:t>е</w:t>
       </w:r>
       <w:r>
         <w:t xml:space="preserve">т одинаковое значение. </w:t>
@@ -7202,7 +7207,23 @@
         <w:t>уравнение баланса полной энергии всей системы при тепловом равновесии может быть</w:t>
       </w:r>
       <w:r>
-        <w:t xml:space="preserve"> записано </w:t>
+        <w:t xml:space="preserve"> записано</w:t>
+      </w:r>
+      <w:r>
+        <w:t xml:space="preserve"> следующим уравнением</w:t>
+      </w:r>
+    </w:p>
+    <w:p>
+      <w:pPr>
+        <w:ind w:firstLine="709"/>
+        <w:jc w:val="both"/>
+        <w:rPr>
+          <w:b/>
+          <w:bCs/>
+        </w:rPr>
+      </w:pPr>
+      <w:r>
+        <w:t xml:space="preserve"> </w:t>
       </w:r>
     </w:p>
     <w:p>
@@ -9610,7 +9631,7 @@
           <v:shape id="_x0000_i1025" type="#_x0000_t75" style="width:372pt;height:78pt" o:ole="">
             <v:imagedata r:id="rId8" o:title=""/>
           </v:shape>
-          <o:OLEObject Type="Embed" ProgID="Equation.DSMT4" ShapeID="_x0000_i1025" DrawAspect="Content" ObjectID="_1810566353" r:id="rId9"/>
+          <o:OLEObject Type="Embed" ProgID="Equation.DSMT4" ShapeID="_x0000_i1025" DrawAspect="Content" ObjectID="_1810839067" r:id="rId9"/>
         </w:object>
       </w:r>
     </w:p>
@@ -9638,7 +9659,7 @@
           <v:shape id="_x0000_i1026" type="#_x0000_t75" style="width:474pt;height:1in" o:ole="">
             <v:imagedata r:id="rId10" o:title=""/>
           </v:shape>
-          <o:OLEObject Type="Embed" ProgID="Equation.DSMT4" ShapeID="_x0000_i1026" DrawAspect="Content" ObjectID="_1810566354" r:id="rId11"/>
+          <o:OLEObject Type="Embed" ProgID="Equation.DSMT4" ShapeID="_x0000_i1026" DrawAspect="Content" ObjectID="_1810839068" r:id="rId11"/>
         </w:object>
       </w:r>
     </w:p>
@@ -10467,15 +10488,7 @@
           <w:sz w:val="26"/>
           <w:szCs w:val="26"/>
         </w:rPr>
-        <w:t xml:space="preserve">по </w:t>
-      </w:r>
-      <w:proofErr w:type="gramStart"/>
-      <w:r>
-        <w:rPr>
-          <w:sz w:val="26"/>
-          <w:szCs w:val="26"/>
-        </w:rPr>
-        <w:t xml:space="preserve">блоку  </w:t>
+        <w:t xml:space="preserve">по блоку  </w:t>
       </w:r>
       <w:r>
         <w:rPr>
@@ -10495,7 +10508,6 @@
         </w:rPr>
         <w:t>i</w:t>
       </w:r>
-      <w:proofErr w:type="gramEnd"/>
       <w:r>
         <w:rPr>
           <w:sz w:val="26"/>
@@ -15869,7 +15881,7 @@
           <v:shape id="_x0000_i1027" type="#_x0000_t75" style="width:42pt;height:24pt" o:ole="">
             <v:imagedata r:id="rId12" o:title=""/>
           </v:shape>
-          <o:OLEObject Type="Embed" ProgID="Equation.3" ShapeID="_x0000_i1027" DrawAspect="Content" ObjectID="_1810566355" r:id="rId13"/>
+          <o:OLEObject Type="Embed" ProgID="Equation.3" ShapeID="_x0000_i1027" DrawAspect="Content" ObjectID="_1810839069" r:id="rId13"/>
         </w:object>
       </w:r>
       <w:r>
@@ -15909,7 +15921,7 @@
           <v:shape id="_x0000_i1028" type="#_x0000_t75" style="width:78pt;height:42pt" o:ole="">
             <v:imagedata r:id="rId14" o:title=""/>
           </v:shape>
-          <o:OLEObject Type="Embed" ProgID="Equation.3" ShapeID="_x0000_i1028" DrawAspect="Content" ObjectID="_1810566356" r:id="rId15"/>
+          <o:OLEObject Type="Embed" ProgID="Equation.3" ShapeID="_x0000_i1028" DrawAspect="Content" ObjectID="_1810839070" r:id="rId15"/>
         </w:object>
       </w:r>
       <w:r>
@@ -15928,7 +15940,6 @@
           <w:szCs w:val="26"/>
         </w:rPr>
       </w:pPr>
-      <w:proofErr w:type="gramStart"/>
       <w:r>
         <w:rPr>
           <w:sz w:val="26"/>
@@ -15936,7 +15947,6 @@
         </w:rPr>
         <w:t>Символ  “</w:t>
       </w:r>
-      <w:proofErr w:type="gramEnd"/>
       <w:r>
         <w:rPr>
           <w:i/>
@@ -15974,7 +15984,7 @@
           <v:shape id="_x0000_i1029" type="#_x0000_t75" style="width:198pt;height:102pt" o:ole="">
             <v:imagedata r:id="rId16" o:title=""/>
           </v:shape>
-          <o:OLEObject Type="Embed" ProgID="Equation.3" ShapeID="_x0000_i1029" DrawAspect="Content" ObjectID="_1810566357" r:id="rId17"/>
+          <o:OLEObject Type="Embed" ProgID="Equation.3" ShapeID="_x0000_i1029" DrawAspect="Content" ObjectID="_1810839071" r:id="rId17"/>
         </w:object>
       </w:r>
     </w:p>
@@ -31229,15 +31239,7 @@
         <w:jc w:val="both"/>
       </w:pPr>
       <w:r>
-        <w:t xml:space="preserve">Пудовкин М.А., Саламатин А.Н., Чугунов В.А. Температурные процессы в действующих скважинах. - </w:t>
-      </w:r>
-      <w:proofErr w:type="gramStart"/>
-      <w:r>
-        <w:t>Казань :</w:t>
-      </w:r>
-      <w:proofErr w:type="gramEnd"/>
-      <w:r>
-        <w:t xml:space="preserve"> Изд-во Казан.унив-та. - 1977.- 168 с.</w:t>
+        <w:t>Пудовкин М.А., Саламатин А.Н., Чугунов В.А. Температурные процессы в действующих скважинах. - Казань : Изд-во Казан.унив-та. - 1977.- 168 с.</w:t>
       </w:r>
     </w:p>
     <w:p>
@@ -32190,15 +32192,7 @@
     </w:p>
     <w:p>
       <w:r>
-        <w:t xml:space="preserve">ro_w = </w:t>
-      </w:r>
-      <w:proofErr w:type="gramStart"/>
-      <w:r>
-        <w:t>1000.0  #</w:t>
-      </w:r>
-      <w:proofErr w:type="gramEnd"/>
-      <w:r>
-        <w:t xml:space="preserve"> Плотность воды, [кг/м^3]</w:t>
+        <w:t>ro_w = 1000.0  # Плотность воды, [кг/м^3]</w:t>
       </w:r>
     </w:p>
     <w:p>
@@ -32213,81 +32207,33 @@
     </w:p>
     <w:p>
       <w:r>
-        <w:t xml:space="preserve">ro_f = </w:t>
-      </w:r>
-      <w:proofErr w:type="gramStart"/>
-      <w:r>
-        <w:t>2500.0  #</w:t>
-      </w:r>
-      <w:proofErr w:type="gramEnd"/>
-      <w:r>
-        <w:t xml:space="preserve"> Плотность пласта, [кг/м^3]</w:t>
+        <w:t>ro_f = 2500.0  # Плотность пласта, [кг/м^3]</w:t>
       </w:r>
     </w:p>
     <w:p>
       <w:r>
-        <w:t>mu_w = 1.0 * cpoise_to_</w:t>
-      </w:r>
-      <w:proofErr w:type="gramStart"/>
-      <w:r>
-        <w:t>Pas  #</w:t>
-      </w:r>
-      <w:proofErr w:type="gramEnd"/>
-      <w:r>
-        <w:t xml:space="preserve"> Вязкость воды, [Па*с]</w:t>
+        <w:t>mu_w = 1.0 * cpoise_to_Pas  # Вязкость воды, [Па*с]</w:t>
       </w:r>
     </w:p>
     <w:p>
       <w:r>
-        <w:t>mu_o = 5.0 * cpoise_to_</w:t>
-      </w:r>
-      <w:proofErr w:type="gramStart"/>
-      <w:r>
-        <w:t>Pas  #</w:t>
-      </w:r>
-      <w:proofErr w:type="gramEnd"/>
-      <w:r>
-        <w:t xml:space="preserve"> Вязкость нефти, [Па*с]</w:t>
+        <w:t>mu_o = 5.0 * cpoise_to_Pas  # Вязкость нефти, [Па*с]</w:t>
       </w:r>
     </w:p>
     <w:p>
       <w:r>
-        <w:t xml:space="preserve">c_w = </w:t>
-      </w:r>
-      <w:proofErr w:type="gramStart"/>
-      <w:r>
-        <w:t>4200  #</w:t>
-      </w:r>
-      <w:proofErr w:type="gramEnd"/>
-      <w:r>
-        <w:t xml:space="preserve"> Теплоемкость воды, [Дж*кг/C]</w:t>
+        <w:t>c_w = 4200  # Теплоемкость воды, [Дж*кг/C]</w:t>
       </w:r>
     </w:p>
     <w:p>
       <w:r>
-        <w:t xml:space="preserve">c_o = </w:t>
-      </w:r>
-      <w:proofErr w:type="gramStart"/>
-      <w:r>
-        <w:t>2000  #</w:t>
-      </w:r>
-      <w:proofErr w:type="gramEnd"/>
-      <w:r>
-        <w:t xml:space="preserve"> Теплоемкость нефти, [Дж*кг/C]</w:t>
+        <w:t>c_o = 2000  # Теплоемкость нефти, [Дж*кг/C]</w:t>
       </w:r>
     </w:p>
     <w:p>
       <w:r>
         <w:lastRenderedPageBreak/>
-        <w:t xml:space="preserve">c_p = </w:t>
-      </w:r>
-      <w:proofErr w:type="gramStart"/>
-      <w:r>
-        <w:t>2200  #</w:t>
-      </w:r>
-      <w:proofErr w:type="gramEnd"/>
-      <w:r>
-        <w:t xml:space="preserve"> Теплоемкость парафина, [Дж*кг/C]</w:t>
+        <w:t>c_p = 2200  # Теплоемкость парафина, [Дж*кг/C]</w:t>
       </w:r>
     </w:p>
     <w:p>
@@ -32297,54 +32243,22 @@
     </w:p>
     <w:p>
       <w:r>
-        <w:t>K_</w:t>
-      </w:r>
-      <w:proofErr w:type="gramStart"/>
-      <w:r>
-        <w:t>p  =</w:t>
-      </w:r>
-      <w:proofErr w:type="gramEnd"/>
-      <w:r>
-        <w:t xml:space="preserve"> 0.2  # Теплопроводность парафина, Вт/(м·С)</w:t>
+        <w:t>K_p  = 0.2  # Теплопроводность парафина, Вт/(м·С)</w:t>
       </w:r>
     </w:p>
     <w:p>
       <w:r>
-        <w:t>K_</w:t>
-      </w:r>
-      <w:proofErr w:type="gramStart"/>
-      <w:r>
-        <w:t>w  =</w:t>
-      </w:r>
-      <w:proofErr w:type="gramEnd"/>
-      <w:r>
-        <w:t xml:space="preserve"> 0.6  # Теплопроводность воды, Вт/(м·С)</w:t>
+        <w:t>K_w  = 0.6  # Теплопроводность воды, Вт/(м·С)</w:t>
       </w:r>
     </w:p>
     <w:p>
       <w:r>
-        <w:t>K_</w:t>
-      </w:r>
-      <w:proofErr w:type="gramStart"/>
-      <w:r>
-        <w:t>o  =</w:t>
-      </w:r>
-      <w:proofErr w:type="gramEnd"/>
-      <w:r>
-        <w:t xml:space="preserve"> 0.12 # Теплопроводность нефти, Вт/(м·С)</w:t>
+        <w:t>K_o  = 0.12 # Теплопроводность нефти, Вт/(м·С)</w:t>
       </w:r>
     </w:p>
     <w:p>
       <w:r>
-        <w:t>K_</w:t>
-      </w:r>
-      <w:proofErr w:type="gramStart"/>
-      <w:r>
-        <w:t>f  =</w:t>
-      </w:r>
-      <w:proofErr w:type="gramEnd"/>
-      <w:r>
-        <w:t xml:space="preserve"> 2.0  # Теплопроводность пласта, Вт/(м·С)</w:t>
+        <w:t>K_f  = 2.0  # Теплопроводность пласта, Вт/(м·С)</w:t>
       </w:r>
     </w:p>
     <w:p/>
@@ -32359,13 +32273,8 @@
       </w:r>
     </w:p>
     <w:p>
-      <w:proofErr w:type="gramStart"/>
-      <w:r>
-        <w:t>Diff  =</w:t>
-      </w:r>
-      <w:proofErr w:type="gramEnd"/>
-      <w:r>
-        <w:t xml:space="preserve"> 2e-18  # Коэффициент диффузионного осаждения частиц, [м^2/с]</w:t>
+      <w:r>
+        <w:t>Diff  = 2e-18  # Коэффициент диффузионного осаждения частиц, [м^2/с]</w:t>
       </w:r>
     </w:p>
     <w:p>
@@ -32400,28 +32309,12 @@
     </w:p>
     <w:p>
       <w:r>
-        <w:t xml:space="preserve">Delta = </w:t>
-      </w:r>
-      <w:proofErr w:type="gramStart"/>
-      <w:r>
-        <w:t>0.005  #</w:t>
-      </w:r>
-      <w:proofErr w:type="gramEnd"/>
-      <w:r>
-        <w:t xml:space="preserve"> Кинетическая константа суффозии, [1/м]</w:t>
+        <w:t>Delta = 0.005  # Кинетическая константа суффозии, [1/м]</w:t>
       </w:r>
     </w:p>
     <w:p>
       <w:r>
-        <w:t xml:space="preserve">R     = </w:t>
-      </w:r>
-      <w:proofErr w:type="gramStart"/>
-      <w:r>
-        <w:t>8.31446261815324  #</w:t>
-      </w:r>
-      <w:proofErr w:type="gramEnd"/>
-      <w:r>
-        <w:t xml:space="preserve"> Газовая постоянная, [J</w:t>
+        <w:t>R     = 8.31446261815324  # Газовая постоянная, [J</w:t>
       </w:r>
       <w:r>
         <w:rPr>
@@ -32450,41 +32343,17 @@
     </w:p>
     <w:p>
       <w:r>
-        <w:t xml:space="preserve">MW = </w:t>
-      </w:r>
-      <w:proofErr w:type="gramStart"/>
-      <w:r>
-        <w:t>350.0  #</w:t>
-      </w:r>
-      <w:proofErr w:type="gramEnd"/>
-      <w:r>
-        <w:t xml:space="preserve"> Молекулярная масса</w:t>
+        <w:t>MW = 350.0  # Молекулярная масса</w:t>
       </w:r>
     </w:p>
     <w:p>
       <w:r>
-        <w:t xml:space="preserve">Tm = 374.5 + 0.02617 * MW - 2.0172e4 / MW - </w:t>
-      </w:r>
-      <w:proofErr w:type="gramStart"/>
-      <w:r>
-        <w:t>273.15  #</w:t>
-      </w:r>
-      <w:proofErr w:type="gramEnd"/>
-      <w:r>
-        <w:t xml:space="preserve"> Температура кристаллизации парафина, [C]</w:t>
+        <w:t>Tm = 374.5 + 0.02617 * MW - 2.0172e4 / MW - 273.15  # Температура кристаллизации парафина, [C]</w:t>
       </w:r>
     </w:p>
     <w:p>
       <w:r>
-        <w:t>alpha = 0.1426 * MW * Tm * kal_to_</w:t>
-      </w:r>
-      <w:proofErr w:type="gramStart"/>
-      <w:r>
-        <w:t>J  #</w:t>
-      </w:r>
-      <w:proofErr w:type="gramEnd"/>
-      <w:r>
-        <w:t xml:space="preserve"> Скрытая теплота плавления парафина, [J/gram-mol]</w:t>
+        <w:t>alpha = 0.1426 * MW * Tm * kal_to_J  # Скрытая теплота плавления парафина, [J/gram-mol]</w:t>
       </w:r>
     </w:p>
     <w:sectPr>

</xml_diff>

<commit_message>
upd abstracts and fix Wp calc
</commit_message>
<xml_diff>
--- a/resources/Лазарев диплом.docx
+++ b/resources/Лазарев диплом.docx
@@ -1906,13 +1906,31 @@
         <w:t>нагнетание воды с целью поддержания пластового давления.</w:t>
       </w:r>
       <w:r>
-        <w:t xml:space="preserve"> Но при этом может возникать множество негативных эффектов, ухудшающих фильтрационно</w:t>
+        <w:t xml:space="preserve"> </w:t>
+      </w:r>
+      <w:r>
+        <w:t xml:space="preserve">В случае, когда </w:t>
+      </w:r>
+      <w:r>
+        <w:t>температура нагнетаемой</w:t>
+      </w:r>
+      <w:r>
+        <w:t xml:space="preserve"> вода воды ниже температуры пласта,</w:t>
+      </w:r>
+      <w:r>
+        <w:t xml:space="preserve"> может возникать множество негативных эффектов, ухудшающих фильтрационно</w:t>
       </w:r>
       <w:r>
         <w:t>-</w:t>
       </w:r>
       <w:r>
-        <w:t xml:space="preserve">емкостные свойства пласта. </w:t>
+        <w:t xml:space="preserve">емкостные свойства </w:t>
+      </w:r>
+      <w:r>
+        <w:t>коллектора</w:t>
+      </w:r>
+      <w:r>
+        <w:t xml:space="preserve">. </w:t>
       </w:r>
       <w:r>
         <w:t xml:space="preserve">Наиболее яркий пример — отложение парафина. </w:t>
@@ -3621,13 +3639,31 @@
         <w:t>ами</w:t>
       </w:r>
       <w:r>
-        <w:t xml:space="preserve"> не происходит массопереноса</w:t>
+        <w:t xml:space="preserve"> не происходит массо</w:t>
+      </w:r>
+      <w:r>
+        <w:t>обмен</w:t>
       </w:r>
       <w:r>
         <w:t xml:space="preserve">. </w:t>
       </w:r>
       <w:r>
-        <w:t>Уравнения баланса масс записываются отдельно для каждого компонента</w:t>
+        <w:t>Уравнения баланса масс записываются для каждо</w:t>
+      </w:r>
+      <w:r>
+        <w:t>й</w:t>
+      </w:r>
+      <w:r>
+        <w:t xml:space="preserve"> </w:t>
+      </w:r>
+      <w:r>
+        <w:t>фазы</w:t>
+      </w:r>
+      <w:r>
+        <w:t xml:space="preserve"> </w:t>
+      </w:r>
+      <w:r>
+        <w:t>отдельно</w:t>
       </w:r>
       <w:r>
         <w:t>.</w:t>
@@ -3642,7 +3678,22 @@
         <w:t xml:space="preserve">, массовый баланс воды и нефти </w:t>
       </w:r>
       <w:r>
-        <w:t>имеет следующий вид:</w:t>
+        <w:t xml:space="preserve">соответственно </w:t>
+      </w:r>
+      <w:r>
+        <w:t>имеет следующий вид</w:t>
+      </w:r>
+      <w:r>
+        <w:t xml:space="preserve"> </w:t>
+      </w:r>
+      <w:r>
+        <w:rPr>
+          <w:highlight w:val="yellow"/>
+        </w:rPr>
+        <w:t>[Азиз]</w:t>
+      </w:r>
+      <w:r>
+        <w:t>:</w:t>
       </w:r>
     </w:p>
     <w:p>
@@ -4825,6 +4876,9 @@
       </w:r>
       <w:r>
         <w:t>]</w:t>
+      </w:r>
+      <w:r>
+        <w:t>:</w:t>
       </w:r>
       <w:r>
         <w:rPr>
@@ -5864,6 +5918,16 @@
                 </w:rPr>
                 <m:t>=1</m:t>
               </m:r>
+              <m:r>
+                <m:rPr>
+                  <m:lit/>
+                </m:rPr>
+                <w:rPr>
+                  <w:rFonts w:ascii="Cambria Math"/>
+                  <w:color w:val="000000" w:themeColor="text1"/>
+                </w:rPr>
+                <m:t>,</m:t>
+              </m:r>
             </m:e>
           </m:mr>
           <m:mr>
@@ -5971,7 +6035,7 @@
                 <w:rPr>
                   <w:rFonts w:ascii="Cambria Math"/>
                 </w:rPr>
-                <m:t>=1</m:t>
+                <m:t>=1.</m:t>
               </m:r>
             </m:e>
           </m:mr>
@@ -7165,10 +7229,7 @@
         <w:t xml:space="preserve">в некотором </w:t>
       </w:r>
       <w:r>
-        <w:t xml:space="preserve">представительном объеме </w:t>
-      </w:r>
-      <w:r>
-        <w:t>(ПС)</w:t>
+        <w:t>представительном объеме (ПС)</w:t>
       </w:r>
       <w:r>
         <w:t xml:space="preserve"> </w:t>
@@ -7215,16 +7276,2877 @@
     </w:p>
     <w:p>
       <w:pPr>
-        <w:ind w:firstLine="709"/>
         <w:jc w:val="both"/>
         <w:rPr>
-          <w:b/>
-          <w:bCs/>
+          <w:rFonts w:eastAsiaTheme="minorEastAsia"/>
+          <w:i/>
+          <w:lang w:val="en-US"/>
         </w:rPr>
       </w:pPr>
-      <w:r>
+      <m:oMathPara>
+        <m:oMath>
+          <m:f>
+            <m:fPr>
+              <m:ctrlPr>
+                <w:rPr>
+                  <w:rFonts w:ascii="Cambria Math" w:hAnsi="Cambria Math"/>
+                  <w:i/>
+                  <w:lang w:val="en-US"/>
+                </w:rPr>
+              </m:ctrlPr>
+            </m:fPr>
+            <m:num>
+              <m:r>
+                <w:rPr>
+                  <w:rFonts w:ascii="Cambria Math"/>
+                </w:rPr>
+                <m:t>∂</m:t>
+              </m:r>
+            </m:num>
+            <m:den>
+              <m:r>
+                <w:rPr>
+                  <w:rFonts w:ascii="Cambria Math"/>
+                </w:rPr>
+                <m:t>∂</m:t>
+              </m:r>
+              <m:r>
+                <w:rPr>
+                  <w:rFonts w:ascii="Cambria Math"/>
+                  <w:lang w:val="en-US"/>
+                </w:rPr>
+                <m:t>t</m:t>
+              </m:r>
+            </m:den>
+          </m:f>
+          <m:r>
+            <w:rPr>
+              <w:rFonts w:ascii="Cambria Math"/>
+            </w:rPr>
+            <m:t>[</m:t>
+          </m:r>
+          <m:r>
+            <w:rPr>
+              <w:rFonts w:ascii="Cambria Math"/>
+              <w:lang w:val="en-US"/>
+            </w:rPr>
+            <m:t xml:space="preserve">m </m:t>
+          </m:r>
+          <m:sSub>
+            <m:sSubPr>
+              <m:ctrlPr>
+                <w:rPr>
+                  <w:rFonts w:ascii="Cambria Math" w:hAnsi="Cambria Math"/>
+                  <w:i/>
+                  <w:lang w:val="en-US"/>
+                </w:rPr>
+              </m:ctrlPr>
+            </m:sSubPr>
+            <m:e>
+              <m:r>
+                <w:rPr>
+                  <w:rFonts w:ascii="Cambria Math"/>
+                  <w:lang w:val="en-US"/>
+                </w:rPr>
+                <m:t>S</m:t>
+              </m:r>
+            </m:e>
+            <m:sub>
+              <m:r>
+                <w:rPr>
+                  <w:rFonts w:ascii="Cambria Math"/>
+                  <w:lang w:val="en-US"/>
+                </w:rPr>
+                <m:t>w</m:t>
+              </m:r>
+            </m:sub>
+          </m:sSub>
+          <m:sSub>
+            <m:sSubPr>
+              <m:ctrlPr>
+                <w:rPr>
+                  <w:rFonts w:ascii="Cambria Math" w:hAnsi="Cambria Math"/>
+                  <w:i/>
+                  <w:lang w:val="en-US"/>
+                </w:rPr>
+              </m:ctrlPr>
+            </m:sSubPr>
+            <m:e>
+              <m:r>
+                <w:rPr>
+                  <w:rFonts w:ascii="Cambria Math"/>
+                  <w:lang w:val="en-US"/>
+                </w:rPr>
+                <m:t>ρ</m:t>
+              </m:r>
+            </m:e>
+            <m:sub>
+              <m:r>
+                <w:rPr>
+                  <w:rFonts w:ascii="Cambria Math"/>
+                  <w:lang w:val="en-US"/>
+                </w:rPr>
+                <m:t>w</m:t>
+              </m:r>
+            </m:sub>
+          </m:sSub>
+          <m:sSub>
+            <m:sSubPr>
+              <m:ctrlPr>
+                <w:rPr>
+                  <w:rFonts w:ascii="Cambria Math" w:hAnsi="Cambria Math"/>
+                  <w:i/>
+                  <w:lang w:val="en-US"/>
+                </w:rPr>
+              </m:ctrlPr>
+            </m:sSubPr>
+            <m:e>
+              <m:r>
+                <w:rPr>
+                  <w:rFonts w:ascii="Cambria Math"/>
+                  <w:lang w:val="en-US"/>
+                </w:rPr>
+                <m:t>H</m:t>
+              </m:r>
+            </m:e>
+            <m:sub>
+              <m:r>
+                <w:rPr>
+                  <w:rFonts w:ascii="Cambria Math"/>
+                  <w:lang w:val="en-US"/>
+                </w:rPr>
+                <m:t>w</m:t>
+              </m:r>
+            </m:sub>
+          </m:sSub>
+          <m:r>
+            <w:rPr>
+              <w:rFonts w:ascii="Cambria Math"/>
+            </w:rPr>
+            <m:t>+</m:t>
+          </m:r>
+          <m:r>
+            <w:rPr>
+              <w:rFonts w:ascii="Cambria Math"/>
+              <w:lang w:val="en-US"/>
+            </w:rPr>
+            <m:t xml:space="preserve">m </m:t>
+          </m:r>
+          <m:sSub>
+            <m:sSubPr>
+              <m:ctrlPr>
+                <w:rPr>
+                  <w:rFonts w:ascii="Cambria Math" w:hAnsi="Cambria Math"/>
+                  <w:i/>
+                  <w:lang w:val="en-US"/>
+                </w:rPr>
+              </m:ctrlPr>
+            </m:sSubPr>
+            <m:e>
+              <m:r>
+                <w:rPr>
+                  <w:rFonts w:ascii="Cambria Math"/>
+                  <w:lang w:val="en-US"/>
+                </w:rPr>
+                <m:t>S</m:t>
+              </m:r>
+            </m:e>
+            <m:sub>
+              <m:r>
+                <w:rPr>
+                  <w:rFonts w:ascii="Cambria Math"/>
+                  <w:lang w:val="en-US"/>
+                </w:rPr>
+                <m:t>o</m:t>
+              </m:r>
+            </m:sub>
+          </m:sSub>
+          <m:sSub>
+            <m:sSubPr>
+              <m:ctrlPr>
+                <w:rPr>
+                  <w:rFonts w:ascii="Cambria Math" w:hAnsi="Cambria Math"/>
+                  <w:i/>
+                  <w:lang w:val="en-US"/>
+                </w:rPr>
+              </m:ctrlPr>
+            </m:sSubPr>
+            <m:e>
+              <m:r>
+                <w:rPr>
+                  <w:rFonts w:ascii="Cambria Math"/>
+                  <w:lang w:val="en-US"/>
+                </w:rPr>
+                <m:t>ρ</m:t>
+              </m:r>
+            </m:e>
+            <m:sub>
+              <m:r>
+                <w:rPr>
+                  <w:rFonts w:ascii="Cambria Math"/>
+                  <w:lang w:val="en-US"/>
+                </w:rPr>
+                <m:t>o</m:t>
+              </m:r>
+            </m:sub>
+          </m:sSub>
+          <m:sSub>
+            <m:sSubPr>
+              <m:ctrlPr>
+                <w:rPr>
+                  <w:rFonts w:ascii="Cambria Math" w:hAnsi="Cambria Math"/>
+                  <w:i/>
+                  <w:lang w:val="en-US"/>
+                </w:rPr>
+              </m:ctrlPr>
+            </m:sSubPr>
+            <m:e>
+              <m:r>
+                <w:rPr>
+                  <w:rFonts w:ascii="Cambria Math"/>
+                  <w:lang w:val="en-US"/>
+                </w:rPr>
+                <m:t>H</m:t>
+              </m:r>
+            </m:e>
+            <m:sub>
+              <m:r>
+                <w:rPr>
+                  <w:rFonts w:ascii="Cambria Math"/>
+                  <w:lang w:val="en-US"/>
+                </w:rPr>
+                <m:t>o</m:t>
+              </m:r>
+            </m:sub>
+          </m:sSub>
+          <m:r>
+            <w:rPr>
+              <w:rFonts w:ascii="Cambria Math"/>
+            </w:rPr>
+            <m:t>(1</m:t>
+          </m:r>
+          <m:r>
+            <w:rPr>
+              <w:rFonts w:ascii="Cambria Math"/>
+            </w:rPr>
+            <m:t>-</m:t>
+          </m:r>
+          <m:r>
+            <w:rPr>
+              <w:rFonts w:ascii="Cambria Math"/>
+            </w:rPr>
+            <m:t xml:space="preserve"> </m:t>
+          </m:r>
+          <m:sSub>
+            <m:sSubPr>
+              <m:ctrlPr>
+                <w:rPr>
+                  <w:rFonts w:ascii="Cambria Math" w:hAnsi="Cambria Math"/>
+                  <w:i/>
+                  <w:lang w:val="en-US"/>
+                </w:rPr>
+              </m:ctrlPr>
+            </m:sSubPr>
+            <m:e>
+              <m:r>
+                <w:rPr>
+                  <w:rFonts w:ascii="Cambria Math"/>
+                  <w:lang w:val="en-US"/>
+                </w:rPr>
+                <m:t>w</m:t>
+              </m:r>
+            </m:e>
+            <m:sub>
+              <m:r>
+                <w:rPr>
+                  <w:rFonts w:ascii="Cambria Math"/>
+                  <w:lang w:val="en-US"/>
+                </w:rPr>
+                <m:t>ps</m:t>
+              </m:r>
+            </m:sub>
+          </m:sSub>
+          <m:r>
+            <w:rPr>
+              <w:rFonts w:ascii="Cambria Math"/>
+            </w:rPr>
+            <m:t>)+</m:t>
+          </m:r>
+          <m:r>
+            <w:rPr>
+              <w:rFonts w:ascii="Cambria Math"/>
+              <w:lang w:val="en-US"/>
+            </w:rPr>
+            <m:t>m</m:t>
+          </m:r>
+          <m:sSub>
+            <m:sSubPr>
+              <m:ctrlPr>
+                <w:rPr>
+                  <w:rFonts w:ascii="Cambria Math" w:hAnsi="Cambria Math"/>
+                  <w:i/>
+                  <w:lang w:val="en-US"/>
+                </w:rPr>
+              </m:ctrlPr>
+            </m:sSubPr>
+            <m:e>
+              <m:r>
+                <w:rPr>
+                  <w:rFonts w:ascii="Cambria Math"/>
+                  <w:lang w:val="en-US"/>
+                </w:rPr>
+                <m:t>S</m:t>
+              </m:r>
+            </m:e>
+            <m:sub>
+              <m:r>
+                <w:rPr>
+                  <w:rFonts w:ascii="Cambria Math"/>
+                  <w:lang w:val="en-US"/>
+                </w:rPr>
+                <m:t>o</m:t>
+              </m:r>
+            </m:sub>
+          </m:sSub>
+          <m:sSub>
+            <m:sSubPr>
+              <m:ctrlPr>
+                <w:rPr>
+                  <w:rFonts w:ascii="Cambria Math" w:hAnsi="Cambria Math"/>
+                  <w:i/>
+                  <w:lang w:val="en-US"/>
+                </w:rPr>
+              </m:ctrlPr>
+            </m:sSubPr>
+            <m:e>
+              <m:r>
+                <w:rPr>
+                  <w:rFonts w:ascii="Cambria Math"/>
+                  <w:lang w:val="en-US"/>
+                </w:rPr>
+                <m:t>w</m:t>
+              </m:r>
+            </m:e>
+            <m:sub>
+              <m:r>
+                <w:rPr>
+                  <w:rFonts w:ascii="Cambria Math"/>
+                  <w:lang w:val="en-US"/>
+                </w:rPr>
+                <m:t>ps</m:t>
+              </m:r>
+            </m:sub>
+          </m:sSub>
+          <m:sSub>
+            <m:sSubPr>
+              <m:ctrlPr>
+                <w:rPr>
+                  <w:rFonts w:ascii="Cambria Math" w:hAnsi="Cambria Math"/>
+                  <w:i/>
+                  <w:lang w:val="en-US"/>
+                </w:rPr>
+              </m:ctrlPr>
+            </m:sSubPr>
+            <m:e>
+              <m:r>
+                <w:rPr>
+                  <w:rFonts w:ascii="Cambria Math"/>
+                  <w:lang w:val="en-US"/>
+                </w:rPr>
+                <m:t>ρ</m:t>
+              </m:r>
+            </m:e>
+            <m:sub>
+              <m:r>
+                <w:rPr>
+                  <w:rFonts w:ascii="Cambria Math"/>
+                  <w:lang w:val="en-US"/>
+                </w:rPr>
+                <m:t>p</m:t>
+              </m:r>
+            </m:sub>
+          </m:sSub>
+          <m:sSub>
+            <m:sSubPr>
+              <m:ctrlPr>
+                <w:rPr>
+                  <w:rFonts w:ascii="Cambria Math" w:hAnsi="Cambria Math"/>
+                  <w:i/>
+                  <w:lang w:val="en-US"/>
+                </w:rPr>
+              </m:ctrlPr>
+            </m:sSubPr>
+            <m:e>
+              <m:r>
+                <w:rPr>
+                  <w:rFonts w:ascii="Cambria Math"/>
+                  <w:lang w:val="en-US"/>
+                </w:rPr>
+                <m:t>H</m:t>
+              </m:r>
+            </m:e>
+            <m:sub>
+              <m:r>
+                <w:rPr>
+                  <w:rFonts w:ascii="Cambria Math"/>
+                  <w:lang w:val="en-US"/>
+                </w:rPr>
+                <m:t>p</m:t>
+              </m:r>
+            </m:sub>
+          </m:sSub>
+          <m:r>
+            <w:rPr>
+              <w:rFonts w:ascii="Cambria Math"/>
+            </w:rPr>
+            <m:t>+(1</m:t>
+          </m:r>
+          <m:r>
+            <w:rPr>
+              <w:rFonts w:ascii="Cambria Math"/>
+            </w:rPr>
+            <m:t>-</m:t>
+          </m:r>
+          <m:r>
+            <w:rPr>
+              <w:rFonts w:ascii="Cambria Math"/>
+              <w:lang w:val="en-US"/>
+            </w:rPr>
+            <m:t>m</m:t>
+          </m:r>
+          <m:r>
+            <w:rPr>
+              <w:rFonts w:ascii="Cambria Math"/>
+            </w:rPr>
+            <m:t>)</m:t>
+          </m:r>
+          <m:sSub>
+            <m:sSubPr>
+              <m:ctrlPr>
+                <w:rPr>
+                  <w:rFonts w:ascii="Cambria Math" w:hAnsi="Cambria Math"/>
+                  <w:i/>
+                  <w:lang w:val="en-US"/>
+                </w:rPr>
+              </m:ctrlPr>
+            </m:sSubPr>
+            <m:e>
+              <m:r>
+                <w:rPr>
+                  <w:rFonts w:ascii="Cambria Math"/>
+                  <w:lang w:val="en-US"/>
+                </w:rPr>
+                <m:t>ρ</m:t>
+              </m:r>
+            </m:e>
+            <m:sub>
+              <m:r>
+                <w:rPr>
+                  <w:rFonts w:ascii="Cambria Math"/>
+                  <w:lang w:val="en-US"/>
+                </w:rPr>
+                <m:t>f</m:t>
+              </m:r>
+            </m:sub>
+          </m:sSub>
+          <m:sSub>
+            <m:sSubPr>
+              <m:ctrlPr>
+                <w:rPr>
+                  <w:rFonts w:ascii="Cambria Math" w:hAnsi="Cambria Math"/>
+                  <w:i/>
+                  <w:lang w:val="en-US"/>
+                </w:rPr>
+              </m:ctrlPr>
+            </m:sSubPr>
+            <m:e>
+              <m:r>
+                <w:rPr>
+                  <w:rFonts w:ascii="Cambria Math"/>
+                  <w:lang w:val="en-US"/>
+                </w:rPr>
+                <m:t>H</m:t>
+              </m:r>
+            </m:e>
+            <m:sub>
+              <m:r>
+                <w:rPr>
+                  <w:rFonts w:ascii="Cambria Math"/>
+                  <w:lang w:val="en-US"/>
+                </w:rPr>
+                <m:t>f</m:t>
+              </m:r>
+            </m:sub>
+          </m:sSub>
+          <m:r>
+            <w:rPr>
+              <w:rFonts w:ascii="Cambria Math"/>
+            </w:rPr>
+            <m:t>]+</m:t>
+          </m:r>
+          <m:r>
+            <w:rPr>
+              <w:rFonts w:ascii="Cambria Math" w:hAnsi="Cambria Math" w:cs="Cambria Math"/>
+            </w:rPr>
+            <m:t>∇</m:t>
+          </m:r>
+          <m:r>
+            <w:rPr>
+              <w:rFonts w:ascii="Cambria Math"/>
+            </w:rPr>
+            <m:t>(</m:t>
+          </m:r>
+          <m:sSub>
+            <m:sSubPr>
+              <m:ctrlPr>
+                <w:rPr>
+                  <w:rFonts w:ascii="Cambria Math" w:hAnsi="Cambria Math"/>
+                  <w:i/>
+                  <w:lang w:val="en-US"/>
+                </w:rPr>
+              </m:ctrlPr>
+            </m:sSubPr>
+            <m:e>
+              <m:r>
+                <w:rPr>
+                  <w:rFonts w:ascii="Cambria Math"/>
+                  <w:lang w:val="en-US"/>
+                </w:rPr>
+                <m:t>ρ</m:t>
+              </m:r>
+            </m:e>
+            <m:sub>
+              <m:r>
+                <w:rPr>
+                  <w:rFonts w:ascii="Cambria Math"/>
+                  <w:lang w:val="en-US"/>
+                </w:rPr>
+                <m:t>w</m:t>
+              </m:r>
+            </m:sub>
+          </m:sSub>
+          <m:sSub>
+            <m:sSubPr>
+              <m:ctrlPr>
+                <w:rPr>
+                  <w:rFonts w:ascii="Cambria Math" w:hAnsi="Cambria Math"/>
+                  <w:i/>
+                  <w:lang w:val="en-US"/>
+                </w:rPr>
+              </m:ctrlPr>
+            </m:sSubPr>
+            <m:e>
+              <m:r>
+                <w:rPr>
+                  <w:rFonts w:ascii="Cambria Math"/>
+                  <w:lang w:val="en-US"/>
+                </w:rPr>
+                <m:t>H</m:t>
+              </m:r>
+            </m:e>
+            <m:sub>
+              <m:r>
+                <w:rPr>
+                  <w:rFonts w:ascii="Cambria Math"/>
+                  <w:lang w:val="en-US"/>
+                </w:rPr>
+                <m:t>w</m:t>
+              </m:r>
+            </m:sub>
+          </m:sSub>
+          <m:sSub>
+            <m:sSubPr>
+              <m:ctrlPr>
+                <w:rPr>
+                  <w:rFonts w:ascii="Cambria Math" w:hAnsi="Cambria Math"/>
+                  <w:i/>
+                  <w:lang w:val="en-US"/>
+                </w:rPr>
+              </m:ctrlPr>
+            </m:sSubPr>
+            <m:e>
+              <m:r>
+                <w:rPr>
+                  <w:rFonts w:ascii="Cambria Math"/>
+                  <w:lang w:val="en-US"/>
+                </w:rPr>
+                <m:t>U</m:t>
+              </m:r>
+            </m:e>
+            <m:sub>
+              <m:r>
+                <w:rPr>
+                  <w:rFonts w:ascii="Cambria Math"/>
+                  <w:lang w:val="en-US"/>
+                </w:rPr>
+                <m:t>w</m:t>
+              </m:r>
+            </m:sub>
+          </m:sSub>
+          <m:r>
+            <w:rPr>
+              <w:rFonts w:ascii="Cambria Math"/>
+            </w:rPr>
+            <m:t>+(1</m:t>
+          </m:r>
+          <m:r>
+            <w:rPr>
+              <w:rFonts w:ascii="Cambria Math"/>
+            </w:rPr>
+            <m:t>-</m:t>
+          </m:r>
+          <m:sSub>
+            <m:sSubPr>
+              <m:ctrlPr>
+                <w:rPr>
+                  <w:rFonts w:ascii="Cambria Math" w:hAnsi="Cambria Math"/>
+                  <w:i/>
+                  <w:lang w:val="en-US"/>
+                </w:rPr>
+              </m:ctrlPr>
+            </m:sSubPr>
+            <m:e>
+              <m:r>
+                <w:rPr>
+                  <w:rFonts w:ascii="Cambria Math"/>
+                  <w:lang w:val="en-US"/>
+                </w:rPr>
+                <m:t>w</m:t>
+              </m:r>
+            </m:e>
+            <m:sub>
+              <m:r>
+                <w:rPr>
+                  <w:rFonts w:ascii="Cambria Math"/>
+                  <w:lang w:val="en-US"/>
+                </w:rPr>
+                <m:t>ps</m:t>
+              </m:r>
+            </m:sub>
+          </m:sSub>
+          <m:r>
+            <w:rPr>
+              <w:rFonts w:ascii="Cambria Math"/>
+            </w:rPr>
+            <m:t>)</m:t>
+          </m:r>
+          <m:sSub>
+            <m:sSubPr>
+              <m:ctrlPr>
+                <w:rPr>
+                  <w:rFonts w:ascii="Cambria Math" w:hAnsi="Cambria Math"/>
+                  <w:i/>
+                  <w:lang w:val="en-US"/>
+                </w:rPr>
+              </m:ctrlPr>
+            </m:sSubPr>
+            <m:e>
+              <m:r>
+                <w:rPr>
+                  <w:rFonts w:ascii="Cambria Math"/>
+                  <w:lang w:val="en-US"/>
+                </w:rPr>
+                <m:t>ρ</m:t>
+              </m:r>
+            </m:e>
+            <m:sub>
+              <m:r>
+                <w:rPr>
+                  <w:rFonts w:ascii="Cambria Math"/>
+                  <w:lang w:val="en-US"/>
+                </w:rPr>
+                <m:t>o</m:t>
+              </m:r>
+            </m:sub>
+          </m:sSub>
+          <m:sSub>
+            <m:sSubPr>
+              <m:ctrlPr>
+                <w:rPr>
+                  <w:rFonts w:ascii="Cambria Math" w:hAnsi="Cambria Math"/>
+                  <w:i/>
+                  <w:lang w:val="en-US"/>
+                </w:rPr>
+              </m:ctrlPr>
+            </m:sSubPr>
+            <m:e>
+              <m:r>
+                <w:rPr>
+                  <w:rFonts w:ascii="Cambria Math"/>
+                  <w:lang w:val="en-US"/>
+                </w:rPr>
+                <m:t>U</m:t>
+              </m:r>
+            </m:e>
+            <m:sub>
+              <m:r>
+                <w:rPr>
+                  <w:rFonts w:ascii="Cambria Math"/>
+                  <w:lang w:val="en-US"/>
+                </w:rPr>
+                <m:t>o</m:t>
+              </m:r>
+            </m:sub>
+          </m:sSub>
+          <m:sSub>
+            <m:sSubPr>
+              <m:ctrlPr>
+                <w:rPr>
+                  <w:rFonts w:ascii="Cambria Math" w:hAnsi="Cambria Math"/>
+                  <w:i/>
+                  <w:lang w:val="en-US"/>
+                </w:rPr>
+              </m:ctrlPr>
+            </m:sSubPr>
+            <m:e>
+              <m:r>
+                <w:rPr>
+                  <w:rFonts w:ascii="Cambria Math"/>
+                  <w:lang w:val="en-US"/>
+                </w:rPr>
+                <m:t>H</m:t>
+              </m:r>
+            </m:e>
+            <m:sub>
+              <m:r>
+                <w:rPr>
+                  <w:rFonts w:ascii="Cambria Math"/>
+                  <w:lang w:val="en-US"/>
+                </w:rPr>
+                <m:t>o</m:t>
+              </m:r>
+            </m:sub>
+          </m:sSub>
+          <m:r>
+            <w:rPr>
+              <w:rFonts w:ascii="Cambria Math"/>
+            </w:rPr>
+            <m:t>+</m:t>
+          </m:r>
+          <m:sSub>
+            <m:sSubPr>
+              <m:ctrlPr>
+                <w:rPr>
+                  <w:rFonts w:ascii="Cambria Math" w:hAnsi="Cambria Math"/>
+                  <w:i/>
+                  <w:lang w:val="en-US"/>
+                </w:rPr>
+              </m:ctrlPr>
+            </m:sSubPr>
+            <m:e>
+              <m:r>
+                <w:rPr>
+                  <w:rFonts w:ascii="Cambria Math"/>
+                  <w:lang w:val="en-US"/>
+                </w:rPr>
+                <m:t>ρ</m:t>
+              </m:r>
+            </m:e>
+            <m:sub>
+              <m:r>
+                <w:rPr>
+                  <w:rFonts w:ascii="Cambria Math"/>
+                  <w:lang w:val="en-US"/>
+                </w:rPr>
+                <m:t>p</m:t>
+              </m:r>
+            </m:sub>
+          </m:sSub>
+          <m:sSub>
+            <m:sSubPr>
+              <m:ctrlPr>
+                <w:rPr>
+                  <w:rFonts w:ascii="Cambria Math" w:hAnsi="Cambria Math"/>
+                  <w:i/>
+                  <w:lang w:val="en-US"/>
+                </w:rPr>
+              </m:ctrlPr>
+            </m:sSubPr>
+            <m:e>
+              <m:r>
+                <w:rPr>
+                  <w:rFonts w:ascii="Cambria Math"/>
+                  <w:lang w:val="en-US"/>
+                </w:rPr>
+                <m:t>w</m:t>
+              </m:r>
+            </m:e>
+            <m:sub>
+              <m:r>
+                <w:rPr>
+                  <w:rFonts w:ascii="Cambria Math"/>
+                  <w:lang w:val="en-US"/>
+                </w:rPr>
+                <m:t>ps</m:t>
+              </m:r>
+            </m:sub>
+          </m:sSub>
+          <m:sSub>
+            <m:sSubPr>
+              <m:ctrlPr>
+                <w:rPr>
+                  <w:rFonts w:ascii="Cambria Math" w:hAnsi="Cambria Math"/>
+                  <w:i/>
+                  <w:lang w:val="en-US"/>
+                </w:rPr>
+              </m:ctrlPr>
+            </m:sSubPr>
+            <m:e>
+              <m:r>
+                <w:rPr>
+                  <w:rFonts w:ascii="Cambria Math"/>
+                  <w:lang w:val="en-US"/>
+                </w:rPr>
+                <m:t>U</m:t>
+              </m:r>
+            </m:e>
+            <m:sub>
+              <m:r>
+                <w:rPr>
+                  <w:rFonts w:ascii="Cambria Math"/>
+                  <w:lang w:val="en-US"/>
+                </w:rPr>
+                <m:t>o</m:t>
+              </m:r>
+            </m:sub>
+          </m:sSub>
+          <m:sSub>
+            <m:sSubPr>
+              <m:ctrlPr>
+                <w:rPr>
+                  <w:rFonts w:ascii="Cambria Math" w:hAnsi="Cambria Math"/>
+                  <w:i/>
+                  <w:lang w:val="en-US"/>
+                </w:rPr>
+              </m:ctrlPr>
+            </m:sSubPr>
+            <m:e>
+              <m:r>
+                <w:rPr>
+                  <w:rFonts w:ascii="Cambria Math"/>
+                  <w:lang w:val="en-US"/>
+                </w:rPr>
+                <m:t>H</m:t>
+              </m:r>
+            </m:e>
+            <m:sub>
+              <m:r>
+                <w:rPr>
+                  <w:rFonts w:ascii="Cambria Math"/>
+                  <w:lang w:val="en-US"/>
+                </w:rPr>
+                <m:t>p</m:t>
+              </m:r>
+            </m:sub>
+          </m:sSub>
+          <m:r>
+            <w:rPr>
+              <w:rFonts w:ascii="Cambria Math"/>
+            </w:rPr>
+            <m:t>)=</m:t>
+          </m:r>
+          <m:r>
+            <w:rPr>
+              <w:rFonts w:ascii="Cambria Math" w:hAnsi="Cambria Math" w:cs="Cambria Math"/>
+            </w:rPr>
+            <m:t>∇</m:t>
+          </m:r>
+          <m:d>
+            <m:dPr>
+              <m:begChr m:val="{"/>
+              <m:endChr m:val="}"/>
+              <m:ctrlPr>
+                <w:rPr>
+                  <w:rFonts w:ascii="Cambria Math" w:hAnsi="Cambria Math"/>
+                  <w:i/>
+                  <w:lang w:val="en-US"/>
+                </w:rPr>
+              </m:ctrlPr>
+            </m:dPr>
+            <m:e>
+              <m:d>
+                <m:dPr>
+                  <m:begChr m:val="["/>
+                  <m:endChr m:val="]"/>
+                  <m:ctrlPr>
+                    <w:rPr>
+                      <w:rFonts w:ascii="Cambria Math" w:hAnsi="Cambria Math"/>
+                      <w:i/>
+                      <w:lang w:val="en-US"/>
+                    </w:rPr>
+                  </m:ctrlPr>
+                </m:dPr>
+                <m:e>
+                  <m:r>
+                    <w:rPr>
+                      <w:rFonts w:ascii="Cambria Math"/>
+                      <w:lang w:val="en-US"/>
+                    </w:rPr>
+                    <m:t xml:space="preserve">m </m:t>
+                  </m:r>
+                  <m:sSub>
+                    <m:sSubPr>
+                      <m:ctrlPr>
+                        <w:rPr>
+                          <w:rFonts w:ascii="Cambria Math" w:hAnsi="Cambria Math"/>
+                          <w:i/>
+                          <w:lang w:val="en-US"/>
+                        </w:rPr>
+                      </m:ctrlPr>
+                    </m:sSubPr>
+                    <m:e>
+                      <m:r>
+                        <w:rPr>
+                          <w:rFonts w:ascii="Cambria Math"/>
+                          <w:lang w:val="en-US"/>
+                        </w:rPr>
+                        <m:t>S</m:t>
+                      </m:r>
+                    </m:e>
+                    <m:sub>
+                      <m:r>
+                        <w:rPr>
+                          <w:rFonts w:ascii="Cambria Math"/>
+                          <w:lang w:val="en-US"/>
+                        </w:rPr>
+                        <m:t>w</m:t>
+                      </m:r>
+                    </m:sub>
+                  </m:sSub>
+                  <m:sSub>
+                    <m:sSubPr>
+                      <m:ctrlPr>
+                        <w:rPr>
+                          <w:rFonts w:ascii="Cambria Math" w:hAnsi="Cambria Math"/>
+                          <w:i/>
+                          <w:lang w:val="en-US"/>
+                        </w:rPr>
+                      </m:ctrlPr>
+                    </m:sSubPr>
+                    <m:e>
+                      <m:r>
+                        <w:rPr>
+                          <w:rFonts w:ascii="Cambria Math"/>
+                          <w:lang w:val="en-US"/>
+                        </w:rPr>
+                        <m:t>K</m:t>
+                      </m:r>
+                    </m:e>
+                    <m:sub>
+                      <m:r>
+                        <w:rPr>
+                          <w:rFonts w:ascii="Cambria Math"/>
+                          <w:lang w:val="en-US"/>
+                        </w:rPr>
+                        <m:t>w</m:t>
+                      </m:r>
+                    </m:sub>
+                  </m:sSub>
+                  <m:r>
+                    <w:rPr>
+                      <w:rFonts w:ascii="Cambria Math"/>
+                    </w:rPr>
+                    <m:t>+</m:t>
+                  </m:r>
+                  <m:r>
+                    <w:rPr>
+                      <w:rFonts w:ascii="Cambria Math"/>
+                      <w:lang w:val="en-US"/>
+                    </w:rPr>
+                    <m:t>m</m:t>
+                  </m:r>
+                  <m:sSub>
+                    <m:sSubPr>
+                      <m:ctrlPr>
+                        <w:rPr>
+                          <w:rFonts w:ascii="Cambria Math" w:hAnsi="Cambria Math"/>
+                          <w:i/>
+                          <w:lang w:val="en-US"/>
+                        </w:rPr>
+                      </m:ctrlPr>
+                    </m:sSubPr>
+                    <m:e>
+                      <m:r>
+                        <w:rPr>
+                          <w:rFonts w:ascii="Cambria Math"/>
+                          <w:lang w:val="en-US"/>
+                        </w:rPr>
+                        <m:t>S</m:t>
+                      </m:r>
+                    </m:e>
+                    <m:sub>
+                      <m:r>
+                        <w:rPr>
+                          <w:rFonts w:ascii="Cambria Math"/>
+                          <w:lang w:val="en-US"/>
+                        </w:rPr>
+                        <m:t>o</m:t>
+                      </m:r>
+                    </m:sub>
+                  </m:sSub>
+                  <m:sSub>
+                    <m:sSubPr>
+                      <m:ctrlPr>
+                        <w:rPr>
+                          <w:rFonts w:ascii="Cambria Math" w:hAnsi="Cambria Math"/>
+                          <w:i/>
+                          <w:lang w:val="en-US"/>
+                        </w:rPr>
+                      </m:ctrlPr>
+                    </m:sSubPr>
+                    <m:e>
+                      <m:r>
+                        <w:rPr>
+                          <w:rFonts w:ascii="Cambria Math"/>
+                          <w:lang w:val="en-US"/>
+                        </w:rPr>
+                        <m:t>K</m:t>
+                      </m:r>
+                    </m:e>
+                    <m:sub>
+                      <m:r>
+                        <w:rPr>
+                          <w:rFonts w:ascii="Cambria Math"/>
+                          <w:lang w:val="en-US"/>
+                        </w:rPr>
+                        <m:t>o</m:t>
+                      </m:r>
+                    </m:sub>
+                  </m:sSub>
+                  <m:r>
+                    <w:rPr>
+                      <w:rFonts w:ascii="Cambria Math"/>
+                    </w:rPr>
+                    <m:t>(1</m:t>
+                  </m:r>
+                  <m:r>
+                    <w:rPr>
+                      <w:rFonts w:ascii="Cambria Math"/>
+                    </w:rPr>
+                    <m:t>-</m:t>
+                  </m:r>
+                  <m:sSub>
+                    <m:sSubPr>
+                      <m:ctrlPr>
+                        <w:rPr>
+                          <w:rFonts w:ascii="Cambria Math" w:hAnsi="Cambria Math"/>
+                          <w:i/>
+                          <w:lang w:val="en-US"/>
+                        </w:rPr>
+                      </m:ctrlPr>
+                    </m:sSubPr>
+                    <m:e>
+                      <m:r>
+                        <w:rPr>
+                          <w:rFonts w:ascii="Cambria Math"/>
+                          <w:lang w:val="en-US"/>
+                        </w:rPr>
+                        <m:t>w</m:t>
+                      </m:r>
+                    </m:e>
+                    <m:sub>
+                      <m:r>
+                        <w:rPr>
+                          <w:rFonts w:ascii="Cambria Math"/>
+                          <w:lang w:val="en-US"/>
+                        </w:rPr>
+                        <m:t>ps</m:t>
+                      </m:r>
+                    </m:sub>
+                  </m:sSub>
+                  <m:r>
+                    <w:rPr>
+                      <w:rFonts w:ascii="Cambria Math"/>
+                    </w:rPr>
+                    <m:t>)+</m:t>
+                  </m:r>
+                  <m:r>
+                    <w:rPr>
+                      <w:rFonts w:ascii="Cambria Math"/>
+                      <w:lang w:val="en-US"/>
+                    </w:rPr>
+                    <m:t>m</m:t>
+                  </m:r>
+                  <m:sSub>
+                    <m:sSubPr>
+                      <m:ctrlPr>
+                        <w:rPr>
+                          <w:rFonts w:ascii="Cambria Math" w:hAnsi="Cambria Math"/>
+                          <w:i/>
+                          <w:lang w:val="en-US"/>
+                        </w:rPr>
+                      </m:ctrlPr>
+                    </m:sSubPr>
+                    <m:e>
+                      <m:r>
+                        <w:rPr>
+                          <w:rFonts w:ascii="Cambria Math"/>
+                          <w:lang w:val="en-US"/>
+                        </w:rPr>
+                        <m:t>S</m:t>
+                      </m:r>
+                    </m:e>
+                    <m:sub>
+                      <m:r>
+                        <w:rPr>
+                          <w:rFonts w:ascii="Cambria Math"/>
+                          <w:lang w:val="en-US"/>
+                        </w:rPr>
+                        <m:t>o</m:t>
+                      </m:r>
+                    </m:sub>
+                  </m:sSub>
+                  <m:sSub>
+                    <m:sSubPr>
+                      <m:ctrlPr>
+                        <w:rPr>
+                          <w:rFonts w:ascii="Cambria Math" w:hAnsi="Cambria Math"/>
+                          <w:i/>
+                          <w:lang w:val="en-US"/>
+                        </w:rPr>
+                      </m:ctrlPr>
+                    </m:sSubPr>
+                    <m:e>
+                      <m:r>
+                        <w:rPr>
+                          <w:rFonts w:ascii="Cambria Math"/>
+                          <w:lang w:val="en-US"/>
+                        </w:rPr>
+                        <m:t>w</m:t>
+                      </m:r>
+                    </m:e>
+                    <m:sub>
+                      <m:r>
+                        <w:rPr>
+                          <w:rFonts w:ascii="Cambria Math"/>
+                          <w:lang w:val="en-US"/>
+                        </w:rPr>
+                        <m:t>ps</m:t>
+                      </m:r>
+                    </m:sub>
+                  </m:sSub>
+                  <m:sSub>
+                    <m:sSubPr>
+                      <m:ctrlPr>
+                        <w:rPr>
+                          <w:rFonts w:ascii="Cambria Math" w:hAnsi="Cambria Math"/>
+                          <w:i/>
+                          <w:lang w:val="en-US"/>
+                        </w:rPr>
+                      </m:ctrlPr>
+                    </m:sSubPr>
+                    <m:e>
+                      <m:r>
+                        <w:rPr>
+                          <w:rFonts w:ascii="Cambria Math"/>
+                          <w:lang w:val="en-US"/>
+                        </w:rPr>
+                        <m:t>K</m:t>
+                      </m:r>
+                    </m:e>
+                    <m:sub>
+                      <m:r>
+                        <w:rPr>
+                          <w:rFonts w:ascii="Cambria Math"/>
+                          <w:lang w:val="en-US"/>
+                        </w:rPr>
+                        <m:t>p</m:t>
+                      </m:r>
+                    </m:sub>
+                  </m:sSub>
+                  <m:r>
+                    <w:rPr>
+                      <w:rFonts w:ascii="Cambria Math"/>
+                    </w:rPr>
+                    <m:t>+(1</m:t>
+                  </m:r>
+                  <m:r>
+                    <w:rPr>
+                      <w:rFonts w:ascii="Cambria Math"/>
+                    </w:rPr>
+                    <m:t>-</m:t>
+                  </m:r>
+                  <m:r>
+                    <w:rPr>
+                      <w:rFonts w:ascii="Cambria Math"/>
+                      <w:lang w:val="en-US"/>
+                    </w:rPr>
+                    <m:t>m</m:t>
+                  </m:r>
+                  <m:r>
+                    <w:rPr>
+                      <w:rFonts w:ascii="Cambria Math"/>
+                    </w:rPr>
+                    <m:t>)</m:t>
+                  </m:r>
+                  <m:sSub>
+                    <m:sSubPr>
+                      <m:ctrlPr>
+                        <w:rPr>
+                          <w:rFonts w:ascii="Cambria Math" w:hAnsi="Cambria Math"/>
+                          <w:i/>
+                          <w:lang w:val="en-US"/>
+                        </w:rPr>
+                      </m:ctrlPr>
+                    </m:sSubPr>
+                    <m:e>
+                      <m:r>
+                        <w:rPr>
+                          <w:rFonts w:ascii="Cambria Math"/>
+                          <w:lang w:val="en-US"/>
+                        </w:rPr>
+                        <m:t>K</m:t>
+                      </m:r>
+                    </m:e>
+                    <m:sub>
+                      <m:r>
+                        <w:rPr>
+                          <w:rFonts w:ascii="Cambria Math"/>
+                          <w:lang w:val="en-US"/>
+                        </w:rPr>
+                        <m:t>f</m:t>
+                      </m:r>
+                    </m:sub>
+                  </m:sSub>
+                </m:e>
+              </m:d>
+              <m:r>
+                <w:rPr>
+                  <w:rFonts w:ascii="Cambria Math" w:hAnsi="Cambria Math" w:cs="Cambria Math"/>
+                </w:rPr>
+                <m:t>∇</m:t>
+              </m:r>
+              <m:r>
+                <w:rPr>
+                  <w:rFonts w:ascii="Cambria Math"/>
+                  <w:lang w:val="en-US"/>
+                </w:rPr>
+                <m:t>T</m:t>
+              </m:r>
+            </m:e>
+          </m:d>
+          <m:r>
+            <w:rPr>
+              <w:rFonts w:ascii="Cambria Math" w:hAnsi="Cambria Math"/>
+            </w:rPr>
+            <m:t>+</m:t>
+          </m:r>
+          <m:sSub>
+            <m:sSubPr>
+              <m:ctrlPr>
+                <w:rPr>
+                  <w:rFonts w:ascii="Cambria Math" w:hAnsi="Cambria Math"/>
+                  <w:i/>
+                  <w:lang w:val="en-US"/>
+                </w:rPr>
+              </m:ctrlPr>
+            </m:sSubPr>
+            <m:e>
+              <m:r>
+                <w:rPr>
+                  <w:rFonts w:ascii="Cambria Math" w:hAnsi="Cambria Math"/>
+                  <w:lang w:val="en-US"/>
+                </w:rPr>
+                <m:t>q</m:t>
+              </m:r>
+            </m:e>
+            <m:sub>
+              <m:r>
+                <w:rPr>
+                  <w:rFonts w:ascii="Cambria Math" w:hAnsi="Cambria Math"/>
+                  <w:lang w:val="en-US"/>
+                </w:rPr>
+                <m:t>o</m:t>
+              </m:r>
+            </m:sub>
+          </m:sSub>
+          <m:sSub>
+            <m:sSubPr>
+              <m:ctrlPr>
+                <w:rPr>
+                  <w:rFonts w:ascii="Cambria Math" w:hAnsi="Cambria Math"/>
+                  <w:i/>
+                  <w:lang w:val="en-US"/>
+                </w:rPr>
+              </m:ctrlPr>
+            </m:sSubPr>
+            <m:e>
+              <m:r>
+                <w:rPr>
+                  <w:rFonts w:ascii="Cambria Math"/>
+                  <w:lang w:val="en-US"/>
+                </w:rPr>
+                <m:t>ρ</m:t>
+              </m:r>
+            </m:e>
+            <m:sub>
+              <m:r>
+                <w:rPr>
+                  <w:rFonts w:ascii="Cambria Math"/>
+                  <w:lang w:val="en-US"/>
+                </w:rPr>
+                <m:t>o</m:t>
+              </m:r>
+            </m:sub>
+          </m:sSub>
+          <m:sSub>
+            <m:sSubPr>
+              <m:ctrlPr>
+                <w:rPr>
+                  <w:rFonts w:ascii="Cambria Math" w:hAnsi="Cambria Math"/>
+                  <w:i/>
+                  <w:lang w:val="en-US"/>
+                </w:rPr>
+              </m:ctrlPr>
+            </m:sSubPr>
+            <m:e>
+              <m:r>
+                <w:rPr>
+                  <w:rFonts w:ascii="Cambria Math"/>
+                  <w:lang w:val="en-US"/>
+                </w:rPr>
+                <m:t>C</m:t>
+              </m:r>
+            </m:e>
+            <m:sub>
+              <m:r>
+                <w:rPr>
+                  <w:rFonts w:ascii="Cambria Math"/>
+                  <w:lang w:val="en-US"/>
+                </w:rPr>
+                <m:t>o</m:t>
+              </m:r>
+            </m:sub>
+          </m:sSub>
+          <m:r>
+            <w:rPr>
+              <w:rFonts w:ascii="Cambria Math"/>
+            </w:rPr>
+            <m:t>T</m:t>
+          </m:r>
+          <m:r>
+            <w:rPr>
+              <w:rFonts w:ascii="Cambria Math" w:hAnsi="Cambria Math"/>
+            </w:rPr>
+            <m:t>+</m:t>
+          </m:r>
+          <m:sSub>
+            <m:sSubPr>
+              <m:ctrlPr>
+                <w:rPr>
+                  <w:rFonts w:ascii="Cambria Math" w:hAnsi="Cambria Math"/>
+                  <w:i/>
+                  <w:lang w:val="en-US"/>
+                </w:rPr>
+              </m:ctrlPr>
+            </m:sSubPr>
+            <m:e>
+              <m:r>
+                <w:rPr>
+                  <w:rFonts w:ascii="Cambria Math" w:hAnsi="Cambria Math"/>
+                  <w:lang w:val="en-US"/>
+                </w:rPr>
+                <m:t>q</m:t>
+              </m:r>
+            </m:e>
+            <m:sub>
+              <m:r>
+                <w:rPr>
+                  <w:rFonts w:ascii="Cambria Math" w:hAnsi="Cambria Math"/>
+                  <w:lang w:val="en-US"/>
+                </w:rPr>
+                <m:t>w</m:t>
+              </m:r>
+            </m:sub>
+          </m:sSub>
+          <m:sSub>
+            <m:sSubPr>
+              <m:ctrlPr>
+                <w:rPr>
+                  <w:rFonts w:ascii="Cambria Math" w:hAnsi="Cambria Math"/>
+                  <w:i/>
+                  <w:lang w:val="en-US"/>
+                </w:rPr>
+              </m:ctrlPr>
+            </m:sSubPr>
+            <m:e>
+              <m:r>
+                <w:rPr>
+                  <w:rFonts w:ascii="Cambria Math"/>
+                  <w:lang w:val="en-US"/>
+                </w:rPr>
+                <m:t>ρ</m:t>
+              </m:r>
+            </m:e>
+            <m:sub>
+              <m:r>
+                <w:rPr>
+                  <w:rFonts w:ascii="Cambria Math"/>
+                  <w:lang w:val="en-US"/>
+                </w:rPr>
+                <m:t>w</m:t>
+              </m:r>
+            </m:sub>
+          </m:sSub>
+          <m:sSub>
+            <m:sSubPr>
+              <m:ctrlPr>
+                <w:rPr>
+                  <w:rFonts w:ascii="Cambria Math" w:hAnsi="Cambria Math"/>
+                  <w:i/>
+                  <w:lang w:val="en-US"/>
+                </w:rPr>
+              </m:ctrlPr>
+            </m:sSubPr>
+            <m:e>
+              <m:r>
+                <w:rPr>
+                  <w:rFonts w:ascii="Cambria Math"/>
+                  <w:lang w:val="en-US"/>
+                </w:rPr>
+                <m:t>C</m:t>
+              </m:r>
+            </m:e>
+            <m:sub>
+              <m:r>
+                <w:rPr>
+                  <w:rFonts w:ascii="Cambria Math"/>
+                  <w:lang w:val="en-US"/>
+                </w:rPr>
+                <m:t>w</m:t>
+              </m:r>
+            </m:sub>
+          </m:sSub>
+          <m:r>
+            <w:rPr>
+              <w:rFonts w:ascii="Cambria Math"/>
+            </w:rPr>
+            <m:t>T</m:t>
+          </m:r>
+        </m:oMath>
+      </m:oMathPara>
+    </w:p>
+    <w:p>
+      <w:pPr>
+        <w:jc w:val="both"/>
+        <w:rPr>
+          <w:lang w:val="en-US"/>
+        </w:rPr>
+      </w:pPr>
+      <m:oMath>
+        <m:m>
+          <m:mPr>
+            <m:mcs>
+              <m:mc>
+                <m:mcPr>
+                  <m:count m:val="1"/>
+                  <m:mcJc m:val="center"/>
+                </m:mcPr>
+              </m:mc>
+            </m:mcs>
+            <m:ctrlPr>
+              <w:rPr>
+                <w:rFonts w:ascii="Cambria Math" w:hAnsi="Cambria Math"/>
+                <w:i/>
+              </w:rPr>
+            </m:ctrlPr>
+          </m:mPr>
+          <m:mr>
+            <m:e>
+              <m:f>
+                <m:fPr>
+                  <m:ctrlPr>
+                    <w:rPr>
+                      <w:rFonts w:ascii="Cambria Math" w:hAnsi="Cambria Math"/>
+                      <w:i/>
+                      <w:lang w:val="en-US"/>
+                    </w:rPr>
+                  </m:ctrlPr>
+                </m:fPr>
+                <m:num>
+                  <m:r>
+                    <w:rPr>
+                      <w:rFonts w:ascii="Cambria Math"/>
+                    </w:rPr>
+                    <m:t>∂</m:t>
+                  </m:r>
+                </m:num>
+                <m:den>
+                  <m:r>
+                    <w:rPr>
+                      <w:rFonts w:ascii="Cambria Math"/>
+                    </w:rPr>
+                    <m:t>∂</m:t>
+                  </m:r>
+                  <m:r>
+                    <w:rPr>
+                      <w:rFonts w:ascii="Cambria Math"/>
+                      <w:lang w:val="en-US"/>
+                    </w:rPr>
+                    <m:t>t</m:t>
+                  </m:r>
+                </m:den>
+              </m:f>
+              <m:r>
+                <w:rPr>
+                  <w:rFonts w:ascii="Cambria Math"/>
+                  <w:lang w:val="en-US"/>
+                </w:rPr>
+                <m:t>[</m:t>
+              </m:r>
+              <m:r>
+                <w:rPr>
+                  <w:rFonts w:ascii="Cambria Math"/>
+                  <w:lang w:val="en-US"/>
+                </w:rPr>
+                <m:t xml:space="preserve">m </m:t>
+              </m:r>
+              <m:sSub>
+                <m:sSubPr>
+                  <m:ctrlPr>
+                    <w:rPr>
+                      <w:rFonts w:ascii="Cambria Math" w:hAnsi="Cambria Math"/>
+                      <w:i/>
+                      <w:lang w:val="en-US"/>
+                    </w:rPr>
+                  </m:ctrlPr>
+                </m:sSubPr>
+                <m:e>
+                  <m:r>
+                    <w:rPr>
+                      <w:rFonts w:ascii="Cambria Math"/>
+                      <w:lang w:val="en-US"/>
+                    </w:rPr>
+                    <m:t>S</m:t>
+                  </m:r>
+                </m:e>
+                <m:sub>
+                  <m:r>
+                    <w:rPr>
+                      <w:rFonts w:ascii="Cambria Math"/>
+                      <w:lang w:val="en-US"/>
+                    </w:rPr>
+                    <m:t>w</m:t>
+                  </m:r>
+                </m:sub>
+              </m:sSub>
+              <m:sSub>
+                <m:sSubPr>
+                  <m:ctrlPr>
+                    <w:rPr>
+                      <w:rFonts w:ascii="Cambria Math" w:hAnsi="Cambria Math"/>
+                      <w:i/>
+                      <w:lang w:val="en-US"/>
+                    </w:rPr>
+                  </m:ctrlPr>
+                </m:sSubPr>
+                <m:e>
+                  <m:r>
+                    <w:rPr>
+                      <w:rFonts w:ascii="Cambria Math"/>
+                      <w:lang w:val="en-US"/>
+                    </w:rPr>
+                    <m:t>ρ</m:t>
+                  </m:r>
+                </m:e>
+                <m:sub>
+                  <m:r>
+                    <w:rPr>
+                      <w:rFonts w:ascii="Cambria Math"/>
+                      <w:lang w:val="en-US"/>
+                    </w:rPr>
+                    <m:t>w</m:t>
+                  </m:r>
+                </m:sub>
+              </m:sSub>
+              <m:sSub>
+                <m:sSubPr>
+                  <m:ctrlPr>
+                    <w:rPr>
+                      <w:rFonts w:ascii="Cambria Math" w:hAnsi="Cambria Math"/>
+                      <w:i/>
+                      <w:lang w:val="en-US"/>
+                    </w:rPr>
+                  </m:ctrlPr>
+                </m:sSubPr>
+                <m:e>
+                  <m:r>
+                    <w:rPr>
+                      <w:rFonts w:ascii="Cambria Math"/>
+                      <w:lang w:val="en-US"/>
+                    </w:rPr>
+                    <m:t>H</m:t>
+                  </m:r>
+                </m:e>
+                <m:sub>
+                  <m:r>
+                    <w:rPr>
+                      <w:rFonts w:ascii="Cambria Math"/>
+                      <w:lang w:val="en-US"/>
+                    </w:rPr>
+                    <m:t>w</m:t>
+                  </m:r>
+                </m:sub>
+              </m:sSub>
+              <m:r>
+                <w:rPr>
+                  <w:rFonts w:ascii="Cambria Math"/>
+                  <w:lang w:val="en-US"/>
+                </w:rPr>
+                <m:t>+</m:t>
+              </m:r>
+              <m:r>
+                <w:rPr>
+                  <w:rFonts w:ascii="Cambria Math"/>
+                  <w:lang w:val="en-US"/>
+                </w:rPr>
+                <m:t xml:space="preserve">m </m:t>
+              </m:r>
+              <m:sSub>
+                <m:sSubPr>
+                  <m:ctrlPr>
+                    <w:rPr>
+                      <w:rFonts w:ascii="Cambria Math" w:hAnsi="Cambria Math"/>
+                      <w:i/>
+                      <w:lang w:val="en-US"/>
+                    </w:rPr>
+                  </m:ctrlPr>
+                </m:sSubPr>
+                <m:e>
+                  <m:r>
+                    <w:rPr>
+                      <w:rFonts w:ascii="Cambria Math"/>
+                      <w:lang w:val="en-US"/>
+                    </w:rPr>
+                    <m:t>S</m:t>
+                  </m:r>
+                </m:e>
+                <m:sub>
+                  <m:r>
+                    <w:rPr>
+                      <w:rFonts w:ascii="Cambria Math"/>
+                      <w:lang w:val="en-US"/>
+                    </w:rPr>
+                    <m:t>o</m:t>
+                  </m:r>
+                </m:sub>
+              </m:sSub>
+              <m:sSub>
+                <m:sSubPr>
+                  <m:ctrlPr>
+                    <w:rPr>
+                      <w:rFonts w:ascii="Cambria Math" w:hAnsi="Cambria Math"/>
+                      <w:i/>
+                      <w:lang w:val="en-US"/>
+                    </w:rPr>
+                  </m:ctrlPr>
+                </m:sSubPr>
+                <m:e>
+                  <m:r>
+                    <w:rPr>
+                      <w:rFonts w:ascii="Cambria Math"/>
+                      <w:lang w:val="en-US"/>
+                    </w:rPr>
+                    <m:t>ρ</m:t>
+                  </m:r>
+                </m:e>
+                <m:sub>
+                  <m:r>
+                    <w:rPr>
+                      <w:rFonts w:ascii="Cambria Math"/>
+                      <w:lang w:val="en-US"/>
+                    </w:rPr>
+                    <m:t>o</m:t>
+                  </m:r>
+                </m:sub>
+              </m:sSub>
+              <m:sSub>
+                <m:sSubPr>
+                  <m:ctrlPr>
+                    <w:rPr>
+                      <w:rFonts w:ascii="Cambria Math" w:hAnsi="Cambria Math"/>
+                      <w:i/>
+                      <w:lang w:val="en-US"/>
+                    </w:rPr>
+                  </m:ctrlPr>
+                </m:sSubPr>
+                <m:e>
+                  <m:r>
+                    <w:rPr>
+                      <w:rFonts w:ascii="Cambria Math"/>
+                      <w:lang w:val="en-US"/>
+                    </w:rPr>
+                    <m:t>H</m:t>
+                  </m:r>
+                </m:e>
+                <m:sub>
+                  <m:r>
+                    <w:rPr>
+                      <w:rFonts w:ascii="Cambria Math"/>
+                      <w:lang w:val="en-US"/>
+                    </w:rPr>
+                    <m:t>o</m:t>
+                  </m:r>
+                </m:sub>
+              </m:sSub>
+              <m:r>
+                <w:rPr>
+                  <w:rFonts w:ascii="Cambria Math"/>
+                  <w:lang w:val="en-US"/>
+                </w:rPr>
+                <m:t>(1</m:t>
+              </m:r>
+              <m:r>
+                <w:rPr>
+                  <w:rFonts w:ascii="Cambria Math"/>
+                  <w:lang w:val="en-US"/>
+                </w:rPr>
+                <m:t>-</m:t>
+              </m:r>
+              <m:r>
+                <w:rPr>
+                  <w:rFonts w:ascii="Cambria Math"/>
+                  <w:lang w:val="en-US"/>
+                </w:rPr>
+                <m:t xml:space="preserve"> </m:t>
+              </m:r>
+              <m:sSub>
+                <m:sSubPr>
+                  <m:ctrlPr>
+                    <w:rPr>
+                      <w:rFonts w:ascii="Cambria Math" w:hAnsi="Cambria Math"/>
+                      <w:i/>
+                      <w:lang w:val="en-US"/>
+                    </w:rPr>
+                  </m:ctrlPr>
+                </m:sSubPr>
+                <m:e>
+                  <m:r>
+                    <w:rPr>
+                      <w:rFonts w:ascii="Cambria Math"/>
+                      <w:lang w:val="en-US"/>
+                    </w:rPr>
+                    <m:t>w</m:t>
+                  </m:r>
+                </m:e>
+                <m:sub>
+                  <m:r>
+                    <w:rPr>
+                      <w:rFonts w:ascii="Cambria Math"/>
+                      <w:lang w:val="en-US"/>
+                    </w:rPr>
+                    <m:t>ps</m:t>
+                  </m:r>
+                </m:sub>
+              </m:sSub>
+              <m:r>
+                <w:rPr>
+                  <w:rFonts w:ascii="Cambria Math"/>
+                  <w:lang w:val="en-US"/>
+                </w:rPr>
+                <m:t>)+</m:t>
+              </m:r>
+              <m:r>
+                <w:rPr>
+                  <w:rFonts w:ascii="Cambria Math"/>
+                  <w:lang w:val="en-US"/>
+                </w:rPr>
+                <m:t>m</m:t>
+              </m:r>
+              <m:sSub>
+                <m:sSubPr>
+                  <m:ctrlPr>
+                    <w:rPr>
+                      <w:rFonts w:ascii="Cambria Math" w:hAnsi="Cambria Math"/>
+                      <w:i/>
+                      <w:lang w:val="en-US"/>
+                    </w:rPr>
+                  </m:ctrlPr>
+                </m:sSubPr>
+                <m:e>
+                  <m:r>
+                    <w:rPr>
+                      <w:rFonts w:ascii="Cambria Math"/>
+                      <w:lang w:val="en-US"/>
+                    </w:rPr>
+                    <m:t>S</m:t>
+                  </m:r>
+                </m:e>
+                <m:sub>
+                  <m:r>
+                    <w:rPr>
+                      <w:rFonts w:ascii="Cambria Math"/>
+                      <w:lang w:val="en-US"/>
+                    </w:rPr>
+                    <m:t>o</m:t>
+                  </m:r>
+                </m:sub>
+              </m:sSub>
+              <m:sSub>
+                <m:sSubPr>
+                  <m:ctrlPr>
+                    <w:rPr>
+                      <w:rFonts w:ascii="Cambria Math" w:hAnsi="Cambria Math"/>
+                      <w:i/>
+                      <w:lang w:val="en-US"/>
+                    </w:rPr>
+                  </m:ctrlPr>
+                </m:sSubPr>
+                <m:e>
+                  <m:r>
+                    <w:rPr>
+                      <w:rFonts w:ascii="Cambria Math"/>
+                      <w:lang w:val="en-US"/>
+                    </w:rPr>
+                    <m:t>w</m:t>
+                  </m:r>
+                </m:e>
+                <m:sub>
+                  <m:r>
+                    <w:rPr>
+                      <w:rFonts w:ascii="Cambria Math"/>
+                      <w:lang w:val="en-US"/>
+                    </w:rPr>
+                    <m:t>ps</m:t>
+                  </m:r>
+                </m:sub>
+              </m:sSub>
+              <m:sSub>
+                <m:sSubPr>
+                  <m:ctrlPr>
+                    <w:rPr>
+                      <w:rFonts w:ascii="Cambria Math" w:hAnsi="Cambria Math"/>
+                      <w:i/>
+                      <w:lang w:val="en-US"/>
+                    </w:rPr>
+                  </m:ctrlPr>
+                </m:sSubPr>
+                <m:e>
+                  <m:r>
+                    <w:rPr>
+                      <w:rFonts w:ascii="Cambria Math"/>
+                      <w:lang w:val="en-US"/>
+                    </w:rPr>
+                    <m:t>ρ</m:t>
+                  </m:r>
+                </m:e>
+                <m:sub>
+                  <m:r>
+                    <w:rPr>
+                      <w:rFonts w:ascii="Cambria Math"/>
+                      <w:lang w:val="en-US"/>
+                    </w:rPr>
+                    <m:t>p</m:t>
+                  </m:r>
+                </m:sub>
+              </m:sSub>
+              <m:sSub>
+                <m:sSubPr>
+                  <m:ctrlPr>
+                    <w:rPr>
+                      <w:rFonts w:ascii="Cambria Math" w:hAnsi="Cambria Math"/>
+                      <w:i/>
+                      <w:lang w:val="en-US"/>
+                    </w:rPr>
+                  </m:ctrlPr>
+                </m:sSubPr>
+                <m:e>
+                  <m:r>
+                    <w:rPr>
+                      <w:rFonts w:ascii="Cambria Math"/>
+                      <w:lang w:val="en-US"/>
+                    </w:rPr>
+                    <m:t>H</m:t>
+                  </m:r>
+                </m:e>
+                <m:sub>
+                  <m:r>
+                    <w:rPr>
+                      <w:rFonts w:ascii="Cambria Math"/>
+                      <w:lang w:val="en-US"/>
+                    </w:rPr>
+                    <m:t>p</m:t>
+                  </m:r>
+                </m:sub>
+              </m:sSub>
+              <m:r>
+                <w:rPr>
+                  <w:rFonts w:ascii="Cambria Math"/>
+                  <w:lang w:val="en-US"/>
+                </w:rPr>
+                <m:t>+(1</m:t>
+              </m:r>
+              <m:r>
+                <w:rPr>
+                  <w:rFonts w:ascii="Cambria Math"/>
+                  <w:lang w:val="en-US"/>
+                </w:rPr>
+                <m:t>-</m:t>
+              </m:r>
+              <m:r>
+                <w:rPr>
+                  <w:rFonts w:ascii="Cambria Math"/>
+                  <w:lang w:val="en-US"/>
+                </w:rPr>
+                <m:t>m</m:t>
+              </m:r>
+              <m:r>
+                <w:rPr>
+                  <w:rFonts w:ascii="Cambria Math"/>
+                  <w:lang w:val="en-US"/>
+                </w:rPr>
+                <m:t>)</m:t>
+              </m:r>
+              <m:sSub>
+                <m:sSubPr>
+                  <m:ctrlPr>
+                    <w:rPr>
+                      <w:rFonts w:ascii="Cambria Math" w:hAnsi="Cambria Math"/>
+                      <w:i/>
+                      <w:lang w:val="en-US"/>
+                    </w:rPr>
+                  </m:ctrlPr>
+                </m:sSubPr>
+                <m:e>
+                  <m:r>
+                    <w:rPr>
+                      <w:rFonts w:ascii="Cambria Math"/>
+                      <w:lang w:val="en-US"/>
+                    </w:rPr>
+                    <m:t>ρ</m:t>
+                  </m:r>
+                </m:e>
+                <m:sub>
+                  <m:r>
+                    <w:rPr>
+                      <w:rFonts w:ascii="Cambria Math"/>
+                      <w:lang w:val="en-US"/>
+                    </w:rPr>
+                    <m:t>f</m:t>
+                  </m:r>
+                </m:sub>
+              </m:sSub>
+              <m:sSub>
+                <m:sSubPr>
+                  <m:ctrlPr>
+                    <w:rPr>
+                      <w:rFonts w:ascii="Cambria Math" w:hAnsi="Cambria Math"/>
+                      <w:i/>
+                      <w:lang w:val="en-US"/>
+                    </w:rPr>
+                  </m:ctrlPr>
+                </m:sSubPr>
+                <m:e>
+                  <m:r>
+                    <w:rPr>
+                      <w:rFonts w:ascii="Cambria Math"/>
+                      <w:lang w:val="en-US"/>
+                    </w:rPr>
+                    <m:t>H</m:t>
+                  </m:r>
+                </m:e>
+                <m:sub>
+                  <m:r>
+                    <w:rPr>
+                      <w:rFonts w:ascii="Cambria Math"/>
+                      <w:lang w:val="en-US"/>
+                    </w:rPr>
+                    <m:t>f</m:t>
+                  </m:r>
+                </m:sub>
+              </m:sSub>
+              <m:r>
+                <w:rPr>
+                  <w:rFonts w:ascii="Cambria Math"/>
+                  <w:lang w:val="en-US"/>
+                </w:rPr>
+                <m:t>]+</m:t>
+              </m:r>
+              <m:r>
+                <w:rPr>
+                  <w:rFonts w:ascii="Cambria Math" w:hAnsi="Cambria Math" w:cs="Cambria Math"/>
+                </w:rPr>
+                <m:t>∇</m:t>
+              </m:r>
+              <m:r>
+                <w:rPr>
+                  <w:rFonts w:ascii="Cambria Math"/>
+                  <w:lang w:val="en-US"/>
+                </w:rPr>
+                <m:t>(</m:t>
+              </m:r>
+              <m:sSub>
+                <m:sSubPr>
+                  <m:ctrlPr>
+                    <w:rPr>
+                      <w:rFonts w:ascii="Cambria Math" w:hAnsi="Cambria Math"/>
+                      <w:i/>
+                      <w:lang w:val="en-US"/>
+                    </w:rPr>
+                  </m:ctrlPr>
+                </m:sSubPr>
+                <m:e>
+                  <m:r>
+                    <w:rPr>
+                      <w:rFonts w:ascii="Cambria Math"/>
+                      <w:lang w:val="en-US"/>
+                    </w:rPr>
+                    <m:t>ρ</m:t>
+                  </m:r>
+                </m:e>
+                <m:sub>
+                  <m:r>
+                    <w:rPr>
+                      <w:rFonts w:ascii="Cambria Math"/>
+                      <w:lang w:val="en-US"/>
+                    </w:rPr>
+                    <m:t>w</m:t>
+                  </m:r>
+                </m:sub>
+              </m:sSub>
+              <m:sSub>
+                <m:sSubPr>
+                  <m:ctrlPr>
+                    <w:rPr>
+                      <w:rFonts w:ascii="Cambria Math" w:hAnsi="Cambria Math"/>
+                      <w:i/>
+                      <w:lang w:val="en-US"/>
+                    </w:rPr>
+                  </m:ctrlPr>
+                </m:sSubPr>
+                <m:e>
+                  <m:r>
+                    <w:rPr>
+                      <w:rFonts w:ascii="Cambria Math"/>
+                      <w:lang w:val="en-US"/>
+                    </w:rPr>
+                    <m:t>H</m:t>
+                  </m:r>
+                </m:e>
+                <m:sub>
+                  <m:r>
+                    <w:rPr>
+                      <w:rFonts w:ascii="Cambria Math"/>
+                      <w:lang w:val="en-US"/>
+                    </w:rPr>
+                    <m:t>w</m:t>
+                  </m:r>
+                </m:sub>
+              </m:sSub>
+              <m:sSub>
+                <m:sSubPr>
+                  <m:ctrlPr>
+                    <w:rPr>
+                      <w:rFonts w:ascii="Cambria Math" w:hAnsi="Cambria Math"/>
+                      <w:i/>
+                      <w:lang w:val="en-US"/>
+                    </w:rPr>
+                  </m:ctrlPr>
+                </m:sSubPr>
+                <m:e>
+                  <m:r>
+                    <w:rPr>
+                      <w:rFonts w:ascii="Cambria Math"/>
+                      <w:lang w:val="en-US"/>
+                    </w:rPr>
+                    <m:t>U</m:t>
+                  </m:r>
+                </m:e>
+                <m:sub>
+                  <m:r>
+                    <w:rPr>
+                      <w:rFonts w:ascii="Cambria Math"/>
+                      <w:lang w:val="en-US"/>
+                    </w:rPr>
+                    <m:t>w</m:t>
+                  </m:r>
+                </m:sub>
+              </m:sSub>
+              <m:r>
+                <w:rPr>
+                  <w:rFonts w:ascii="Cambria Math"/>
+                  <w:lang w:val="en-US"/>
+                </w:rPr>
+                <m:t>+</m:t>
+              </m:r>
+            </m:e>
+          </m:mr>
+          <m:mr>
+            <m:e>
+              <m:r>
+                <w:rPr>
+                  <w:rFonts w:ascii="Cambria Math"/>
+                  <w:lang w:val="en-US"/>
+                </w:rPr>
+                <m:t>(1</m:t>
+              </m:r>
+              <m:r>
+                <w:rPr>
+                  <w:rFonts w:ascii="Cambria Math"/>
+                  <w:lang w:val="en-US"/>
+                </w:rPr>
+                <m:t>-</m:t>
+              </m:r>
+              <m:sSub>
+                <m:sSubPr>
+                  <m:ctrlPr>
+                    <w:rPr>
+                      <w:rFonts w:ascii="Cambria Math" w:hAnsi="Cambria Math"/>
+                      <w:i/>
+                      <w:lang w:val="en-US"/>
+                    </w:rPr>
+                  </m:ctrlPr>
+                </m:sSubPr>
+                <m:e>
+                  <m:r>
+                    <w:rPr>
+                      <w:rFonts w:ascii="Cambria Math"/>
+                      <w:lang w:val="en-US"/>
+                    </w:rPr>
+                    <m:t>w</m:t>
+                  </m:r>
+                </m:e>
+                <m:sub>
+                  <m:r>
+                    <w:rPr>
+                      <w:rFonts w:ascii="Cambria Math"/>
+                      <w:lang w:val="en-US"/>
+                    </w:rPr>
+                    <m:t>ps</m:t>
+                  </m:r>
+                </m:sub>
+              </m:sSub>
+              <m:r>
+                <w:rPr>
+                  <w:rFonts w:ascii="Cambria Math"/>
+                  <w:lang w:val="en-US"/>
+                </w:rPr>
+                <m:t>)</m:t>
+              </m:r>
+              <m:sSub>
+                <m:sSubPr>
+                  <m:ctrlPr>
+                    <w:rPr>
+                      <w:rFonts w:ascii="Cambria Math" w:hAnsi="Cambria Math"/>
+                      <w:i/>
+                      <w:lang w:val="en-US"/>
+                    </w:rPr>
+                  </m:ctrlPr>
+                </m:sSubPr>
+                <m:e>
+                  <m:r>
+                    <w:rPr>
+                      <w:rFonts w:ascii="Cambria Math"/>
+                      <w:lang w:val="en-US"/>
+                    </w:rPr>
+                    <m:t>ρ</m:t>
+                  </m:r>
+                </m:e>
+                <m:sub>
+                  <m:r>
+                    <w:rPr>
+                      <w:rFonts w:ascii="Cambria Math"/>
+                      <w:lang w:val="en-US"/>
+                    </w:rPr>
+                    <m:t>o</m:t>
+                  </m:r>
+                </m:sub>
+              </m:sSub>
+              <m:sSub>
+                <m:sSubPr>
+                  <m:ctrlPr>
+                    <w:rPr>
+                      <w:rFonts w:ascii="Cambria Math" w:hAnsi="Cambria Math"/>
+                      <w:i/>
+                      <w:lang w:val="en-US"/>
+                    </w:rPr>
+                  </m:ctrlPr>
+                </m:sSubPr>
+                <m:e>
+                  <m:r>
+                    <w:rPr>
+                      <w:rFonts w:ascii="Cambria Math"/>
+                      <w:lang w:val="en-US"/>
+                    </w:rPr>
+                    <m:t>U</m:t>
+                  </m:r>
+                </m:e>
+                <m:sub>
+                  <m:r>
+                    <w:rPr>
+                      <w:rFonts w:ascii="Cambria Math"/>
+                      <w:lang w:val="en-US"/>
+                    </w:rPr>
+                    <m:t>o</m:t>
+                  </m:r>
+                </m:sub>
+              </m:sSub>
+              <m:sSub>
+                <m:sSubPr>
+                  <m:ctrlPr>
+                    <w:rPr>
+                      <w:rFonts w:ascii="Cambria Math" w:hAnsi="Cambria Math"/>
+                      <w:i/>
+                      <w:lang w:val="en-US"/>
+                    </w:rPr>
+                  </m:ctrlPr>
+                </m:sSubPr>
+                <m:e>
+                  <m:r>
+                    <w:rPr>
+                      <w:rFonts w:ascii="Cambria Math"/>
+                      <w:lang w:val="en-US"/>
+                    </w:rPr>
+                    <m:t>H</m:t>
+                  </m:r>
+                </m:e>
+                <m:sub>
+                  <m:r>
+                    <w:rPr>
+                      <w:rFonts w:ascii="Cambria Math"/>
+                      <w:lang w:val="en-US"/>
+                    </w:rPr>
+                    <m:t>o</m:t>
+                  </m:r>
+                </m:sub>
+              </m:sSub>
+              <m:r>
+                <w:rPr>
+                  <w:rFonts w:ascii="Cambria Math"/>
+                  <w:lang w:val="en-US"/>
+                </w:rPr>
+                <m:t>+</m:t>
+              </m:r>
+              <m:sSub>
+                <m:sSubPr>
+                  <m:ctrlPr>
+                    <w:rPr>
+                      <w:rFonts w:ascii="Cambria Math" w:hAnsi="Cambria Math"/>
+                      <w:i/>
+                      <w:lang w:val="en-US"/>
+                    </w:rPr>
+                  </m:ctrlPr>
+                </m:sSubPr>
+                <m:e>
+                  <m:r>
+                    <w:rPr>
+                      <w:rFonts w:ascii="Cambria Math"/>
+                      <w:lang w:val="en-US"/>
+                    </w:rPr>
+                    <m:t>ρ</m:t>
+                  </m:r>
+                </m:e>
+                <m:sub>
+                  <m:r>
+                    <w:rPr>
+                      <w:rFonts w:ascii="Cambria Math"/>
+                      <w:lang w:val="en-US"/>
+                    </w:rPr>
+                    <m:t>p</m:t>
+                  </m:r>
+                </m:sub>
+              </m:sSub>
+              <m:sSub>
+                <m:sSubPr>
+                  <m:ctrlPr>
+                    <w:rPr>
+                      <w:rFonts w:ascii="Cambria Math" w:hAnsi="Cambria Math"/>
+                      <w:i/>
+                      <w:lang w:val="en-US"/>
+                    </w:rPr>
+                  </m:ctrlPr>
+                </m:sSubPr>
+                <m:e>
+                  <m:r>
+                    <w:rPr>
+                      <w:rFonts w:ascii="Cambria Math"/>
+                      <w:lang w:val="en-US"/>
+                    </w:rPr>
+                    <m:t>w</m:t>
+                  </m:r>
+                </m:e>
+                <m:sub>
+                  <m:r>
+                    <w:rPr>
+                      <w:rFonts w:ascii="Cambria Math"/>
+                      <w:lang w:val="en-US"/>
+                    </w:rPr>
+                    <m:t>ps</m:t>
+                  </m:r>
+                </m:sub>
+              </m:sSub>
+              <m:sSub>
+                <m:sSubPr>
+                  <m:ctrlPr>
+                    <w:rPr>
+                      <w:rFonts w:ascii="Cambria Math" w:hAnsi="Cambria Math"/>
+                      <w:i/>
+                      <w:lang w:val="en-US"/>
+                    </w:rPr>
+                  </m:ctrlPr>
+                </m:sSubPr>
+                <m:e>
+                  <m:r>
+                    <w:rPr>
+                      <w:rFonts w:ascii="Cambria Math"/>
+                      <w:lang w:val="en-US"/>
+                    </w:rPr>
+                    <m:t>U</m:t>
+                  </m:r>
+                </m:e>
+                <m:sub>
+                  <m:r>
+                    <w:rPr>
+                      <w:rFonts w:ascii="Cambria Math"/>
+                      <w:lang w:val="en-US"/>
+                    </w:rPr>
+                    <m:t>o</m:t>
+                  </m:r>
+                </m:sub>
+              </m:sSub>
+              <m:sSub>
+                <m:sSubPr>
+                  <m:ctrlPr>
+                    <w:rPr>
+                      <w:rFonts w:ascii="Cambria Math" w:hAnsi="Cambria Math"/>
+                      <w:i/>
+                      <w:lang w:val="en-US"/>
+                    </w:rPr>
+                  </m:ctrlPr>
+                </m:sSubPr>
+                <m:e>
+                  <m:r>
+                    <w:rPr>
+                      <w:rFonts w:ascii="Cambria Math"/>
+                      <w:lang w:val="en-US"/>
+                    </w:rPr>
+                    <m:t>H</m:t>
+                  </m:r>
+                </m:e>
+                <m:sub>
+                  <m:r>
+                    <w:rPr>
+                      <w:rFonts w:ascii="Cambria Math"/>
+                      <w:lang w:val="en-US"/>
+                    </w:rPr>
+                    <m:t>p</m:t>
+                  </m:r>
+                </m:sub>
+              </m:sSub>
+              <m:r>
+                <w:rPr>
+                  <w:rFonts w:ascii="Cambria Math"/>
+                  <w:lang w:val="en-US"/>
+                </w:rPr>
+                <m:t>)=</m:t>
+              </m:r>
+              <m:r>
+                <w:rPr>
+                  <w:rFonts w:ascii="Cambria Math" w:hAnsi="Cambria Math" w:cs="Cambria Math"/>
+                </w:rPr>
+                <m:t>∇</m:t>
+              </m:r>
+              <m:d>
+                <m:dPr>
+                  <m:begChr m:val="{"/>
+                  <m:endChr m:val="}"/>
+                  <m:ctrlPr>
+                    <w:rPr>
+                      <w:rFonts w:ascii="Cambria Math" w:hAnsi="Cambria Math"/>
+                      <w:i/>
+                      <w:lang w:val="en-US"/>
+                    </w:rPr>
+                  </m:ctrlPr>
+                </m:dPr>
+                <m:e>
+                  <m:d>
+                    <m:dPr>
+                      <m:begChr m:val="["/>
+                      <m:endChr m:val="]"/>
+                      <m:ctrlPr>
+                        <w:rPr>
+                          <w:rFonts w:ascii="Cambria Math" w:hAnsi="Cambria Math"/>
+                          <w:i/>
+                          <w:lang w:val="en-US"/>
+                        </w:rPr>
+                      </m:ctrlPr>
+                    </m:dPr>
+                    <m:e>
+                      <m:r>
+                        <w:rPr>
+                          <w:rFonts w:ascii="Cambria Math"/>
+                          <w:lang w:val="en-US"/>
+                        </w:rPr>
+                        <m:t xml:space="preserve">m </m:t>
+                      </m:r>
+                      <m:sSub>
+                        <m:sSubPr>
+                          <m:ctrlPr>
+                            <w:rPr>
+                              <w:rFonts w:ascii="Cambria Math" w:hAnsi="Cambria Math"/>
+                              <w:i/>
+                              <w:lang w:val="en-US"/>
+                            </w:rPr>
+                          </m:ctrlPr>
+                        </m:sSubPr>
+                        <m:e>
+                          <m:r>
+                            <w:rPr>
+                              <w:rFonts w:ascii="Cambria Math"/>
+                              <w:lang w:val="en-US"/>
+                            </w:rPr>
+                            <m:t>S</m:t>
+                          </m:r>
+                        </m:e>
+                        <m:sub>
+                          <m:r>
+                            <w:rPr>
+                              <w:rFonts w:ascii="Cambria Math"/>
+                              <w:lang w:val="en-US"/>
+                            </w:rPr>
+                            <m:t>w</m:t>
+                          </m:r>
+                        </m:sub>
+                      </m:sSub>
+                      <m:sSub>
+                        <m:sSubPr>
+                          <m:ctrlPr>
+                            <w:rPr>
+                              <w:rFonts w:ascii="Cambria Math" w:hAnsi="Cambria Math"/>
+                              <w:i/>
+                              <w:lang w:val="en-US"/>
+                            </w:rPr>
+                          </m:ctrlPr>
+                        </m:sSubPr>
+                        <m:e>
+                          <m:r>
+                            <w:rPr>
+                              <w:rFonts w:ascii="Cambria Math"/>
+                              <w:lang w:val="en-US"/>
+                            </w:rPr>
+                            <m:t>K</m:t>
+                          </m:r>
+                        </m:e>
+                        <m:sub>
+                          <m:r>
+                            <w:rPr>
+                              <w:rFonts w:ascii="Cambria Math"/>
+                              <w:lang w:val="en-US"/>
+                            </w:rPr>
+                            <m:t>w</m:t>
+                          </m:r>
+                        </m:sub>
+                      </m:sSub>
+                      <m:r>
+                        <w:rPr>
+                          <w:rFonts w:ascii="Cambria Math"/>
+                          <w:lang w:val="en-US"/>
+                        </w:rPr>
+                        <m:t>+</m:t>
+                      </m:r>
+                      <m:r>
+                        <w:rPr>
+                          <w:rFonts w:ascii="Cambria Math"/>
+                          <w:lang w:val="en-US"/>
+                        </w:rPr>
+                        <m:t>m</m:t>
+                      </m:r>
+                      <m:sSub>
+                        <m:sSubPr>
+                          <m:ctrlPr>
+                            <w:rPr>
+                              <w:rFonts w:ascii="Cambria Math" w:hAnsi="Cambria Math"/>
+                              <w:i/>
+                              <w:lang w:val="en-US"/>
+                            </w:rPr>
+                          </m:ctrlPr>
+                        </m:sSubPr>
+                        <m:e>
+                          <m:r>
+                            <w:rPr>
+                              <w:rFonts w:ascii="Cambria Math"/>
+                              <w:lang w:val="en-US"/>
+                            </w:rPr>
+                            <m:t>S</m:t>
+                          </m:r>
+                        </m:e>
+                        <m:sub>
+                          <m:r>
+                            <w:rPr>
+                              <w:rFonts w:ascii="Cambria Math"/>
+                              <w:lang w:val="en-US"/>
+                            </w:rPr>
+                            <m:t>o</m:t>
+                          </m:r>
+                        </m:sub>
+                      </m:sSub>
+                      <m:sSub>
+                        <m:sSubPr>
+                          <m:ctrlPr>
+                            <w:rPr>
+                              <w:rFonts w:ascii="Cambria Math" w:hAnsi="Cambria Math"/>
+                              <w:i/>
+                              <w:lang w:val="en-US"/>
+                            </w:rPr>
+                          </m:ctrlPr>
+                        </m:sSubPr>
+                        <m:e>
+                          <m:r>
+                            <w:rPr>
+                              <w:rFonts w:ascii="Cambria Math"/>
+                              <w:lang w:val="en-US"/>
+                            </w:rPr>
+                            <m:t>K</m:t>
+                          </m:r>
+                        </m:e>
+                        <m:sub>
+                          <m:r>
+                            <w:rPr>
+                              <w:rFonts w:ascii="Cambria Math"/>
+                              <w:lang w:val="en-US"/>
+                            </w:rPr>
+                            <m:t>o</m:t>
+                          </m:r>
+                        </m:sub>
+                      </m:sSub>
+                      <m:r>
+                        <w:rPr>
+                          <w:rFonts w:ascii="Cambria Math"/>
+                          <w:lang w:val="en-US"/>
+                        </w:rPr>
+                        <m:t>(1</m:t>
+                      </m:r>
+                      <m:r>
+                        <w:rPr>
+                          <w:rFonts w:ascii="Cambria Math"/>
+                          <w:lang w:val="en-US"/>
+                        </w:rPr>
+                        <m:t>-</m:t>
+                      </m:r>
+                      <m:sSub>
+                        <m:sSubPr>
+                          <m:ctrlPr>
+                            <w:rPr>
+                              <w:rFonts w:ascii="Cambria Math" w:hAnsi="Cambria Math"/>
+                              <w:i/>
+                              <w:lang w:val="en-US"/>
+                            </w:rPr>
+                          </m:ctrlPr>
+                        </m:sSubPr>
+                        <m:e>
+                          <m:r>
+                            <w:rPr>
+                              <w:rFonts w:ascii="Cambria Math"/>
+                              <w:lang w:val="en-US"/>
+                            </w:rPr>
+                            <m:t>w</m:t>
+                          </m:r>
+                        </m:e>
+                        <m:sub>
+                          <m:r>
+                            <w:rPr>
+                              <w:rFonts w:ascii="Cambria Math"/>
+                              <w:lang w:val="en-US"/>
+                            </w:rPr>
+                            <m:t>ps</m:t>
+                          </m:r>
+                        </m:sub>
+                      </m:sSub>
+                      <m:r>
+                        <w:rPr>
+                          <w:rFonts w:ascii="Cambria Math"/>
+                          <w:lang w:val="en-US"/>
+                        </w:rPr>
+                        <m:t>)+</m:t>
+                      </m:r>
+                      <m:r>
+                        <w:rPr>
+                          <w:rFonts w:ascii="Cambria Math"/>
+                          <w:lang w:val="en-US"/>
+                        </w:rPr>
+                        <m:t>m</m:t>
+                      </m:r>
+                      <m:sSub>
+                        <m:sSubPr>
+                          <m:ctrlPr>
+                            <w:rPr>
+                              <w:rFonts w:ascii="Cambria Math" w:hAnsi="Cambria Math"/>
+                              <w:i/>
+                              <w:lang w:val="en-US"/>
+                            </w:rPr>
+                          </m:ctrlPr>
+                        </m:sSubPr>
+                        <m:e>
+                          <m:r>
+                            <w:rPr>
+                              <w:rFonts w:ascii="Cambria Math"/>
+                              <w:lang w:val="en-US"/>
+                            </w:rPr>
+                            <m:t>S</m:t>
+                          </m:r>
+                        </m:e>
+                        <m:sub>
+                          <m:r>
+                            <w:rPr>
+                              <w:rFonts w:ascii="Cambria Math"/>
+                              <w:lang w:val="en-US"/>
+                            </w:rPr>
+                            <m:t>o</m:t>
+                          </m:r>
+                        </m:sub>
+                      </m:sSub>
+                      <m:sSub>
+                        <m:sSubPr>
+                          <m:ctrlPr>
+                            <w:rPr>
+                              <w:rFonts w:ascii="Cambria Math" w:hAnsi="Cambria Math"/>
+                              <w:i/>
+                              <w:lang w:val="en-US"/>
+                            </w:rPr>
+                          </m:ctrlPr>
+                        </m:sSubPr>
+                        <m:e>
+                          <m:r>
+                            <w:rPr>
+                              <w:rFonts w:ascii="Cambria Math"/>
+                              <w:lang w:val="en-US"/>
+                            </w:rPr>
+                            <m:t>w</m:t>
+                          </m:r>
+                        </m:e>
+                        <m:sub>
+                          <m:r>
+                            <w:rPr>
+                              <w:rFonts w:ascii="Cambria Math"/>
+                              <w:lang w:val="en-US"/>
+                            </w:rPr>
+                            <m:t>ps</m:t>
+                          </m:r>
+                        </m:sub>
+                      </m:sSub>
+                      <m:sSub>
+                        <m:sSubPr>
+                          <m:ctrlPr>
+                            <w:rPr>
+                              <w:rFonts w:ascii="Cambria Math" w:hAnsi="Cambria Math"/>
+                              <w:i/>
+                              <w:lang w:val="en-US"/>
+                            </w:rPr>
+                          </m:ctrlPr>
+                        </m:sSubPr>
+                        <m:e>
+                          <m:r>
+                            <w:rPr>
+                              <w:rFonts w:ascii="Cambria Math"/>
+                              <w:lang w:val="en-US"/>
+                            </w:rPr>
+                            <m:t>K</m:t>
+                          </m:r>
+                        </m:e>
+                        <m:sub>
+                          <m:r>
+                            <w:rPr>
+                              <w:rFonts w:ascii="Cambria Math"/>
+                              <w:lang w:val="en-US"/>
+                            </w:rPr>
+                            <m:t>p</m:t>
+                          </m:r>
+                        </m:sub>
+                      </m:sSub>
+                      <m:r>
+                        <w:rPr>
+                          <w:rFonts w:ascii="Cambria Math"/>
+                          <w:lang w:val="en-US"/>
+                        </w:rPr>
+                        <m:t>+(1</m:t>
+                      </m:r>
+                      <m:r>
+                        <w:rPr>
+                          <w:rFonts w:ascii="Cambria Math"/>
+                          <w:lang w:val="en-US"/>
+                        </w:rPr>
+                        <m:t>-</m:t>
+                      </m:r>
+                      <m:r>
+                        <w:rPr>
+                          <w:rFonts w:ascii="Cambria Math"/>
+                          <w:lang w:val="en-US"/>
+                        </w:rPr>
+                        <m:t>m</m:t>
+                      </m:r>
+                      <m:r>
+                        <w:rPr>
+                          <w:rFonts w:ascii="Cambria Math"/>
+                          <w:lang w:val="en-US"/>
+                        </w:rPr>
+                        <m:t>)</m:t>
+                      </m:r>
+                      <m:sSub>
+                        <m:sSubPr>
+                          <m:ctrlPr>
+                            <w:rPr>
+                              <w:rFonts w:ascii="Cambria Math" w:hAnsi="Cambria Math"/>
+                              <w:i/>
+                              <w:lang w:val="en-US"/>
+                            </w:rPr>
+                          </m:ctrlPr>
+                        </m:sSubPr>
+                        <m:e>
+                          <m:r>
+                            <w:rPr>
+                              <w:rFonts w:ascii="Cambria Math"/>
+                              <w:lang w:val="en-US"/>
+                            </w:rPr>
+                            <m:t>K</m:t>
+                          </m:r>
+                        </m:e>
+                        <m:sub>
+                          <m:r>
+                            <w:rPr>
+                              <w:rFonts w:ascii="Cambria Math"/>
+                              <w:lang w:val="en-US"/>
+                            </w:rPr>
+                            <m:t>f</m:t>
+                          </m:r>
+                        </m:sub>
+                      </m:sSub>
+                    </m:e>
+                  </m:d>
+                  <m:r>
+                    <w:rPr>
+                      <w:rFonts w:ascii="Cambria Math" w:hAnsi="Cambria Math" w:cs="Cambria Math"/>
+                    </w:rPr>
+                    <m:t>∇</m:t>
+                  </m:r>
+                  <m:r>
+                    <w:rPr>
+                      <w:rFonts w:ascii="Cambria Math"/>
+                      <w:lang w:val="en-US"/>
+                    </w:rPr>
+                    <m:t>T</m:t>
+                  </m:r>
+                </m:e>
+              </m:d>
+              <m:r>
+                <w:rPr>
+                  <w:rFonts w:ascii="Cambria Math" w:hAnsi="Cambria Math"/>
+                  <w:lang w:val="en-US"/>
+                </w:rPr>
+                <m:t>+</m:t>
+              </m:r>
+              <m:sSub>
+                <m:sSubPr>
+                  <m:ctrlPr>
+                    <w:rPr>
+                      <w:rFonts w:ascii="Cambria Math" w:hAnsi="Cambria Math"/>
+                      <w:i/>
+                      <w:lang w:val="en-US"/>
+                    </w:rPr>
+                  </m:ctrlPr>
+                </m:sSubPr>
+                <m:e>
+                  <m:r>
+                    <w:rPr>
+                      <w:rFonts w:ascii="Cambria Math" w:hAnsi="Cambria Math"/>
+                      <w:lang w:val="en-US"/>
+                    </w:rPr>
+                    <m:t>q</m:t>
+                  </m:r>
+                </m:e>
+                <m:sub>
+                  <m:r>
+                    <w:rPr>
+                      <w:rFonts w:ascii="Cambria Math" w:hAnsi="Cambria Math"/>
+                      <w:lang w:val="en-US"/>
+                    </w:rPr>
+                    <m:t>o</m:t>
+                  </m:r>
+                </m:sub>
+              </m:sSub>
+              <m:sSub>
+                <m:sSubPr>
+                  <m:ctrlPr>
+                    <w:rPr>
+                      <w:rFonts w:ascii="Cambria Math" w:hAnsi="Cambria Math"/>
+                      <w:i/>
+                      <w:lang w:val="en-US"/>
+                    </w:rPr>
+                  </m:ctrlPr>
+                </m:sSubPr>
+                <m:e>
+                  <m:r>
+                    <w:rPr>
+                      <w:rFonts w:ascii="Cambria Math"/>
+                      <w:lang w:val="en-US"/>
+                    </w:rPr>
+                    <m:t>ρ</m:t>
+                  </m:r>
+                </m:e>
+                <m:sub>
+                  <m:r>
+                    <w:rPr>
+                      <w:rFonts w:ascii="Cambria Math"/>
+                      <w:lang w:val="en-US"/>
+                    </w:rPr>
+                    <m:t>o</m:t>
+                  </m:r>
+                </m:sub>
+              </m:sSub>
+              <m:sSub>
+                <m:sSubPr>
+                  <m:ctrlPr>
+                    <w:rPr>
+                      <w:rFonts w:ascii="Cambria Math" w:hAnsi="Cambria Math"/>
+                      <w:i/>
+                      <w:lang w:val="en-US"/>
+                    </w:rPr>
+                  </m:ctrlPr>
+                </m:sSubPr>
+                <m:e>
+                  <m:r>
+                    <w:rPr>
+                      <w:rFonts w:ascii="Cambria Math"/>
+                      <w:lang w:val="en-US"/>
+                    </w:rPr>
+                    <m:t>C</m:t>
+                  </m:r>
+                </m:e>
+                <m:sub>
+                  <m:r>
+                    <w:rPr>
+                      <w:rFonts w:ascii="Cambria Math"/>
+                      <w:lang w:val="en-US"/>
+                    </w:rPr>
+                    <m:t>o</m:t>
+                  </m:r>
+                </m:sub>
+              </m:sSub>
+              <m:r>
+                <w:rPr>
+                  <w:rFonts w:ascii="Cambria Math"/>
+                </w:rPr>
+                <m:t>T</m:t>
+              </m:r>
+            </m:e>
+          </m:mr>
+        </m:m>
+      </m:oMath>
+      <w:r>
+        <w:rPr>
+          <w:lang w:val="en-US"/>
+        </w:rPr>
         <w:t xml:space="preserve"> </w:t>
       </w:r>
+    </w:p>
+    <w:p>
+      <w:pPr>
+        <w:jc w:val="both"/>
+        <w:rPr>
+          <w:rFonts w:eastAsiaTheme="minorEastAsia"/>
+          <w:i/>
+          <w:lang w:val="en-US"/>
+        </w:rPr>
+      </w:pPr>
     </w:p>
     <w:p>
       <w:pPr>
@@ -7235,6 +10157,7 @@
         <w:jc w:val="both"/>
         <w:rPr>
           <w:rFonts w:eastAsiaTheme="minorEastAsia"/>
+          <w:lang w:val="en-US"/>
         </w:rPr>
       </w:pPr>
     </w:p>
@@ -7246,6 +10169,7 @@
         <w:jc w:val="both"/>
         <w:rPr>
           <w:rFonts w:eastAsiaTheme="minorEastAsia"/>
+          <w:lang w:val="en-US"/>
         </w:rPr>
       </w:pPr>
     </w:p>
@@ -7257,6 +10181,7 @@
         <w:jc w:val="both"/>
         <w:rPr>
           <w:rFonts w:eastAsiaTheme="minorEastAsia"/>
+          <w:lang w:val="en-US"/>
         </w:rPr>
       </w:pPr>
     </w:p>
@@ -7266,6 +10191,9 @@
           <w:tab w:val="right" w:pos="9750"/>
         </w:tabs>
         <w:jc w:val="both"/>
+        <w:rPr>
+          <w:lang w:val="en-US"/>
+        </w:rPr>
       </w:pPr>
     </w:p>
     <w:p>
@@ -7879,6 +10807,7 @@
         <w:jc w:val="both"/>
       </w:pPr>
       <w:r>
+        <w:lastRenderedPageBreak/>
         <w:br w:type="page"/>
       </w:r>
     </w:p>
@@ -9631,7 +12560,7 @@
           <v:shape id="_x0000_i1025" type="#_x0000_t75" style="width:372pt;height:78pt" o:ole="">
             <v:imagedata r:id="rId8" o:title=""/>
           </v:shape>
-          <o:OLEObject Type="Embed" ProgID="Equation.DSMT4" ShapeID="_x0000_i1025" DrawAspect="Content" ObjectID="_1810839067" r:id="rId9"/>
+          <o:OLEObject Type="Embed" ProgID="Equation.DSMT4" ShapeID="_x0000_i1025" DrawAspect="Content" ObjectID="_1810919177" r:id="rId9"/>
         </w:object>
       </w:r>
     </w:p>
@@ -9659,7 +12588,7 @@
           <v:shape id="_x0000_i1026" type="#_x0000_t75" style="width:474pt;height:1in" o:ole="">
             <v:imagedata r:id="rId10" o:title=""/>
           </v:shape>
-          <o:OLEObject Type="Embed" ProgID="Equation.DSMT4" ShapeID="_x0000_i1026" DrawAspect="Content" ObjectID="_1810839068" r:id="rId11"/>
+          <o:OLEObject Type="Embed" ProgID="Equation.DSMT4" ShapeID="_x0000_i1026" DrawAspect="Content" ObjectID="_1810919178" r:id="rId11"/>
         </w:object>
       </w:r>
     </w:p>
@@ -15881,7 +18810,7 @@
           <v:shape id="_x0000_i1027" type="#_x0000_t75" style="width:42pt;height:24pt" o:ole="">
             <v:imagedata r:id="rId12" o:title=""/>
           </v:shape>
-          <o:OLEObject Type="Embed" ProgID="Equation.3" ShapeID="_x0000_i1027" DrawAspect="Content" ObjectID="_1810839069" r:id="rId13"/>
+          <o:OLEObject Type="Embed" ProgID="Equation.3" ShapeID="_x0000_i1027" DrawAspect="Content" ObjectID="_1810919179" r:id="rId13"/>
         </w:object>
       </w:r>
       <w:r>
@@ -15921,7 +18850,7 @@
           <v:shape id="_x0000_i1028" type="#_x0000_t75" style="width:78pt;height:42pt" o:ole="">
             <v:imagedata r:id="rId14" o:title=""/>
           </v:shape>
-          <o:OLEObject Type="Embed" ProgID="Equation.3" ShapeID="_x0000_i1028" DrawAspect="Content" ObjectID="_1810839070" r:id="rId15"/>
+          <o:OLEObject Type="Embed" ProgID="Equation.3" ShapeID="_x0000_i1028" DrawAspect="Content" ObjectID="_1810919180" r:id="rId15"/>
         </w:object>
       </w:r>
       <w:r>
@@ -15984,7 +18913,7 @@
           <v:shape id="_x0000_i1029" type="#_x0000_t75" style="width:198pt;height:102pt" o:ole="">
             <v:imagedata r:id="rId16" o:title=""/>
           </v:shape>
-          <o:OLEObject Type="Embed" ProgID="Equation.3" ShapeID="_x0000_i1029" DrawAspect="Content" ObjectID="_1810839071" r:id="rId17"/>
+          <o:OLEObject Type="Embed" ProgID="Equation.3" ShapeID="_x0000_i1029" DrawAspect="Content" ObjectID="_1810919181" r:id="rId17"/>
         </w:object>
       </w:r>
     </w:p>
@@ -30381,6 +33310,17 @@
       <w:pPr>
         <w:pStyle w:val="1"/>
         <w:rPr>
+          <w:rFonts w:ascii="Times New Roman" w:eastAsiaTheme="minorHAnsi" w:hAnsi="Times New Roman" w:cs="Times New Roman"/>
+          <w:b/>
+          <w:bCs/>
+          <w:color w:val="auto"/>
+          <w:sz w:val="28"/>
+          <w:szCs w:val="28"/>
+        </w:rPr>
+      </w:pPr>
+      <w:bookmarkStart w:id="6" w:name="_Toc199749673"/>
+      <w:r>
+        <w:rPr>
           <w:rFonts w:ascii="Times New Roman" w:hAnsi="Times New Roman" w:cs="Times New Roman"/>
           <w:b/>
           <w:bCs/>
@@ -30388,8 +33328,10 @@
           <w:sz w:val="28"/>
           <w:szCs w:val="28"/>
         </w:rPr>
-      </w:pPr>
-      <w:bookmarkStart w:id="6" w:name="_Toc199749673"/>
+        <w:lastRenderedPageBreak/>
+        <w:t>Кольматация</w:t>
+      </w:r>
+      <w:bookmarkEnd w:id="6"/>
       <w:r>
         <w:rPr>
           <w:rFonts w:ascii="Times New Roman" w:hAnsi="Times New Roman" w:cs="Times New Roman"/>
@@ -30399,10 +33341,8 @@
           <w:sz w:val="28"/>
           <w:szCs w:val="28"/>
         </w:rPr>
-        <w:lastRenderedPageBreak/>
-        <w:t>Кольматация</w:t>
-      </w:r>
-      <w:bookmarkEnd w:id="6"/>
+        <w:t xml:space="preserve"> </w:t>
+      </w:r>
       <w:r>
         <w:rPr>
           <w:rFonts w:ascii="Times New Roman" w:hAnsi="Times New Roman" w:cs="Times New Roman"/>
@@ -30412,30 +33352,8 @@
           <w:sz w:val="28"/>
           <w:szCs w:val="28"/>
         </w:rPr>
-        <w:t xml:space="preserve"> </w:t>
-      </w:r>
-    </w:p>
-    <w:p/>
-    <w:p>
-      <w:pPr>
-        <w:spacing w:after="160" w:line="259" w:lineRule="auto"/>
-      </w:pPr>
-      <w:r>
-        <w:br w:type="page"/>
-      </w:r>
-    </w:p>
-    <w:p>
-      <w:pPr>
-        <w:pStyle w:val="1"/>
-        <w:rPr>
-          <w:rFonts w:ascii="Times New Roman" w:eastAsiaTheme="minorHAnsi" w:hAnsi="Times New Roman" w:cs="Times New Roman"/>
-          <w:b/>
-          <w:bCs/>
-          <w:color w:val="auto"/>
-          <w:sz w:val="28"/>
-          <w:szCs w:val="28"/>
-        </w:rPr>
-      </w:pPr>
+        <w:t xml:space="preserve">и </w:t>
+      </w:r>
       <w:bookmarkStart w:id="7" w:name="_Toc199749674"/>
       <w:r>
         <w:rPr>
@@ -30446,18 +33364,38 @@
           <w:sz w:val="28"/>
           <w:szCs w:val="28"/>
         </w:rPr>
-        <w:lastRenderedPageBreak/>
-        <w:t>Суффозия</w:t>
+        <w:t>с</w:t>
+      </w:r>
+      <w:r>
+        <w:rPr>
+          <w:rFonts w:ascii="Times New Roman" w:hAnsi="Times New Roman" w:cs="Times New Roman"/>
+          <w:b/>
+          <w:bCs/>
+          <w:color w:val="auto"/>
+          <w:sz w:val="28"/>
+          <w:szCs w:val="28"/>
+        </w:rPr>
+        <w:t>уффозия</w:t>
       </w:r>
       <w:bookmarkEnd w:id="7"/>
     </w:p>
-    <w:p/>
-    <w:p/>
+    <w:p>
+      <w:pPr>
+        <w:pStyle w:val="1"/>
+        <w:rPr>
+          <w:rFonts w:ascii="Times New Roman" w:hAnsi="Times New Roman" w:cs="Times New Roman"/>
+          <w:b/>
+          <w:bCs/>
+          <w:color w:val="auto"/>
+          <w:sz w:val="28"/>
+          <w:szCs w:val="28"/>
+        </w:rPr>
+      </w:pPr>
+    </w:p>
     <w:p/>
     <w:p>
       <w:pPr>
-        <w:spacing w:after="160" w:line="360" w:lineRule="auto"/>
-        <w:jc w:val="both"/>
+        <w:spacing w:after="160" w:line="259" w:lineRule="auto"/>
       </w:pPr>
       <w:r>
         <w:br w:type="page"/>
@@ -30625,8 +33563,6 @@
       </w:r>
       <w:r>
         <w:rPr>
-          <w:b/>
-          <w:bCs/>
           <w:lang w:val="en-US"/>
         </w:rPr>
         <w:t>2</w:t>
@@ -31239,7 +34175,15 @@
         <w:jc w:val="both"/>
       </w:pPr>
       <w:r>
-        <w:t>Пудовкин М.А., Саламатин А.Н., Чугунов В.А. Температурные процессы в действующих скважинах. - Казань : Изд-во Казан.унив-та. - 1977.- 168 с.</w:t>
+        <w:t xml:space="preserve">Пудовкин М.А., Саламатин А.Н., Чугунов В.А. Температурные процессы в действующих скважинах. - Казань: Изд-во </w:t>
+      </w:r>
+      <w:proofErr w:type="spellStart"/>
+      <w:r>
+        <w:t>Казан.унив</w:t>
+      </w:r>
+      <w:proofErr w:type="spellEnd"/>
+      <w:r>
+        <w:t>-та. - 1977.- 168 с.</w:t>
       </w:r>
     </w:p>
     <w:p>

</xml_diff>

<commit_message>
upd abstracts and text dissertation
</commit_message>
<xml_diff>
--- a/resources/Лазарев диплом.docx
+++ b/resources/Лазарев диплом.docx
@@ -102,7 +102,11 @@
         <w:t>Направление</w:t>
       </w:r>
       <w:r>
-        <w:t xml:space="preserve"> подготовки</w:t>
+        <w:t xml:space="preserve"> </w:t>
+      </w:r>
+      <w:proofErr w:type="gramStart"/>
+      <w:r>
+        <w:t>подготовки</w:t>
       </w:r>
       <w:r>
         <w:t>:</w:t>
@@ -111,7 +115,14 @@
         <w:rPr>
           <w:u w:val="single"/>
         </w:rPr>
-        <w:t xml:space="preserve">  01.04.03  </w:t>
+        <w:t xml:space="preserve">  01.04.03</w:t>
+      </w:r>
+      <w:proofErr w:type="gramEnd"/>
+      <w:r>
+        <w:rPr>
+          <w:u w:val="single"/>
+        </w:rPr>
+        <w:t xml:space="preserve">  </w:t>
       </w:r>
       <w:r>
         <w:t xml:space="preserve"> –</w:t>
@@ -388,12 +399,27 @@
         <w:rPr>
           <w:u w:val="single"/>
         </w:rPr>
-        <w:t>д. ф.- м.н.</w:t>
-      </w:r>
+        <w:t xml:space="preserve">д. ф.- </w:t>
+      </w:r>
+      <w:proofErr w:type="spellStart"/>
+      <w:proofErr w:type="gramStart"/>
       <w:r>
         <w:rPr>
           <w:u w:val="single"/>
         </w:rPr>
+        <w:t>м.н</w:t>
+      </w:r>
+      <w:proofErr w:type="spellEnd"/>
+      <w:r>
+        <w:rPr>
+          <w:u w:val="single"/>
+        </w:rPr>
+        <w:t>.</w:t>
+      </w:r>
+      <w:r>
+        <w:rPr>
+          <w:u w:val="single"/>
+        </w:rPr>
         <w:t xml:space="preserve"> </w:t>
       </w:r>
       <w:r>
@@ -402,6 +428,7 @@
         </w:rPr>
         <w:t>,</w:t>
       </w:r>
+      <w:proofErr w:type="gramEnd"/>
       <w:r>
         <w:rPr>
           <w:u w:val="single"/>
@@ -551,19 +578,41 @@
         <w:rPr>
           <w:u w:val="single"/>
         </w:rPr>
-        <w:t>д. ф.- м.н.</w:t>
-      </w:r>
+        <w:t xml:space="preserve">д. ф.- </w:t>
+      </w:r>
+      <w:proofErr w:type="spellStart"/>
+      <w:proofErr w:type="gramStart"/>
       <w:r>
         <w:rPr>
           <w:u w:val="single"/>
         </w:rPr>
+        <w:t>м.н</w:t>
+      </w:r>
+      <w:proofErr w:type="spellEnd"/>
+      <w:r>
+        <w:rPr>
+          <w:u w:val="single"/>
+        </w:rPr>
+        <w:t>.</w:t>
+      </w:r>
+      <w:r>
+        <w:rPr>
+          <w:u w:val="single"/>
+        </w:rPr>
         <w:t xml:space="preserve"> </w:t>
       </w:r>
       <w:r>
         <w:rPr>
           <w:u w:val="single"/>
         </w:rPr>
-        <w:t xml:space="preserve">, </w:t>
+        <w:t>,</w:t>
+      </w:r>
+      <w:proofErr w:type="gramEnd"/>
+      <w:r>
+        <w:rPr>
+          <w:u w:val="single"/>
+        </w:rPr>
+        <w:t xml:space="preserve"> </w:t>
       </w:r>
       <w:r>
         <w:rPr>
@@ -5319,12 +5368,33 @@
           </w:rPr>
           <m:t>=</m:t>
         </m:r>
-        <m:r>
-          <w:rPr>
-            <w:rFonts w:ascii="Cambria Math"/>
-          </w:rPr>
-          <m:t>-</m:t>
-        </m:r>
+        <m:sSub>
+          <m:sSubPr>
+            <m:ctrlPr>
+              <w:rPr>
+                <w:rFonts w:ascii="Cambria Math" w:hAnsi="Cambria Math"/>
+                <w:i/>
+              </w:rPr>
+            </m:ctrlPr>
+          </m:sSubPr>
+          <m:e>
+            <m:r>
+              <w:rPr>
+                <w:rFonts w:ascii="Cambria Math" w:hAnsi="Cambria Math"/>
+                <w:lang w:val="en-US"/>
+              </w:rPr>
+              <m:t>q</m:t>
+            </m:r>
+          </m:e>
+          <m:sub>
+            <m:r>
+              <w:rPr>
+                <w:rFonts w:ascii="Cambria Math" w:hAnsi="Cambria Math"/>
+              </w:rPr>
+              <m:t>p</m:t>
+            </m:r>
+          </m:sub>
+        </m:sSub>
         <m:sSub>
           <m:sSubPr>
             <m:ctrlPr>
@@ -5354,38 +5424,11 @@
             </m:r>
           </m:sub>
         </m:sSub>
-        <m:sSub>
-          <m:sSubPr>
-            <m:ctrlPr>
-              <w:rPr>
-                <w:rFonts w:ascii="Cambria Math" w:hAnsi="Cambria Math"/>
-                <w:i/>
-              </w:rPr>
-            </m:ctrlPr>
-          </m:sSubPr>
-          <m:e>
-            <m:r>
-              <w:rPr>
-                <w:rFonts w:ascii="Cambria Math" w:hAnsi="Cambria Math"/>
-                <w:lang w:val="en-US"/>
-              </w:rPr>
-              <m:t>q</m:t>
-            </m:r>
-          </m:e>
-          <m:sub>
-            <m:r>
-              <w:rPr>
-                <w:rFonts w:ascii="Cambria Math" w:hAnsi="Cambria Math"/>
-              </w:rPr>
-              <m:t>p</m:t>
-            </m:r>
-          </m:sub>
-        </m:sSub>
         <m:r>
           <w:rPr>
             <w:rFonts w:ascii="Cambria Math" w:hAnsi="Cambria Math"/>
           </w:rPr>
-          <m:t>-</m:t>
+          <m:t>+</m:t>
         </m:r>
         <m:sSub>
           <m:sSubPr>
@@ -7198,10 +7241,22 @@
         <w:t xml:space="preserve"> Поэтому можно полагать, что </w:t>
       </w:r>
       <w:r>
-        <w:t xml:space="preserve">в некотором </w:t>
-      </w:r>
-      <w:r>
-        <w:t>представительном объеме (ПС)</w:t>
+        <w:t xml:space="preserve">для любого </w:t>
+      </w:r>
+      <w:r>
+        <w:t>представительно</w:t>
+      </w:r>
+      <w:r>
+        <w:t>го</w:t>
+      </w:r>
+      <w:r>
+        <w:t xml:space="preserve"> объем</w:t>
+      </w:r>
+      <w:r>
+        <w:t>а</w:t>
+      </w:r>
+      <w:r>
+        <w:t xml:space="preserve"> (ПС)</w:t>
       </w:r>
       <w:r>
         <w:t xml:space="preserve"> </w:t>
@@ -7237,13 +7292,16 @@
         <w:t xml:space="preserve">Тогда </w:t>
       </w:r>
       <w:r>
-        <w:t>уравнение баланса полной энергии всей системы при тепловом равновесии может быть</w:t>
+        <w:t>уравнение баланса полной энергии всей системы может быть</w:t>
       </w:r>
       <w:r>
         <w:t xml:space="preserve"> записано</w:t>
       </w:r>
       <w:r>
         <w:t xml:space="preserve"> следующим уравнением</w:t>
+      </w:r>
+      <w:r>
+        <w:t>:</w:t>
       </w:r>
     </w:p>
     <w:p>
@@ -8702,926 +8760,928 @@
       <w:pPr>
         <w:jc w:val="both"/>
         <w:rPr>
+          <w:rFonts w:eastAsiaTheme="minorEastAsia"/>
           <w:lang w:val="en-US"/>
         </w:rPr>
       </w:pPr>
-      <m:oMath>
-        <m:m>
-          <m:mPr>
-            <m:mcs>
-              <m:mc>
-                <m:mcPr>
-                  <m:count m:val="1"/>
-                  <m:mcJc m:val="center"/>
-                </m:mcPr>
-              </m:mc>
-            </m:mcs>
-            <m:ctrlPr>
-              <w:rPr>
-                <w:rFonts w:ascii="Cambria Math" w:hAnsi="Cambria Math"/>
-                <w:i/>
-              </w:rPr>
-            </m:ctrlPr>
-          </m:mPr>
-          <m:mr>
-            <m:e>
-              <m:f>
-                <m:fPr>
-                  <m:ctrlPr>
-                    <w:rPr>
-                      <w:rFonts w:ascii="Cambria Math" w:hAnsi="Cambria Math"/>
-                      <w:i/>
-                      <w:lang w:val="en-US"/>
-                    </w:rPr>
-                  </m:ctrlPr>
-                </m:fPr>
-                <m:num>
-                  <m:r>
-                    <w:rPr>
-                      <w:rFonts w:ascii="Cambria Math"/>
-                    </w:rPr>
-                    <m:t>∂</m:t>
-                  </m:r>
-                </m:num>
-                <m:den>
-                  <m:r>
-                    <w:rPr>
-                      <w:rFonts w:ascii="Cambria Math"/>
-                    </w:rPr>
-                    <m:t>∂</m:t>
-                  </m:r>
-                  <m:r>
-                    <w:rPr>
-                      <w:rFonts w:ascii="Cambria Math"/>
-                      <w:lang w:val="en-US"/>
-                    </w:rPr>
-                    <m:t>t</m:t>
-                  </m:r>
-                </m:den>
-              </m:f>
+      <m:oMathPara>
+        <m:oMath>
+          <m:f>
+            <m:fPr>
+              <m:ctrlPr>
+                <w:rPr>
+                  <w:rFonts w:ascii="Cambria Math" w:hAnsi="Cambria Math"/>
+                  <w:i/>
+                  <w:lang w:val="en-US"/>
+                </w:rPr>
+              </m:ctrlPr>
+            </m:fPr>
+            <m:num>
+              <m:r>
+                <w:rPr>
+                  <w:rFonts w:ascii="Cambria Math"/>
+                </w:rPr>
+                <m:t>∂</m:t>
+              </m:r>
+            </m:num>
+            <m:den>
+              <m:r>
+                <w:rPr>
+                  <w:rFonts w:ascii="Cambria Math"/>
+                </w:rPr>
+                <m:t>∂</m:t>
+              </m:r>
               <m:r>
                 <w:rPr>
                   <w:rFonts w:ascii="Cambria Math"/>
                   <w:lang w:val="en-US"/>
                 </w:rPr>
-                <m:t>[</m:t>
+                <m:t>t</m:t>
               </m:r>
+            </m:den>
+          </m:f>
+          <m:r>
+            <w:rPr>
+              <w:rFonts w:ascii="Cambria Math"/>
+            </w:rPr>
+            <m:t>[</m:t>
+          </m:r>
+          <m:r>
+            <w:rPr>
+              <w:rFonts w:ascii="Cambria Math"/>
+              <w:lang w:val="en-US"/>
+            </w:rPr>
+            <m:t>m</m:t>
+          </m:r>
+          <m:r>
+            <w:rPr>
+              <w:rFonts w:ascii="Cambria Math"/>
+            </w:rPr>
+            <m:t xml:space="preserve"> </m:t>
+          </m:r>
+          <m:sSub>
+            <m:sSubPr>
+              <m:ctrlPr>
+                <w:rPr>
+                  <w:rFonts w:ascii="Cambria Math" w:hAnsi="Cambria Math"/>
+                  <w:i/>
+                  <w:lang w:val="en-US"/>
+                </w:rPr>
+              </m:ctrlPr>
+            </m:sSubPr>
+            <m:e>
               <m:r>
                 <w:rPr>
                   <w:rFonts w:ascii="Cambria Math"/>
                   <w:lang w:val="en-US"/>
                 </w:rPr>
-                <m:t xml:space="preserve">m </m:t>
+                <m:t>S</m:t>
               </m:r>
-              <m:sSub>
-                <m:sSubPr>
-                  <m:ctrlPr>
-                    <w:rPr>
-                      <w:rFonts w:ascii="Cambria Math" w:hAnsi="Cambria Math"/>
-                      <w:i/>
-                      <w:lang w:val="en-US"/>
-                    </w:rPr>
-                  </m:ctrlPr>
-                </m:sSubPr>
-                <m:e>
-                  <m:r>
-                    <w:rPr>
-                      <w:rFonts w:ascii="Cambria Math"/>
-                      <w:lang w:val="en-US"/>
-                    </w:rPr>
-                    <m:t>S</m:t>
-                  </m:r>
-                </m:e>
-                <m:sub>
-                  <m:r>
-                    <w:rPr>
-                      <w:rFonts w:ascii="Cambria Math"/>
-                      <w:lang w:val="en-US"/>
-                    </w:rPr>
-                    <m:t>w</m:t>
-                  </m:r>
-                </m:sub>
-              </m:sSub>
-              <m:sSub>
-                <m:sSubPr>
-                  <m:ctrlPr>
-                    <w:rPr>
-                      <w:rFonts w:ascii="Cambria Math" w:hAnsi="Cambria Math"/>
-                      <w:i/>
-                      <w:lang w:val="en-US"/>
-                    </w:rPr>
-                  </m:ctrlPr>
-                </m:sSubPr>
-                <m:e>
-                  <m:r>
-                    <w:rPr>
-                      <w:rFonts w:ascii="Cambria Math"/>
-                      <w:lang w:val="en-US"/>
-                    </w:rPr>
-                    <m:t>ρ</m:t>
-                  </m:r>
-                </m:e>
-                <m:sub>
-                  <m:r>
-                    <w:rPr>
-                      <w:rFonts w:ascii="Cambria Math"/>
-                      <w:lang w:val="en-US"/>
-                    </w:rPr>
-                    <m:t>w</m:t>
-                  </m:r>
-                </m:sub>
-              </m:sSub>
-              <m:sSub>
-                <m:sSubPr>
-                  <m:ctrlPr>
-                    <w:rPr>
-                      <w:rFonts w:ascii="Cambria Math" w:hAnsi="Cambria Math"/>
-                      <w:i/>
-                      <w:lang w:val="en-US"/>
-                    </w:rPr>
-                  </m:ctrlPr>
-                </m:sSubPr>
-                <m:e>
-                  <m:r>
-                    <w:rPr>
-                      <w:rFonts w:ascii="Cambria Math"/>
-                      <w:lang w:val="en-US"/>
-                    </w:rPr>
-                    <m:t>H</m:t>
-                  </m:r>
-                </m:e>
-                <m:sub>
-                  <m:r>
-                    <w:rPr>
-                      <w:rFonts w:ascii="Cambria Math"/>
-                      <w:lang w:val="en-US"/>
-                    </w:rPr>
-                    <m:t>w</m:t>
-                  </m:r>
-                </m:sub>
-              </m:sSub>
+            </m:e>
+            <m:sub>
               <m:r>
                 <w:rPr>
                   <w:rFonts w:ascii="Cambria Math"/>
                   <w:lang w:val="en-US"/>
                 </w:rPr>
-                <m:t>+</m:t>
+                <m:t>w</m:t>
               </m:r>
+            </m:sub>
+          </m:sSub>
+          <m:sSub>
+            <m:sSubPr>
+              <m:ctrlPr>
+                <w:rPr>
+                  <w:rFonts w:ascii="Cambria Math" w:hAnsi="Cambria Math"/>
+                  <w:i/>
+                  <w:lang w:val="en-US"/>
+                </w:rPr>
+              </m:ctrlPr>
+            </m:sSubPr>
+            <m:e>
               <m:r>
                 <w:rPr>
                   <w:rFonts w:ascii="Cambria Math"/>
                   <w:lang w:val="en-US"/>
                 </w:rPr>
-                <m:t xml:space="preserve">m </m:t>
+                <m:t>ρ</m:t>
               </m:r>
-              <m:sSub>
-                <m:sSubPr>
-                  <m:ctrlPr>
-                    <w:rPr>
-                      <w:rFonts w:ascii="Cambria Math" w:hAnsi="Cambria Math"/>
-                      <w:i/>
-                      <w:lang w:val="en-US"/>
-                    </w:rPr>
-                  </m:ctrlPr>
-                </m:sSubPr>
-                <m:e>
-                  <m:r>
-                    <w:rPr>
-                      <w:rFonts w:ascii="Cambria Math"/>
-                      <w:lang w:val="en-US"/>
-                    </w:rPr>
-                    <m:t>S</m:t>
-                  </m:r>
-                </m:e>
-                <m:sub>
-                  <m:r>
-                    <w:rPr>
-                      <w:rFonts w:ascii="Cambria Math"/>
-                      <w:lang w:val="en-US"/>
-                    </w:rPr>
-                    <m:t>o</m:t>
-                  </m:r>
-                </m:sub>
-              </m:sSub>
-              <m:sSub>
-                <m:sSubPr>
-                  <m:ctrlPr>
-                    <w:rPr>
-                      <w:rFonts w:ascii="Cambria Math" w:hAnsi="Cambria Math"/>
-                      <w:i/>
-                      <w:lang w:val="en-US"/>
-                    </w:rPr>
-                  </m:ctrlPr>
-                </m:sSubPr>
-                <m:e>
-                  <m:r>
-                    <w:rPr>
-                      <w:rFonts w:ascii="Cambria Math"/>
-                      <w:lang w:val="en-US"/>
-                    </w:rPr>
-                    <m:t>ρ</m:t>
-                  </m:r>
-                </m:e>
-                <m:sub>
-                  <m:r>
-                    <w:rPr>
-                      <w:rFonts w:ascii="Cambria Math"/>
-                      <w:lang w:val="en-US"/>
-                    </w:rPr>
-                    <m:t>o</m:t>
-                  </m:r>
-                </m:sub>
-              </m:sSub>
-              <m:sSub>
-                <m:sSubPr>
-                  <m:ctrlPr>
-                    <w:rPr>
-                      <w:rFonts w:ascii="Cambria Math" w:hAnsi="Cambria Math"/>
-                      <w:i/>
-                      <w:lang w:val="en-US"/>
-                    </w:rPr>
-                  </m:ctrlPr>
-                </m:sSubPr>
-                <m:e>
-                  <m:r>
-                    <w:rPr>
-                      <w:rFonts w:ascii="Cambria Math"/>
-                      <w:lang w:val="en-US"/>
-                    </w:rPr>
-                    <m:t>H</m:t>
-                  </m:r>
-                </m:e>
-                <m:sub>
-                  <m:r>
-                    <w:rPr>
-                      <w:rFonts w:ascii="Cambria Math"/>
-                      <w:lang w:val="en-US"/>
-                    </w:rPr>
-                    <m:t>o</m:t>
-                  </m:r>
-                </m:sub>
-              </m:sSub>
+            </m:e>
+            <m:sub>
               <m:r>
                 <w:rPr>
                   <w:rFonts w:ascii="Cambria Math"/>
                   <w:lang w:val="en-US"/>
                 </w:rPr>
-                <m:t>(1</m:t>
+                <m:t>w</m:t>
               </m:r>
+            </m:sub>
+          </m:sSub>
+          <m:sSub>
+            <m:sSubPr>
+              <m:ctrlPr>
+                <w:rPr>
+                  <w:rFonts w:ascii="Cambria Math" w:hAnsi="Cambria Math"/>
+                  <w:i/>
+                  <w:lang w:val="en-US"/>
+                </w:rPr>
+              </m:ctrlPr>
+            </m:sSubPr>
+            <m:e>
               <m:r>
                 <w:rPr>
                   <w:rFonts w:ascii="Cambria Math"/>
                   <w:lang w:val="en-US"/>
                 </w:rPr>
-                <m:t>-</m:t>
+                <m:t>C</m:t>
               </m:r>
+            </m:e>
+            <m:sub>
               <m:r>
                 <w:rPr>
                   <w:rFonts w:ascii="Cambria Math"/>
                   <w:lang w:val="en-US"/>
                 </w:rPr>
-                <m:t xml:space="preserve"> </m:t>
+                <m:t>w</m:t>
               </m:r>
-              <m:sSub>
-                <m:sSubPr>
-                  <m:ctrlPr>
-                    <w:rPr>
-                      <w:rFonts w:ascii="Cambria Math" w:hAnsi="Cambria Math"/>
-                      <w:i/>
-                      <w:lang w:val="en-US"/>
-                    </w:rPr>
-                  </m:ctrlPr>
-                </m:sSubPr>
-                <m:e>
-                  <m:r>
-                    <w:rPr>
-                      <w:rFonts w:ascii="Cambria Math"/>
-                      <w:lang w:val="en-US"/>
-                    </w:rPr>
-                    <m:t>w</m:t>
-                  </m:r>
-                </m:e>
-                <m:sub>
-                  <m:r>
-                    <w:rPr>
-                      <w:rFonts w:ascii="Cambria Math"/>
-                      <w:lang w:val="en-US"/>
-                    </w:rPr>
-                    <m:t>ps</m:t>
-                  </m:r>
-                </m:sub>
-              </m:sSub>
+            </m:sub>
+          </m:sSub>
+          <m:r>
+            <w:rPr>
+              <w:rFonts w:ascii="Cambria Math"/>
+            </w:rPr>
+            <m:t>T+</m:t>
+          </m:r>
+          <m:r>
+            <w:rPr>
+              <w:rFonts w:ascii="Cambria Math"/>
+              <w:lang w:val="en-US"/>
+            </w:rPr>
+            <m:t>m</m:t>
+          </m:r>
+          <m:r>
+            <w:rPr>
+              <w:rFonts w:ascii="Cambria Math"/>
+            </w:rPr>
+            <m:t xml:space="preserve"> </m:t>
+          </m:r>
+          <m:sSub>
+            <m:sSubPr>
+              <m:ctrlPr>
+                <w:rPr>
+                  <w:rFonts w:ascii="Cambria Math" w:hAnsi="Cambria Math"/>
+                  <w:i/>
+                  <w:lang w:val="en-US"/>
+                </w:rPr>
+              </m:ctrlPr>
+            </m:sSubPr>
+            <m:e>
               <m:r>
                 <w:rPr>
                   <w:rFonts w:ascii="Cambria Math"/>
                   <w:lang w:val="en-US"/>
                 </w:rPr>
-                <m:t>)+</m:t>
+                <m:t>S</m:t>
               </m:r>
+            </m:e>
+            <m:sub>
               <m:r>
                 <w:rPr>
                   <w:rFonts w:ascii="Cambria Math"/>
                   <w:lang w:val="en-US"/>
                 </w:rPr>
-                <m:t>m</m:t>
+                <m:t>o</m:t>
               </m:r>
-              <m:sSub>
-                <m:sSubPr>
-                  <m:ctrlPr>
-                    <w:rPr>
-                      <w:rFonts w:ascii="Cambria Math" w:hAnsi="Cambria Math"/>
-                      <w:i/>
-                      <w:lang w:val="en-US"/>
-                    </w:rPr>
-                  </m:ctrlPr>
-                </m:sSubPr>
-                <m:e>
-                  <m:r>
-                    <w:rPr>
-                      <w:rFonts w:ascii="Cambria Math"/>
-                      <w:lang w:val="en-US"/>
-                    </w:rPr>
-                    <m:t>S</m:t>
-                  </m:r>
-                </m:e>
-                <m:sub>
-                  <m:r>
-                    <w:rPr>
-                      <w:rFonts w:ascii="Cambria Math"/>
-                      <w:lang w:val="en-US"/>
-                    </w:rPr>
-                    <m:t>o</m:t>
-                  </m:r>
-                </m:sub>
-              </m:sSub>
-              <m:sSub>
-                <m:sSubPr>
-                  <m:ctrlPr>
-                    <w:rPr>
-                      <w:rFonts w:ascii="Cambria Math" w:hAnsi="Cambria Math"/>
-                      <w:i/>
-                      <w:lang w:val="en-US"/>
-                    </w:rPr>
-                  </m:ctrlPr>
-                </m:sSubPr>
-                <m:e>
-                  <m:r>
-                    <w:rPr>
-                      <w:rFonts w:ascii="Cambria Math"/>
-                      <w:lang w:val="en-US"/>
-                    </w:rPr>
-                    <m:t>w</m:t>
-                  </m:r>
-                </m:e>
-                <m:sub>
-                  <m:r>
-                    <w:rPr>
-                      <w:rFonts w:ascii="Cambria Math"/>
-                      <w:lang w:val="en-US"/>
-                    </w:rPr>
-                    <m:t>ps</m:t>
-                  </m:r>
-                </m:sub>
-              </m:sSub>
-              <m:sSub>
-                <m:sSubPr>
-                  <m:ctrlPr>
-                    <w:rPr>
-                      <w:rFonts w:ascii="Cambria Math" w:hAnsi="Cambria Math"/>
-                      <w:i/>
-                      <w:lang w:val="en-US"/>
-                    </w:rPr>
-                  </m:ctrlPr>
-                </m:sSubPr>
-                <m:e>
-                  <m:r>
-                    <w:rPr>
-                      <w:rFonts w:ascii="Cambria Math"/>
-                      <w:lang w:val="en-US"/>
-                    </w:rPr>
-                    <m:t>ρ</m:t>
-                  </m:r>
-                </m:e>
-                <m:sub>
-                  <m:r>
-                    <w:rPr>
-                      <w:rFonts w:ascii="Cambria Math"/>
-                      <w:lang w:val="en-US"/>
-                    </w:rPr>
-                    <m:t>p</m:t>
-                  </m:r>
-                </m:sub>
-              </m:sSub>
-              <m:sSub>
-                <m:sSubPr>
-                  <m:ctrlPr>
-                    <w:rPr>
-                      <w:rFonts w:ascii="Cambria Math" w:hAnsi="Cambria Math"/>
-                      <w:i/>
-                      <w:lang w:val="en-US"/>
-                    </w:rPr>
-                  </m:ctrlPr>
-                </m:sSubPr>
-                <m:e>
-                  <m:r>
-                    <w:rPr>
-                      <w:rFonts w:ascii="Cambria Math"/>
-                      <w:lang w:val="en-US"/>
-                    </w:rPr>
-                    <m:t>H</m:t>
-                  </m:r>
-                </m:e>
-                <m:sub>
-                  <m:r>
-                    <w:rPr>
-                      <w:rFonts w:ascii="Cambria Math"/>
-                      <w:lang w:val="en-US"/>
-                    </w:rPr>
-                    <m:t>p</m:t>
-                  </m:r>
-                </m:sub>
-              </m:sSub>
+            </m:sub>
+          </m:sSub>
+          <m:sSub>
+            <m:sSubPr>
+              <m:ctrlPr>
+                <w:rPr>
+                  <w:rFonts w:ascii="Cambria Math" w:hAnsi="Cambria Math"/>
+                  <w:i/>
+                  <w:lang w:val="en-US"/>
+                </w:rPr>
+              </m:ctrlPr>
+            </m:sSubPr>
+            <m:e>
               <m:r>
                 <w:rPr>
                   <w:rFonts w:ascii="Cambria Math"/>
                   <w:lang w:val="en-US"/>
                 </w:rPr>
-                <m:t>+(1</m:t>
+                <m:t>ρ</m:t>
               </m:r>
+            </m:e>
+            <m:sub>
               <m:r>
                 <w:rPr>
                   <w:rFonts w:ascii="Cambria Math"/>
                   <w:lang w:val="en-US"/>
                 </w:rPr>
-                <m:t>-</m:t>
+                <m:t>o</m:t>
               </m:r>
+            </m:sub>
+          </m:sSub>
+          <m:sSub>
+            <m:sSubPr>
+              <m:ctrlPr>
+                <w:rPr>
+                  <w:rFonts w:ascii="Cambria Math" w:hAnsi="Cambria Math"/>
+                  <w:i/>
+                  <w:lang w:val="en-US"/>
+                </w:rPr>
+              </m:ctrlPr>
+            </m:sSubPr>
+            <m:e>
               <m:r>
                 <w:rPr>
                   <w:rFonts w:ascii="Cambria Math"/>
                   <w:lang w:val="en-US"/>
                 </w:rPr>
-                <m:t>m</m:t>
+                <m:t>C</m:t>
               </m:r>
+            </m:e>
+            <m:sub>
               <m:r>
                 <w:rPr>
                   <w:rFonts w:ascii="Cambria Math"/>
                   <w:lang w:val="en-US"/>
                 </w:rPr>
-                <m:t>)</m:t>
+                <m:t>o</m:t>
               </m:r>
-              <m:sSub>
-                <m:sSubPr>
-                  <m:ctrlPr>
-                    <w:rPr>
-                      <w:rFonts w:ascii="Cambria Math" w:hAnsi="Cambria Math"/>
-                      <w:i/>
-                      <w:lang w:val="en-US"/>
-                    </w:rPr>
-                  </m:ctrlPr>
-                </m:sSubPr>
-                <m:e>
-                  <m:r>
-                    <w:rPr>
-                      <w:rFonts w:ascii="Cambria Math"/>
-                      <w:lang w:val="en-US"/>
-                    </w:rPr>
-                    <m:t>ρ</m:t>
-                  </m:r>
-                </m:e>
-                <m:sub>
-                  <m:r>
-                    <w:rPr>
-                      <w:rFonts w:ascii="Cambria Math"/>
-                      <w:lang w:val="en-US"/>
-                    </w:rPr>
-                    <m:t>f</m:t>
-                  </m:r>
-                </m:sub>
-              </m:sSub>
-              <m:sSub>
-                <m:sSubPr>
-                  <m:ctrlPr>
-                    <w:rPr>
-                      <w:rFonts w:ascii="Cambria Math" w:hAnsi="Cambria Math"/>
-                      <w:i/>
-                      <w:lang w:val="en-US"/>
-                    </w:rPr>
-                  </m:ctrlPr>
-                </m:sSubPr>
-                <m:e>
-                  <m:r>
-                    <w:rPr>
-                      <w:rFonts w:ascii="Cambria Math"/>
-                      <w:lang w:val="en-US"/>
-                    </w:rPr>
-                    <m:t>H</m:t>
-                  </m:r>
-                </m:e>
-                <m:sub>
-                  <m:r>
-                    <w:rPr>
-                      <w:rFonts w:ascii="Cambria Math"/>
-                      <w:lang w:val="en-US"/>
-                    </w:rPr>
-                    <m:t>f</m:t>
-                  </m:r>
-                </m:sub>
-              </m:sSub>
+            </m:sub>
+          </m:sSub>
+          <m:r>
+            <w:rPr>
+              <w:rFonts w:ascii="Cambria Math"/>
+            </w:rPr>
+            <m:t>T(1</m:t>
+          </m:r>
+          <m:r>
+            <w:rPr>
+              <w:rFonts w:ascii="Cambria Math"/>
+            </w:rPr>
+            <m:t>-</m:t>
+          </m:r>
+          <m:r>
+            <w:rPr>
+              <w:rFonts w:ascii="Cambria Math"/>
+            </w:rPr>
+            <m:t xml:space="preserve"> </m:t>
+          </m:r>
+          <m:sSub>
+            <m:sSubPr>
+              <m:ctrlPr>
+                <w:rPr>
+                  <w:rFonts w:ascii="Cambria Math" w:hAnsi="Cambria Math"/>
+                  <w:i/>
+                  <w:lang w:val="en-US"/>
+                </w:rPr>
+              </m:ctrlPr>
+            </m:sSubPr>
+            <m:e>
               <m:r>
                 <w:rPr>
                   <w:rFonts w:ascii="Cambria Math"/>
                   <w:lang w:val="en-US"/>
                 </w:rPr>
-                <m:t>]+</m:t>
+                <m:t>w</m:t>
               </m:r>
-              <m:r>
-                <w:rPr>
-                  <w:rFonts w:ascii="Cambria Math" w:hAnsi="Cambria Math" w:cs="Cambria Math"/>
-                </w:rPr>
-                <m:t>∇</m:t>
-              </m:r>
+            </m:e>
+            <m:sub>
               <m:r>
                 <w:rPr>
                   <w:rFonts w:ascii="Cambria Math"/>
                   <w:lang w:val="en-US"/>
                 </w:rPr>
-                <m:t>(</m:t>
+                <m:t>ps</m:t>
               </m:r>
-              <m:sSub>
-                <m:sSubPr>
-                  <m:ctrlPr>
-                    <w:rPr>
-                      <w:rFonts w:ascii="Cambria Math" w:hAnsi="Cambria Math"/>
-                      <w:i/>
-                      <w:lang w:val="en-US"/>
-                    </w:rPr>
-                  </m:ctrlPr>
-                </m:sSubPr>
-                <m:e>
-                  <m:r>
-                    <w:rPr>
-                      <w:rFonts w:ascii="Cambria Math"/>
-                      <w:lang w:val="en-US"/>
-                    </w:rPr>
-                    <m:t>ρ</m:t>
-                  </m:r>
-                </m:e>
-                <m:sub>
-                  <m:r>
-                    <w:rPr>
-                      <w:rFonts w:ascii="Cambria Math"/>
-                      <w:lang w:val="en-US"/>
-                    </w:rPr>
-                    <m:t>w</m:t>
-                  </m:r>
-                </m:sub>
-              </m:sSub>
-              <m:sSub>
-                <m:sSubPr>
-                  <m:ctrlPr>
-                    <w:rPr>
-                      <w:rFonts w:ascii="Cambria Math" w:hAnsi="Cambria Math"/>
-                      <w:i/>
-                      <w:lang w:val="en-US"/>
-                    </w:rPr>
-                  </m:ctrlPr>
-                </m:sSubPr>
-                <m:e>
-                  <m:r>
-                    <w:rPr>
-                      <w:rFonts w:ascii="Cambria Math"/>
-                      <w:lang w:val="en-US"/>
-                    </w:rPr>
-                    <m:t>H</m:t>
-                  </m:r>
-                </m:e>
-                <m:sub>
-                  <m:r>
-                    <w:rPr>
-                      <w:rFonts w:ascii="Cambria Math"/>
-                      <w:lang w:val="en-US"/>
-                    </w:rPr>
-                    <m:t>w</m:t>
-                  </m:r>
-                </m:sub>
-              </m:sSub>
-              <m:sSub>
-                <m:sSubPr>
-                  <m:ctrlPr>
-                    <w:rPr>
-                      <w:rFonts w:ascii="Cambria Math" w:hAnsi="Cambria Math"/>
-                      <w:i/>
-                      <w:lang w:val="en-US"/>
-                    </w:rPr>
-                  </m:ctrlPr>
-                </m:sSubPr>
-                <m:e>
-                  <m:r>
-                    <w:rPr>
-                      <w:rFonts w:ascii="Cambria Math"/>
-                      <w:lang w:val="en-US"/>
-                    </w:rPr>
-                    <m:t>U</m:t>
-                  </m:r>
-                </m:e>
-                <m:sub>
-                  <m:r>
-                    <w:rPr>
-                      <w:rFonts w:ascii="Cambria Math"/>
-                      <w:lang w:val="en-US"/>
-                    </w:rPr>
-                    <m:t>w</m:t>
-                  </m:r>
-                </m:sub>
-              </m:sSub>
+            </m:sub>
+          </m:sSub>
+          <m:r>
+            <w:rPr>
+              <w:rFonts w:ascii="Cambria Math"/>
+            </w:rPr>
+            <m:t>)+</m:t>
+          </m:r>
+          <m:r>
+            <w:rPr>
+              <w:rFonts w:ascii="Cambria Math"/>
+              <w:lang w:val="en-US"/>
+            </w:rPr>
+            <m:t>m</m:t>
+          </m:r>
+          <m:sSub>
+            <m:sSubPr>
+              <m:ctrlPr>
+                <w:rPr>
+                  <w:rFonts w:ascii="Cambria Math" w:hAnsi="Cambria Math"/>
+                  <w:i/>
+                  <w:lang w:val="en-US"/>
+                </w:rPr>
+              </m:ctrlPr>
+            </m:sSubPr>
+            <m:e>
               <m:r>
                 <w:rPr>
                   <w:rFonts w:ascii="Cambria Math"/>
                   <w:lang w:val="en-US"/>
                 </w:rPr>
-                <m:t>+</m:t>
+                <m:t>S</m:t>
               </m:r>
             </m:e>
-          </m:mr>
-          <m:mr>
+            <m:sub>
+              <m:r>
+                <w:rPr>
+                  <w:rFonts w:ascii="Cambria Math"/>
+                  <w:lang w:val="en-US"/>
+                </w:rPr>
+                <m:t>o</m:t>
+              </m:r>
+            </m:sub>
+          </m:sSub>
+          <m:sSub>
+            <m:sSubPr>
+              <m:ctrlPr>
+                <w:rPr>
+                  <w:rFonts w:ascii="Cambria Math" w:hAnsi="Cambria Math"/>
+                  <w:i/>
+                  <w:lang w:val="en-US"/>
+                </w:rPr>
+              </m:ctrlPr>
+            </m:sSubPr>
             <m:e>
               <m:r>
                 <w:rPr>
                   <w:rFonts w:ascii="Cambria Math"/>
                   <w:lang w:val="en-US"/>
                 </w:rPr>
-                <m:t>(1</m:t>
+                <m:t>w</m:t>
               </m:r>
+            </m:e>
+            <m:sub>
               <m:r>
                 <w:rPr>
                   <w:rFonts w:ascii="Cambria Math"/>
                   <w:lang w:val="en-US"/>
                 </w:rPr>
-                <m:t>-</m:t>
+                <m:t>ps</m:t>
               </m:r>
-              <m:sSub>
-                <m:sSubPr>
-                  <m:ctrlPr>
-                    <w:rPr>
-                      <w:rFonts w:ascii="Cambria Math" w:hAnsi="Cambria Math"/>
-                      <w:i/>
-                      <w:lang w:val="en-US"/>
-                    </w:rPr>
-                  </m:ctrlPr>
-                </m:sSubPr>
-                <m:e>
-                  <m:r>
-                    <w:rPr>
-                      <w:rFonts w:ascii="Cambria Math"/>
-                      <w:lang w:val="en-US"/>
-                    </w:rPr>
-                    <m:t>w</m:t>
-                  </m:r>
-                </m:e>
-                <m:sub>
-                  <m:r>
-                    <w:rPr>
-                      <w:rFonts w:ascii="Cambria Math"/>
-                      <w:lang w:val="en-US"/>
-                    </w:rPr>
-                    <m:t>ps</m:t>
-                  </m:r>
-                </m:sub>
-              </m:sSub>
+            </m:sub>
+          </m:sSub>
+          <m:sSub>
+            <m:sSubPr>
+              <m:ctrlPr>
+                <w:rPr>
+                  <w:rFonts w:ascii="Cambria Math" w:hAnsi="Cambria Math"/>
+                  <w:i/>
+                  <w:lang w:val="en-US"/>
+                </w:rPr>
+              </m:ctrlPr>
+            </m:sSubPr>
+            <m:e>
               <m:r>
                 <w:rPr>
                   <w:rFonts w:ascii="Cambria Math"/>
                   <w:lang w:val="en-US"/>
                 </w:rPr>
-                <m:t>)</m:t>
+                <m:t>ρ</m:t>
               </m:r>
-              <m:sSub>
-                <m:sSubPr>
-                  <m:ctrlPr>
-                    <w:rPr>
-                      <w:rFonts w:ascii="Cambria Math" w:hAnsi="Cambria Math"/>
-                      <w:i/>
-                      <w:lang w:val="en-US"/>
-                    </w:rPr>
-                  </m:ctrlPr>
-                </m:sSubPr>
-                <m:e>
-                  <m:r>
-                    <w:rPr>
-                      <w:rFonts w:ascii="Cambria Math"/>
-                      <w:lang w:val="en-US"/>
-                    </w:rPr>
-                    <m:t>ρ</m:t>
-                  </m:r>
-                </m:e>
-                <m:sub>
-                  <m:r>
-                    <w:rPr>
-                      <w:rFonts w:ascii="Cambria Math"/>
-                      <w:lang w:val="en-US"/>
-                    </w:rPr>
-                    <m:t>o</m:t>
-                  </m:r>
-                </m:sub>
-              </m:sSub>
-              <m:sSub>
-                <m:sSubPr>
-                  <m:ctrlPr>
-                    <w:rPr>
-                      <w:rFonts w:ascii="Cambria Math" w:hAnsi="Cambria Math"/>
-                      <w:i/>
-                      <w:lang w:val="en-US"/>
-                    </w:rPr>
-                  </m:ctrlPr>
-                </m:sSubPr>
-                <m:e>
-                  <m:r>
-                    <w:rPr>
-                      <w:rFonts w:ascii="Cambria Math"/>
-                      <w:lang w:val="en-US"/>
-                    </w:rPr>
-                    <m:t>U</m:t>
-                  </m:r>
-                </m:e>
-                <m:sub>
-                  <m:r>
-                    <w:rPr>
-                      <w:rFonts w:ascii="Cambria Math"/>
-                      <w:lang w:val="en-US"/>
-                    </w:rPr>
-                    <m:t>o</m:t>
-                  </m:r>
-                </m:sub>
-              </m:sSub>
-              <m:sSub>
-                <m:sSubPr>
-                  <m:ctrlPr>
-                    <w:rPr>
-                      <w:rFonts w:ascii="Cambria Math" w:hAnsi="Cambria Math"/>
-                      <w:i/>
-                      <w:lang w:val="en-US"/>
-                    </w:rPr>
-                  </m:ctrlPr>
-                </m:sSubPr>
-                <m:e>
-                  <m:r>
-                    <w:rPr>
-                      <w:rFonts w:ascii="Cambria Math"/>
-                      <w:lang w:val="en-US"/>
-                    </w:rPr>
-                    <m:t>H</m:t>
-                  </m:r>
-                </m:e>
-                <m:sub>
-                  <m:r>
-                    <w:rPr>
-                      <w:rFonts w:ascii="Cambria Math"/>
-                      <w:lang w:val="en-US"/>
-                    </w:rPr>
-                    <m:t>o</m:t>
-                  </m:r>
-                </m:sub>
-              </m:sSub>
+            </m:e>
+            <m:sub>
               <m:r>
                 <w:rPr>
                   <w:rFonts w:ascii="Cambria Math"/>
                   <w:lang w:val="en-US"/>
                 </w:rPr>
-                <m:t>+</m:t>
+                <m:t>p</m:t>
               </m:r>
-              <m:sSub>
-                <m:sSubPr>
-                  <m:ctrlPr>
-                    <w:rPr>
-                      <w:rFonts w:ascii="Cambria Math" w:hAnsi="Cambria Math"/>
-                      <w:i/>
-                      <w:lang w:val="en-US"/>
-                    </w:rPr>
-                  </m:ctrlPr>
-                </m:sSubPr>
-                <m:e>
-                  <m:r>
-                    <w:rPr>
-                      <w:rFonts w:ascii="Cambria Math"/>
-                      <w:lang w:val="en-US"/>
-                    </w:rPr>
-                    <m:t>ρ</m:t>
-                  </m:r>
-                </m:e>
-                <m:sub>
-                  <m:r>
-                    <w:rPr>
-                      <w:rFonts w:ascii="Cambria Math"/>
-                      <w:lang w:val="en-US"/>
-                    </w:rPr>
-                    <m:t>p</m:t>
-                  </m:r>
-                </m:sub>
-              </m:sSub>
-              <m:sSub>
-                <m:sSubPr>
-                  <m:ctrlPr>
-                    <w:rPr>
-                      <w:rFonts w:ascii="Cambria Math" w:hAnsi="Cambria Math"/>
-                      <w:i/>
-                      <w:lang w:val="en-US"/>
-                    </w:rPr>
-                  </m:ctrlPr>
-                </m:sSubPr>
-                <m:e>
-                  <m:r>
-                    <w:rPr>
-                      <w:rFonts w:ascii="Cambria Math"/>
-                      <w:lang w:val="en-US"/>
-                    </w:rPr>
-                    <m:t>w</m:t>
-                  </m:r>
-                </m:e>
-                <m:sub>
-                  <m:r>
-                    <w:rPr>
-                      <w:rFonts w:ascii="Cambria Math"/>
-                      <w:lang w:val="en-US"/>
-                    </w:rPr>
-                    <m:t>ps</m:t>
-                  </m:r>
-                </m:sub>
-              </m:sSub>
-              <m:sSub>
-                <m:sSubPr>
-                  <m:ctrlPr>
-                    <w:rPr>
-                      <w:rFonts w:ascii="Cambria Math" w:hAnsi="Cambria Math"/>
-                      <w:i/>
-                      <w:lang w:val="en-US"/>
-                    </w:rPr>
-                  </m:ctrlPr>
-                </m:sSubPr>
-                <m:e>
-                  <m:r>
-                    <w:rPr>
-                      <w:rFonts w:ascii="Cambria Math"/>
-                      <w:lang w:val="en-US"/>
-                    </w:rPr>
-                    <m:t>U</m:t>
-                  </m:r>
-                </m:e>
-                <m:sub>
-                  <m:r>
-                    <w:rPr>
-                      <w:rFonts w:ascii="Cambria Math"/>
-                      <w:lang w:val="en-US"/>
-                    </w:rPr>
-                    <m:t>o</m:t>
-                  </m:r>
-                </m:sub>
-              </m:sSub>
-              <m:sSub>
-                <m:sSubPr>
-                  <m:ctrlPr>
-                    <w:rPr>
-                      <w:rFonts w:ascii="Cambria Math" w:hAnsi="Cambria Math"/>
-                      <w:i/>
-                      <w:lang w:val="en-US"/>
-                    </w:rPr>
-                  </m:ctrlPr>
-                </m:sSubPr>
-                <m:e>
-                  <m:r>
-                    <w:rPr>
-                      <w:rFonts w:ascii="Cambria Math"/>
-                      <w:lang w:val="en-US"/>
-                    </w:rPr>
-                    <m:t>H</m:t>
-                  </m:r>
-                </m:e>
-                <m:sub>
-                  <m:r>
-                    <w:rPr>
-                      <w:rFonts w:ascii="Cambria Math"/>
-                      <w:lang w:val="en-US"/>
-                    </w:rPr>
-                    <m:t>p</m:t>
-                  </m:r>
-                </m:sub>
-              </m:sSub>
+            </m:sub>
+          </m:sSub>
+          <m:sSub>
+            <m:sSubPr>
+              <m:ctrlPr>
+                <w:rPr>
+                  <w:rFonts w:ascii="Cambria Math" w:hAnsi="Cambria Math"/>
+                  <w:i/>
+                  <w:lang w:val="en-US"/>
+                </w:rPr>
+              </m:ctrlPr>
+            </m:sSubPr>
+            <m:e>
               <m:r>
                 <w:rPr>
                   <w:rFonts w:ascii="Cambria Math"/>
                   <w:lang w:val="en-US"/>
                 </w:rPr>
-                <m:t>)=</m:t>
+                <m:t>C</m:t>
               </m:r>
+            </m:e>
+            <m:sub>
               <m:r>
                 <w:rPr>
-                  <w:rFonts w:ascii="Cambria Math" w:hAnsi="Cambria Math" w:cs="Cambria Math"/>
-                </w:rPr>
-                <m:t>∇</m:t>
+                  <w:rFonts w:ascii="Cambria Math"/>
+                  <w:lang w:val="en-US"/>
+                </w:rPr>
+                <m:t>p</m:t>
               </m:r>
+            </m:sub>
+          </m:sSub>
+          <m:r>
+            <w:rPr>
+              <w:rFonts w:ascii="Cambria Math"/>
+            </w:rPr>
+            <m:t>T+(1</m:t>
+          </m:r>
+          <m:r>
+            <w:rPr>
+              <w:rFonts w:ascii="Cambria Math"/>
+            </w:rPr>
+            <m:t>-</m:t>
+          </m:r>
+          <m:r>
+            <w:rPr>
+              <w:rFonts w:ascii="Cambria Math"/>
+              <w:lang w:val="en-US"/>
+            </w:rPr>
+            <m:t>m</m:t>
+          </m:r>
+          <m:r>
+            <w:rPr>
+              <w:rFonts w:ascii="Cambria Math"/>
+            </w:rPr>
+            <m:t>)</m:t>
+          </m:r>
+          <m:sSub>
+            <m:sSubPr>
+              <m:ctrlPr>
+                <w:rPr>
+                  <w:rFonts w:ascii="Cambria Math" w:hAnsi="Cambria Math"/>
+                  <w:i/>
+                  <w:lang w:val="en-US"/>
+                </w:rPr>
+              </m:ctrlPr>
+            </m:sSubPr>
+            <m:e>
+              <m:r>
+                <w:rPr>
+                  <w:rFonts w:ascii="Cambria Math"/>
+                  <w:lang w:val="en-US"/>
+                </w:rPr>
+                <m:t>ρ</m:t>
+              </m:r>
+            </m:e>
+            <m:sub>
+              <m:r>
+                <w:rPr>
+                  <w:rFonts w:ascii="Cambria Math"/>
+                  <w:lang w:val="en-US"/>
+                </w:rPr>
+                <m:t>f</m:t>
+              </m:r>
+            </m:sub>
+          </m:sSub>
+          <m:sSub>
+            <m:sSubPr>
+              <m:ctrlPr>
+                <w:rPr>
+                  <w:rFonts w:ascii="Cambria Math" w:hAnsi="Cambria Math"/>
+                  <w:i/>
+                  <w:lang w:val="en-US"/>
+                </w:rPr>
+              </m:ctrlPr>
+            </m:sSubPr>
+            <m:e>
+              <m:r>
+                <w:rPr>
+                  <w:rFonts w:ascii="Cambria Math"/>
+                  <w:lang w:val="en-US"/>
+                </w:rPr>
+                <m:t>C</m:t>
+              </m:r>
+            </m:e>
+            <m:sub>
+              <m:r>
+                <w:rPr>
+                  <w:rFonts w:ascii="Cambria Math"/>
+                  <w:lang w:val="en-US"/>
+                </w:rPr>
+                <m:t>f</m:t>
+              </m:r>
+            </m:sub>
+          </m:sSub>
+          <m:r>
+            <w:rPr>
+              <w:rFonts w:ascii="Cambria Math"/>
+            </w:rPr>
+            <m:t>T]+</m:t>
+          </m:r>
+          <m:r>
+            <w:rPr>
+              <w:rFonts w:ascii="Cambria Math" w:hAnsi="Cambria Math" w:cs="Cambria Math"/>
+            </w:rPr>
+            <m:t>∇</m:t>
+          </m:r>
+          <m:r>
+            <w:rPr>
+              <w:rFonts w:ascii="Cambria Math"/>
+            </w:rPr>
+            <m:t>(</m:t>
+          </m:r>
+          <m:sSub>
+            <m:sSubPr>
+              <m:ctrlPr>
+                <w:rPr>
+                  <w:rFonts w:ascii="Cambria Math" w:hAnsi="Cambria Math"/>
+                  <w:i/>
+                  <w:lang w:val="en-US"/>
+                </w:rPr>
+              </m:ctrlPr>
+            </m:sSubPr>
+            <m:e>
+              <m:r>
+                <w:rPr>
+                  <w:rFonts w:ascii="Cambria Math"/>
+                  <w:lang w:val="en-US"/>
+                </w:rPr>
+                <m:t>ρ</m:t>
+              </m:r>
+            </m:e>
+            <m:sub>
+              <m:r>
+                <w:rPr>
+                  <w:rFonts w:ascii="Cambria Math"/>
+                  <w:lang w:val="en-US"/>
+                </w:rPr>
+                <m:t>w</m:t>
+              </m:r>
+            </m:sub>
+          </m:sSub>
+          <m:sSub>
+            <m:sSubPr>
+              <m:ctrlPr>
+                <w:rPr>
+                  <w:rFonts w:ascii="Cambria Math" w:hAnsi="Cambria Math"/>
+                  <w:i/>
+                  <w:lang w:val="en-US"/>
+                </w:rPr>
+              </m:ctrlPr>
+            </m:sSubPr>
+            <m:e>
+              <m:r>
+                <w:rPr>
+                  <w:rFonts w:ascii="Cambria Math"/>
+                  <w:lang w:val="en-US"/>
+                </w:rPr>
+                <m:t>C</m:t>
+              </m:r>
+            </m:e>
+            <m:sub>
+              <m:r>
+                <w:rPr>
+                  <w:rFonts w:ascii="Cambria Math"/>
+                  <w:lang w:val="en-US"/>
+                </w:rPr>
+                <m:t>w</m:t>
+              </m:r>
+            </m:sub>
+          </m:sSub>
+          <m:r>
+            <w:rPr>
+              <w:rFonts w:ascii="Cambria Math" w:hAnsi="Cambria Math"/>
+              <w:lang w:val="en-US"/>
+            </w:rPr>
+            <m:t>T</m:t>
+          </m:r>
+          <m:sSub>
+            <m:sSubPr>
+              <m:ctrlPr>
+                <w:rPr>
+                  <w:rFonts w:ascii="Cambria Math" w:hAnsi="Cambria Math"/>
+                  <w:i/>
+                  <w:lang w:val="en-US"/>
+                </w:rPr>
+              </m:ctrlPr>
+            </m:sSubPr>
+            <m:e>
+              <m:r>
+                <w:rPr>
+                  <w:rFonts w:ascii="Cambria Math"/>
+                  <w:lang w:val="en-US"/>
+                </w:rPr>
+                <m:t>U</m:t>
+              </m:r>
+            </m:e>
+            <m:sub>
+              <m:r>
+                <w:rPr>
+                  <w:rFonts w:ascii="Cambria Math"/>
+                  <w:lang w:val="en-US"/>
+                </w:rPr>
+                <m:t>w</m:t>
+              </m:r>
+            </m:sub>
+          </m:sSub>
+          <m:r>
+            <w:rPr>
+              <w:rFonts w:ascii="Cambria Math"/>
+            </w:rPr>
+            <m:t>+(1</m:t>
+          </m:r>
+          <m:r>
+            <w:rPr>
+              <w:rFonts w:ascii="Cambria Math"/>
+            </w:rPr>
+            <m:t>-</m:t>
+          </m:r>
+          <m:sSub>
+            <m:sSubPr>
+              <m:ctrlPr>
+                <w:rPr>
+                  <w:rFonts w:ascii="Cambria Math" w:hAnsi="Cambria Math"/>
+                  <w:i/>
+                  <w:lang w:val="en-US"/>
+                </w:rPr>
+              </m:ctrlPr>
+            </m:sSubPr>
+            <m:e>
+              <m:r>
+                <w:rPr>
+                  <w:rFonts w:ascii="Cambria Math"/>
+                  <w:lang w:val="en-US"/>
+                </w:rPr>
+                <m:t>w</m:t>
+              </m:r>
+            </m:e>
+            <m:sub>
+              <m:r>
+                <w:rPr>
+                  <w:rFonts w:ascii="Cambria Math"/>
+                  <w:lang w:val="en-US"/>
+                </w:rPr>
+                <m:t>ps</m:t>
+              </m:r>
+            </m:sub>
+          </m:sSub>
+          <m:r>
+            <w:rPr>
+              <w:rFonts w:ascii="Cambria Math"/>
+            </w:rPr>
+            <m:t>)</m:t>
+          </m:r>
+          <m:sSub>
+            <m:sSubPr>
+              <m:ctrlPr>
+                <w:rPr>
+                  <w:rFonts w:ascii="Cambria Math" w:hAnsi="Cambria Math"/>
+                  <w:i/>
+                  <w:lang w:val="en-US"/>
+                </w:rPr>
+              </m:ctrlPr>
+            </m:sSubPr>
+            <m:e>
+              <m:r>
+                <w:rPr>
+                  <w:rFonts w:ascii="Cambria Math"/>
+                  <w:lang w:val="en-US"/>
+                </w:rPr>
+                <m:t>ρ</m:t>
+              </m:r>
+            </m:e>
+            <m:sub>
+              <m:r>
+                <w:rPr>
+                  <w:rFonts w:ascii="Cambria Math"/>
+                  <w:lang w:val="en-US"/>
+                </w:rPr>
+                <m:t>o</m:t>
+              </m:r>
+            </m:sub>
+          </m:sSub>
+          <m:sSub>
+            <m:sSubPr>
+              <m:ctrlPr>
+                <w:rPr>
+                  <w:rFonts w:ascii="Cambria Math" w:hAnsi="Cambria Math"/>
+                  <w:i/>
+                  <w:lang w:val="en-US"/>
+                </w:rPr>
+              </m:ctrlPr>
+            </m:sSubPr>
+            <m:e>
+              <m:r>
+                <w:rPr>
+                  <w:rFonts w:ascii="Cambria Math"/>
+                  <w:lang w:val="en-US"/>
+                </w:rPr>
+                <m:t>C</m:t>
+              </m:r>
+            </m:e>
+            <m:sub>
+              <m:r>
+                <w:rPr>
+                  <w:rFonts w:ascii="Cambria Math"/>
+                  <w:lang w:val="en-US"/>
+                </w:rPr>
+                <m:t>o</m:t>
+              </m:r>
+            </m:sub>
+          </m:sSub>
+          <m:r>
+            <w:rPr>
+              <w:rFonts w:ascii="Cambria Math" w:hAnsi="Cambria Math"/>
+              <w:lang w:val="en-US"/>
+            </w:rPr>
+            <m:t>T</m:t>
+          </m:r>
+          <m:sSub>
+            <m:sSubPr>
+              <m:ctrlPr>
+                <w:rPr>
+                  <w:rFonts w:ascii="Cambria Math" w:hAnsi="Cambria Math"/>
+                  <w:i/>
+                  <w:lang w:val="en-US"/>
+                </w:rPr>
+              </m:ctrlPr>
+            </m:sSubPr>
+            <m:e>
+              <m:r>
+                <w:rPr>
+                  <w:rFonts w:ascii="Cambria Math"/>
+                  <w:lang w:val="en-US"/>
+                </w:rPr>
+                <m:t>H</m:t>
+              </m:r>
+            </m:e>
+            <m:sub>
+              <m:r>
+                <w:rPr>
+                  <w:rFonts w:ascii="Cambria Math"/>
+                  <w:lang w:val="en-US"/>
+                </w:rPr>
+                <m:t>o</m:t>
+              </m:r>
+            </m:sub>
+          </m:sSub>
+          <m:r>
+            <w:rPr>
+              <w:rFonts w:ascii="Cambria Math"/>
+            </w:rPr>
+            <m:t>+</m:t>
+          </m:r>
+          <m:sSub>
+            <m:sSubPr>
+              <m:ctrlPr>
+                <w:rPr>
+                  <w:rFonts w:ascii="Cambria Math" w:hAnsi="Cambria Math"/>
+                  <w:i/>
+                  <w:lang w:val="en-US"/>
+                </w:rPr>
+              </m:ctrlPr>
+            </m:sSubPr>
+            <m:e>
+              <m:r>
+                <w:rPr>
+                  <w:rFonts w:ascii="Cambria Math"/>
+                  <w:lang w:val="en-US"/>
+                </w:rPr>
+                <m:t>ρ</m:t>
+              </m:r>
+            </m:e>
+            <m:sub>
+              <m:r>
+                <w:rPr>
+                  <w:rFonts w:ascii="Cambria Math"/>
+                  <w:lang w:val="en-US"/>
+                </w:rPr>
+                <m:t>p</m:t>
+              </m:r>
+            </m:sub>
+          </m:sSub>
+          <m:sSub>
+            <m:sSubPr>
+              <m:ctrlPr>
+                <w:rPr>
+                  <w:rFonts w:ascii="Cambria Math" w:hAnsi="Cambria Math"/>
+                  <w:i/>
+                  <w:lang w:val="en-US"/>
+                </w:rPr>
+              </m:ctrlPr>
+            </m:sSubPr>
+            <m:e>
+              <m:r>
+                <w:rPr>
+                  <w:rFonts w:ascii="Cambria Math"/>
+                  <w:lang w:val="en-US"/>
+                </w:rPr>
+                <m:t>w</m:t>
+              </m:r>
+            </m:e>
+            <m:sub>
+              <m:r>
+                <w:rPr>
+                  <w:rFonts w:ascii="Cambria Math"/>
+                  <w:lang w:val="en-US"/>
+                </w:rPr>
+                <m:t>ps</m:t>
+              </m:r>
+            </m:sub>
+          </m:sSub>
+          <m:sSub>
+            <m:sSubPr>
+              <m:ctrlPr>
+                <w:rPr>
+                  <w:rFonts w:ascii="Cambria Math" w:hAnsi="Cambria Math"/>
+                  <w:i/>
+                  <w:lang w:val="en-US"/>
+                </w:rPr>
+              </m:ctrlPr>
+            </m:sSubPr>
+            <m:e>
+              <m:r>
+                <w:rPr>
+                  <w:rFonts w:ascii="Cambria Math"/>
+                  <w:lang w:val="en-US"/>
+                </w:rPr>
+                <m:t>C</m:t>
+              </m:r>
+            </m:e>
+            <m:sub>
+              <m:r>
+                <w:rPr>
+                  <w:rFonts w:ascii="Cambria Math"/>
+                  <w:lang w:val="en-US"/>
+                </w:rPr>
+                <m:t>o</m:t>
+              </m:r>
+            </m:sub>
+          </m:sSub>
+          <m:r>
+            <w:rPr>
+              <w:rFonts w:ascii="Cambria Math" w:hAnsi="Cambria Math"/>
+              <w:lang w:val="en-US"/>
+            </w:rPr>
+            <m:t>T</m:t>
+          </m:r>
+          <m:sSub>
+            <m:sSubPr>
+              <m:ctrlPr>
+                <w:rPr>
+                  <w:rFonts w:ascii="Cambria Math" w:hAnsi="Cambria Math"/>
+                  <w:i/>
+                  <w:lang w:val="en-US"/>
+                </w:rPr>
+              </m:ctrlPr>
+            </m:sSubPr>
+            <m:e>
+              <m:r>
+                <w:rPr>
+                  <w:rFonts w:ascii="Cambria Math"/>
+                  <w:lang w:val="en-US"/>
+                </w:rPr>
+                <m:t>H</m:t>
+              </m:r>
+            </m:e>
+            <m:sub>
+              <m:r>
+                <w:rPr>
+                  <w:rFonts w:ascii="Cambria Math"/>
+                  <w:lang w:val="en-US"/>
+                </w:rPr>
+                <m:t>p</m:t>
+              </m:r>
+            </m:sub>
+          </m:sSub>
+          <m:r>
+            <w:rPr>
+              <w:rFonts w:ascii="Cambria Math"/>
+            </w:rPr>
+            <m:t>)=</m:t>
+          </m:r>
+          <m:r>
+            <w:rPr>
+              <w:rFonts w:ascii="Cambria Math" w:hAnsi="Cambria Math" w:cs="Cambria Math"/>
+            </w:rPr>
+            <m:t>∇</m:t>
+          </m:r>
+          <m:d>
+            <m:dPr>
+              <m:begChr m:val="{"/>
+              <m:endChr m:val="}"/>
+              <m:ctrlPr>
+                <w:rPr>
+                  <w:rFonts w:ascii="Cambria Math" w:hAnsi="Cambria Math"/>
+                  <w:i/>
+                  <w:lang w:val="en-US"/>
+                </w:rPr>
+              </m:ctrlPr>
+            </m:dPr>
+            <m:e>
               <m:d>
                 <m:dPr>
-                  <m:begChr m:val="{"/>
-                  <m:endChr m:val="}"/>
+                  <m:begChr m:val="["/>
+                  <m:endChr m:val="]"/>
                   <m:ctrlPr>
                     <w:rPr>
                       <w:rFonts w:ascii="Cambria Math" w:hAnsi="Cambria Math"/>
@@ -9631,10 +9691,21 @@
                   </m:ctrlPr>
                 </m:dPr>
                 <m:e>
-                  <m:d>
-                    <m:dPr>
-                      <m:begChr m:val="["/>
-                      <m:endChr m:val="]"/>
+                  <m:r>
+                    <w:rPr>
+                      <w:rFonts w:ascii="Cambria Math"/>
+                      <w:lang w:val="en-US"/>
+                    </w:rPr>
+                    <m:t>m</m:t>
+                  </m:r>
+                  <m:r>
+                    <w:rPr>
+                      <w:rFonts w:ascii="Cambria Math"/>
+                    </w:rPr>
+                    <m:t xml:space="preserve"> </m:t>
+                  </m:r>
+                  <m:sSub>
+                    <m:sSubPr>
                       <m:ctrlPr>
                         <w:rPr>
                           <w:rFonts w:ascii="Cambria Math" w:hAnsi="Cambria Math"/>
@@ -9642,473 +9713,560 @@
                           <w:lang w:val="en-US"/>
                         </w:rPr>
                       </m:ctrlPr>
-                    </m:dPr>
+                    </m:sSubPr>
                     <m:e>
                       <m:r>
                         <w:rPr>
                           <w:rFonts w:ascii="Cambria Math"/>
                           <w:lang w:val="en-US"/>
                         </w:rPr>
-                        <m:t xml:space="preserve">m </m:t>
+                        <m:t>S</m:t>
                       </m:r>
-                      <m:sSub>
-                        <m:sSubPr>
-                          <m:ctrlPr>
-                            <w:rPr>
-                              <w:rFonts w:ascii="Cambria Math" w:hAnsi="Cambria Math"/>
-                              <w:i/>
-                              <w:lang w:val="en-US"/>
-                            </w:rPr>
-                          </m:ctrlPr>
-                        </m:sSubPr>
-                        <m:e>
-                          <m:r>
-                            <w:rPr>
-                              <w:rFonts w:ascii="Cambria Math"/>
-                              <w:lang w:val="en-US"/>
-                            </w:rPr>
-                            <m:t>S</m:t>
-                          </m:r>
-                        </m:e>
-                        <m:sub>
-                          <m:r>
-                            <w:rPr>
-                              <w:rFonts w:ascii="Cambria Math"/>
-                              <w:lang w:val="en-US"/>
-                            </w:rPr>
-                            <m:t>w</m:t>
-                          </m:r>
-                        </m:sub>
-                      </m:sSub>
-                      <m:sSub>
-                        <m:sSubPr>
-                          <m:ctrlPr>
-                            <w:rPr>
-                              <w:rFonts w:ascii="Cambria Math" w:hAnsi="Cambria Math"/>
-                              <w:i/>
-                              <w:lang w:val="en-US"/>
-                            </w:rPr>
-                          </m:ctrlPr>
-                        </m:sSubPr>
-                        <m:e>
-                          <m:r>
-                            <w:rPr>
-                              <w:rFonts w:ascii="Cambria Math"/>
-                              <w:lang w:val="en-US"/>
-                            </w:rPr>
-                            <m:t>K</m:t>
-                          </m:r>
-                        </m:e>
-                        <m:sub>
-                          <m:r>
-                            <w:rPr>
-                              <w:rFonts w:ascii="Cambria Math"/>
-                              <w:lang w:val="en-US"/>
-                            </w:rPr>
-                            <m:t>w</m:t>
-                          </m:r>
-                        </m:sub>
-                      </m:sSub>
+                    </m:e>
+                    <m:sub>
                       <m:r>
                         <w:rPr>
                           <w:rFonts w:ascii="Cambria Math"/>
                           <w:lang w:val="en-US"/>
                         </w:rPr>
-                        <m:t>+</m:t>
+                        <m:t>w</m:t>
                       </m:r>
+                    </m:sub>
+                  </m:sSub>
+                  <m:sSub>
+                    <m:sSubPr>
+                      <m:ctrlPr>
+                        <w:rPr>
+                          <w:rFonts w:ascii="Cambria Math" w:hAnsi="Cambria Math"/>
+                          <w:i/>
+                          <w:lang w:val="en-US"/>
+                        </w:rPr>
+                      </m:ctrlPr>
+                    </m:sSubPr>
+                    <m:e>
                       <m:r>
                         <w:rPr>
                           <w:rFonts w:ascii="Cambria Math"/>
                           <w:lang w:val="en-US"/>
                         </w:rPr>
-                        <m:t>m</m:t>
+                        <m:t>K</m:t>
                       </m:r>
-                      <m:sSub>
-                        <m:sSubPr>
-                          <m:ctrlPr>
-                            <w:rPr>
-                              <w:rFonts w:ascii="Cambria Math" w:hAnsi="Cambria Math"/>
-                              <w:i/>
-                              <w:lang w:val="en-US"/>
-                            </w:rPr>
-                          </m:ctrlPr>
-                        </m:sSubPr>
-                        <m:e>
-                          <m:r>
-                            <w:rPr>
-                              <w:rFonts w:ascii="Cambria Math"/>
-                              <w:lang w:val="en-US"/>
-                            </w:rPr>
-                            <m:t>S</m:t>
-                          </m:r>
-                        </m:e>
-                        <m:sub>
-                          <m:r>
-                            <w:rPr>
-                              <w:rFonts w:ascii="Cambria Math"/>
-                              <w:lang w:val="en-US"/>
-                            </w:rPr>
-                            <m:t>o</m:t>
-                          </m:r>
-                        </m:sub>
-                      </m:sSub>
-                      <m:sSub>
-                        <m:sSubPr>
-                          <m:ctrlPr>
-                            <w:rPr>
-                              <w:rFonts w:ascii="Cambria Math" w:hAnsi="Cambria Math"/>
-                              <w:i/>
-                              <w:lang w:val="en-US"/>
-                            </w:rPr>
-                          </m:ctrlPr>
-                        </m:sSubPr>
-                        <m:e>
-                          <m:r>
-                            <w:rPr>
-                              <w:rFonts w:ascii="Cambria Math"/>
-                              <w:lang w:val="en-US"/>
-                            </w:rPr>
-                            <m:t>K</m:t>
-                          </m:r>
-                        </m:e>
-                        <m:sub>
-                          <m:r>
-                            <w:rPr>
-                              <w:rFonts w:ascii="Cambria Math"/>
-                              <w:lang w:val="en-US"/>
-                            </w:rPr>
-                            <m:t>o</m:t>
-                          </m:r>
-                        </m:sub>
-                      </m:sSub>
+                    </m:e>
+                    <m:sub>
                       <m:r>
                         <w:rPr>
                           <w:rFonts w:ascii="Cambria Math"/>
                           <w:lang w:val="en-US"/>
                         </w:rPr>
-                        <m:t>(1</m:t>
+                        <m:t>w</m:t>
                       </m:r>
-                      <m:r>
-                        <w:rPr>
-                          <w:rFonts w:ascii="Cambria Math"/>
-                          <w:lang w:val="en-US"/>
-                        </w:rPr>
-                        <m:t>-</m:t>
-                      </m:r>
-                      <m:sSub>
-                        <m:sSubPr>
-                          <m:ctrlPr>
-                            <w:rPr>
-                              <w:rFonts w:ascii="Cambria Math" w:hAnsi="Cambria Math"/>
-                              <w:i/>
-                              <w:lang w:val="en-US"/>
-                            </w:rPr>
-                          </m:ctrlPr>
-                        </m:sSubPr>
-                        <m:e>
-                          <m:r>
-                            <w:rPr>
-                              <w:rFonts w:ascii="Cambria Math"/>
-                              <w:lang w:val="en-US"/>
-                            </w:rPr>
-                            <m:t>w</m:t>
-                          </m:r>
-                        </m:e>
-                        <m:sub>
-                          <m:r>
-                            <w:rPr>
-                              <w:rFonts w:ascii="Cambria Math"/>
-                              <w:lang w:val="en-US"/>
-                            </w:rPr>
-                            <m:t>ps</m:t>
-                          </m:r>
-                        </m:sub>
-                      </m:sSub>
-                      <m:r>
-                        <w:rPr>
-                          <w:rFonts w:ascii="Cambria Math"/>
-                          <w:lang w:val="en-US"/>
-                        </w:rPr>
-                        <m:t>)+</m:t>
-                      </m:r>
-                      <m:r>
-                        <w:rPr>
-                          <w:rFonts w:ascii="Cambria Math"/>
-                          <w:lang w:val="en-US"/>
-                        </w:rPr>
-                        <m:t>m</m:t>
-                      </m:r>
-                      <m:sSub>
-                        <m:sSubPr>
-                          <m:ctrlPr>
-                            <w:rPr>
-                              <w:rFonts w:ascii="Cambria Math" w:hAnsi="Cambria Math"/>
-                              <w:i/>
-                              <w:lang w:val="en-US"/>
-                            </w:rPr>
-                          </m:ctrlPr>
-                        </m:sSubPr>
-                        <m:e>
-                          <m:r>
-                            <w:rPr>
-                              <w:rFonts w:ascii="Cambria Math"/>
-                              <w:lang w:val="en-US"/>
-                            </w:rPr>
-                            <m:t>S</m:t>
-                          </m:r>
-                        </m:e>
-                        <m:sub>
-                          <m:r>
-                            <w:rPr>
-                              <w:rFonts w:ascii="Cambria Math"/>
-                              <w:lang w:val="en-US"/>
-                            </w:rPr>
-                            <m:t>o</m:t>
-                          </m:r>
-                        </m:sub>
-                      </m:sSub>
-                      <m:sSub>
-                        <m:sSubPr>
-                          <m:ctrlPr>
-                            <w:rPr>
-                              <w:rFonts w:ascii="Cambria Math" w:hAnsi="Cambria Math"/>
-                              <w:i/>
-                              <w:lang w:val="en-US"/>
-                            </w:rPr>
-                          </m:ctrlPr>
-                        </m:sSubPr>
-                        <m:e>
-                          <m:r>
-                            <w:rPr>
-                              <w:rFonts w:ascii="Cambria Math"/>
-                              <w:lang w:val="en-US"/>
-                            </w:rPr>
-                            <m:t>w</m:t>
-                          </m:r>
-                        </m:e>
-                        <m:sub>
-                          <m:r>
-                            <w:rPr>
-                              <w:rFonts w:ascii="Cambria Math"/>
-                              <w:lang w:val="en-US"/>
-                            </w:rPr>
-                            <m:t>ps</m:t>
-                          </m:r>
-                        </m:sub>
-                      </m:sSub>
-                      <m:sSub>
-                        <m:sSubPr>
-                          <m:ctrlPr>
-                            <w:rPr>
-                              <w:rFonts w:ascii="Cambria Math" w:hAnsi="Cambria Math"/>
-                              <w:i/>
-                              <w:lang w:val="en-US"/>
-                            </w:rPr>
-                          </m:ctrlPr>
-                        </m:sSubPr>
-                        <m:e>
-                          <m:r>
-                            <w:rPr>
-                              <w:rFonts w:ascii="Cambria Math"/>
-                              <w:lang w:val="en-US"/>
-                            </w:rPr>
-                            <m:t>K</m:t>
-                          </m:r>
-                        </m:e>
-                        <m:sub>
-                          <m:r>
-                            <w:rPr>
-                              <w:rFonts w:ascii="Cambria Math"/>
-                              <w:lang w:val="en-US"/>
-                            </w:rPr>
-                            <m:t>p</m:t>
-                          </m:r>
-                        </m:sub>
-                      </m:sSub>
-                      <m:r>
-                        <w:rPr>
-                          <w:rFonts w:ascii="Cambria Math"/>
-                          <w:lang w:val="en-US"/>
-                        </w:rPr>
-                        <m:t>+(1</m:t>
-                      </m:r>
-                      <m:r>
-                        <w:rPr>
-                          <w:rFonts w:ascii="Cambria Math"/>
-                          <w:lang w:val="en-US"/>
-                        </w:rPr>
-                        <m:t>-</m:t>
-                      </m:r>
-                      <m:r>
-                        <w:rPr>
-                          <w:rFonts w:ascii="Cambria Math"/>
-                          <w:lang w:val="en-US"/>
-                        </w:rPr>
-                        <m:t>m</m:t>
-                      </m:r>
-                      <m:r>
-                        <w:rPr>
-                          <w:rFonts w:ascii="Cambria Math"/>
-                          <w:lang w:val="en-US"/>
-                        </w:rPr>
-                        <m:t>)</m:t>
-                      </m:r>
-                      <m:sSub>
-                        <m:sSubPr>
-                          <m:ctrlPr>
-                            <w:rPr>
-                              <w:rFonts w:ascii="Cambria Math" w:hAnsi="Cambria Math"/>
-                              <w:i/>
-                              <w:lang w:val="en-US"/>
-                            </w:rPr>
-                          </m:ctrlPr>
-                        </m:sSubPr>
-                        <m:e>
-                          <m:r>
-                            <w:rPr>
-                              <w:rFonts w:ascii="Cambria Math"/>
-                              <w:lang w:val="en-US"/>
-                            </w:rPr>
-                            <m:t>K</m:t>
-                          </m:r>
-                        </m:e>
-                        <m:sub>
-                          <m:r>
-                            <w:rPr>
-                              <w:rFonts w:ascii="Cambria Math"/>
-                              <w:lang w:val="en-US"/>
-                            </w:rPr>
-                            <m:t>f</m:t>
-                          </m:r>
-                        </m:sub>
-                      </m:sSub>
-                    </m:e>
-                  </m:d>
+                    </m:sub>
+                  </m:sSub>
                   <m:r>
                     <w:rPr>
-                      <w:rFonts w:ascii="Cambria Math" w:hAnsi="Cambria Math" w:cs="Cambria Math"/>
+                      <w:rFonts w:ascii="Cambria Math"/>
                     </w:rPr>
-                    <m:t>∇</m:t>
+                    <m:t>+</m:t>
                   </m:r>
                   <m:r>
                     <w:rPr>
                       <w:rFonts w:ascii="Cambria Math"/>
                       <w:lang w:val="en-US"/>
                     </w:rPr>
-                    <m:t>T</m:t>
+                    <m:t>m</m:t>
                   </m:r>
-                </m:e>
-              </m:d>
-              <m:r>
-                <w:rPr>
-                  <w:rFonts w:ascii="Cambria Math" w:hAnsi="Cambria Math"/>
-                  <w:lang w:val="en-US"/>
-                </w:rPr>
-                <m:t>+</m:t>
-              </m:r>
-              <m:sSub>
-                <m:sSubPr>
-                  <m:ctrlPr>
-                    <w:rPr>
-                      <w:rFonts w:ascii="Cambria Math" w:hAnsi="Cambria Math"/>
-                      <w:i/>
-                      <w:lang w:val="en-US"/>
-                    </w:rPr>
-                  </m:ctrlPr>
-                </m:sSubPr>
-                <m:e>
+                  <m:sSub>
+                    <m:sSubPr>
+                      <m:ctrlPr>
+                        <w:rPr>
+                          <w:rFonts w:ascii="Cambria Math" w:hAnsi="Cambria Math"/>
+                          <w:i/>
+                          <w:lang w:val="en-US"/>
+                        </w:rPr>
+                      </m:ctrlPr>
+                    </m:sSubPr>
+                    <m:e>
+                      <m:r>
+                        <w:rPr>
+                          <w:rFonts w:ascii="Cambria Math"/>
+                          <w:lang w:val="en-US"/>
+                        </w:rPr>
+                        <m:t>S</m:t>
+                      </m:r>
+                    </m:e>
+                    <m:sub>
+                      <m:r>
+                        <w:rPr>
+                          <w:rFonts w:ascii="Cambria Math"/>
+                          <w:lang w:val="en-US"/>
+                        </w:rPr>
+                        <m:t>o</m:t>
+                      </m:r>
+                    </m:sub>
+                  </m:sSub>
+                  <m:sSub>
+                    <m:sSubPr>
+                      <m:ctrlPr>
+                        <w:rPr>
+                          <w:rFonts w:ascii="Cambria Math" w:hAnsi="Cambria Math"/>
+                          <w:i/>
+                          <w:lang w:val="en-US"/>
+                        </w:rPr>
+                      </m:ctrlPr>
+                    </m:sSubPr>
+                    <m:e>
+                      <m:r>
+                        <w:rPr>
+                          <w:rFonts w:ascii="Cambria Math"/>
+                          <w:lang w:val="en-US"/>
+                        </w:rPr>
+                        <m:t>K</m:t>
+                      </m:r>
+                    </m:e>
+                    <m:sub>
+                      <m:r>
+                        <w:rPr>
+                          <w:rFonts w:ascii="Cambria Math"/>
+                          <w:lang w:val="en-US"/>
+                        </w:rPr>
+                        <m:t>o</m:t>
+                      </m:r>
+                    </m:sub>
+                  </m:sSub>
                   <m:r>
                     <w:rPr>
-                      <w:rFonts w:ascii="Cambria Math" w:hAnsi="Cambria Math"/>
-                      <w:lang w:val="en-US"/>
+                      <w:rFonts w:ascii="Cambria Math"/>
                     </w:rPr>
-                    <m:t>q</m:t>
+                    <m:t>(1</m:t>
                   </m:r>
-                </m:e>
-                <m:sub>
                   <m:r>
                     <w:rPr>
-                      <w:rFonts w:ascii="Cambria Math" w:hAnsi="Cambria Math"/>
-                      <w:lang w:val="en-US"/>
+                      <w:rFonts w:ascii="Cambria Math"/>
                     </w:rPr>
-                    <m:t>o</m:t>
+                    <m:t>-</m:t>
                   </m:r>
-                </m:sub>
-              </m:sSub>
-              <m:sSub>
-                <m:sSubPr>
-                  <m:ctrlPr>
+                  <m:sSub>
+                    <m:sSubPr>
+                      <m:ctrlPr>
+                        <w:rPr>
+                          <w:rFonts w:ascii="Cambria Math" w:hAnsi="Cambria Math"/>
+                          <w:i/>
+                          <w:lang w:val="en-US"/>
+                        </w:rPr>
+                      </m:ctrlPr>
+                    </m:sSubPr>
+                    <m:e>
+                      <m:r>
+                        <w:rPr>
+                          <w:rFonts w:ascii="Cambria Math"/>
+                          <w:lang w:val="en-US"/>
+                        </w:rPr>
+                        <m:t>w</m:t>
+                      </m:r>
+                    </m:e>
+                    <m:sub>
+                      <m:r>
+                        <w:rPr>
+                          <w:rFonts w:ascii="Cambria Math"/>
+                          <w:lang w:val="en-US"/>
+                        </w:rPr>
+                        <m:t>ps</m:t>
+                      </m:r>
+                    </m:sub>
+                  </m:sSub>
+                  <m:r>
                     <w:rPr>
-                      <w:rFonts w:ascii="Cambria Math" w:hAnsi="Cambria Math"/>
-                      <w:i/>
-                      <w:lang w:val="en-US"/>
+                      <w:rFonts w:ascii="Cambria Math"/>
                     </w:rPr>
-                  </m:ctrlPr>
-                </m:sSubPr>
-                <m:e>
+                    <m:t>)+</m:t>
+                  </m:r>
                   <m:r>
                     <w:rPr>
                       <w:rFonts w:ascii="Cambria Math"/>
                       <w:lang w:val="en-US"/>
                     </w:rPr>
-                    <m:t>ρ</m:t>
+                    <m:t>m</m:t>
                   </m:r>
-                </m:e>
-                <m:sub>
+                  <m:sSub>
+                    <m:sSubPr>
+                      <m:ctrlPr>
+                        <w:rPr>
+                          <w:rFonts w:ascii="Cambria Math" w:hAnsi="Cambria Math"/>
+                          <w:i/>
+                          <w:lang w:val="en-US"/>
+                        </w:rPr>
+                      </m:ctrlPr>
+                    </m:sSubPr>
+                    <m:e>
+                      <m:r>
+                        <w:rPr>
+                          <w:rFonts w:ascii="Cambria Math"/>
+                          <w:lang w:val="en-US"/>
+                        </w:rPr>
+                        <m:t>S</m:t>
+                      </m:r>
+                    </m:e>
+                    <m:sub>
+                      <m:r>
+                        <w:rPr>
+                          <w:rFonts w:ascii="Cambria Math"/>
+                          <w:lang w:val="en-US"/>
+                        </w:rPr>
+                        <m:t>o</m:t>
+                      </m:r>
+                    </m:sub>
+                  </m:sSub>
+                  <m:sSub>
+                    <m:sSubPr>
+                      <m:ctrlPr>
+                        <w:rPr>
+                          <w:rFonts w:ascii="Cambria Math" w:hAnsi="Cambria Math"/>
+                          <w:i/>
+                          <w:lang w:val="en-US"/>
+                        </w:rPr>
+                      </m:ctrlPr>
+                    </m:sSubPr>
+                    <m:e>
+                      <m:r>
+                        <w:rPr>
+                          <w:rFonts w:ascii="Cambria Math"/>
+                          <w:lang w:val="en-US"/>
+                        </w:rPr>
+                        <m:t>w</m:t>
+                      </m:r>
+                    </m:e>
+                    <m:sub>
+                      <m:r>
+                        <w:rPr>
+                          <w:rFonts w:ascii="Cambria Math"/>
+                          <w:lang w:val="en-US"/>
+                        </w:rPr>
+                        <m:t>ps</m:t>
+                      </m:r>
+                    </m:sub>
+                  </m:sSub>
+                  <m:sSub>
+                    <m:sSubPr>
+                      <m:ctrlPr>
+                        <w:rPr>
+                          <w:rFonts w:ascii="Cambria Math" w:hAnsi="Cambria Math"/>
+                          <w:i/>
+                          <w:lang w:val="en-US"/>
+                        </w:rPr>
+                      </m:ctrlPr>
+                    </m:sSubPr>
+                    <m:e>
+                      <m:r>
+                        <w:rPr>
+                          <w:rFonts w:ascii="Cambria Math"/>
+                          <w:lang w:val="en-US"/>
+                        </w:rPr>
+                        <m:t>K</m:t>
+                      </m:r>
+                    </m:e>
+                    <m:sub>
+                      <m:r>
+                        <w:rPr>
+                          <w:rFonts w:ascii="Cambria Math"/>
+                          <w:lang w:val="en-US"/>
+                        </w:rPr>
+                        <m:t>p</m:t>
+                      </m:r>
+                    </m:sub>
+                  </m:sSub>
+                  <m:r>
+                    <w:rPr>
+                      <w:rFonts w:ascii="Cambria Math"/>
+                    </w:rPr>
+                    <m:t>+(1</m:t>
+                  </m:r>
+                  <m:r>
+                    <w:rPr>
+                      <w:rFonts w:ascii="Cambria Math"/>
+                    </w:rPr>
+                    <m:t>-</m:t>
+                  </m:r>
                   <m:r>
                     <w:rPr>
                       <w:rFonts w:ascii="Cambria Math"/>
                       <w:lang w:val="en-US"/>
                     </w:rPr>
-                    <m:t>o</m:t>
+                    <m:t>m</m:t>
                   </m:r>
-                </m:sub>
-              </m:sSub>
-              <m:sSub>
-                <m:sSubPr>
-                  <m:ctrlPr>
-                    <w:rPr>
-                      <w:rFonts w:ascii="Cambria Math" w:hAnsi="Cambria Math"/>
-                      <w:i/>
-                      <w:lang w:val="en-US"/>
-                    </w:rPr>
-                  </m:ctrlPr>
-                </m:sSubPr>
-                <m:e>
                   <m:r>
                     <w:rPr>
                       <w:rFonts w:ascii="Cambria Math"/>
-                      <w:lang w:val="en-US"/>
                     </w:rPr>
-                    <m:t>C</m:t>
+                    <m:t>)</m:t>
                   </m:r>
+                  <m:sSub>
+                    <m:sSubPr>
+                      <m:ctrlPr>
+                        <w:rPr>
+                          <w:rFonts w:ascii="Cambria Math" w:hAnsi="Cambria Math"/>
+                          <w:i/>
+                          <w:lang w:val="en-US"/>
+                        </w:rPr>
+                      </m:ctrlPr>
+                    </m:sSubPr>
+                    <m:e>
+                      <m:r>
+                        <w:rPr>
+                          <w:rFonts w:ascii="Cambria Math"/>
+                          <w:lang w:val="en-US"/>
+                        </w:rPr>
+                        <m:t>K</m:t>
+                      </m:r>
+                    </m:e>
+                    <m:sub>
+                      <m:r>
+                        <w:rPr>
+                          <w:rFonts w:ascii="Cambria Math"/>
+                          <w:lang w:val="en-US"/>
+                        </w:rPr>
+                        <m:t>f</m:t>
+                      </m:r>
+                    </m:sub>
+                  </m:sSub>
                 </m:e>
-                <m:sub>
-                  <m:r>
-                    <w:rPr>
-                      <w:rFonts w:ascii="Cambria Math"/>
-                      <w:lang w:val="en-US"/>
-                    </w:rPr>
-                    <m:t>o</m:t>
-                  </m:r>
-                </m:sub>
-              </m:sSub>
+              </m:d>
               <m:r>
                 <w:rPr>
+                  <w:rFonts w:ascii="Cambria Math" w:hAnsi="Cambria Math" w:cs="Cambria Math"/>
+                </w:rPr>
+                <m:t>∇</m:t>
+              </m:r>
+              <m:r>
+                <w:rPr>
                   <w:rFonts w:ascii="Cambria Math"/>
+                  <w:lang w:val="en-US"/>
                 </w:rPr>
                 <m:t>T</m:t>
               </m:r>
             </m:e>
-          </m:mr>
-        </m:m>
-      </m:oMath>
-      <w:r>
-        <w:rPr>
+          </m:d>
+        </m:oMath>
+      </m:oMathPara>
+    </w:p>
+    <w:p>
+      <w:pPr>
+        <w:jc w:val="both"/>
+        <w:rPr>
+          <w:rFonts w:eastAsiaTheme="minorEastAsia"/>
+          <w:i/>
           <w:lang w:val="en-US"/>
         </w:rPr>
-        <w:t xml:space="preserve"> </w:t>
-      </w:r>
+      </w:pPr>
+      <m:oMathPara>
+        <m:oMath>
+          <m:r>
+            <w:rPr>
+              <w:rFonts w:ascii="Cambria Math" w:hAnsi="Cambria Math"/>
+            </w:rPr>
+            <m:t>+</m:t>
+          </m:r>
+          <m:sSub>
+            <m:sSubPr>
+              <m:ctrlPr>
+                <w:rPr>
+                  <w:rFonts w:ascii="Cambria Math" w:hAnsi="Cambria Math"/>
+                  <w:i/>
+                  <w:lang w:val="en-US"/>
+                </w:rPr>
+              </m:ctrlPr>
+            </m:sSubPr>
+            <m:e>
+              <m:r>
+                <w:rPr>
+                  <w:rFonts w:ascii="Cambria Math" w:hAnsi="Cambria Math"/>
+                  <w:lang w:val="en-US"/>
+                </w:rPr>
+                <m:t>q</m:t>
+              </m:r>
+            </m:e>
+            <m:sub>
+              <m:r>
+                <w:rPr>
+                  <w:rFonts w:ascii="Cambria Math" w:hAnsi="Cambria Math"/>
+                  <w:lang w:val="en-US"/>
+                </w:rPr>
+                <m:t>o</m:t>
+              </m:r>
+            </m:sub>
+          </m:sSub>
+          <m:sSub>
+            <m:sSubPr>
+              <m:ctrlPr>
+                <w:rPr>
+                  <w:rFonts w:ascii="Cambria Math" w:hAnsi="Cambria Math"/>
+                  <w:i/>
+                  <w:lang w:val="en-US"/>
+                </w:rPr>
+              </m:ctrlPr>
+            </m:sSubPr>
+            <m:e>
+              <m:r>
+                <w:rPr>
+                  <w:rFonts w:ascii="Cambria Math"/>
+                  <w:lang w:val="en-US"/>
+                </w:rPr>
+                <m:t>ρ</m:t>
+              </m:r>
+            </m:e>
+            <m:sub>
+              <m:r>
+                <w:rPr>
+                  <w:rFonts w:ascii="Cambria Math"/>
+                  <w:lang w:val="en-US"/>
+                </w:rPr>
+                <m:t>o</m:t>
+              </m:r>
+            </m:sub>
+          </m:sSub>
+          <m:sSub>
+            <m:sSubPr>
+              <m:ctrlPr>
+                <w:rPr>
+                  <w:rFonts w:ascii="Cambria Math" w:hAnsi="Cambria Math"/>
+                  <w:i/>
+                  <w:lang w:val="en-US"/>
+                </w:rPr>
+              </m:ctrlPr>
+            </m:sSubPr>
+            <m:e>
+              <m:r>
+                <w:rPr>
+                  <w:rFonts w:ascii="Cambria Math"/>
+                  <w:lang w:val="en-US"/>
+                </w:rPr>
+                <m:t>C</m:t>
+              </m:r>
+            </m:e>
+            <m:sub>
+              <m:r>
+                <w:rPr>
+                  <w:rFonts w:ascii="Cambria Math"/>
+                  <w:lang w:val="en-US"/>
+                </w:rPr>
+                <m:t>o</m:t>
+              </m:r>
+            </m:sub>
+          </m:sSub>
+          <m:r>
+            <w:rPr>
+              <w:rFonts w:ascii="Cambria Math"/>
+            </w:rPr>
+            <m:t>T</m:t>
+          </m:r>
+          <m:r>
+            <w:rPr>
+              <w:rFonts w:ascii="Cambria Math" w:hAnsi="Cambria Math"/>
+            </w:rPr>
+            <m:t>+</m:t>
+          </m:r>
+          <m:sSub>
+            <m:sSubPr>
+              <m:ctrlPr>
+                <w:rPr>
+                  <w:rFonts w:ascii="Cambria Math" w:hAnsi="Cambria Math"/>
+                  <w:i/>
+                  <w:lang w:val="en-US"/>
+                </w:rPr>
+              </m:ctrlPr>
+            </m:sSubPr>
+            <m:e>
+              <m:r>
+                <w:rPr>
+                  <w:rFonts w:ascii="Cambria Math" w:hAnsi="Cambria Math"/>
+                  <w:lang w:val="en-US"/>
+                </w:rPr>
+                <m:t>q</m:t>
+              </m:r>
+            </m:e>
+            <m:sub>
+              <m:r>
+                <w:rPr>
+                  <w:rFonts w:ascii="Cambria Math" w:hAnsi="Cambria Math"/>
+                  <w:lang w:val="en-US"/>
+                </w:rPr>
+                <m:t>w</m:t>
+              </m:r>
+            </m:sub>
+          </m:sSub>
+          <m:sSub>
+            <m:sSubPr>
+              <m:ctrlPr>
+                <w:rPr>
+                  <w:rFonts w:ascii="Cambria Math" w:hAnsi="Cambria Math"/>
+                  <w:i/>
+                  <w:lang w:val="en-US"/>
+                </w:rPr>
+              </m:ctrlPr>
+            </m:sSubPr>
+            <m:e>
+              <m:r>
+                <w:rPr>
+                  <w:rFonts w:ascii="Cambria Math"/>
+                  <w:lang w:val="en-US"/>
+                </w:rPr>
+                <m:t>ρ</m:t>
+              </m:r>
+            </m:e>
+            <m:sub>
+              <m:r>
+                <w:rPr>
+                  <w:rFonts w:ascii="Cambria Math"/>
+                  <w:lang w:val="en-US"/>
+                </w:rPr>
+                <m:t>w</m:t>
+              </m:r>
+            </m:sub>
+          </m:sSub>
+          <m:sSub>
+            <m:sSubPr>
+              <m:ctrlPr>
+                <w:rPr>
+                  <w:rFonts w:ascii="Cambria Math" w:hAnsi="Cambria Math"/>
+                  <w:i/>
+                  <w:lang w:val="en-US"/>
+                </w:rPr>
+              </m:ctrlPr>
+            </m:sSubPr>
+            <m:e>
+              <m:r>
+                <w:rPr>
+                  <w:rFonts w:ascii="Cambria Math"/>
+                  <w:lang w:val="en-US"/>
+                </w:rPr>
+                <m:t>C</m:t>
+              </m:r>
+            </m:e>
+            <m:sub>
+              <m:r>
+                <w:rPr>
+                  <w:rFonts w:ascii="Cambria Math"/>
+                  <w:lang w:val="en-US"/>
+                </w:rPr>
+                <m:t>w</m:t>
+              </m:r>
+            </m:sub>
+          </m:sSub>
+          <m:r>
+            <w:rPr>
+              <w:rFonts w:ascii="Cambria Math"/>
+            </w:rPr>
+            <m:t>T</m:t>
+          </m:r>
+        </m:oMath>
+      </m:oMathPara>
+    </w:p>
+    <w:p>
+      <w:pPr>
+        <w:jc w:val="both"/>
+        <w:rPr>
+          <w:lang w:val="en-US"/>
+        </w:rPr>
+      </w:pPr>
     </w:p>
     <w:p>
       <w:pPr>
@@ -10412,6 +10570,7 @@
         </w:rPr>
       </w:pPr>
       <w:r>
+        <w:lastRenderedPageBreak/>
         <w:t xml:space="preserve">На вскрытых поверхностях </w:t>
       </w:r>
       <m:oMath>
@@ -10779,7 +10938,6 @@
         <w:jc w:val="both"/>
       </w:pPr>
       <w:r>
-        <w:lastRenderedPageBreak/>
         <w:br w:type="page"/>
       </w:r>
     </w:p>
@@ -12532,7 +12690,7 @@
           <v:shape id="_x0000_i1025" type="#_x0000_t75" style="width:372pt;height:78pt" o:ole="">
             <v:imagedata r:id="rId8" o:title=""/>
           </v:shape>
-          <o:OLEObject Type="Embed" ProgID="Equation.DSMT4" ShapeID="_x0000_i1025" DrawAspect="Content" ObjectID="_1810919940" r:id="rId9"/>
+          <o:OLEObject Type="Embed" ProgID="Equation.DSMT4" ShapeID="_x0000_i1025" DrawAspect="Content" ObjectID="_1810921123" r:id="rId9"/>
         </w:object>
       </w:r>
     </w:p>
@@ -12560,7 +12718,7 @@
           <v:shape id="_x0000_i1026" type="#_x0000_t75" style="width:474pt;height:1in" o:ole="">
             <v:imagedata r:id="rId10" o:title=""/>
           </v:shape>
-          <o:OLEObject Type="Embed" ProgID="Equation.DSMT4" ShapeID="_x0000_i1026" DrawAspect="Content" ObjectID="_1810919941" r:id="rId11"/>
+          <o:OLEObject Type="Embed" ProgID="Equation.DSMT4" ShapeID="_x0000_i1026" DrawAspect="Content" ObjectID="_1810921124" r:id="rId11"/>
         </w:object>
       </w:r>
     </w:p>
@@ -13389,7 +13547,15 @@
           <w:sz w:val="26"/>
           <w:szCs w:val="26"/>
         </w:rPr>
-        <w:t xml:space="preserve">по блоку  </w:t>
+        <w:t xml:space="preserve">по </w:t>
+      </w:r>
+      <w:proofErr w:type="gramStart"/>
+      <w:r>
+        <w:rPr>
+          <w:sz w:val="26"/>
+          <w:szCs w:val="26"/>
+        </w:rPr>
+        <w:t xml:space="preserve">блоку  </w:t>
       </w:r>
       <w:r>
         <w:rPr>
@@ -13409,6 +13575,7 @@
         </w:rPr>
         <w:t>i</w:t>
       </w:r>
+      <w:proofErr w:type="gramEnd"/>
       <w:r>
         <w:rPr>
           <w:sz w:val="26"/>
@@ -18782,7 +18949,7 @@
           <v:shape id="_x0000_i1027" type="#_x0000_t75" style="width:42pt;height:24pt" o:ole="">
             <v:imagedata r:id="rId12" o:title=""/>
           </v:shape>
-          <o:OLEObject Type="Embed" ProgID="Equation.3" ShapeID="_x0000_i1027" DrawAspect="Content" ObjectID="_1810919942" r:id="rId13"/>
+          <o:OLEObject Type="Embed" ProgID="Equation.3" ShapeID="_x0000_i1027" DrawAspect="Content" ObjectID="_1810921125" r:id="rId13"/>
         </w:object>
       </w:r>
       <w:r>
@@ -18822,7 +18989,7 @@
           <v:shape id="_x0000_i1028" type="#_x0000_t75" style="width:78pt;height:42pt" o:ole="">
             <v:imagedata r:id="rId14" o:title=""/>
           </v:shape>
-          <o:OLEObject Type="Embed" ProgID="Equation.3" ShapeID="_x0000_i1028" DrawAspect="Content" ObjectID="_1810919943" r:id="rId15"/>
+          <o:OLEObject Type="Embed" ProgID="Equation.3" ShapeID="_x0000_i1028" DrawAspect="Content" ObjectID="_1810921126" r:id="rId15"/>
         </w:object>
       </w:r>
       <w:r>
@@ -18841,6 +19008,7 @@
           <w:szCs w:val="26"/>
         </w:rPr>
       </w:pPr>
+      <w:proofErr w:type="gramStart"/>
       <w:r>
         <w:rPr>
           <w:sz w:val="26"/>
@@ -18848,6 +19016,7 @@
         </w:rPr>
         <w:t>Символ  “</w:t>
       </w:r>
+      <w:proofErr w:type="gramEnd"/>
       <w:r>
         <w:rPr>
           <w:i/>
@@ -18885,7 +19054,7 @@
           <v:shape id="_x0000_i1029" type="#_x0000_t75" style="width:198pt;height:102pt" o:ole="">
             <v:imagedata r:id="rId16" o:title=""/>
           </v:shape>
-          <o:OLEObject Type="Embed" ProgID="Equation.3" ShapeID="_x0000_i1029" DrawAspect="Content" ObjectID="_1810919944" r:id="rId17"/>
+          <o:OLEObject Type="Embed" ProgID="Equation.3" ShapeID="_x0000_i1029" DrawAspect="Content" ObjectID="_1810921127" r:id="rId17"/>
         </w:object>
       </w:r>
     </w:p>
@@ -34147,7 +34316,15 @@
         <w:jc w:val="both"/>
       </w:pPr>
       <w:r>
-        <w:t>Пудовкин М.А., Саламатин А.Н., Чугунов В.А. Температурные процессы в действующих скважинах. - Казань: Изд-во Казан.унив-та. - 1977.- 168 с.</w:t>
+        <w:t xml:space="preserve">Пудовкин М.А., Саламатин А.Н., Чугунов В.А. Температурные процессы в действующих скважинах. - Казань: Изд-во </w:t>
+      </w:r>
+      <w:proofErr w:type="spellStart"/>
+      <w:r>
+        <w:t>Казан.унив</w:t>
+      </w:r>
+      <w:proofErr w:type="spellEnd"/>
+      <w:r>
+        <w:t>-та. - 1977.- 168 с.</w:t>
       </w:r>
     </w:p>
     <w:p>
@@ -35100,7 +35277,15 @@
     </w:p>
     <w:p>
       <w:r>
-        <w:t>ro_w = 1000.0  # Плотность воды, [кг/м^3]</w:t>
+        <w:t xml:space="preserve">ro_w = </w:t>
+      </w:r>
+      <w:proofErr w:type="gramStart"/>
+      <w:r>
+        <w:t>1000.0  #</w:t>
+      </w:r>
+      <w:proofErr w:type="gramEnd"/>
+      <w:r>
+        <w:t xml:space="preserve"> Плотность воды, [кг/м^3]</w:t>
       </w:r>
     </w:p>
     <w:p>
@@ -35115,33 +35300,81 @@
     </w:p>
     <w:p>
       <w:r>
-        <w:t>ro_f = 2500.0  # Плотность пласта, [кг/м^3]</w:t>
+        <w:t xml:space="preserve">ro_f = </w:t>
+      </w:r>
+      <w:proofErr w:type="gramStart"/>
+      <w:r>
+        <w:t>2500.0  #</w:t>
+      </w:r>
+      <w:proofErr w:type="gramEnd"/>
+      <w:r>
+        <w:t xml:space="preserve"> Плотность пласта, [кг/м^3]</w:t>
       </w:r>
     </w:p>
     <w:p>
       <w:r>
-        <w:t>mu_w = 1.0 * cpoise_to_Pas  # Вязкость воды, [Па*с]</w:t>
+        <w:t>mu_w = 1.0 * cpoise_to_</w:t>
+      </w:r>
+      <w:proofErr w:type="gramStart"/>
+      <w:r>
+        <w:t>Pas  #</w:t>
+      </w:r>
+      <w:proofErr w:type="gramEnd"/>
+      <w:r>
+        <w:t xml:space="preserve"> Вязкость воды, [Па*с]</w:t>
       </w:r>
     </w:p>
     <w:p>
       <w:r>
-        <w:t>mu_o = 5.0 * cpoise_to_Pas  # Вязкость нефти, [Па*с]</w:t>
+        <w:t>mu_o = 5.0 * cpoise_to_</w:t>
+      </w:r>
+      <w:proofErr w:type="gramStart"/>
+      <w:r>
+        <w:t>Pas  #</w:t>
+      </w:r>
+      <w:proofErr w:type="gramEnd"/>
+      <w:r>
+        <w:t xml:space="preserve"> Вязкость нефти, [Па*с]</w:t>
       </w:r>
     </w:p>
     <w:p>
       <w:r>
-        <w:t>c_w = 4200  # Теплоемкость воды, [Дж*кг/C]</w:t>
+        <w:t xml:space="preserve">c_w = </w:t>
+      </w:r>
+      <w:proofErr w:type="gramStart"/>
+      <w:r>
+        <w:t>4200  #</w:t>
+      </w:r>
+      <w:proofErr w:type="gramEnd"/>
+      <w:r>
+        <w:t xml:space="preserve"> Теплоемкость воды, [Дж*кг/C]</w:t>
       </w:r>
     </w:p>
     <w:p>
       <w:r>
-        <w:t>c_o = 2000  # Теплоемкость нефти, [Дж*кг/C]</w:t>
+        <w:t xml:space="preserve">c_o = </w:t>
+      </w:r>
+      <w:proofErr w:type="gramStart"/>
+      <w:r>
+        <w:t>2000  #</w:t>
+      </w:r>
+      <w:proofErr w:type="gramEnd"/>
+      <w:r>
+        <w:t xml:space="preserve"> Теплоемкость нефти, [Дж*кг/C]</w:t>
       </w:r>
     </w:p>
     <w:p>
       <w:r>
         <w:lastRenderedPageBreak/>
-        <w:t>c_p = 2200  # Теплоемкость парафина, [Дж*кг/C]</w:t>
+        <w:t xml:space="preserve">c_p = </w:t>
+      </w:r>
+      <w:proofErr w:type="gramStart"/>
+      <w:r>
+        <w:t>2200  #</w:t>
+      </w:r>
+      <w:proofErr w:type="gramEnd"/>
+      <w:r>
+        <w:t xml:space="preserve"> Теплоемкость парафина, [Дж*кг/C]</w:t>
       </w:r>
     </w:p>
     <w:p>
@@ -35151,22 +35384,54 @@
     </w:p>
     <w:p>
       <w:r>
-        <w:t>K_p  = 0.2  # Теплопроводность парафина, Вт/(м·С)</w:t>
+        <w:t>K_</w:t>
+      </w:r>
+      <w:proofErr w:type="gramStart"/>
+      <w:r>
+        <w:t>p  =</w:t>
+      </w:r>
+      <w:proofErr w:type="gramEnd"/>
+      <w:r>
+        <w:t xml:space="preserve"> 0.2  # Теплопроводность парафина, Вт/(м·С)</w:t>
       </w:r>
     </w:p>
     <w:p>
       <w:r>
-        <w:t>K_w  = 0.6  # Теплопроводность воды, Вт/(м·С)</w:t>
+        <w:t>K_</w:t>
+      </w:r>
+      <w:proofErr w:type="gramStart"/>
+      <w:r>
+        <w:t>w  =</w:t>
+      </w:r>
+      <w:proofErr w:type="gramEnd"/>
+      <w:r>
+        <w:t xml:space="preserve"> 0.6  # Теплопроводность воды, Вт/(м·С)</w:t>
       </w:r>
     </w:p>
     <w:p>
       <w:r>
-        <w:t>K_o  = 0.12 # Теплопроводность нефти, Вт/(м·С)</w:t>
+        <w:t>K_</w:t>
+      </w:r>
+      <w:proofErr w:type="gramStart"/>
+      <w:r>
+        <w:t>o  =</w:t>
+      </w:r>
+      <w:proofErr w:type="gramEnd"/>
+      <w:r>
+        <w:t xml:space="preserve"> 0.12 # Теплопроводность нефти, Вт/(м·С)</w:t>
       </w:r>
     </w:p>
     <w:p>
       <w:r>
-        <w:t>K_f  = 2.0  # Теплопроводность пласта, Вт/(м·С)</w:t>
+        <w:t>K_</w:t>
+      </w:r>
+      <w:proofErr w:type="gramStart"/>
+      <w:r>
+        <w:t>f  =</w:t>
+      </w:r>
+      <w:proofErr w:type="gramEnd"/>
+      <w:r>
+        <w:t xml:space="preserve"> 2.0  # Теплопроводность пласта, Вт/(м·С)</w:t>
       </w:r>
     </w:p>
     <w:p/>
@@ -35181,8 +35446,13 @@
       </w:r>
     </w:p>
     <w:p>
-      <w:r>
-        <w:t>Diff  = 2e-18  # Коэффициент диффузионного осаждения частиц, [м^2/с]</w:t>
+      <w:proofErr w:type="gramStart"/>
+      <w:r>
+        <w:t>Diff  =</w:t>
+      </w:r>
+      <w:proofErr w:type="gramEnd"/>
+      <w:r>
+        <w:t xml:space="preserve"> 2e-18  # Коэффициент диффузионного осаждения частиц, [м^2/с]</w:t>
       </w:r>
     </w:p>
     <w:p>
@@ -35217,12 +35487,28 @@
     </w:p>
     <w:p>
       <w:r>
-        <w:t>Delta = 0.005  # Кинетическая константа суффозии, [1/м]</w:t>
+        <w:t xml:space="preserve">Delta = </w:t>
+      </w:r>
+      <w:proofErr w:type="gramStart"/>
+      <w:r>
+        <w:t>0.005  #</w:t>
+      </w:r>
+      <w:proofErr w:type="gramEnd"/>
+      <w:r>
+        <w:t xml:space="preserve"> Кинетическая константа суффозии, [1/м]</w:t>
       </w:r>
     </w:p>
     <w:p>
       <w:r>
-        <w:t>R     = 8.31446261815324  # Газовая постоянная, [J</w:t>
+        <w:t xml:space="preserve">R     = </w:t>
+      </w:r>
+      <w:proofErr w:type="gramStart"/>
+      <w:r>
+        <w:t>8.31446261815324  #</w:t>
+      </w:r>
+      <w:proofErr w:type="gramEnd"/>
+      <w:r>
+        <w:t xml:space="preserve"> Газовая постоянная, [J</w:t>
       </w:r>
       <w:r>
         <w:rPr>
@@ -35251,17 +35537,41 @@
     </w:p>
     <w:p>
       <w:r>
-        <w:t>MW = 350.0  # Молекулярная масса</w:t>
+        <w:t xml:space="preserve">MW = </w:t>
+      </w:r>
+      <w:proofErr w:type="gramStart"/>
+      <w:r>
+        <w:t>350.0  #</w:t>
+      </w:r>
+      <w:proofErr w:type="gramEnd"/>
+      <w:r>
+        <w:t xml:space="preserve"> Молекулярная масса</w:t>
       </w:r>
     </w:p>
     <w:p>
       <w:r>
-        <w:t>Tm = 374.5 + 0.02617 * MW - 2.0172e4 / MW - 273.15  # Температура кристаллизации парафина, [C]</w:t>
+        <w:t xml:space="preserve">Tm = 374.5 + 0.02617 * MW - 2.0172e4 / MW - </w:t>
+      </w:r>
+      <w:proofErr w:type="gramStart"/>
+      <w:r>
+        <w:t>273.15  #</w:t>
+      </w:r>
+      <w:proofErr w:type="gramEnd"/>
+      <w:r>
+        <w:t xml:space="preserve"> Температура кристаллизации парафина, [C]</w:t>
       </w:r>
     </w:p>
     <w:p>
       <w:r>
-        <w:t>alpha = 0.1426 * MW * Tm * kal_to_J  # Скрытая теплота плавления парафина, [J/gram-mol]</w:t>
+        <w:t>alpha = 0.1426 * MW * Tm * kal_to_</w:t>
+      </w:r>
+      <w:proofErr w:type="gramStart"/>
+      <w:r>
+        <w:t>J  #</w:t>
+      </w:r>
+      <w:proofErr w:type="gramEnd"/>
+      <w:r>
+        <w:t xml:space="preserve"> Скрытая теплота плавления парафина, [J/gram-mol]</w:t>
       </w:r>
     </w:p>
     <w:sectPr>

</xml_diff>

<commit_message>
upd calculation Ur Ub
</commit_message>
<xml_diff>
--- a/resources/Лазарев диплом.docx
+++ b/resources/Лазарев диплом.docx
@@ -2878,30 +2878,78 @@
       <w:r>
         <w:t>].</w:t>
       </w:r>
+      <w:r>
+        <w:t xml:space="preserve"> </w:t>
+      </w:r>
+      <w:r>
+        <w:t xml:space="preserve">В качестве метода решения </w:t>
+      </w:r>
+      <w:r>
+        <w:t>используется</w:t>
+      </w:r>
+      <w:r>
+        <w:t xml:space="preserve"> метод </w:t>
+      </w:r>
+      <w:r>
+        <w:t>конечных</w:t>
+      </w:r>
+      <w:r>
+        <w:t xml:space="preserve"> объемов. При </w:t>
+      </w:r>
+      <w:r>
+        <w:t>вычислении</w:t>
+      </w:r>
+      <w:r>
+        <w:t xml:space="preserve"> интеграл</w:t>
+      </w:r>
+      <w:r>
+        <w:t>ов</w:t>
+      </w:r>
+      <w:r>
+        <w:t xml:space="preserve"> от членов уравнений, содержащих временную производную, вычислял</w:t>
+      </w:r>
+      <w:r>
+        <w:t>и</w:t>
+      </w:r>
+      <w:r>
+        <w:t>сь с использованием “</w:t>
+      </w:r>
+      <w:proofErr w:type="spellStart"/>
+      <w:r>
+        <w:t>лампинг</w:t>
+      </w:r>
+      <w:proofErr w:type="spellEnd"/>
+      <w:r>
+        <w:t>”</w:t>
+      </w:r>
+      <w:r>
+        <w:t xml:space="preserve"> подхода, а конвективное слагаемое интегрировалось </w:t>
+      </w:r>
+      <w:r>
+        <w:t>по схеме вверх по</w:t>
+      </w:r>
+      <w:r>
+        <w:t xml:space="preserve"> поток</w:t>
+      </w:r>
+      <w:r>
+        <w:t>у</w:t>
+      </w:r>
+      <w:r>
+        <w:t xml:space="preserve"> </w:t>
+      </w:r>
+      <w:r>
+        <w:rPr>
+          <w:highlight w:val="yellow"/>
+        </w:rPr>
+        <w:t>[ссылки]</w:t>
+      </w:r>
+      <w:r>
+        <w:t>.</w:t>
+      </w:r>
     </w:p>
     <w:p>
       <w:pPr>
-        <w:spacing w:after="0" w:line="360" w:lineRule="auto"/>
-        <w:ind w:firstLine="709"/>
-        <w:jc w:val="both"/>
-      </w:pPr>
-      <w:r>
-        <w:rPr>
-          <w:highlight w:val="cyan"/>
-        </w:rPr>
-        <w:t>Добавить о методе решения</w:t>
-      </w:r>
-    </w:p>
-    <w:p>
-      <w:pPr>
-        <w:spacing w:line="360" w:lineRule="auto"/>
-        <w:jc w:val="both"/>
-      </w:pPr>
-    </w:p>
-    <w:p>
-      <w:pPr>
-        <w:spacing w:after="160" w:line="360" w:lineRule="auto"/>
-        <w:jc w:val="both"/>
+        <w:spacing w:after="160" w:line="259" w:lineRule="auto"/>
       </w:pPr>
       <w:r>
         <w:br w:type="page"/>
@@ -3581,28 +3629,7 @@
         <w:t xml:space="preserve"> симметрии 5 точечной системы заводнения</w:t>
       </w:r>
       <w:r>
-        <w:t xml:space="preserve"> с </w:t>
-      </w:r>
-      <w:r>
-        <w:t>вертикальны</w:t>
-      </w:r>
-      <w:r>
-        <w:t xml:space="preserve">ми </w:t>
-      </w:r>
-      <w:r>
-        <w:t>скважин</w:t>
-      </w:r>
-      <w:r>
-        <w:t>ами</w:t>
-      </w:r>
-      <w:r>
-        <w:t xml:space="preserve"> радиус</w:t>
-      </w:r>
-      <w:r>
-        <w:t>а</w:t>
-      </w:r>
-      <w:r>
-        <w:t xml:space="preserve"> </w:t>
+        <w:t xml:space="preserve"> с вертикальными скважинами радиуса </w:t>
       </w:r>
       <m:oMath>
         <m:sSub>
@@ -3829,19 +3856,7 @@
                 <w:rPr>
                   <w:rFonts w:ascii="Cambria Math" w:hAnsi="Cambria Math"/>
                 </w:rPr>
-                <m:t>0</m:t>
-              </m:r>
-              <m:r>
-                <w:rPr>
-                  <w:rFonts w:ascii="Cambria Math" w:hAnsi="Cambria Math"/>
-                </w:rPr>
-                <m:t xml:space="preserve">, </m:t>
-              </m:r>
-              <m:r>
-                <w:rPr>
-                  <w:rFonts w:ascii="Cambria Math" w:hAnsi="Cambria Math"/>
-                </w:rPr>
-                <m:t>0</m:t>
+                <m:t>0, 0</m:t>
               </m:r>
             </m:e>
           </m:d>
@@ -4165,7 +4180,7 @@
       <w:pPr>
         <w:tabs>
           <w:tab w:val="center" w:pos="4678"/>
-          <w:tab w:val="right" w:pos="9750"/>
+          <w:tab w:val="right" w:pos="9355"/>
         </w:tabs>
         <w:jc w:val="both"/>
       </w:pPr>
@@ -4445,7 +4460,7 @@
       <w:pPr>
         <w:tabs>
           <w:tab w:val="center" w:pos="4678"/>
-          <w:tab w:val="right" w:pos="9750"/>
+          <w:tab w:val="right" w:pos="9355"/>
         </w:tabs>
         <w:jc w:val="both"/>
         <w:rPr>
@@ -4910,17 +4925,6 @@
         <w:t>доля масляного компонента в нефтяной фазе</w:t>
       </w:r>
       <w:r>
-        <w:t xml:space="preserve">, </w:t>
-      </w:r>
-      <m:oMath>
-        <m:r>
-          <w:rPr>
-            <w:rFonts w:ascii="Cambria Math" w:hAnsi="Cambria Math"/>
-          </w:rPr>
-          <m:t>[-]</m:t>
-        </m:r>
-      </m:oMath>
-      <w:r>
         <w:t xml:space="preserve">; </w:t>
       </w:r>
       <w:r>
@@ -4970,23 +4974,9 @@
         <w:t xml:space="preserve"> скорость фильтрации водной фазы</w:t>
       </w:r>
       <w:r>
-        <w:t xml:space="preserve">, </w:t>
-      </w:r>
-      <m:oMath>
-        <m:r>
-          <w:rPr>
-            <w:rFonts w:ascii="Cambria Math" w:hAnsi="Cambria Math"/>
-          </w:rPr>
-          <m:t>[м/сек]</m:t>
-        </m:r>
-      </m:oMath>
-      <w:r>
-        <w:t xml:space="preserve">;  </w:t>
-      </w:r>
-      <w:r>
-        <w:rPr>
-          <w:rFonts w:eastAsiaTheme="minorEastAsia"/>
-        </w:rPr>
+        <w:t>;</w:t>
+      </w:r>
+      <w:r>
         <w:t xml:space="preserve"> </w:t>
       </w:r>
       <m:oMath>
@@ -5030,24 +5020,7 @@
         <w:rPr>
           <w:rFonts w:eastAsiaTheme="minorEastAsia"/>
         </w:rPr>
-        <w:t xml:space="preserve"> скорость фильтрации нефтяной фазы</w:t>
-      </w:r>
-      <w:r>
-        <w:t xml:space="preserve">, </w:t>
-      </w:r>
-      <m:oMath>
-        <m:r>
-          <w:rPr>
-            <w:rFonts w:ascii="Cambria Math" w:hAnsi="Cambria Math"/>
-          </w:rPr>
-          <m:t>[м/сек]</m:t>
-        </m:r>
-      </m:oMath>
-      <w:r>
-        <w:rPr>
-          <w:rFonts w:eastAsiaTheme="minorEastAsia"/>
-        </w:rPr>
-        <w:t xml:space="preserve">; </w:t>
+        <w:t xml:space="preserve"> скорость фильтрации нефтяной фазы; </w:t>
       </w:r>
       <m:oMath>
         <m:sSub>
@@ -5093,18 +5066,10 @@
         <w:t xml:space="preserve"> водонасыщенность</w:t>
       </w:r>
       <w:r>
-        <w:t xml:space="preserve">, </w:t>
-      </w:r>
-      <m:oMath>
-        <m:r>
-          <w:rPr>
-            <w:rFonts w:ascii="Cambria Math" w:hAnsi="Cambria Math"/>
-          </w:rPr>
-          <m:t>[-]</m:t>
-        </m:r>
-      </m:oMath>
-      <w:r>
-        <w:t xml:space="preserve">; </w:t>
+        <w:t>;</w:t>
+      </w:r>
+      <w:r>
+        <w:t xml:space="preserve"> </w:t>
       </w:r>
       <w:r>
         <w:rPr>
@@ -5156,17 +5121,6 @@
         <w:t xml:space="preserve"> нефтенасыщенность</w:t>
       </w:r>
       <w:r>
-        <w:t xml:space="preserve">, </w:t>
-      </w:r>
-      <m:oMath>
-        <m:r>
-          <w:rPr>
-            <w:rFonts w:ascii="Cambria Math" w:hAnsi="Cambria Math"/>
-          </w:rPr>
-          <m:t>[-]</m:t>
-        </m:r>
-      </m:oMath>
-      <w:r>
         <w:t xml:space="preserve">;  </w:t>
       </w:r>
       <w:r>
@@ -5231,52 +5185,6 @@
         <w:t>одной фазы</w:t>
       </w:r>
       <w:r>
-        <w:t xml:space="preserve">, </w:t>
-      </w:r>
-      <m:oMath>
-        <m:r>
-          <w:rPr>
-            <w:rFonts w:ascii="Cambria Math" w:hAnsi="Cambria Math"/>
-          </w:rPr>
-          <m:t>[кг/</m:t>
-        </m:r>
-        <m:sSup>
-          <m:sSupPr>
-            <m:ctrlPr>
-              <w:rPr>
-                <w:rFonts w:ascii="Cambria Math" w:hAnsi="Cambria Math"/>
-                <w:i/>
-              </w:rPr>
-            </m:ctrlPr>
-          </m:sSupPr>
-          <m:e>
-            <m:r>
-              <w:rPr>
-                <w:rFonts w:ascii="Cambria Math" w:hAnsi="Cambria Math"/>
-              </w:rPr>
-              <m:t>м</m:t>
-            </m:r>
-          </m:e>
-          <m:sup>
-            <m:r>
-              <w:rPr>
-                <w:rFonts w:ascii="Cambria Math" w:hAnsi="Cambria Math"/>
-              </w:rPr>
-              <m:t>3</m:t>
-            </m:r>
-          </m:sup>
-        </m:sSup>
-        <m:r>
-          <w:rPr>
-            <w:rFonts w:ascii="Cambria Math" w:hAnsi="Cambria Math"/>
-          </w:rPr>
-          <m:t>]</m:t>
-        </m:r>
-      </m:oMath>
-      <w:r>
-        <w:rPr>
-          <w:rFonts w:eastAsiaTheme="minorEastAsia"/>
-        </w:rPr>
         <w:t>;</w:t>
       </w:r>
       <w:r>
@@ -5335,59 +5243,7 @@
         <w:t xml:space="preserve"> плотность нефтяной фазы</w:t>
       </w:r>
       <w:r>
-        <w:t xml:space="preserve">, </w:t>
-      </w:r>
-      <m:oMath>
-        <m:r>
-          <w:rPr>
-            <w:rFonts w:ascii="Cambria Math" w:hAnsi="Cambria Math"/>
-          </w:rPr>
-          <m:t>[кг/</m:t>
-        </m:r>
-        <m:sSup>
-          <m:sSupPr>
-            <m:ctrlPr>
-              <w:rPr>
-                <w:rFonts w:ascii="Cambria Math" w:hAnsi="Cambria Math"/>
-                <w:i/>
-              </w:rPr>
-            </m:ctrlPr>
-          </m:sSupPr>
-          <m:e>
-            <m:r>
-              <w:rPr>
-                <w:rFonts w:ascii="Cambria Math" w:hAnsi="Cambria Math"/>
-              </w:rPr>
-              <m:t>м</m:t>
-            </m:r>
-          </m:e>
-          <m:sup>
-            <m:r>
-              <w:rPr>
-                <w:rFonts w:ascii="Cambria Math" w:hAnsi="Cambria Math"/>
-              </w:rPr>
-              <m:t>3</m:t>
-            </m:r>
-          </m:sup>
-        </m:sSup>
-        <m:r>
-          <w:rPr>
-            <w:rFonts w:ascii="Cambria Math" w:hAnsi="Cambria Math"/>
-          </w:rPr>
-          <m:t>]</m:t>
-        </m:r>
-      </m:oMath>
-      <w:r>
-        <w:rPr>
-          <w:rFonts w:eastAsiaTheme="minorEastAsia"/>
-        </w:rPr>
-        <w:t>;</w:t>
-      </w:r>
-      <w:r>
-        <w:rPr>
-          <w:rFonts w:eastAsiaTheme="minorEastAsia"/>
-        </w:rPr>
-        <w:t xml:space="preserve"> </w:t>
+        <w:t xml:space="preserve">; </w:t>
       </w:r>
       <m:oMath>
         <m:sSub>
@@ -5430,49 +5286,6 @@
         </w:rPr>
         <w:t xml:space="preserve"> дебет скважин по воде</w:t>
       </w:r>
-      <w:r>
-        <w:t xml:space="preserve">, </w:t>
-      </w:r>
-      <m:oMath>
-        <m:r>
-          <w:rPr>
-            <w:rFonts w:ascii="Cambria Math" w:hAnsi="Cambria Math"/>
-          </w:rPr>
-          <m:t>[</m:t>
-        </m:r>
-        <m:sSup>
-          <m:sSupPr>
-            <m:ctrlPr>
-              <w:rPr>
-                <w:rFonts w:ascii="Cambria Math" w:hAnsi="Cambria Math"/>
-                <w:i/>
-              </w:rPr>
-            </m:ctrlPr>
-          </m:sSupPr>
-          <m:e>
-            <m:r>
-              <w:rPr>
-                <w:rFonts w:ascii="Cambria Math" w:hAnsi="Cambria Math"/>
-              </w:rPr>
-              <m:t>м</m:t>
-            </m:r>
-          </m:e>
-          <m:sup>
-            <m:r>
-              <w:rPr>
-                <w:rFonts w:ascii="Cambria Math" w:hAnsi="Cambria Math"/>
-              </w:rPr>
-              <m:t>3</m:t>
-            </m:r>
-          </m:sup>
-        </m:sSup>
-        <m:r>
-          <w:rPr>
-            <w:rFonts w:ascii="Cambria Math" w:hAnsi="Cambria Math"/>
-          </w:rPr>
-          <m:t>/сек]</m:t>
-        </m:r>
-      </m:oMath>
       <w:r>
         <w:rPr>
           <w:rFonts w:eastAsiaTheme="minorEastAsia"/>
@@ -5528,66 +5341,13 @@
         <w:t xml:space="preserve"> дебет скважин по нефти</w:t>
       </w:r>
       <w:r>
-        <w:t xml:space="preserve">, </w:t>
-      </w:r>
-      <m:oMath>
-        <m:r>
-          <w:rPr>
-            <w:rFonts w:ascii="Cambria Math" w:hAnsi="Cambria Math"/>
-          </w:rPr>
-          <m:t>[</m:t>
-        </m:r>
-        <m:sSup>
-          <m:sSupPr>
-            <m:ctrlPr>
-              <w:rPr>
-                <w:rFonts w:ascii="Cambria Math" w:hAnsi="Cambria Math"/>
-                <w:i/>
-              </w:rPr>
-            </m:ctrlPr>
-          </m:sSupPr>
-          <m:e>
-            <m:r>
-              <w:rPr>
-                <w:rFonts w:ascii="Cambria Math" w:hAnsi="Cambria Math"/>
-              </w:rPr>
-              <m:t>м</m:t>
-            </m:r>
-          </m:e>
-          <m:sup>
-            <m:r>
-              <w:rPr>
-                <w:rFonts w:ascii="Cambria Math" w:hAnsi="Cambria Math"/>
-              </w:rPr>
-              <m:t>3</m:t>
-            </m:r>
-          </m:sup>
-        </m:sSup>
-        <m:r>
-          <w:rPr>
-            <w:rFonts w:ascii="Cambria Math" w:hAnsi="Cambria Math"/>
-          </w:rPr>
-          <m:t>/сек]</m:t>
-        </m:r>
-      </m:oMath>
+        <w:t>.</w:t>
+      </w:r>
       <w:r>
         <w:rPr>
           <w:rFonts w:eastAsiaTheme="minorEastAsia"/>
         </w:rPr>
-        <w:t>.</w:t>
-      </w:r>
-      <w:r>
-        <w:rPr>
-          <w:rFonts w:eastAsiaTheme="minorEastAsia"/>
-        </w:rPr>
         <w:t xml:space="preserve"> </w:t>
-      </w:r>
-      <w:r>
-        <w:rPr>
-          <w:rFonts w:eastAsiaTheme="minorEastAsia"/>
-          <w:highlight w:val="yellow"/>
-        </w:rPr>
-        <w:t>Надо ли ЕИ?</w:t>
       </w:r>
     </w:p>
     <w:p>
@@ -5669,7 +5429,7 @@
       <w:pPr>
         <w:tabs>
           <w:tab w:val="center" w:pos="4678"/>
-          <w:tab w:val="right" w:pos="9750"/>
+          <w:tab w:val="right" w:pos="9355"/>
         </w:tabs>
         <w:ind w:firstLine="284"/>
         <w:jc w:val="both"/>
@@ -7606,7 +7366,7 @@
       <w:pPr>
         <w:tabs>
           <w:tab w:val="center" w:pos="4678"/>
-          <w:tab w:val="right" w:pos="9750"/>
+          <w:tab w:val="right" w:pos="9355"/>
         </w:tabs>
         <w:jc w:val="both"/>
         <w:rPr>
@@ -9665,6 +9425,7 @@
         <m:r>
           <w:rPr>
             <w:rFonts w:ascii="Cambria Math" w:hAnsi="Cambria Math"/>
+            <w:highlight w:val="yellow"/>
           </w:rPr>
           <m:t>C-</m:t>
         </m:r>
@@ -9672,18 +9433,26 @@
       <w:r>
         <w:rPr>
           <w:rFonts w:eastAsiaTheme="minorEastAsia"/>
+          <w:highlight w:val="yellow"/>
         </w:rPr>
         <w:t xml:space="preserve"> </w:t>
       </w:r>
       <w:r>
+        <w:rPr>
+          <w:highlight w:val="yellow"/>
+        </w:rPr>
         <w:t>теплоемкость</w:t>
       </w:r>
       <w:r>
+        <w:rPr>
+          <w:highlight w:val="yellow"/>
+        </w:rPr>
         <w:t xml:space="preserve">; </w:t>
       </w:r>
       <w:r>
         <w:rPr>
           <w:rFonts w:eastAsiaTheme="minorEastAsia"/>
+          <w:highlight w:val="yellow"/>
         </w:rPr>
         <w:t xml:space="preserve"> </w:t>
       </w:r>
@@ -9691,6 +9460,7 @@
         <m:r>
           <w:rPr>
             <w:rFonts w:ascii="Cambria Math" w:hAnsi="Cambria Math"/>
+            <w:highlight w:val="yellow"/>
             <w:lang w:val="en-US"/>
           </w:rPr>
           <m:t>K</m:t>
@@ -9698,6 +9468,7 @@
         <m:r>
           <w:rPr>
             <w:rFonts w:ascii="Cambria Math" w:hAnsi="Cambria Math"/>
+            <w:highlight w:val="yellow"/>
           </w:rPr>
           <m:t>-</m:t>
         </m:r>
@@ -9705,21 +9476,27 @@
       <w:r>
         <w:rPr>
           <w:rFonts w:eastAsiaTheme="minorEastAsia"/>
+          <w:highlight w:val="yellow"/>
         </w:rPr>
         <w:t xml:space="preserve"> </w:t>
       </w:r>
       <w:r>
         <w:rPr>
           <w:rFonts w:eastAsiaTheme="minorEastAsia"/>
+          <w:highlight w:val="yellow"/>
         </w:rPr>
         <w:t>теплопроводность</w:t>
       </w:r>
       <w:r>
+        <w:rPr>
+          <w:highlight w:val="yellow"/>
+        </w:rPr>
         <w:t xml:space="preserve">; </w:t>
       </w:r>
       <w:r>
         <w:rPr>
           <w:rFonts w:eastAsiaTheme="minorEastAsia"/>
+          <w:highlight w:val="yellow"/>
         </w:rPr>
         <w:t xml:space="preserve"> </w:t>
       </w:r>
@@ -9727,6 +9504,7 @@
         <m:r>
           <w:rPr>
             <w:rFonts w:ascii="Cambria Math" w:hAnsi="Cambria Math"/>
+            <w:highlight w:val="yellow"/>
             <w:lang w:val="en-US"/>
           </w:rPr>
           <m:t>T</m:t>
@@ -9734,6 +9512,7 @@
         <m:r>
           <w:rPr>
             <w:rFonts w:ascii="Cambria Math" w:hAnsi="Cambria Math"/>
+            <w:highlight w:val="yellow"/>
           </w:rPr>
           <m:t>-</m:t>
         </m:r>
@@ -9741,12 +9520,14 @@
       <w:r>
         <w:rPr>
           <w:rFonts w:eastAsiaTheme="minorEastAsia"/>
+          <w:highlight w:val="yellow"/>
         </w:rPr>
         <w:t xml:space="preserve"> </w:t>
       </w:r>
       <w:r>
         <w:rPr>
           <w:rFonts w:eastAsiaTheme="minorEastAsia"/>
+          <w:highlight w:val="yellow"/>
         </w:rPr>
         <w:t>температура</w:t>
       </w:r>
@@ -10049,9 +9830,6 @@
           <w:tab w:val="right" w:pos="9750"/>
         </w:tabs>
         <w:jc w:val="both"/>
-        <w:rPr>
-          <w:rFonts w:eastAsiaTheme="minorEastAsia"/>
-        </w:rPr>
       </w:pPr>
       <m:oMath>
         <m:r>
@@ -10138,43 +9916,8 @@
           <w:tab w:val="right" w:pos="9750"/>
         </w:tabs>
         <w:jc w:val="both"/>
-        <w:rPr>
-          <w:rFonts w:eastAsiaTheme="minorEastAsia"/>
-        </w:rPr>
       </w:pPr>
       <w:r>
-        <w:rPr>
-          <w:rFonts w:eastAsiaTheme="minorEastAsia"/>
-          <w:highlight w:val="yellow"/>
-        </w:rPr>
-        <w:t>Тут описать процесс кольматации парафина или только в решении?</w:t>
-      </w:r>
-    </w:p>
-    <w:p>
-      <w:pPr>
-        <w:tabs>
-          <w:tab w:val="right" w:pos="9750"/>
-        </w:tabs>
-        <w:jc w:val="both"/>
-      </w:pPr>
-    </w:p>
-    <w:p>
-      <w:pPr>
-        <w:spacing w:after="160" w:line="259" w:lineRule="auto"/>
-      </w:pPr>
-      <w:r>
-        <w:br w:type="page"/>
-      </w:r>
-    </w:p>
-    <w:p>
-      <w:pPr>
-        <w:tabs>
-          <w:tab w:val="right" w:pos="9750"/>
-        </w:tabs>
-        <w:jc w:val="both"/>
-      </w:pPr>
-      <w:r>
-        <w:lastRenderedPageBreak/>
         <w:t>В начальный момент времени пласт полностью нефтенасыщен:</w:t>
       </w:r>
     </w:p>
@@ -10255,7 +9998,6 @@
       </w:r>
       <w:r>
         <w:tab/>
-        <w:t>()</w:t>
       </w:r>
     </w:p>
     <w:p>
@@ -10393,12 +10135,6 @@
         </w:rPr>
         <w:tab/>
       </w:r>
-      <w:r>
-        <w:rPr>
-          <w:iCs/>
-        </w:rPr>
-        <w:t>()</w:t>
-      </w:r>
     </w:p>
     <w:p>
       <w:pPr>
@@ -10454,6 +10190,7 @@
           <w:b/>
           <w:bCs/>
         </w:rPr>
+        <w:lastRenderedPageBreak/>
         <w:tab/>
       </w:r>
       <m:oMath>
@@ -10770,12 +10507,6 @@
           <w:i/>
         </w:rPr>
         <w:tab/>
-      </w:r>
-      <w:r>
-        <w:rPr>
-          <w:iCs/>
-        </w:rPr>
-        <w:t>()</w:t>
       </w:r>
     </w:p>
     <w:p>
@@ -12542,7 +12273,7 @@
           <v:shape id="_x0000_i1025" type="#_x0000_t75" style="width:372pt;height:78pt" o:ole="">
             <v:imagedata r:id="rId8" o:title=""/>
           </v:shape>
-          <o:OLEObject Type="Embed" ProgID="Equation.DSMT4" ShapeID="_x0000_i1025" DrawAspect="Content" ObjectID="_1811013606" r:id="rId9"/>
+          <o:OLEObject Type="Embed" ProgID="Equation.DSMT4" ShapeID="_x0000_i1025" DrawAspect="Content" ObjectID="_1811065862" r:id="rId9"/>
         </w:object>
       </w:r>
     </w:p>
@@ -12570,7 +12301,7 @@
           <v:shape id="_x0000_i1026" type="#_x0000_t75" style="width:474pt;height:1in" o:ole="">
             <v:imagedata r:id="rId10" o:title=""/>
           </v:shape>
-          <o:OLEObject Type="Embed" ProgID="Equation.DSMT4" ShapeID="_x0000_i1026" DrawAspect="Content" ObjectID="_1811013607" r:id="rId11"/>
+          <o:OLEObject Type="Embed" ProgID="Equation.DSMT4" ShapeID="_x0000_i1026" DrawAspect="Content" ObjectID="_1811065863" r:id="rId11"/>
         </w:object>
       </w:r>
     </w:p>
@@ -18801,7 +18532,7 @@
           <v:shape id="_x0000_i1027" type="#_x0000_t75" style="width:42pt;height:24pt" o:ole="">
             <v:imagedata r:id="rId12" o:title=""/>
           </v:shape>
-          <o:OLEObject Type="Embed" ProgID="Equation.3" ShapeID="_x0000_i1027" DrawAspect="Content" ObjectID="_1811013608" r:id="rId13"/>
+          <o:OLEObject Type="Embed" ProgID="Equation.3" ShapeID="_x0000_i1027" DrawAspect="Content" ObjectID="_1811065864" r:id="rId13"/>
         </w:object>
       </w:r>
       <w:r>
@@ -18841,7 +18572,7 @@
           <v:shape id="_x0000_i1028" type="#_x0000_t75" style="width:78pt;height:42pt" o:ole="">
             <v:imagedata r:id="rId14" o:title=""/>
           </v:shape>
-          <o:OLEObject Type="Embed" ProgID="Equation.3" ShapeID="_x0000_i1028" DrawAspect="Content" ObjectID="_1811013609" r:id="rId15"/>
+          <o:OLEObject Type="Embed" ProgID="Equation.3" ShapeID="_x0000_i1028" DrawAspect="Content" ObjectID="_1811065865" r:id="rId15"/>
         </w:object>
       </w:r>
       <w:r>
@@ -18904,7 +18635,7 @@
           <v:shape id="_x0000_i1029" type="#_x0000_t75" style="width:198.6pt;height:102pt" o:ole="">
             <v:imagedata r:id="rId16" o:title=""/>
           </v:shape>
-          <o:OLEObject Type="Embed" ProgID="Equation.3" ShapeID="_x0000_i1029" DrawAspect="Content" ObjectID="_1811013610" r:id="rId17"/>
+          <o:OLEObject Type="Embed" ProgID="Equation.3" ShapeID="_x0000_i1029" DrawAspect="Content" ObjectID="_1811065866" r:id="rId17"/>
         </w:object>
       </w:r>
     </w:p>
@@ -35854,7 +35585,7 @@
     <w:lsdException w:name="Table Web 2" w:semiHidden="1" w:unhideWhenUsed="1"/>
     <w:lsdException w:name="Table Web 3" w:semiHidden="1" w:unhideWhenUsed="1"/>
     <w:lsdException w:name="Balloon Text" w:semiHidden="1" w:unhideWhenUsed="1"/>
-    <w:lsdException w:name="Table Grid" w:semiHidden="1" w:uiPriority="39" w:unhideWhenUsed="1"/>
+    <w:lsdException w:name="Table Grid" w:uiPriority="39"/>
     <w:lsdException w:name="Table Theme" w:semiHidden="1" w:unhideWhenUsed="1"/>
     <w:lsdException w:name="Placeholder Text" w:semiHidden="1"/>
     <w:lsdException w:name="No Spacing" w:uiPriority="1" w:qFormat="1"/>

</xml_diff>